<commit_message>
feat: implement project automation suite with pywebview UI, auto-scaling document generation, and comprehensive testing infrastructure
</commit_message>
<xml_diff>
--- a/templates/Final-Grade-Discussion_LATEST.docx
+++ b/templates/Final-Grade-Discussion_LATEST.docx
@@ -1,72 +1,165 @@
 
 <file path=word/document.xml><?xml version="1.0" encoding="utf-8"?>
-<w:document xmlns:wpc="http://schemas.microsoft.com/office/word/2010/wordprocessingCanvas" xmlns:mc="http://schemas.openxmlformats.org/markup-compatibility/2006" xmlns:o="urn:schemas-microsoft-com:office:office" xmlns:r="http://schemas.openxmlformats.org/officeDocument/2006/relationships" xmlns:m="http://schemas.openxmlformats.org/officeDocument/2006/math" xmlns:v="urn:schemas-microsoft-com:vml" xmlns:wp14="http://schemas.microsoft.com/office/word/2010/wordprocessingDrawing" xmlns:wp="http://schemas.openxmlformats.org/drawingml/2006/wordprocessingDrawing" xmlns:w10="urn:schemas-microsoft-com:office:word" xmlns:w="http://schemas.openxmlformats.org/wordprocessingml/2006/main" xmlns:w14="http://schemas.microsoft.com/office/word/2010/wordml" xmlns:w15="http://schemas.microsoft.com/office/word/2012/wordml" xmlns:w16se="http://schemas.microsoft.com/office/word/2015/wordml/symex" xmlns:w16cid="http://schemas.microsoft.com/office/word/2016/wordml/cid" xmlns:w16="http://schemas.microsoft.com/office/word/2018/wordml" xmlns:w16cex="http://schemas.microsoft.com/office/word/2018/wordml/cex" xmlns:w16sdtdh="http://schemas.microsoft.com/office/word/2020/wordml/sdtdatahash" xmlns:wne="http://schemas.microsoft.com/office/word/2006/wordml" xmlns:wpg="http://schemas.microsoft.com/office/word/2010/wordprocessingGroup" xmlns:wps="http://schemas.microsoft.com/office/word/2010/wordprocessingShape" mc:Ignorable="w14 w15 w16se w16cid w16 w16cex w16sdtdh wp14">
+<w:document xmlns:wpc="http://schemas.microsoft.com/office/word/2010/wordprocessingCanvas" xmlns:cx="http://schemas.microsoft.com/office/drawing/2014/chartex" xmlns:cx1="http://schemas.microsoft.com/office/drawing/2015/9/8/chartex" xmlns:cx2="http://schemas.microsoft.com/office/drawing/2015/10/21/chartex" xmlns:cx3="http://schemas.microsoft.com/office/drawing/2016/5/9/chartex" xmlns:cx4="http://schemas.microsoft.com/office/drawing/2016/5/10/chartex" xmlns:cx5="http://schemas.microsoft.com/office/drawing/2016/5/11/chartex" xmlns:cx6="http://schemas.microsoft.com/office/drawing/2016/5/12/chartex" xmlns:cx7="http://schemas.microsoft.com/office/drawing/2016/5/13/chartex" xmlns:cx8="http://schemas.microsoft.com/office/drawing/2016/5/14/chartex" xmlns:mc="http://schemas.openxmlformats.org/markup-compatibility/2006" xmlns:aink="http://schemas.microsoft.com/office/drawing/2016/ink" xmlns:am3d="http://schemas.microsoft.com/office/drawing/2017/model3d" xmlns:o="urn:schemas-microsoft-com:office:office" xmlns:oel="http://schemas.microsoft.com/office/2019/extlst" xmlns:r="http://schemas.openxmlformats.org/officeDocument/2006/relationships" xmlns:m="http://schemas.openxmlformats.org/officeDocument/2006/math" xmlns:v="urn:schemas-microsoft-com:vml" xmlns:wp14="http://schemas.microsoft.com/office/word/2010/wordprocessingDrawing" xmlns:wp="http://schemas.openxmlformats.org/drawingml/2006/wordprocessingDrawing" xmlns:w10="urn:schemas-microsoft-com:office:word" xmlns:w="http://schemas.openxmlformats.org/wordprocessingml/2006/main" xmlns:w14="http://schemas.microsoft.com/office/word/2010/wordml" xmlns:w15="http://schemas.microsoft.com/office/word/2012/wordml" xmlns:w16cex="http://schemas.microsoft.com/office/word/2018/wordml/cex" xmlns:w16cid="http://schemas.microsoft.com/office/word/2016/wordml/cid" xmlns:w16="http://schemas.microsoft.com/office/word/2018/wordml" xmlns:w16du="http://schemas.microsoft.com/office/word/2023/wordml/word16du" xmlns:w16sdtdh="http://schemas.microsoft.com/office/word/2020/wordml/sdtdatahash" xmlns:w16sdtfl="http://schemas.microsoft.com/office/word/2024/wordml/sdtformatlock" xmlns:w16se="http://schemas.microsoft.com/office/word/2015/wordml/symex" xmlns:wpg="http://schemas.microsoft.com/office/word/2010/wordprocessingGroup" xmlns:wpi="http://schemas.microsoft.com/office/word/2010/wordprocessingInk" xmlns:wne="http://schemas.microsoft.com/office/word/2006/wordml" xmlns:wps="http://schemas.microsoft.com/office/word/2010/wordprocessingShape" mc:Ignorable="w14 w15 w16se w16cid w16 w16cex w16sdtdh w16sdtfl w16du wp14">
   <w:body>
     <w:p>
+      <w:pPr>
+        <w:jc w:val="both"/>
+        <w:rPr>
+          <w:rFonts w:ascii="Arial" w:hAnsi="Arial" w:cs="Arial"/>
+          <w:b/>
+          <w:sz w:val="12"/>
+          <w:szCs w:val="20"/>
+        </w:rPr>
+      </w:pPr>
       <w:r>
-        <w:drawing>
-          <wp:anchor distT="0" distB="0" distL="114300" distR="114300" simplePos="0" relativeHeight="251658240" behindDoc="0" locked="0" layoutInCell="1" allowOverlap="1">
-            <wp:simplePos x="0" y="0"/>
-            <wp:positionH relativeFrom="column">
-              <wp:posOffset>4312969</wp:posOffset>
-            </wp:positionH>
-            <wp:positionV relativeFrom="paragraph">
-              <wp:posOffset>-1542513</wp:posOffset>
-            </wp:positionV>
-            <wp:extent cx="1504950" cy="247650"/>
-            <wp:effectExtent l="0" t="0" r="0" b="0"/>
-            <wp:wrapNone/>
-            <wp:docPr id="100000" name="Picture 100000"/>
-            <wp:cNvGraphicFramePr>
-              <a:graphicFrameLocks xmlns:a="http://schemas.openxmlformats.org/drawingml/2006/main" noChangeAspect="1"/>
-            </wp:cNvGraphicFramePr>
-            <a:graphic xmlns:a="http://schemas.openxmlformats.org/drawingml/2006/main">
-              <a:graphicData uri="http://schemas.openxmlformats.org/drawingml/2006/picture">
-                <pic:pic xmlns:pic="http://schemas.openxmlformats.org/drawingml/2006/picture">
-                  <pic:nvPicPr>
-                    <pic:cNvPr id="100000" name="image100000"/>
-                    <pic:cNvPicPr/>
-                  </pic:nvPicPr>
-                  <pic:blipFill>
-                    <a:blip r:embed="rId1"/>
-                    <a:stretch>
-                      <a:fillRect/>
-                    </a:stretch>
-                  </pic:blipFill>
-                  <pic:spPr>
-                    <a:xfrm>
-                      <a:off x="0" y="0"/>
-                      <a:ext cx="1504950" cy="247650"/>
-                    </a:xfrm>
-                    <a:prstGeom prst="rect">
-                      <a:avLst/>
-                    </a:prstGeom>
-                  </pic:spPr>
-                </pic:pic>
-              </a:graphicData>
-            </a:graphic>
-          </wp:anchor>
-        </w:drawing>
+        <w:rPr>
+          <w:rFonts w:ascii="Arial" w:hAnsi="Arial" w:cs="Arial"/>
+          <w:b/>
+          <w:noProof/>
+          <w:sz w:val="12"/>
+          <w:szCs w:val="20"/>
+        </w:rPr>
+        <mc:AlternateContent>
+          <mc:Choice Requires="wps">
+            <w:drawing>
+              <wp:anchor distT="0" distB="0" distL="114300" distR="114300" simplePos="0" relativeHeight="251658240" behindDoc="0" locked="0" layoutInCell="1" allowOverlap="1" wp14:anchorId="0D881622" wp14:editId="38C5BC31">
+                <wp:simplePos x="0" y="0"/>
+                <wp:positionH relativeFrom="column">
+                  <wp:posOffset>4312969</wp:posOffset>
+                </wp:positionH>
+                <wp:positionV relativeFrom="paragraph">
+                  <wp:posOffset>-1542513</wp:posOffset>
+                </wp:positionV>
+                <wp:extent cx="1508760" cy="247015"/>
+                <wp:effectExtent l="0" t="0" r="15240" b="24765"/>
+                <wp:wrapNone/>
+                <wp:docPr id="307" name="Text Box 307"/>
+                <wp:cNvGraphicFramePr>
+                  <a:graphicFrameLocks xmlns:a="http://schemas.openxmlformats.org/drawingml/2006/main"/>
+                </wp:cNvGraphicFramePr>
+                <a:graphic xmlns:a="http://schemas.openxmlformats.org/drawingml/2006/main">
+                  <a:graphicData uri="http://schemas.microsoft.com/office/word/2010/wordprocessingShape">
+                    <wps:wsp>
+                      <wps:cNvSpPr txBox="1">
+                        <a:spLocks noChangeArrowheads="1"/>
+                      </wps:cNvSpPr>
+                      <wps:spPr bwMode="auto">
+                        <a:xfrm>
+                          <a:off x="0" y="0"/>
+                          <a:ext cx="1508760" cy="247015"/>
+                        </a:xfrm>
+                        <a:prstGeom prst="rect">
+                          <a:avLst/>
+                        </a:prstGeom>
+                        <a:solidFill>
+                          <a:srgbClr val="FFFFFF"/>
+                        </a:solidFill>
+                        <a:ln w="9525">
+                          <a:solidFill>
+                            <a:schemeClr val="bg1"/>
+                          </a:solidFill>
+                          <a:miter lim="800000"/>
+                          <a:headEnd/>
+                          <a:tailEnd/>
+                        </a:ln>
+                      </wps:spPr>
+                      <wps:txbx>
+                        <w:txbxContent>
+                          <w:p>
+                            <w:pPr>
+                              <w:jc w:val="center"/>
+                              <w:rPr>
+                                <w:i/>
+                                <w:sz w:val="18"/>
+                                <w:szCs w:val="18"/>
+                              </w:rPr>
+                            </w:pPr>
+                            <w:r>
+                              <w:rPr>
+                                <w:rFonts w:ascii="Arial" w:hAnsi="Arial" w:cs="Arial"/>
+                                <w:i/>
+                                <w:sz w:val="18"/>
+                                <w:szCs w:val="18"/>
+                              </w:rPr>
+                              <w:t xml:space="preserve">CEIT- QF - </w:t>
+                            </w:r>
+                            <w:r>
+                              <w:rPr>
+                                <w:rFonts w:ascii="Arial" w:hAnsi="Arial" w:cs="Arial"/>
+                                <w:i/>
+                                <w:sz w:val="18"/>
+                                <w:szCs w:val="18"/>
+                              </w:rPr>
+                              <w:t>xx</w:t>
+                            </w:r>
+                          </w:p>
+                        </w:txbxContent>
+                      </wps:txbx>
+                      <wps:bodyPr rot="0" vert="horz" wrap="square" lIns="91440" tIns="45720" rIns="91440" bIns="45720" anchor="t" anchorCtr="0">
+                        <a:spAutoFit/>
+                      </wps:bodyPr>
+                    </wps:wsp>
+                  </a:graphicData>
+                </a:graphic>
+                <wp14:sizeRelH relativeFrom="margin">
+                  <wp14:pctWidth>0</wp14:pctWidth>
+                </wp14:sizeRelH>
+                <wp14:sizeRelV relativeFrom="margin">
+                  <wp14:pctHeight>20000</wp14:pctHeight>
+                </wp14:sizeRelV>
+              </wp:anchor>
+            </w:drawing>
+          </mc:Choice>
+          <mc:Fallback>
+            <w:pict>
+              <v:shapetype w14:anchorId="0D881622" id="_x0000_t202" coordsize="21600,21600" o:spt="202" path="m,l,21600r21600,l21600,xe">
+                <v:stroke joinstyle="miter"/>
+                <v:path gradientshapeok="t" o:connecttype="rect"/>
+              </v:shapetype>
+              <v:shape id="Text Box 307" o:spid="_x0000_s1026" type="#_x0000_t202" style="position:absolute;left:0;text-align:left;margin-left:339.6pt;margin-top:-121.45pt;width:118.8pt;height:19.45pt;z-index:251658240;visibility:visible;mso-wrap-style:square;mso-width-percent:0;mso-height-percent:200;mso-wrap-distance-left:9pt;mso-wrap-distance-top:0;mso-wrap-distance-right:9pt;mso-wrap-distance-bottom:0;mso-position-horizontal:absolute;mso-position-horizontal-relative:text;mso-position-vertical:absolute;mso-position-vertical-relative:text;mso-width-percent:0;mso-height-percent:200;mso-width-relative:margin;mso-height-relative:margin;v-text-anchor:top" o:gfxdata="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" strokecolor="white [3212]">
+                <v:textbox style="mso-fit-shape-to-text:t">
+                  <w:txbxContent>
+                    <w:p>
+                      <w:pPr>
+                        <w:jc w:val="center"/>
+                        <w:rPr>
+                          <w:i/>
+                          <w:sz w:val="18"/>
+                          <w:szCs w:val="18"/>
+                        </w:rPr>
+                      </w:pPr>
+                      <w:r>
+                        <w:rPr>
+                          <w:rFonts w:ascii="Arial" w:hAnsi="Arial" w:cs="Arial"/>
+                          <w:i/>
+                          <w:sz w:val="18"/>
+                          <w:szCs w:val="18"/>
+                        </w:rPr>
+                        <w:t xml:space="preserve">CEIT- QF - </w:t>
+                      </w:r>
+                      <w:r>
+                        <w:rPr>
+                          <w:rFonts w:ascii="Arial" w:hAnsi="Arial" w:cs="Arial"/>
+                          <w:i/>
+                          <w:sz w:val="18"/>
+                          <w:szCs w:val="18"/>
+                        </w:rPr>
+                        <w:t>xx</w:t>
+                      </w:r>
+                    </w:p>
+                  </w:txbxContent>
+                </v:textbox>
+              </v:shape>
+            </w:pict>
+          </mc:Fallback>
+        </mc:AlternateContent>
       </w:r>
     </w:p>
     <w:tbl>
       <w:tblPr>
         <w:tblW w:w="0" w:type="auto"/>
-        <w:tblBorders>
-          <w:top w:val="single" w:sz="4" w:space="0" w:color="auto"/>
-          <w:left w:val="single" w:sz="4" w:space="0" w:color="auto"/>
-          <w:bottom w:val="single" w:sz="4" w:space="0" w:color="auto"/>
-          <w:right w:val="single" w:sz="4" w:space="0" w:color="auto"/>
-          <w:insideH w:val="single" w:sz="4" w:space="0" w:color="auto"/>
-          <w:insideV w:val="single" w:sz="4" w:space="0" w:color="auto"/>
-        </w:tblBorders>
-        <w:tblCellMar>
-          <w:top w:w="0" w:type="dxa"/>
-          <w:left w:w="108" w:type="dxa"/>
-          <w:bottom w:w="0" w:type="dxa"/>
-          <w:right w:w="108" w:type="dxa"/>
-        </w:tblCellMar>
-        <w:tblLook w:firstRow="1" w:firstColumn="1" w:noVBand="1"/>
+        <w:tblLook w:val="04A0" w:firstRow="1" w:lastRow="0" w:firstColumn="1" w:lastColumn="0" w:noHBand="0" w:noVBand="1"/>
       </w:tblPr>
       <w:tblGrid>
         <w:gridCol w:w="4285"/>
@@ -77,18 +170,6 @@
         <w:tc>
           <w:tcPr>
             <w:tcW w:w="4361" w:type="dxa"/>
-            <w:tcBorders>
-              <w:top w:val="none"/>
-              <w:left w:val="none"/>
-              <w:bottom w:val="none"/>
-              <w:right w:val="none"/>
-            </w:tcBorders>
-            <w:tcMar>
-              <w:top w:w="0" w:type="dxa"/>
-              <w:left w:w="108" w:type="dxa"/>
-              <w:bottom w:w="0" w:type="dxa"/>
-              <w:right w:w="108" w:type="dxa"/>
-            </w:tcMar>
           </w:tcPr>
           <w:p>
             <w:pPr>
@@ -101,9 +182,7 @@
             </w:pPr>
             <w:r>
               <w:rPr>
-                <w:rFonts w:ascii="Arial" w:hAnsi="Arial" w:eastAsia="Calibri" w:cs="Arial" w:eastAsiaTheme="minorHAnsi"/>
-                <w:sz w:val="22"/>
-                <w:szCs w:val="22"/>
+                <w:rFonts w:ascii="Arial" w:hAnsi="Arial" w:cs="Arial"/>
               </w:rPr>
               <w:t>INSTRUCTOR’S NAME/SIGNATURE</w:t>
             </w:r>
@@ -112,18 +191,6 @@
         <w:tc>
           <w:tcPr>
             <w:tcW w:w="283" w:type="dxa"/>
-            <w:tcBorders>
-              <w:top w:val="none"/>
-              <w:left w:val="none"/>
-              <w:bottom w:val="none"/>
-              <w:right w:val="none"/>
-            </w:tcBorders>
-            <w:tcMar>
-              <w:top w:w="0" w:type="dxa"/>
-              <w:left w:w="108" w:type="dxa"/>
-              <w:bottom w:w="0" w:type="dxa"/>
-              <w:right w:w="108" w:type="dxa"/>
-            </w:tcMar>
           </w:tcPr>
           <w:p>
             <w:pPr>
@@ -136,7 +203,7 @@
             </w:pPr>
             <w:r>
               <w:rPr>
-                <w:rFonts w:ascii="Arial" w:hAnsi="Arial" w:eastAsia="Calibri" w:cs="Arial" w:eastAsiaTheme="minorHAnsi"/>
+                <w:rFonts w:ascii="Arial" w:hAnsi="Arial" w:cs="Arial"/>
                 <w:sz w:val="20"/>
                 <w:szCs w:val="20"/>
               </w:rPr>
@@ -148,17 +215,8 @@
           <w:tcPr>
             <w:tcW w:w="4241" w:type="dxa"/>
             <w:tcBorders>
-              <w:top w:val="none"/>
-              <w:left w:val="none"/>
-              <w:bottom w:val="single" w:sz="4" w:color="000000"/>
-              <w:right w:val="none"/>
+              <w:bottom w:val="single" w:sz="4" w:space="0" w:color="auto"/>
             </w:tcBorders>
-            <w:tcMar>
-              <w:top w:w="0" w:type="dxa"/>
-              <w:left w:w="108" w:type="dxa"/>
-              <w:bottom w:w="0" w:type="dxa"/>
-              <w:right w:w="108" w:type="dxa"/>
-            </w:tcMar>
           </w:tcPr>
           <w:p>
             <w:pPr>
@@ -176,18 +234,6 @@
         <w:tc>
           <w:tcPr>
             <w:tcW w:w="4361" w:type="dxa"/>
-            <w:tcBorders>
-              <w:top w:val="none"/>
-              <w:left w:val="none"/>
-              <w:bottom w:val="none"/>
-              <w:right w:val="none"/>
-            </w:tcBorders>
-            <w:tcMar>
-              <w:top w:w="0" w:type="dxa"/>
-              <w:left w:w="108" w:type="dxa"/>
-              <w:bottom w:w="0" w:type="dxa"/>
-              <w:right w:w="108" w:type="dxa"/>
-            </w:tcMar>
           </w:tcPr>
           <w:p>
             <w:pPr>
@@ -200,9 +246,7 @@
             </w:pPr>
             <w:r>
               <w:rPr>
-                <w:rFonts w:ascii="Arial" w:hAnsi="Arial" w:eastAsia="Calibri" w:cs="Arial" w:eastAsiaTheme="minorHAnsi"/>
-                <w:sz w:val="22"/>
-                <w:szCs w:val="22"/>
+                <w:rFonts w:ascii="Arial" w:hAnsi="Arial" w:cs="Arial"/>
               </w:rPr>
               <w:t>COURSE / YEAR / SECTION</w:t>
             </w:r>
@@ -211,18 +255,6 @@
         <w:tc>
           <w:tcPr>
             <w:tcW w:w="283" w:type="dxa"/>
-            <w:tcBorders>
-              <w:top w:val="none"/>
-              <w:left w:val="none"/>
-              <w:bottom w:val="none"/>
-              <w:right w:val="none"/>
-            </w:tcBorders>
-            <w:tcMar>
-              <w:top w:w="0" w:type="dxa"/>
-              <w:left w:w="108" w:type="dxa"/>
-              <w:bottom w:w="0" w:type="dxa"/>
-              <w:right w:w="108" w:type="dxa"/>
-            </w:tcMar>
           </w:tcPr>
           <w:p>
             <w:pPr>
@@ -235,7 +267,7 @@
             </w:pPr>
             <w:r>
               <w:rPr>
-                <w:rFonts w:ascii="Arial" w:hAnsi="Arial" w:eastAsia="Calibri" w:cs="Arial" w:eastAsiaTheme="minorHAnsi"/>
+                <w:rFonts w:ascii="Arial" w:hAnsi="Arial" w:cs="Arial"/>
                 <w:sz w:val="20"/>
                 <w:szCs w:val="20"/>
               </w:rPr>
@@ -247,17 +279,9 @@
           <w:tcPr>
             <w:tcW w:w="4241" w:type="dxa"/>
             <w:tcBorders>
-              <w:top w:val="single" w:sz="4" w:color="000000"/>
-              <w:left w:val="none"/>
-              <w:bottom w:val="single" w:sz="4" w:color="000000"/>
-              <w:right w:val="none"/>
+              <w:top w:val="single" w:sz="4" w:space="0" w:color="auto"/>
+              <w:bottom w:val="single" w:sz="4" w:space="0" w:color="auto"/>
             </w:tcBorders>
-            <w:tcMar>
-              <w:top w:w="0" w:type="dxa"/>
-              <w:left w:w="108" w:type="dxa"/>
-              <w:bottom w:w="0" w:type="dxa"/>
-              <w:right w:w="108" w:type="dxa"/>
-            </w:tcMar>
           </w:tcPr>
           <w:p>
             <w:pPr>
@@ -275,18 +299,6 @@
         <w:tc>
           <w:tcPr>
             <w:tcW w:w="4361" w:type="dxa"/>
-            <w:tcBorders>
-              <w:top w:val="none"/>
-              <w:left w:val="none"/>
-              <w:bottom w:val="none"/>
-              <w:right w:val="none"/>
-            </w:tcBorders>
-            <w:tcMar>
-              <w:top w:w="0" w:type="dxa"/>
-              <w:left w:w="108" w:type="dxa"/>
-              <w:bottom w:w="0" w:type="dxa"/>
-              <w:right w:w="108" w:type="dxa"/>
-            </w:tcMar>
           </w:tcPr>
           <w:p>
             <w:pPr>
@@ -299,9 +311,7 @@
             </w:pPr>
             <w:r>
               <w:rPr>
-                <w:rFonts w:ascii="Arial" w:hAnsi="Arial" w:eastAsia="Calibri" w:cs="Arial" w:eastAsiaTheme="minorHAnsi"/>
-                <w:sz w:val="22"/>
-                <w:szCs w:val="22"/>
+                <w:rFonts w:ascii="Arial" w:hAnsi="Arial" w:cs="Arial"/>
               </w:rPr>
               <w:t>SCHEDULE CODE</w:t>
             </w:r>
@@ -310,18 +320,6 @@
         <w:tc>
           <w:tcPr>
             <w:tcW w:w="283" w:type="dxa"/>
-            <w:tcBorders>
-              <w:top w:val="none"/>
-              <w:left w:val="none"/>
-              <w:bottom w:val="none"/>
-              <w:right w:val="none"/>
-            </w:tcBorders>
-            <w:tcMar>
-              <w:top w:w="0" w:type="dxa"/>
-              <w:left w:w="108" w:type="dxa"/>
-              <w:bottom w:w="0" w:type="dxa"/>
-              <w:right w:w="108" w:type="dxa"/>
-            </w:tcMar>
           </w:tcPr>
           <w:p>
             <w:pPr>
@@ -334,7 +332,7 @@
             </w:pPr>
             <w:r>
               <w:rPr>
-                <w:rFonts w:ascii="Arial" w:hAnsi="Arial" w:eastAsia="Calibri" w:cs="Arial" w:eastAsiaTheme="minorHAnsi"/>
+                <w:rFonts w:ascii="Arial" w:hAnsi="Arial" w:cs="Arial"/>
                 <w:sz w:val="20"/>
                 <w:szCs w:val="20"/>
               </w:rPr>
@@ -346,17 +344,9 @@
           <w:tcPr>
             <w:tcW w:w="4241" w:type="dxa"/>
             <w:tcBorders>
-              <w:top w:val="single" w:sz="4" w:color="000000"/>
-              <w:left w:val="none"/>
-              <w:bottom w:val="single" w:sz="4" w:color="000000"/>
-              <w:right w:val="none"/>
+              <w:top w:val="single" w:sz="4" w:space="0" w:color="auto"/>
+              <w:bottom w:val="single" w:sz="4" w:space="0" w:color="auto"/>
             </w:tcBorders>
-            <w:tcMar>
-              <w:top w:w="0" w:type="dxa"/>
-              <w:left w:w="108" w:type="dxa"/>
-              <w:bottom w:w="0" w:type="dxa"/>
-              <w:right w:w="108" w:type="dxa"/>
-            </w:tcMar>
           </w:tcPr>
           <w:p>
             <w:pPr>
@@ -374,18 +364,6 @@
         <w:tc>
           <w:tcPr>
             <w:tcW w:w="4361" w:type="dxa"/>
-            <w:tcBorders>
-              <w:top w:val="none"/>
-              <w:left w:val="none"/>
-              <w:bottom w:val="none"/>
-              <w:right w:val="none"/>
-            </w:tcBorders>
-            <w:tcMar>
-              <w:top w:w="0" w:type="dxa"/>
-              <w:left w:w="108" w:type="dxa"/>
-              <w:bottom w:w="0" w:type="dxa"/>
-              <w:right w:w="108" w:type="dxa"/>
-            </w:tcMar>
           </w:tcPr>
           <w:p>
             <w:pPr>
@@ -398,9 +376,7 @@
             </w:pPr>
             <w:r>
               <w:rPr>
-                <w:rFonts w:ascii="Arial" w:hAnsi="Arial" w:eastAsia="Calibri" w:cs="Arial" w:eastAsiaTheme="minorHAnsi"/>
-                <w:sz w:val="22"/>
-                <w:szCs w:val="22"/>
+                <w:rFonts w:ascii="Arial" w:hAnsi="Arial" w:cs="Arial"/>
               </w:rPr>
               <w:t>SUBJECT CODE / TITLE</w:t>
             </w:r>
@@ -409,18 +385,6 @@
         <w:tc>
           <w:tcPr>
             <w:tcW w:w="283" w:type="dxa"/>
-            <w:tcBorders>
-              <w:top w:val="none"/>
-              <w:left w:val="none"/>
-              <w:bottom w:val="none"/>
-              <w:right w:val="none"/>
-            </w:tcBorders>
-            <w:tcMar>
-              <w:top w:w="0" w:type="dxa"/>
-              <w:left w:w="108" w:type="dxa"/>
-              <w:bottom w:w="0" w:type="dxa"/>
-              <w:right w:w="108" w:type="dxa"/>
-            </w:tcMar>
           </w:tcPr>
           <w:p>
             <w:pPr>
@@ -433,7 +397,7 @@
             </w:pPr>
             <w:r>
               <w:rPr>
-                <w:rFonts w:ascii="Arial" w:hAnsi="Arial" w:eastAsia="Calibri" w:cs="Arial" w:eastAsiaTheme="minorHAnsi"/>
+                <w:rFonts w:ascii="Arial" w:hAnsi="Arial" w:cs="Arial"/>
                 <w:sz w:val="20"/>
                 <w:szCs w:val="20"/>
               </w:rPr>
@@ -445,17 +409,9 @@
           <w:tcPr>
             <w:tcW w:w="4241" w:type="dxa"/>
             <w:tcBorders>
-              <w:top w:val="single" w:sz="4" w:color="000000"/>
-              <w:left w:val="none"/>
-              <w:bottom w:val="single" w:sz="4" w:color="000000"/>
-              <w:right w:val="none"/>
+              <w:top w:val="single" w:sz="4" w:space="0" w:color="auto"/>
+              <w:bottom w:val="single" w:sz="4" w:space="0" w:color="auto"/>
             </w:tcBorders>
-            <w:tcMar>
-              <w:top w:w="0" w:type="dxa"/>
-              <w:left w:w="108" w:type="dxa"/>
-              <w:bottom w:w="0" w:type="dxa"/>
-              <w:right w:w="108" w:type="dxa"/>
-            </w:tcMar>
           </w:tcPr>
           <w:p>
             <w:pPr>
@@ -473,18 +429,6 @@
         <w:tc>
           <w:tcPr>
             <w:tcW w:w="4361" w:type="dxa"/>
-            <w:tcBorders>
-              <w:top w:val="none"/>
-              <w:left w:val="none"/>
-              <w:bottom w:val="none"/>
-              <w:right w:val="none"/>
-            </w:tcBorders>
-            <w:tcMar>
-              <w:top w:w="0" w:type="dxa"/>
-              <w:left w:w="108" w:type="dxa"/>
-              <w:bottom w:w="0" w:type="dxa"/>
-              <w:right w:w="108" w:type="dxa"/>
-            </w:tcMar>
           </w:tcPr>
           <w:p>
             <w:pPr>
@@ -495,11 +439,68 @@
                 <w:szCs w:val="20"/>
               </w:rPr>
             </w:pPr>
+          </w:p>
+        </w:tc>
+        <w:tc>
+          <w:tcPr>
+            <w:tcW w:w="283" w:type="dxa"/>
+          </w:tcPr>
+          <w:p>
+            <w:pPr>
+              <w:jc w:val="both"/>
+              <w:rPr>
+                <w:rFonts w:ascii="Arial" w:hAnsi="Arial" w:cs="Arial"/>
+                <w:sz w:val="20"/>
+                <w:szCs w:val="20"/>
+              </w:rPr>
+            </w:pPr>
             <w:r>
               <w:rPr>
-                <w:rFonts w:ascii="Arial" w:hAnsi="Arial" w:eastAsia="Calibri" w:cs="Arial" w:eastAsiaTheme="minorHAnsi"/>
-                <w:sz w:val="22"/>
-                <w:szCs w:val="22"/>
+                <w:rFonts w:ascii="Arial" w:hAnsi="Arial" w:cs="Arial"/>
+                <w:sz w:val="20"/>
+                <w:szCs w:val="20"/>
+              </w:rPr>
+              <w:t>:</w:t>
+            </w:r>
+          </w:p>
+        </w:tc>
+        <w:tc>
+          <w:tcPr>
+            <w:tcW w:w="4241" w:type="dxa"/>
+            <w:tcBorders>
+              <w:top w:val="single" w:sz="4" w:space="0" w:color="auto"/>
+              <w:bottom w:val="single" w:sz="4" w:space="0" w:color="auto"/>
+            </w:tcBorders>
+          </w:tcPr>
+          <w:p>
+            <w:pPr>
+              <w:jc w:val="both"/>
+              <w:rPr>
+                <w:rFonts w:ascii="Arial" w:hAnsi="Arial" w:cs="Arial"/>
+                <w:sz w:val="20"/>
+                <w:szCs w:val="20"/>
+              </w:rPr>
+            </w:pPr>
+          </w:p>
+        </w:tc>
+      </w:tr>
+      <w:tr>
+        <w:tc>
+          <w:tcPr>
+            <w:tcW w:w="4361" w:type="dxa"/>
+          </w:tcPr>
+          <w:p>
+            <w:pPr>
+              <w:jc w:val="both"/>
+              <w:rPr>
+                <w:rFonts w:ascii="Arial" w:hAnsi="Arial" w:cs="Arial"/>
+                <w:sz w:val="20"/>
+                <w:szCs w:val="20"/>
+              </w:rPr>
+            </w:pPr>
+            <w:r>
+              <w:rPr>
+                <w:rFonts w:ascii="Arial" w:hAnsi="Arial" w:cs="Arial"/>
               </w:rPr>
               <w:t>SEMESTER / ACADEMIC YEAR</w:t>
             </w:r>
@@ -508,18 +509,6 @@
         <w:tc>
           <w:tcPr>
             <w:tcW w:w="283" w:type="dxa"/>
-            <w:tcBorders>
-              <w:top w:val="none"/>
-              <w:left w:val="none"/>
-              <w:bottom w:val="none"/>
-              <w:right w:val="none"/>
-            </w:tcBorders>
-            <w:tcMar>
-              <w:top w:w="0" w:type="dxa"/>
-              <w:left w:w="108" w:type="dxa"/>
-              <w:bottom w:w="0" w:type="dxa"/>
-              <w:right w:w="108" w:type="dxa"/>
-            </w:tcMar>
           </w:tcPr>
           <w:p>
             <w:pPr>
@@ -532,7 +521,7 @@
             </w:pPr>
             <w:r>
               <w:rPr>
-                <w:rFonts w:ascii="Arial" w:hAnsi="Arial" w:eastAsia="Calibri" w:cs="Arial" w:eastAsiaTheme="minorHAnsi"/>
+                <w:rFonts w:ascii="Arial" w:hAnsi="Arial" w:cs="Arial"/>
                 <w:sz w:val="20"/>
                 <w:szCs w:val="20"/>
               </w:rPr>
@@ -544,17 +533,9 @@
           <w:tcPr>
             <w:tcW w:w="4241" w:type="dxa"/>
             <w:tcBorders>
-              <w:top w:val="single" w:sz="4" w:color="000000"/>
-              <w:left w:val="none"/>
-              <w:bottom w:val="single" w:sz="4" w:color="000000"/>
-              <w:right w:val="none"/>
+              <w:top w:val="single" w:sz="4" w:space="0" w:color="auto"/>
+              <w:bottom w:val="single" w:sz="4" w:space="0" w:color="auto"/>
             </w:tcBorders>
-            <w:tcMar>
-              <w:top w:w="0" w:type="dxa"/>
-              <w:left w:w="108" w:type="dxa"/>
-              <w:bottom w:w="0" w:type="dxa"/>
-              <w:right w:w="108" w:type="dxa"/>
-            </w:tcMar>
           </w:tcPr>
           <w:p>
             <w:pPr>
@@ -572,18 +553,6 @@
         <w:tc>
           <w:tcPr>
             <w:tcW w:w="4361" w:type="dxa"/>
-            <w:tcBorders>
-              <w:top w:val="none"/>
-              <w:left w:val="none"/>
-              <w:bottom w:val="none"/>
-              <w:right w:val="none"/>
-            </w:tcBorders>
-            <w:tcMar>
-              <w:top w:w="0" w:type="dxa"/>
-              <w:left w:w="108" w:type="dxa"/>
-              <w:bottom w:w="0" w:type="dxa"/>
-              <w:right w:w="108" w:type="dxa"/>
-            </w:tcMar>
           </w:tcPr>
           <w:p>
             <w:pPr>
@@ -596,9 +565,7 @@
             </w:pPr>
             <w:r>
               <w:rPr>
-                <w:rFonts w:ascii="Arial" w:hAnsi="Arial" w:eastAsia="Calibri" w:cs="Arial" w:eastAsiaTheme="minorHAnsi"/>
-                <w:sz w:val="22"/>
-                <w:szCs w:val="22"/>
+                <w:rFonts w:ascii="Arial" w:hAnsi="Arial" w:cs="Arial"/>
               </w:rPr>
               <w:t>DATE</w:t>
             </w:r>
@@ -607,18 +574,6 @@
         <w:tc>
           <w:tcPr>
             <w:tcW w:w="283" w:type="dxa"/>
-            <w:tcBorders>
-              <w:top w:val="none"/>
-              <w:left w:val="none"/>
-              <w:bottom w:val="none"/>
-              <w:right w:val="none"/>
-            </w:tcBorders>
-            <w:tcMar>
-              <w:top w:w="0" w:type="dxa"/>
-              <w:left w:w="108" w:type="dxa"/>
-              <w:bottom w:w="0" w:type="dxa"/>
-              <w:right w:w="108" w:type="dxa"/>
-            </w:tcMar>
           </w:tcPr>
           <w:p>
             <w:pPr>
@@ -631,7 +586,7 @@
             </w:pPr>
             <w:r>
               <w:rPr>
-                <w:rFonts w:ascii="Arial" w:hAnsi="Arial" w:eastAsia="Calibri" w:cs="Arial" w:eastAsiaTheme="minorHAnsi"/>
+                <w:rFonts w:ascii="Arial" w:hAnsi="Arial" w:cs="Arial"/>
                 <w:sz w:val="20"/>
                 <w:szCs w:val="20"/>
               </w:rPr>
@@ -643,17 +598,9 @@
           <w:tcPr>
             <w:tcW w:w="4241" w:type="dxa"/>
             <w:tcBorders>
-              <w:top w:val="single" w:sz="4" w:color="000000"/>
-              <w:left w:val="none"/>
-              <w:bottom w:val="single" w:sz="4" w:color="000000"/>
-              <w:right w:val="none"/>
+              <w:top w:val="single" w:sz="4" w:space="0" w:color="auto"/>
+              <w:bottom w:val="single" w:sz="4" w:space="0" w:color="auto"/>
             </w:tcBorders>
-            <w:tcMar>
-              <w:top w:w="0" w:type="dxa"/>
-              <w:left w:w="108" w:type="dxa"/>
-              <w:bottom w:w="0" w:type="dxa"/>
-              <w:right w:w="108" w:type="dxa"/>
-            </w:tcMar>
           </w:tcPr>
           <w:p>
             <w:pPr>
@@ -698,13 +645,45 @@
       </w:pPr>
       <w:r>
         <w:rPr>
-          <w:rFonts w:ascii="Arial" w:hAnsi="Arial" w:eastAsia="Calibri" w:cs="Arial" w:eastAsiaTheme="minorHAnsi"/>
+          <w:rFonts w:ascii="Arial" w:hAnsi="Arial" w:cs="Arial"/>
           <w:i/>
-          <w:iCs/>
-          <w:sz w:val="22"/>
-          <w:szCs w:val="22"/>
         </w:rPr>
-        <w:t>This serves as confirmation that the instructor of this subject has presented and discussed the Final Grades. By affixing our signatures opposite our names, we acknowledge receipt and understanding of the grades presented.</w:t>
+        <w:t xml:space="preserve">This serves as confirmation that the instructor of this subject has presented and discussed the </w:t>
+      </w:r>
+      <w:r>
+        <w:rPr>
+          <w:rFonts w:ascii="Arial" w:hAnsi="Arial" w:cs="Arial"/>
+          <w:i/>
+        </w:rPr>
+        <w:t>Final</w:t>
+      </w:r>
+      <w:r>
+        <w:rPr>
+          <w:rFonts w:ascii="Arial" w:hAnsi="Arial" w:cs="Arial"/>
+          <w:i/>
+        </w:rPr>
+        <w:t xml:space="preserve"> </w:t>
+      </w:r>
+      <w:r>
+        <w:rPr>
+          <w:rFonts w:ascii="Arial" w:hAnsi="Arial" w:cs="Arial"/>
+          <w:i/>
+        </w:rPr>
+        <w:t>G</w:t>
+      </w:r>
+      <w:r>
+        <w:rPr>
+          <w:rFonts w:ascii="Arial" w:hAnsi="Arial" w:cs="Arial"/>
+          <w:i/>
+        </w:rPr>
+        <w:t>rades</w:t>
+      </w:r>
+      <w:r>
+        <w:rPr>
+          <w:rFonts w:ascii="Arial" w:hAnsi="Arial" w:cs="Arial"/>
+          <w:i/>
+        </w:rPr>
+        <w:t>. By affixing our signatures opposite our names, we acknowledge receipt and understanding of the grades presented.</w:t>
       </w:r>
     </w:p>
     <w:p>
@@ -745,13 +724,7 @@
           <w:insideH w:val="single" w:sz="4" w:space="0" w:color="auto"/>
           <w:insideV w:val="single" w:sz="4" w:space="0" w:color="auto"/>
         </w:tblBorders>
-        <w:tblCellMar>
-          <w:top w:w="0" w:type="dxa"/>
-          <w:left w:w="108" w:type="dxa"/>
-          <w:bottom w:w="0" w:type="dxa"/>
-          <w:right w:w="108" w:type="dxa"/>
-        </w:tblCellMar>
-        <w:tblLook w:firstRow="1" w:lastRow="1" w:firstColumn="1" w:lastColumn="1"/>
+        <w:tblLook w:val="01E0" w:firstRow="1" w:lastRow="1" w:firstColumn="1" w:lastColumn="1" w:noHBand="0" w:noVBand="0"/>
       </w:tblPr>
       <w:tblGrid>
         <w:gridCol w:w="4936"/>
@@ -765,18 +738,6 @@
         <w:tc>
           <w:tcPr>
             <w:tcW w:w="2850" w:type="pct"/>
-            <w:tcBorders>
-              <w:top w:val="single" w:sz="4" w:space="0" w:color="auto"/>
-              <w:left w:val="single" w:sz="4" w:space="0" w:color="auto"/>
-              <w:bottom w:val="single" w:sz="4" w:space="0" w:color="auto"/>
-              <w:right w:val="single" w:sz="4" w:space="0" w:color="auto"/>
-            </w:tcBorders>
-            <w:tcMar>
-              <w:top w:w="0" w:type="dxa"/>
-              <w:left w:w="108" w:type="dxa"/>
-              <w:bottom w:w="0" w:type="dxa"/>
-              <w:right w:w="108" w:type="dxa"/>
-            </w:tcMar>
             <w:vAlign w:val="center"/>
           </w:tcPr>
           <w:p>
@@ -789,11 +750,8 @@
             </w:pPr>
             <w:r>
               <w:rPr>
-                <w:rFonts w:ascii="Arial" w:hAnsi="Arial" w:eastAsia="Calibri" w:cs="Arial" w:eastAsiaTheme="minorHAnsi"/>
+                <w:rFonts w:ascii="Arial" w:hAnsi="Arial" w:cs="Arial"/>
                 <w:b/>
-                <w:bCs/>
-                <w:sz w:val="22"/>
-                <w:szCs w:val="22"/>
               </w:rPr>
               <w:t>NAME OF STUDENTS</w:t>
             </w:r>
@@ -802,18 +760,6 @@
         <w:tc>
           <w:tcPr>
             <w:tcW w:w="1126" w:type="pct"/>
-            <w:tcBorders>
-              <w:top w:val="single" w:sz="4" w:space="0" w:color="auto"/>
-              <w:left w:val="single" w:sz="4" w:space="0" w:color="auto"/>
-              <w:bottom w:val="single" w:sz="4" w:space="0" w:color="auto"/>
-              <w:right w:val="single" w:sz="4" w:space="0" w:color="auto"/>
-            </w:tcBorders>
-            <w:tcMar>
-              <w:top w:w="0" w:type="dxa"/>
-              <w:left w:w="108" w:type="dxa"/>
-              <w:bottom w:w="0" w:type="dxa"/>
-              <w:right w:w="108" w:type="dxa"/>
-            </w:tcMar>
             <w:vAlign w:val="center"/>
           </w:tcPr>
           <w:p>
@@ -826,11 +772,8 @@
             </w:pPr>
             <w:r>
               <w:rPr>
-                <w:rFonts w:ascii="Arial" w:hAnsi="Arial" w:eastAsia="Calibri" w:cs="Arial" w:eastAsiaTheme="minorHAnsi"/>
+                <w:rFonts w:ascii="Arial" w:hAnsi="Arial" w:cs="Arial"/>
                 <w:b/>
-                <w:bCs/>
-                <w:sz w:val="22"/>
-                <w:szCs w:val="22"/>
               </w:rPr>
               <w:t>STUDENT NUMBER</w:t>
             </w:r>
@@ -839,18 +782,6 @@
         <w:tc>
           <w:tcPr>
             <w:tcW w:w="1024" w:type="pct"/>
-            <w:tcBorders>
-              <w:top w:val="single" w:sz="4" w:space="0" w:color="auto"/>
-              <w:left w:val="single" w:sz="4" w:space="0" w:color="auto"/>
-              <w:bottom w:val="single" w:sz="4" w:space="0" w:color="auto"/>
-              <w:right w:val="single" w:sz="4" w:space="0" w:color="auto"/>
-            </w:tcBorders>
-            <w:tcMar>
-              <w:top w:w="0" w:type="dxa"/>
-              <w:left w:w="108" w:type="dxa"/>
-              <w:bottom w:w="0" w:type="dxa"/>
-              <w:right w:w="108" w:type="dxa"/>
-            </w:tcMar>
             <w:vAlign w:val="center"/>
           </w:tcPr>
           <w:p>
@@ -863,11 +794,8 @@
             </w:pPr>
             <w:r>
               <w:rPr>
-                <w:rFonts w:ascii="Arial" w:hAnsi="Arial" w:eastAsia="Calibri" w:cs="Arial" w:eastAsiaTheme="minorHAnsi"/>
+                <w:rFonts w:ascii="Arial" w:hAnsi="Arial" w:cs="Arial"/>
                 <w:b/>
-                <w:bCs/>
-                <w:sz w:val="22"/>
-                <w:szCs w:val="22"/>
               </w:rPr>
               <w:t>SIGNATURE</w:t>
             </w:r>
@@ -881,18 +809,6 @@
         <w:tc>
           <w:tcPr>
             <w:tcW w:w="2850" w:type="pct"/>
-            <w:tcBorders>
-              <w:top w:val="single" w:sz="4" w:space="0" w:color="auto"/>
-              <w:left w:val="single" w:sz="4" w:space="0" w:color="auto"/>
-              <w:bottom w:val="single" w:sz="4" w:space="0" w:color="auto"/>
-              <w:right w:val="single" w:sz="4" w:space="0" w:color="auto"/>
-            </w:tcBorders>
-            <w:tcMar>
-              <w:top w:w="0" w:type="dxa"/>
-              <w:left w:w="108" w:type="dxa"/>
-              <w:bottom w:w="0" w:type="dxa"/>
-              <w:right w:w="108" w:type="dxa"/>
-            </w:tcMar>
             <w:vAlign w:val="center"/>
           </w:tcPr>
           <w:p>
@@ -918,18 +834,6 @@
         <w:tc>
           <w:tcPr>
             <w:tcW w:w="1126" w:type="pct"/>
-            <w:tcBorders>
-              <w:top w:val="single" w:sz="4" w:space="0" w:color="auto"/>
-              <w:left w:val="single" w:sz="4" w:space="0" w:color="auto"/>
-              <w:bottom w:val="single" w:sz="4" w:space="0" w:color="auto"/>
-              <w:right w:val="single" w:sz="4" w:space="0" w:color="auto"/>
-            </w:tcBorders>
-            <w:tcMar>
-              <w:top w:w="0" w:type="dxa"/>
-              <w:left w:w="108" w:type="dxa"/>
-              <w:bottom w:w="0" w:type="dxa"/>
-              <w:right w:w="108" w:type="dxa"/>
-            </w:tcMar>
           </w:tcPr>
           <w:p>
             <w:pPr>
@@ -946,18 +850,6 @@
         <w:tc>
           <w:tcPr>
             <w:tcW w:w="1024" w:type="pct"/>
-            <w:tcBorders>
-              <w:top w:val="single" w:sz="4" w:space="0" w:color="auto"/>
-              <w:left w:val="single" w:sz="4" w:space="0" w:color="auto"/>
-              <w:bottom w:val="single" w:sz="4" w:space="0" w:color="auto"/>
-              <w:right w:val="single" w:sz="4" w:space="0" w:color="auto"/>
-            </w:tcBorders>
-            <w:tcMar>
-              <w:top w:w="0" w:type="dxa"/>
-              <w:left w:w="108" w:type="dxa"/>
-              <w:bottom w:w="0" w:type="dxa"/>
-              <w:right w:w="108" w:type="dxa"/>
-            </w:tcMar>
           </w:tcPr>
           <w:p>
             <w:pPr>
@@ -979,18 +871,6 @@
         <w:tc>
           <w:tcPr>
             <w:tcW w:w="2850" w:type="pct"/>
-            <w:tcBorders>
-              <w:top w:val="single" w:sz="4" w:space="0" w:color="auto"/>
-              <w:left w:val="single" w:sz="4" w:space="0" w:color="auto"/>
-              <w:bottom w:val="single" w:sz="4" w:space="0" w:color="auto"/>
-              <w:right w:val="single" w:sz="4" w:space="0" w:color="auto"/>
-            </w:tcBorders>
-            <w:tcMar>
-              <w:top w:w="0" w:type="dxa"/>
-              <w:left w:w="108" w:type="dxa"/>
-              <w:bottom w:w="0" w:type="dxa"/>
-              <w:right w:w="108" w:type="dxa"/>
-            </w:tcMar>
             <w:vAlign w:val="center"/>
           </w:tcPr>
           <w:p>
@@ -1016,18 +896,6 @@
         <w:tc>
           <w:tcPr>
             <w:tcW w:w="1126" w:type="pct"/>
-            <w:tcBorders>
-              <w:top w:val="single" w:sz="4" w:space="0" w:color="auto"/>
-              <w:left w:val="single" w:sz="4" w:space="0" w:color="auto"/>
-              <w:bottom w:val="single" w:sz="4" w:space="0" w:color="auto"/>
-              <w:right w:val="single" w:sz="4" w:space="0" w:color="auto"/>
-            </w:tcBorders>
-            <w:tcMar>
-              <w:top w:w="0" w:type="dxa"/>
-              <w:left w:w="108" w:type="dxa"/>
-              <w:bottom w:w="0" w:type="dxa"/>
-              <w:right w:w="108" w:type="dxa"/>
-            </w:tcMar>
           </w:tcPr>
           <w:p>
             <w:pPr>
@@ -1044,18 +912,6 @@
         <w:tc>
           <w:tcPr>
             <w:tcW w:w="1024" w:type="pct"/>
-            <w:tcBorders>
-              <w:top w:val="single" w:sz="4" w:space="0" w:color="auto"/>
-              <w:left w:val="single" w:sz="4" w:space="0" w:color="auto"/>
-              <w:bottom w:val="single" w:sz="4" w:space="0" w:color="auto"/>
-              <w:right w:val="single" w:sz="4" w:space="0" w:color="auto"/>
-            </w:tcBorders>
-            <w:tcMar>
-              <w:top w:w="0" w:type="dxa"/>
-              <w:left w:w="108" w:type="dxa"/>
-              <w:bottom w:w="0" w:type="dxa"/>
-              <w:right w:w="108" w:type="dxa"/>
-            </w:tcMar>
           </w:tcPr>
           <w:p>
             <w:pPr>
@@ -1077,18 +933,6 @@
         <w:tc>
           <w:tcPr>
             <w:tcW w:w="2850" w:type="pct"/>
-            <w:tcBorders>
-              <w:top w:val="single" w:sz="4" w:space="0" w:color="auto"/>
-              <w:left w:val="single" w:sz="4" w:space="0" w:color="auto"/>
-              <w:bottom w:val="single" w:sz="4" w:space="0" w:color="auto"/>
-              <w:right w:val="single" w:sz="4" w:space="0" w:color="auto"/>
-            </w:tcBorders>
-            <w:tcMar>
-              <w:top w:w="0" w:type="dxa"/>
-              <w:left w:w="108" w:type="dxa"/>
-              <w:bottom w:w="0" w:type="dxa"/>
-              <w:right w:w="108" w:type="dxa"/>
-            </w:tcMar>
             <w:vAlign w:val="center"/>
           </w:tcPr>
           <w:p>
@@ -1114,18 +958,6 @@
         <w:tc>
           <w:tcPr>
             <w:tcW w:w="1126" w:type="pct"/>
-            <w:tcBorders>
-              <w:top w:val="single" w:sz="4" w:space="0" w:color="auto"/>
-              <w:left w:val="single" w:sz="4" w:space="0" w:color="auto"/>
-              <w:bottom w:val="single" w:sz="4" w:space="0" w:color="auto"/>
-              <w:right w:val="single" w:sz="4" w:space="0" w:color="auto"/>
-            </w:tcBorders>
-            <w:tcMar>
-              <w:top w:w="0" w:type="dxa"/>
-              <w:left w:w="108" w:type="dxa"/>
-              <w:bottom w:w="0" w:type="dxa"/>
-              <w:right w:w="108" w:type="dxa"/>
-            </w:tcMar>
           </w:tcPr>
           <w:p>
             <w:pPr>
@@ -1142,18 +974,6 @@
         <w:tc>
           <w:tcPr>
             <w:tcW w:w="1024" w:type="pct"/>
-            <w:tcBorders>
-              <w:top w:val="single" w:sz="4" w:space="0" w:color="auto"/>
-              <w:left w:val="single" w:sz="4" w:space="0" w:color="auto"/>
-              <w:bottom w:val="single" w:sz="4" w:space="0" w:color="auto"/>
-              <w:right w:val="single" w:sz="4" w:space="0" w:color="auto"/>
-            </w:tcBorders>
-            <w:tcMar>
-              <w:top w:w="0" w:type="dxa"/>
-              <w:left w:w="108" w:type="dxa"/>
-              <w:bottom w:w="0" w:type="dxa"/>
-              <w:right w:w="108" w:type="dxa"/>
-            </w:tcMar>
           </w:tcPr>
           <w:p>
             <w:pPr>
@@ -1175,18 +995,6 @@
         <w:tc>
           <w:tcPr>
             <w:tcW w:w="2850" w:type="pct"/>
-            <w:tcBorders>
-              <w:top w:val="single" w:sz="4" w:space="0" w:color="auto"/>
-              <w:left w:val="single" w:sz="4" w:space="0" w:color="auto"/>
-              <w:bottom w:val="single" w:sz="4" w:space="0" w:color="auto"/>
-              <w:right w:val="single" w:sz="4" w:space="0" w:color="auto"/>
-            </w:tcBorders>
-            <w:tcMar>
-              <w:top w:w="0" w:type="dxa"/>
-              <w:left w:w="108" w:type="dxa"/>
-              <w:bottom w:w="0" w:type="dxa"/>
-              <w:right w:w="108" w:type="dxa"/>
-            </w:tcMar>
             <w:vAlign w:val="center"/>
           </w:tcPr>
           <w:p>
@@ -1212,18 +1020,6 @@
         <w:tc>
           <w:tcPr>
             <w:tcW w:w="1126" w:type="pct"/>
-            <w:tcBorders>
-              <w:top w:val="single" w:sz="4" w:space="0" w:color="auto"/>
-              <w:left w:val="single" w:sz="4" w:space="0" w:color="auto"/>
-              <w:bottom w:val="single" w:sz="4" w:space="0" w:color="auto"/>
-              <w:right w:val="single" w:sz="4" w:space="0" w:color="auto"/>
-            </w:tcBorders>
-            <w:tcMar>
-              <w:top w:w="0" w:type="dxa"/>
-              <w:left w:w="108" w:type="dxa"/>
-              <w:bottom w:w="0" w:type="dxa"/>
-              <w:right w:w="108" w:type="dxa"/>
-            </w:tcMar>
           </w:tcPr>
           <w:p>
             <w:pPr>
@@ -1240,18 +1036,6 @@
         <w:tc>
           <w:tcPr>
             <w:tcW w:w="1024" w:type="pct"/>
-            <w:tcBorders>
-              <w:top w:val="single" w:sz="4" w:space="0" w:color="auto"/>
-              <w:left w:val="single" w:sz="4" w:space="0" w:color="auto"/>
-              <w:bottom w:val="single" w:sz="4" w:space="0" w:color="auto"/>
-              <w:right w:val="single" w:sz="4" w:space="0" w:color="auto"/>
-            </w:tcBorders>
-            <w:tcMar>
-              <w:top w:w="0" w:type="dxa"/>
-              <w:left w:w="108" w:type="dxa"/>
-              <w:bottom w:w="0" w:type="dxa"/>
-              <w:right w:w="108" w:type="dxa"/>
-            </w:tcMar>
           </w:tcPr>
           <w:p>
             <w:pPr>
@@ -1273,18 +1057,6 @@
         <w:tc>
           <w:tcPr>
             <w:tcW w:w="2850" w:type="pct"/>
-            <w:tcBorders>
-              <w:top w:val="single" w:sz="4" w:space="0" w:color="auto"/>
-              <w:left w:val="single" w:sz="4" w:space="0" w:color="auto"/>
-              <w:bottom w:val="single" w:sz="4" w:space="0" w:color="auto"/>
-              <w:right w:val="single" w:sz="4" w:space="0" w:color="auto"/>
-            </w:tcBorders>
-            <w:tcMar>
-              <w:top w:w="0" w:type="dxa"/>
-              <w:left w:w="108" w:type="dxa"/>
-              <w:bottom w:w="0" w:type="dxa"/>
-              <w:right w:w="108" w:type="dxa"/>
-            </w:tcMar>
             <w:vAlign w:val="center"/>
           </w:tcPr>
           <w:p>
@@ -1310,18 +1082,6 @@
         <w:tc>
           <w:tcPr>
             <w:tcW w:w="1126" w:type="pct"/>
-            <w:tcBorders>
-              <w:top w:val="single" w:sz="4" w:space="0" w:color="auto"/>
-              <w:left w:val="single" w:sz="4" w:space="0" w:color="auto"/>
-              <w:bottom w:val="single" w:sz="4" w:space="0" w:color="auto"/>
-              <w:right w:val="single" w:sz="4" w:space="0" w:color="auto"/>
-            </w:tcBorders>
-            <w:tcMar>
-              <w:top w:w="0" w:type="dxa"/>
-              <w:left w:w="108" w:type="dxa"/>
-              <w:bottom w:w="0" w:type="dxa"/>
-              <w:right w:w="108" w:type="dxa"/>
-            </w:tcMar>
             <w:vAlign w:val="center"/>
           </w:tcPr>
           <w:p>
@@ -1339,18 +1099,6 @@
         <w:tc>
           <w:tcPr>
             <w:tcW w:w="1024" w:type="pct"/>
-            <w:tcBorders>
-              <w:top w:val="single" w:sz="4" w:space="0" w:color="auto"/>
-              <w:left w:val="single" w:sz="4" w:space="0" w:color="auto"/>
-              <w:bottom w:val="single" w:sz="4" w:space="0" w:color="auto"/>
-              <w:right w:val="single" w:sz="4" w:space="0" w:color="auto"/>
-            </w:tcBorders>
-            <w:tcMar>
-              <w:top w:w="0" w:type="dxa"/>
-              <w:left w:w="108" w:type="dxa"/>
-              <w:bottom w:w="0" w:type="dxa"/>
-              <w:right w:w="108" w:type="dxa"/>
-            </w:tcMar>
             <w:vAlign w:val="center"/>
           </w:tcPr>
           <w:p>
@@ -1373,18 +1121,6 @@
         <w:tc>
           <w:tcPr>
             <w:tcW w:w="2850" w:type="pct"/>
-            <w:tcBorders>
-              <w:top w:val="single" w:sz="4" w:space="0" w:color="auto"/>
-              <w:left w:val="single" w:sz="4" w:space="0" w:color="auto"/>
-              <w:bottom w:val="single" w:sz="4" w:space="0" w:color="auto"/>
-              <w:right w:val="single" w:sz="4" w:space="0" w:color="auto"/>
-            </w:tcBorders>
-            <w:tcMar>
-              <w:top w:w="0" w:type="dxa"/>
-              <w:left w:w="108" w:type="dxa"/>
-              <w:bottom w:w="0" w:type="dxa"/>
-              <w:right w:w="108" w:type="dxa"/>
-            </w:tcMar>
             <w:vAlign w:val="center"/>
           </w:tcPr>
           <w:p>
@@ -1410,18 +1146,6 @@
         <w:tc>
           <w:tcPr>
             <w:tcW w:w="1126" w:type="pct"/>
-            <w:tcBorders>
-              <w:top w:val="single" w:sz="4" w:space="0" w:color="auto"/>
-              <w:left w:val="single" w:sz="4" w:space="0" w:color="auto"/>
-              <w:bottom w:val="single" w:sz="4" w:space="0" w:color="auto"/>
-              <w:right w:val="single" w:sz="4" w:space="0" w:color="auto"/>
-            </w:tcBorders>
-            <w:tcMar>
-              <w:top w:w="0" w:type="dxa"/>
-              <w:left w:w="108" w:type="dxa"/>
-              <w:bottom w:w="0" w:type="dxa"/>
-              <w:right w:w="108" w:type="dxa"/>
-            </w:tcMar>
             <w:vAlign w:val="center"/>
           </w:tcPr>
           <w:p>
@@ -1439,18 +1163,6 @@
         <w:tc>
           <w:tcPr>
             <w:tcW w:w="1024" w:type="pct"/>
-            <w:tcBorders>
-              <w:top w:val="single" w:sz="4" w:space="0" w:color="auto"/>
-              <w:left w:val="single" w:sz="4" w:space="0" w:color="auto"/>
-              <w:bottom w:val="single" w:sz="4" w:space="0" w:color="auto"/>
-              <w:right w:val="single" w:sz="4" w:space="0" w:color="auto"/>
-            </w:tcBorders>
-            <w:tcMar>
-              <w:top w:w="0" w:type="dxa"/>
-              <w:left w:w="108" w:type="dxa"/>
-              <w:bottom w:w="0" w:type="dxa"/>
-              <w:right w:w="108" w:type="dxa"/>
-            </w:tcMar>
             <w:vAlign w:val="center"/>
           </w:tcPr>
           <w:p>
@@ -1473,18 +1185,6 @@
         <w:tc>
           <w:tcPr>
             <w:tcW w:w="2850" w:type="pct"/>
-            <w:tcBorders>
-              <w:top w:val="single" w:sz="4" w:space="0" w:color="auto"/>
-              <w:left w:val="single" w:sz="4" w:space="0" w:color="auto"/>
-              <w:bottom w:val="single" w:sz="4" w:space="0" w:color="auto"/>
-              <w:right w:val="single" w:sz="4" w:space="0" w:color="auto"/>
-            </w:tcBorders>
-            <w:tcMar>
-              <w:top w:w="0" w:type="dxa"/>
-              <w:left w:w="108" w:type="dxa"/>
-              <w:bottom w:w="0" w:type="dxa"/>
-              <w:right w:w="108" w:type="dxa"/>
-            </w:tcMar>
             <w:vAlign w:val="center"/>
           </w:tcPr>
           <w:p>
@@ -1510,18 +1210,6 @@
         <w:tc>
           <w:tcPr>
             <w:tcW w:w="1126" w:type="pct"/>
-            <w:tcBorders>
-              <w:top w:val="single" w:sz="4" w:space="0" w:color="auto"/>
-              <w:left w:val="single" w:sz="4" w:space="0" w:color="auto"/>
-              <w:bottom w:val="single" w:sz="4" w:space="0" w:color="auto"/>
-              <w:right w:val="single" w:sz="4" w:space="0" w:color="auto"/>
-            </w:tcBorders>
-            <w:tcMar>
-              <w:top w:w="0" w:type="dxa"/>
-              <w:left w:w="108" w:type="dxa"/>
-              <w:bottom w:w="0" w:type="dxa"/>
-              <w:right w:w="108" w:type="dxa"/>
-            </w:tcMar>
           </w:tcPr>
           <w:p>
             <w:pPr>
@@ -1538,18 +1226,6 @@
         <w:tc>
           <w:tcPr>
             <w:tcW w:w="1024" w:type="pct"/>
-            <w:tcBorders>
-              <w:top w:val="single" w:sz="4" w:space="0" w:color="auto"/>
-              <w:left w:val="single" w:sz="4" w:space="0" w:color="auto"/>
-              <w:bottom w:val="single" w:sz="4" w:space="0" w:color="auto"/>
-              <w:right w:val="single" w:sz="4" w:space="0" w:color="auto"/>
-            </w:tcBorders>
-            <w:tcMar>
-              <w:top w:w="0" w:type="dxa"/>
-              <w:left w:w="108" w:type="dxa"/>
-              <w:bottom w:w="0" w:type="dxa"/>
-              <w:right w:w="108" w:type="dxa"/>
-            </w:tcMar>
           </w:tcPr>
           <w:p>
             <w:pPr>
@@ -1571,18 +1247,6 @@
         <w:tc>
           <w:tcPr>
             <w:tcW w:w="2850" w:type="pct"/>
-            <w:tcBorders>
-              <w:top w:val="single" w:sz="4" w:space="0" w:color="auto"/>
-              <w:left w:val="single" w:sz="4" w:space="0" w:color="auto"/>
-              <w:bottom w:val="single" w:sz="4" w:space="0" w:color="auto"/>
-              <w:right w:val="single" w:sz="4" w:space="0" w:color="auto"/>
-            </w:tcBorders>
-            <w:tcMar>
-              <w:top w:w="0" w:type="dxa"/>
-              <w:left w:w="108" w:type="dxa"/>
-              <w:bottom w:w="0" w:type="dxa"/>
-              <w:right w:w="108" w:type="dxa"/>
-            </w:tcMar>
             <w:vAlign w:val="center"/>
           </w:tcPr>
           <w:p>
@@ -1608,18 +1272,6 @@
         <w:tc>
           <w:tcPr>
             <w:tcW w:w="1126" w:type="pct"/>
-            <w:tcBorders>
-              <w:top w:val="single" w:sz="4" w:space="0" w:color="auto"/>
-              <w:left w:val="single" w:sz="4" w:space="0" w:color="auto"/>
-              <w:bottom w:val="single" w:sz="4" w:space="0" w:color="auto"/>
-              <w:right w:val="single" w:sz="4" w:space="0" w:color="auto"/>
-            </w:tcBorders>
-            <w:tcMar>
-              <w:top w:w="0" w:type="dxa"/>
-              <w:left w:w="108" w:type="dxa"/>
-              <w:bottom w:w="0" w:type="dxa"/>
-              <w:right w:w="108" w:type="dxa"/>
-            </w:tcMar>
           </w:tcPr>
           <w:p>
             <w:pPr>
@@ -1636,18 +1288,6 @@
         <w:tc>
           <w:tcPr>
             <w:tcW w:w="1024" w:type="pct"/>
-            <w:tcBorders>
-              <w:top w:val="single" w:sz="4" w:space="0" w:color="auto"/>
-              <w:left w:val="single" w:sz="4" w:space="0" w:color="auto"/>
-              <w:bottom w:val="single" w:sz="4" w:space="0" w:color="auto"/>
-              <w:right w:val="single" w:sz="4" w:space="0" w:color="auto"/>
-            </w:tcBorders>
-            <w:tcMar>
-              <w:top w:w="0" w:type="dxa"/>
-              <w:left w:w="108" w:type="dxa"/>
-              <w:bottom w:w="0" w:type="dxa"/>
-              <w:right w:w="108" w:type="dxa"/>
-            </w:tcMar>
           </w:tcPr>
           <w:p>
             <w:pPr>
@@ -1669,18 +1309,6 @@
         <w:tc>
           <w:tcPr>
             <w:tcW w:w="2850" w:type="pct"/>
-            <w:tcBorders>
-              <w:top w:val="single" w:sz="4" w:space="0" w:color="auto"/>
-              <w:left w:val="single" w:sz="4" w:space="0" w:color="auto"/>
-              <w:bottom w:val="single" w:sz="4" w:space="0" w:color="auto"/>
-              <w:right w:val="single" w:sz="4" w:space="0" w:color="auto"/>
-            </w:tcBorders>
-            <w:tcMar>
-              <w:top w:w="0" w:type="dxa"/>
-              <w:left w:w="108" w:type="dxa"/>
-              <w:bottom w:w="0" w:type="dxa"/>
-              <w:right w:w="108" w:type="dxa"/>
-            </w:tcMar>
             <w:vAlign w:val="center"/>
           </w:tcPr>
           <w:p>
@@ -1706,18 +1334,6 @@
         <w:tc>
           <w:tcPr>
             <w:tcW w:w="1126" w:type="pct"/>
-            <w:tcBorders>
-              <w:top w:val="single" w:sz="4" w:space="0" w:color="auto"/>
-              <w:left w:val="single" w:sz="4" w:space="0" w:color="auto"/>
-              <w:bottom w:val="single" w:sz="4" w:space="0" w:color="auto"/>
-              <w:right w:val="single" w:sz="4" w:space="0" w:color="auto"/>
-            </w:tcBorders>
-            <w:tcMar>
-              <w:top w:w="0" w:type="dxa"/>
-              <w:left w:w="108" w:type="dxa"/>
-              <w:bottom w:w="0" w:type="dxa"/>
-              <w:right w:w="108" w:type="dxa"/>
-            </w:tcMar>
           </w:tcPr>
           <w:p>
             <w:pPr>
@@ -1734,18 +1350,6 @@
         <w:tc>
           <w:tcPr>
             <w:tcW w:w="1024" w:type="pct"/>
-            <w:tcBorders>
-              <w:top w:val="single" w:sz="4" w:space="0" w:color="auto"/>
-              <w:left w:val="single" w:sz="4" w:space="0" w:color="auto"/>
-              <w:bottom w:val="single" w:sz="4" w:space="0" w:color="auto"/>
-              <w:right w:val="single" w:sz="4" w:space="0" w:color="auto"/>
-            </w:tcBorders>
-            <w:tcMar>
-              <w:top w:w="0" w:type="dxa"/>
-              <w:left w:w="108" w:type="dxa"/>
-              <w:bottom w:w="0" w:type="dxa"/>
-              <w:right w:w="108" w:type="dxa"/>
-            </w:tcMar>
           </w:tcPr>
           <w:p>
             <w:pPr>
@@ -1767,18 +1371,6 @@
         <w:tc>
           <w:tcPr>
             <w:tcW w:w="2850" w:type="pct"/>
-            <w:tcBorders>
-              <w:top w:val="single" w:sz="4" w:space="0" w:color="auto"/>
-              <w:left w:val="single" w:sz="4" w:space="0" w:color="auto"/>
-              <w:bottom w:val="single" w:sz="4" w:space="0" w:color="auto"/>
-              <w:right w:val="single" w:sz="4" w:space="0" w:color="auto"/>
-            </w:tcBorders>
-            <w:tcMar>
-              <w:top w:w="0" w:type="dxa"/>
-              <w:left w:w="108" w:type="dxa"/>
-              <w:bottom w:w="0" w:type="dxa"/>
-              <w:right w:w="108" w:type="dxa"/>
-            </w:tcMar>
             <w:vAlign w:val="center"/>
           </w:tcPr>
           <w:p>
@@ -1805,18 +1397,6 @@
         <w:tc>
           <w:tcPr>
             <w:tcW w:w="1126" w:type="pct"/>
-            <w:tcBorders>
-              <w:top w:val="single" w:sz="4" w:space="0" w:color="auto"/>
-              <w:left w:val="single" w:sz="4" w:space="0" w:color="auto"/>
-              <w:bottom w:val="single" w:sz="4" w:space="0" w:color="auto"/>
-              <w:right w:val="single" w:sz="4" w:space="0" w:color="auto"/>
-            </w:tcBorders>
-            <w:tcMar>
-              <w:top w:w="0" w:type="dxa"/>
-              <w:left w:w="108" w:type="dxa"/>
-              <w:bottom w:w="0" w:type="dxa"/>
-              <w:right w:w="108" w:type="dxa"/>
-            </w:tcMar>
           </w:tcPr>
           <w:p>
             <w:pPr>
@@ -1833,18 +1413,6 @@
         <w:tc>
           <w:tcPr>
             <w:tcW w:w="1024" w:type="pct"/>
-            <w:tcBorders>
-              <w:top w:val="single" w:sz="4" w:space="0" w:color="auto"/>
-              <w:left w:val="single" w:sz="4" w:space="0" w:color="auto"/>
-              <w:bottom w:val="single" w:sz="4" w:space="0" w:color="auto"/>
-              <w:right w:val="single" w:sz="4" w:space="0" w:color="auto"/>
-            </w:tcBorders>
-            <w:tcMar>
-              <w:top w:w="0" w:type="dxa"/>
-              <w:left w:w="108" w:type="dxa"/>
-              <w:bottom w:w="0" w:type="dxa"/>
-              <w:right w:w="108" w:type="dxa"/>
-            </w:tcMar>
           </w:tcPr>
           <w:p>
             <w:pPr>
@@ -1866,18 +1434,6 @@
         <w:tc>
           <w:tcPr>
             <w:tcW w:w="2850" w:type="pct"/>
-            <w:tcBorders>
-              <w:top w:val="single" w:sz="4" w:space="0" w:color="auto"/>
-              <w:left w:val="single" w:sz="4" w:space="0" w:color="auto"/>
-              <w:bottom w:val="single" w:sz="4" w:space="0" w:color="auto"/>
-              <w:right w:val="single" w:sz="4" w:space="0" w:color="auto"/>
-            </w:tcBorders>
-            <w:tcMar>
-              <w:top w:w="0" w:type="dxa"/>
-              <w:left w:w="108" w:type="dxa"/>
-              <w:bottom w:w="0" w:type="dxa"/>
-              <w:right w:w="108" w:type="dxa"/>
-            </w:tcMar>
             <w:vAlign w:val="center"/>
           </w:tcPr>
           <w:p>
@@ -1904,18 +1460,6 @@
         <w:tc>
           <w:tcPr>
             <w:tcW w:w="1126" w:type="pct"/>
-            <w:tcBorders>
-              <w:top w:val="single" w:sz="4" w:space="0" w:color="auto"/>
-              <w:left w:val="single" w:sz="4" w:space="0" w:color="auto"/>
-              <w:bottom w:val="single" w:sz="4" w:space="0" w:color="auto"/>
-              <w:right w:val="single" w:sz="4" w:space="0" w:color="auto"/>
-            </w:tcBorders>
-            <w:tcMar>
-              <w:top w:w="0" w:type="dxa"/>
-              <w:left w:w="108" w:type="dxa"/>
-              <w:bottom w:w="0" w:type="dxa"/>
-              <w:right w:w="108" w:type="dxa"/>
-            </w:tcMar>
           </w:tcPr>
           <w:p>
             <w:pPr>
@@ -1932,18 +1476,6 @@
         <w:tc>
           <w:tcPr>
             <w:tcW w:w="1024" w:type="pct"/>
-            <w:tcBorders>
-              <w:top w:val="single" w:sz="4" w:space="0" w:color="auto"/>
-              <w:left w:val="single" w:sz="4" w:space="0" w:color="auto"/>
-              <w:bottom w:val="single" w:sz="4" w:space="0" w:color="auto"/>
-              <w:right w:val="single" w:sz="4" w:space="0" w:color="auto"/>
-            </w:tcBorders>
-            <w:tcMar>
-              <w:top w:w="0" w:type="dxa"/>
-              <w:left w:w="108" w:type="dxa"/>
-              <w:bottom w:w="0" w:type="dxa"/>
-              <w:right w:w="108" w:type="dxa"/>
-            </w:tcMar>
           </w:tcPr>
           <w:p>
             <w:pPr>
@@ -1965,18 +1497,6 @@
         <w:tc>
           <w:tcPr>
             <w:tcW w:w="2850" w:type="pct"/>
-            <w:tcBorders>
-              <w:top w:val="single" w:sz="4" w:space="0" w:color="auto"/>
-              <w:left w:val="single" w:sz="4" w:space="0" w:color="auto"/>
-              <w:bottom w:val="single" w:sz="4" w:space="0" w:color="auto"/>
-              <w:right w:val="single" w:sz="4" w:space="0" w:color="auto"/>
-            </w:tcBorders>
-            <w:tcMar>
-              <w:top w:w="0" w:type="dxa"/>
-              <w:left w:w="108" w:type="dxa"/>
-              <w:bottom w:w="0" w:type="dxa"/>
-              <w:right w:w="108" w:type="dxa"/>
-            </w:tcMar>
             <w:vAlign w:val="center"/>
           </w:tcPr>
           <w:p>
@@ -2003,18 +1523,6 @@
         <w:tc>
           <w:tcPr>
             <w:tcW w:w="1126" w:type="pct"/>
-            <w:tcBorders>
-              <w:top w:val="single" w:sz="4" w:space="0" w:color="auto"/>
-              <w:left w:val="single" w:sz="4" w:space="0" w:color="auto"/>
-              <w:bottom w:val="single" w:sz="4" w:space="0" w:color="auto"/>
-              <w:right w:val="single" w:sz="4" w:space="0" w:color="auto"/>
-            </w:tcBorders>
-            <w:tcMar>
-              <w:top w:w="0" w:type="dxa"/>
-              <w:left w:w="108" w:type="dxa"/>
-              <w:bottom w:w="0" w:type="dxa"/>
-              <w:right w:w="108" w:type="dxa"/>
-            </w:tcMar>
           </w:tcPr>
           <w:p>
             <w:pPr>
@@ -2031,18 +1539,6 @@
         <w:tc>
           <w:tcPr>
             <w:tcW w:w="1024" w:type="pct"/>
-            <w:tcBorders>
-              <w:top w:val="single" w:sz="4" w:space="0" w:color="auto"/>
-              <w:left w:val="single" w:sz="4" w:space="0" w:color="auto"/>
-              <w:bottom w:val="single" w:sz="4" w:space="0" w:color="auto"/>
-              <w:right w:val="single" w:sz="4" w:space="0" w:color="auto"/>
-            </w:tcBorders>
-            <w:tcMar>
-              <w:top w:w="0" w:type="dxa"/>
-              <w:left w:w="108" w:type="dxa"/>
-              <w:bottom w:w="0" w:type="dxa"/>
-              <w:right w:w="108" w:type="dxa"/>
-            </w:tcMar>
           </w:tcPr>
           <w:p>
             <w:pPr>
@@ -2064,18 +1560,6 @@
         <w:tc>
           <w:tcPr>
             <w:tcW w:w="2850" w:type="pct"/>
-            <w:tcBorders>
-              <w:top w:val="single" w:sz="4" w:space="0" w:color="auto"/>
-              <w:left w:val="single" w:sz="4" w:space="0" w:color="auto"/>
-              <w:bottom w:val="single" w:sz="4" w:space="0" w:color="auto"/>
-              <w:right w:val="single" w:sz="4" w:space="0" w:color="auto"/>
-            </w:tcBorders>
-            <w:tcMar>
-              <w:top w:w="0" w:type="dxa"/>
-              <w:left w:w="108" w:type="dxa"/>
-              <w:bottom w:w="0" w:type="dxa"/>
-              <w:right w:w="108" w:type="dxa"/>
-            </w:tcMar>
             <w:vAlign w:val="center"/>
           </w:tcPr>
           <w:p>
@@ -2102,18 +1586,6 @@
         <w:tc>
           <w:tcPr>
             <w:tcW w:w="1126" w:type="pct"/>
-            <w:tcBorders>
-              <w:top w:val="single" w:sz="4" w:space="0" w:color="auto"/>
-              <w:left w:val="single" w:sz="4" w:space="0" w:color="auto"/>
-              <w:bottom w:val="single" w:sz="4" w:space="0" w:color="auto"/>
-              <w:right w:val="single" w:sz="4" w:space="0" w:color="auto"/>
-            </w:tcBorders>
-            <w:tcMar>
-              <w:top w:w="0" w:type="dxa"/>
-              <w:left w:w="108" w:type="dxa"/>
-              <w:bottom w:w="0" w:type="dxa"/>
-              <w:right w:w="108" w:type="dxa"/>
-            </w:tcMar>
           </w:tcPr>
           <w:p>
             <w:pPr>
@@ -2130,18 +1602,6 @@
         <w:tc>
           <w:tcPr>
             <w:tcW w:w="1024" w:type="pct"/>
-            <w:tcBorders>
-              <w:top w:val="single" w:sz="4" w:space="0" w:color="auto"/>
-              <w:left w:val="single" w:sz="4" w:space="0" w:color="auto"/>
-              <w:bottom w:val="single" w:sz="4" w:space="0" w:color="auto"/>
-              <w:right w:val="single" w:sz="4" w:space="0" w:color="auto"/>
-            </w:tcBorders>
-            <w:tcMar>
-              <w:top w:w="0" w:type="dxa"/>
-              <w:left w:w="108" w:type="dxa"/>
-              <w:bottom w:w="0" w:type="dxa"/>
-              <w:right w:w="108" w:type="dxa"/>
-            </w:tcMar>
           </w:tcPr>
           <w:p>
             <w:pPr>
@@ -2163,18 +1623,6 @@
         <w:tc>
           <w:tcPr>
             <w:tcW w:w="2850" w:type="pct"/>
-            <w:tcBorders>
-              <w:top w:val="single" w:sz="4" w:space="0" w:color="auto"/>
-              <w:left w:val="single" w:sz="4" w:space="0" w:color="auto"/>
-              <w:bottom w:val="single" w:sz="4" w:space="0" w:color="auto"/>
-              <w:right w:val="single" w:sz="4" w:space="0" w:color="auto"/>
-            </w:tcBorders>
-            <w:tcMar>
-              <w:top w:w="0" w:type="dxa"/>
-              <w:left w:w="108" w:type="dxa"/>
-              <w:bottom w:w="0" w:type="dxa"/>
-              <w:right w:w="108" w:type="dxa"/>
-            </w:tcMar>
             <w:vAlign w:val="center"/>
           </w:tcPr>
           <w:p>
@@ -2201,18 +1649,6 @@
         <w:tc>
           <w:tcPr>
             <w:tcW w:w="1126" w:type="pct"/>
-            <w:tcBorders>
-              <w:top w:val="single" w:sz="4" w:space="0" w:color="auto"/>
-              <w:left w:val="single" w:sz="4" w:space="0" w:color="auto"/>
-              <w:bottom w:val="single" w:sz="4" w:space="0" w:color="auto"/>
-              <w:right w:val="single" w:sz="4" w:space="0" w:color="auto"/>
-            </w:tcBorders>
-            <w:tcMar>
-              <w:top w:w="0" w:type="dxa"/>
-              <w:left w:w="108" w:type="dxa"/>
-              <w:bottom w:w="0" w:type="dxa"/>
-              <w:right w:w="108" w:type="dxa"/>
-            </w:tcMar>
           </w:tcPr>
           <w:p>
             <w:pPr>
@@ -2229,18 +1665,6 @@
         <w:tc>
           <w:tcPr>
             <w:tcW w:w="1024" w:type="pct"/>
-            <w:tcBorders>
-              <w:top w:val="single" w:sz="4" w:space="0" w:color="auto"/>
-              <w:left w:val="single" w:sz="4" w:space="0" w:color="auto"/>
-              <w:bottom w:val="single" w:sz="4" w:space="0" w:color="auto"/>
-              <w:right w:val="single" w:sz="4" w:space="0" w:color="auto"/>
-            </w:tcBorders>
-            <w:tcMar>
-              <w:top w:w="0" w:type="dxa"/>
-              <w:left w:w="108" w:type="dxa"/>
-              <w:bottom w:w="0" w:type="dxa"/>
-              <w:right w:w="108" w:type="dxa"/>
-            </w:tcMar>
           </w:tcPr>
           <w:p>
             <w:pPr>
@@ -2262,18 +1686,6 @@
         <w:tc>
           <w:tcPr>
             <w:tcW w:w="2850" w:type="pct"/>
-            <w:tcBorders>
-              <w:top w:val="single" w:sz="4" w:space="0" w:color="auto"/>
-              <w:left w:val="single" w:sz="4" w:space="0" w:color="auto"/>
-              <w:bottom w:val="single" w:sz="4" w:space="0" w:color="auto"/>
-              <w:right w:val="single" w:sz="4" w:space="0" w:color="auto"/>
-            </w:tcBorders>
-            <w:tcMar>
-              <w:top w:w="0" w:type="dxa"/>
-              <w:left w:w="108" w:type="dxa"/>
-              <w:bottom w:w="0" w:type="dxa"/>
-              <w:right w:w="108" w:type="dxa"/>
-            </w:tcMar>
             <w:vAlign w:val="center"/>
           </w:tcPr>
           <w:p>
@@ -2300,18 +1712,6 @@
         <w:tc>
           <w:tcPr>
             <w:tcW w:w="1126" w:type="pct"/>
-            <w:tcBorders>
-              <w:top w:val="single" w:sz="4" w:space="0" w:color="auto"/>
-              <w:left w:val="single" w:sz="4" w:space="0" w:color="auto"/>
-              <w:bottom w:val="single" w:sz="4" w:space="0" w:color="auto"/>
-              <w:right w:val="single" w:sz="4" w:space="0" w:color="auto"/>
-            </w:tcBorders>
-            <w:tcMar>
-              <w:top w:w="0" w:type="dxa"/>
-              <w:left w:w="108" w:type="dxa"/>
-              <w:bottom w:w="0" w:type="dxa"/>
-              <w:right w:w="108" w:type="dxa"/>
-            </w:tcMar>
           </w:tcPr>
           <w:p>
             <w:pPr>
@@ -2328,18 +1728,6 @@
         <w:tc>
           <w:tcPr>
             <w:tcW w:w="1024" w:type="pct"/>
-            <w:tcBorders>
-              <w:top w:val="single" w:sz="4" w:space="0" w:color="auto"/>
-              <w:left w:val="single" w:sz="4" w:space="0" w:color="auto"/>
-              <w:bottom w:val="single" w:sz="4" w:space="0" w:color="auto"/>
-              <w:right w:val="single" w:sz="4" w:space="0" w:color="auto"/>
-            </w:tcBorders>
-            <w:tcMar>
-              <w:top w:w="0" w:type="dxa"/>
-              <w:left w:w="108" w:type="dxa"/>
-              <w:bottom w:w="0" w:type="dxa"/>
-              <w:right w:w="108" w:type="dxa"/>
-            </w:tcMar>
           </w:tcPr>
           <w:p>
             <w:pPr>
@@ -2361,18 +1749,6 @@
         <w:tc>
           <w:tcPr>
             <w:tcW w:w="2850" w:type="pct"/>
-            <w:tcBorders>
-              <w:top w:val="single" w:sz="4" w:space="0" w:color="auto"/>
-              <w:left w:val="single" w:sz="4" w:space="0" w:color="auto"/>
-              <w:bottom w:val="single" w:sz="4" w:space="0" w:color="auto"/>
-              <w:right w:val="single" w:sz="4" w:space="0" w:color="auto"/>
-            </w:tcBorders>
-            <w:tcMar>
-              <w:top w:w="0" w:type="dxa"/>
-              <w:left w:w="108" w:type="dxa"/>
-              <w:bottom w:w="0" w:type="dxa"/>
-              <w:right w:w="108" w:type="dxa"/>
-            </w:tcMar>
             <w:vAlign w:val="center"/>
           </w:tcPr>
           <w:p>
@@ -2399,18 +1775,6 @@
         <w:tc>
           <w:tcPr>
             <w:tcW w:w="1126" w:type="pct"/>
-            <w:tcBorders>
-              <w:top w:val="single" w:sz="4" w:space="0" w:color="auto"/>
-              <w:left w:val="single" w:sz="4" w:space="0" w:color="auto"/>
-              <w:bottom w:val="single" w:sz="4" w:space="0" w:color="auto"/>
-              <w:right w:val="single" w:sz="4" w:space="0" w:color="auto"/>
-            </w:tcBorders>
-            <w:tcMar>
-              <w:top w:w="0" w:type="dxa"/>
-              <w:left w:w="108" w:type="dxa"/>
-              <w:bottom w:w="0" w:type="dxa"/>
-              <w:right w:w="108" w:type="dxa"/>
-            </w:tcMar>
           </w:tcPr>
           <w:p>
             <w:pPr>
@@ -2427,18 +1791,6 @@
         <w:tc>
           <w:tcPr>
             <w:tcW w:w="1024" w:type="pct"/>
-            <w:tcBorders>
-              <w:top w:val="single" w:sz="4" w:space="0" w:color="auto"/>
-              <w:left w:val="single" w:sz="4" w:space="0" w:color="auto"/>
-              <w:bottom w:val="single" w:sz="4" w:space="0" w:color="auto"/>
-              <w:right w:val="single" w:sz="4" w:space="0" w:color="auto"/>
-            </w:tcBorders>
-            <w:tcMar>
-              <w:top w:w="0" w:type="dxa"/>
-              <w:left w:w="108" w:type="dxa"/>
-              <w:bottom w:w="0" w:type="dxa"/>
-              <w:right w:w="108" w:type="dxa"/>
-            </w:tcMar>
           </w:tcPr>
           <w:p>
             <w:pPr>
@@ -2460,18 +1812,6 @@
         <w:tc>
           <w:tcPr>
             <w:tcW w:w="2850" w:type="pct"/>
-            <w:tcBorders>
-              <w:top w:val="single" w:sz="4" w:space="0" w:color="auto"/>
-              <w:left w:val="single" w:sz="4" w:space="0" w:color="auto"/>
-              <w:bottom w:val="single" w:sz="4" w:space="0" w:color="auto"/>
-              <w:right w:val="single" w:sz="4" w:space="0" w:color="auto"/>
-            </w:tcBorders>
-            <w:tcMar>
-              <w:top w:w="0" w:type="dxa"/>
-              <w:left w:w="108" w:type="dxa"/>
-              <w:bottom w:w="0" w:type="dxa"/>
-              <w:right w:w="108" w:type="dxa"/>
-            </w:tcMar>
             <w:vAlign w:val="center"/>
           </w:tcPr>
           <w:p>
@@ -2498,18 +1838,6 @@
         <w:tc>
           <w:tcPr>
             <w:tcW w:w="1126" w:type="pct"/>
-            <w:tcBorders>
-              <w:top w:val="single" w:sz="4" w:space="0" w:color="auto"/>
-              <w:left w:val="single" w:sz="4" w:space="0" w:color="auto"/>
-              <w:bottom w:val="single" w:sz="4" w:space="0" w:color="auto"/>
-              <w:right w:val="single" w:sz="4" w:space="0" w:color="auto"/>
-            </w:tcBorders>
-            <w:tcMar>
-              <w:top w:w="0" w:type="dxa"/>
-              <w:left w:w="108" w:type="dxa"/>
-              <w:bottom w:w="0" w:type="dxa"/>
-              <w:right w:w="108" w:type="dxa"/>
-            </w:tcMar>
           </w:tcPr>
           <w:p>
             <w:pPr>
@@ -2526,18 +1854,6 @@
         <w:tc>
           <w:tcPr>
             <w:tcW w:w="1024" w:type="pct"/>
-            <w:tcBorders>
-              <w:top w:val="single" w:sz="4" w:space="0" w:color="auto"/>
-              <w:left w:val="single" w:sz="4" w:space="0" w:color="auto"/>
-              <w:bottom w:val="single" w:sz="4" w:space="0" w:color="auto"/>
-              <w:right w:val="single" w:sz="4" w:space="0" w:color="auto"/>
-            </w:tcBorders>
-            <w:tcMar>
-              <w:top w:w="0" w:type="dxa"/>
-              <w:left w:w="108" w:type="dxa"/>
-              <w:bottom w:w="0" w:type="dxa"/>
-              <w:right w:w="108" w:type="dxa"/>
-            </w:tcMar>
           </w:tcPr>
           <w:p>
             <w:pPr>
@@ -2559,18 +1875,6 @@
         <w:tc>
           <w:tcPr>
             <w:tcW w:w="2850" w:type="pct"/>
-            <w:tcBorders>
-              <w:top w:val="single" w:sz="4" w:space="0" w:color="auto"/>
-              <w:left w:val="single" w:sz="4" w:space="0" w:color="auto"/>
-              <w:bottom w:val="single" w:sz="4" w:space="0" w:color="auto"/>
-              <w:right w:val="single" w:sz="4" w:space="0" w:color="auto"/>
-            </w:tcBorders>
-            <w:tcMar>
-              <w:top w:w="0" w:type="dxa"/>
-              <w:left w:w="108" w:type="dxa"/>
-              <w:bottom w:w="0" w:type="dxa"/>
-              <w:right w:w="108" w:type="dxa"/>
-            </w:tcMar>
             <w:vAlign w:val="center"/>
           </w:tcPr>
           <w:p>
@@ -2597,18 +1901,6 @@
         <w:tc>
           <w:tcPr>
             <w:tcW w:w="1126" w:type="pct"/>
-            <w:tcBorders>
-              <w:top w:val="single" w:sz="4" w:space="0" w:color="auto"/>
-              <w:left w:val="single" w:sz="4" w:space="0" w:color="auto"/>
-              <w:bottom w:val="single" w:sz="4" w:space="0" w:color="auto"/>
-              <w:right w:val="single" w:sz="4" w:space="0" w:color="auto"/>
-            </w:tcBorders>
-            <w:tcMar>
-              <w:top w:w="0" w:type="dxa"/>
-              <w:left w:w="108" w:type="dxa"/>
-              <w:bottom w:w="0" w:type="dxa"/>
-              <w:right w:w="108" w:type="dxa"/>
-            </w:tcMar>
           </w:tcPr>
           <w:p>
             <w:pPr>
@@ -2625,18 +1917,6 @@
         <w:tc>
           <w:tcPr>
             <w:tcW w:w="1024" w:type="pct"/>
-            <w:tcBorders>
-              <w:top w:val="single" w:sz="4" w:space="0" w:color="auto"/>
-              <w:left w:val="single" w:sz="4" w:space="0" w:color="auto"/>
-              <w:bottom w:val="single" w:sz="4" w:space="0" w:color="auto"/>
-              <w:right w:val="single" w:sz="4" w:space="0" w:color="auto"/>
-            </w:tcBorders>
-            <w:tcMar>
-              <w:top w:w="0" w:type="dxa"/>
-              <w:left w:w="108" w:type="dxa"/>
-              <w:bottom w:w="0" w:type="dxa"/>
-              <w:right w:w="108" w:type="dxa"/>
-            </w:tcMar>
           </w:tcPr>
           <w:p>
             <w:pPr>
@@ -2658,18 +1938,6 @@
         <w:tc>
           <w:tcPr>
             <w:tcW w:w="2850" w:type="pct"/>
-            <w:tcBorders>
-              <w:top w:val="single" w:sz="4" w:space="0" w:color="auto"/>
-              <w:left w:val="single" w:sz="4" w:space="0" w:color="auto"/>
-              <w:bottom w:val="single" w:sz="4" w:space="0" w:color="auto"/>
-              <w:right w:val="single" w:sz="4" w:space="0" w:color="auto"/>
-            </w:tcBorders>
-            <w:tcMar>
-              <w:top w:w="0" w:type="dxa"/>
-              <w:left w:w="108" w:type="dxa"/>
-              <w:bottom w:w="0" w:type="dxa"/>
-              <w:right w:w="108" w:type="dxa"/>
-            </w:tcMar>
             <w:vAlign w:val="center"/>
           </w:tcPr>
           <w:p>
@@ -2696,18 +1964,6 @@
         <w:tc>
           <w:tcPr>
             <w:tcW w:w="1126" w:type="pct"/>
-            <w:tcBorders>
-              <w:top w:val="single" w:sz="4" w:space="0" w:color="auto"/>
-              <w:left w:val="single" w:sz="4" w:space="0" w:color="auto"/>
-              <w:bottom w:val="single" w:sz="4" w:space="0" w:color="auto"/>
-              <w:right w:val="single" w:sz="4" w:space="0" w:color="auto"/>
-            </w:tcBorders>
-            <w:tcMar>
-              <w:top w:w="0" w:type="dxa"/>
-              <w:left w:w="108" w:type="dxa"/>
-              <w:bottom w:w="0" w:type="dxa"/>
-              <w:right w:w="108" w:type="dxa"/>
-            </w:tcMar>
           </w:tcPr>
           <w:p>
             <w:pPr>
@@ -2724,18 +1980,6 @@
         <w:tc>
           <w:tcPr>
             <w:tcW w:w="1024" w:type="pct"/>
-            <w:tcBorders>
-              <w:top w:val="single" w:sz="4" w:space="0" w:color="auto"/>
-              <w:left w:val="single" w:sz="4" w:space="0" w:color="auto"/>
-              <w:bottom w:val="single" w:sz="4" w:space="0" w:color="auto"/>
-              <w:right w:val="single" w:sz="4" w:space="0" w:color="auto"/>
-            </w:tcBorders>
-            <w:tcMar>
-              <w:top w:w="0" w:type="dxa"/>
-              <w:left w:w="108" w:type="dxa"/>
-              <w:bottom w:w="0" w:type="dxa"/>
-              <w:right w:w="108" w:type="dxa"/>
-            </w:tcMar>
           </w:tcPr>
           <w:p>
             <w:pPr>
@@ -2757,18 +2001,6 @@
         <w:tc>
           <w:tcPr>
             <w:tcW w:w="2850" w:type="pct"/>
-            <w:tcBorders>
-              <w:top w:val="single" w:sz="4" w:space="0" w:color="auto"/>
-              <w:left w:val="single" w:sz="4" w:space="0" w:color="auto"/>
-              <w:bottom w:val="single" w:sz="4" w:space="0" w:color="auto"/>
-              <w:right w:val="single" w:sz="4" w:space="0" w:color="auto"/>
-            </w:tcBorders>
-            <w:tcMar>
-              <w:top w:w="0" w:type="dxa"/>
-              <w:left w:w="108" w:type="dxa"/>
-              <w:bottom w:w="0" w:type="dxa"/>
-              <w:right w:w="108" w:type="dxa"/>
-            </w:tcMar>
             <w:vAlign w:val="center"/>
           </w:tcPr>
           <w:p>
@@ -2795,18 +2027,6 @@
         <w:tc>
           <w:tcPr>
             <w:tcW w:w="1126" w:type="pct"/>
-            <w:tcBorders>
-              <w:top w:val="single" w:sz="4" w:space="0" w:color="auto"/>
-              <w:left w:val="single" w:sz="4" w:space="0" w:color="auto"/>
-              <w:bottom w:val="single" w:sz="4" w:space="0" w:color="auto"/>
-              <w:right w:val="single" w:sz="4" w:space="0" w:color="auto"/>
-            </w:tcBorders>
-            <w:tcMar>
-              <w:top w:w="0" w:type="dxa"/>
-              <w:left w:w="108" w:type="dxa"/>
-              <w:bottom w:w="0" w:type="dxa"/>
-              <w:right w:w="108" w:type="dxa"/>
-            </w:tcMar>
           </w:tcPr>
           <w:p>
             <w:pPr>
@@ -2823,18 +2043,6 @@
         <w:tc>
           <w:tcPr>
             <w:tcW w:w="1024" w:type="pct"/>
-            <w:tcBorders>
-              <w:top w:val="single" w:sz="4" w:space="0" w:color="auto"/>
-              <w:left w:val="single" w:sz="4" w:space="0" w:color="auto"/>
-              <w:bottom w:val="single" w:sz="4" w:space="0" w:color="auto"/>
-              <w:right w:val="single" w:sz="4" w:space="0" w:color="auto"/>
-            </w:tcBorders>
-            <w:tcMar>
-              <w:top w:w="0" w:type="dxa"/>
-              <w:left w:w="108" w:type="dxa"/>
-              <w:bottom w:w="0" w:type="dxa"/>
-              <w:right w:w="108" w:type="dxa"/>
-            </w:tcMar>
           </w:tcPr>
           <w:p>
             <w:pPr>
@@ -2856,18 +2064,6 @@
         <w:tc>
           <w:tcPr>
             <w:tcW w:w="2850" w:type="pct"/>
-            <w:tcBorders>
-              <w:top w:val="single" w:sz="4" w:space="0" w:color="auto"/>
-              <w:left w:val="single" w:sz="4" w:space="0" w:color="auto"/>
-              <w:bottom w:val="single" w:sz="4" w:space="0" w:color="auto"/>
-              <w:right w:val="single" w:sz="4" w:space="0" w:color="auto"/>
-            </w:tcBorders>
-            <w:tcMar>
-              <w:top w:w="0" w:type="dxa"/>
-              <w:left w:w="108" w:type="dxa"/>
-              <w:bottom w:w="0" w:type="dxa"/>
-              <w:right w:w="108" w:type="dxa"/>
-            </w:tcMar>
             <w:vAlign w:val="center"/>
           </w:tcPr>
           <w:p>
@@ -2894,18 +2090,6 @@
         <w:tc>
           <w:tcPr>
             <w:tcW w:w="1126" w:type="pct"/>
-            <w:tcBorders>
-              <w:top w:val="single" w:sz="4" w:space="0" w:color="auto"/>
-              <w:left w:val="single" w:sz="4" w:space="0" w:color="auto"/>
-              <w:bottom w:val="single" w:sz="4" w:space="0" w:color="auto"/>
-              <w:right w:val="single" w:sz="4" w:space="0" w:color="auto"/>
-            </w:tcBorders>
-            <w:tcMar>
-              <w:top w:w="0" w:type="dxa"/>
-              <w:left w:w="108" w:type="dxa"/>
-              <w:bottom w:w="0" w:type="dxa"/>
-              <w:right w:w="108" w:type="dxa"/>
-            </w:tcMar>
           </w:tcPr>
           <w:p>
             <w:pPr>
@@ -2922,18 +2106,6 @@
         <w:tc>
           <w:tcPr>
             <w:tcW w:w="1024" w:type="pct"/>
-            <w:tcBorders>
-              <w:top w:val="single" w:sz="4" w:space="0" w:color="auto"/>
-              <w:left w:val="single" w:sz="4" w:space="0" w:color="auto"/>
-              <w:bottom w:val="single" w:sz="4" w:space="0" w:color="auto"/>
-              <w:right w:val="single" w:sz="4" w:space="0" w:color="auto"/>
-            </w:tcBorders>
-            <w:tcMar>
-              <w:top w:w="0" w:type="dxa"/>
-              <w:left w:w="108" w:type="dxa"/>
-              <w:bottom w:w="0" w:type="dxa"/>
-              <w:right w:w="108" w:type="dxa"/>
-            </w:tcMar>
           </w:tcPr>
           <w:p>
             <w:pPr>
@@ -2955,18 +2127,6 @@
         <w:tc>
           <w:tcPr>
             <w:tcW w:w="2850" w:type="pct"/>
-            <w:tcBorders>
-              <w:top w:val="single" w:sz="4" w:space="0" w:color="auto"/>
-              <w:left w:val="single" w:sz="4" w:space="0" w:color="auto"/>
-              <w:bottom w:val="single" w:sz="4" w:space="0" w:color="auto"/>
-              <w:right w:val="single" w:sz="4" w:space="0" w:color="auto"/>
-            </w:tcBorders>
-            <w:tcMar>
-              <w:top w:w="0" w:type="dxa"/>
-              <w:left w:w="108" w:type="dxa"/>
-              <w:bottom w:w="0" w:type="dxa"/>
-              <w:right w:w="108" w:type="dxa"/>
-            </w:tcMar>
             <w:vAlign w:val="center"/>
           </w:tcPr>
           <w:p>
@@ -2993,18 +2153,6 @@
         <w:tc>
           <w:tcPr>
             <w:tcW w:w="1126" w:type="pct"/>
-            <w:tcBorders>
-              <w:top w:val="single" w:sz="4" w:space="0" w:color="auto"/>
-              <w:left w:val="single" w:sz="4" w:space="0" w:color="auto"/>
-              <w:bottom w:val="single" w:sz="4" w:space="0" w:color="auto"/>
-              <w:right w:val="single" w:sz="4" w:space="0" w:color="auto"/>
-            </w:tcBorders>
-            <w:tcMar>
-              <w:top w:w="0" w:type="dxa"/>
-              <w:left w:w="108" w:type="dxa"/>
-              <w:bottom w:w="0" w:type="dxa"/>
-              <w:right w:w="108" w:type="dxa"/>
-            </w:tcMar>
           </w:tcPr>
           <w:p>
             <w:pPr>
@@ -3021,18 +2169,6 @@
         <w:tc>
           <w:tcPr>
             <w:tcW w:w="1024" w:type="pct"/>
-            <w:tcBorders>
-              <w:top w:val="single" w:sz="4" w:space="0" w:color="auto"/>
-              <w:left w:val="single" w:sz="4" w:space="0" w:color="auto"/>
-              <w:bottom w:val="single" w:sz="4" w:space="0" w:color="auto"/>
-              <w:right w:val="single" w:sz="4" w:space="0" w:color="auto"/>
-            </w:tcBorders>
-            <w:tcMar>
-              <w:top w:w="0" w:type="dxa"/>
-              <w:left w:w="108" w:type="dxa"/>
-              <w:bottom w:w="0" w:type="dxa"/>
-              <w:right w:w="108" w:type="dxa"/>
-            </w:tcMar>
           </w:tcPr>
           <w:p>
             <w:pPr>
@@ -3054,18 +2190,6 @@
         <w:tc>
           <w:tcPr>
             <w:tcW w:w="2850" w:type="pct"/>
-            <w:tcBorders>
-              <w:top w:val="single" w:sz="4" w:space="0" w:color="auto"/>
-              <w:left w:val="single" w:sz="4" w:space="0" w:color="auto"/>
-              <w:bottom w:val="single" w:sz="4" w:space="0" w:color="auto"/>
-              <w:right w:val="single" w:sz="4" w:space="0" w:color="auto"/>
-            </w:tcBorders>
-            <w:tcMar>
-              <w:top w:w="0" w:type="dxa"/>
-              <w:left w:w="108" w:type="dxa"/>
-              <w:bottom w:w="0" w:type="dxa"/>
-              <w:right w:w="108" w:type="dxa"/>
-            </w:tcMar>
             <w:vAlign w:val="center"/>
           </w:tcPr>
           <w:p>
@@ -3092,18 +2216,6 @@
         <w:tc>
           <w:tcPr>
             <w:tcW w:w="1126" w:type="pct"/>
-            <w:tcBorders>
-              <w:top w:val="single" w:sz="4" w:space="0" w:color="auto"/>
-              <w:left w:val="single" w:sz="4" w:space="0" w:color="auto"/>
-              <w:bottom w:val="single" w:sz="4" w:space="0" w:color="auto"/>
-              <w:right w:val="single" w:sz="4" w:space="0" w:color="auto"/>
-            </w:tcBorders>
-            <w:tcMar>
-              <w:top w:w="0" w:type="dxa"/>
-              <w:left w:w="108" w:type="dxa"/>
-              <w:bottom w:w="0" w:type="dxa"/>
-              <w:right w:w="108" w:type="dxa"/>
-            </w:tcMar>
           </w:tcPr>
           <w:p>
             <w:pPr>
@@ -3120,18 +2232,6 @@
         <w:tc>
           <w:tcPr>
             <w:tcW w:w="1024" w:type="pct"/>
-            <w:tcBorders>
-              <w:top w:val="single" w:sz="4" w:space="0" w:color="auto"/>
-              <w:left w:val="single" w:sz="4" w:space="0" w:color="auto"/>
-              <w:bottom w:val="single" w:sz="4" w:space="0" w:color="auto"/>
-              <w:right w:val="single" w:sz="4" w:space="0" w:color="auto"/>
-            </w:tcBorders>
-            <w:tcMar>
-              <w:top w:w="0" w:type="dxa"/>
-              <w:left w:w="108" w:type="dxa"/>
-              <w:bottom w:w="0" w:type="dxa"/>
-              <w:right w:w="108" w:type="dxa"/>
-            </w:tcMar>
           </w:tcPr>
           <w:p>
             <w:pPr>
@@ -3153,18 +2253,6 @@
         <w:tc>
           <w:tcPr>
             <w:tcW w:w="2850" w:type="pct"/>
-            <w:tcBorders>
-              <w:top w:val="single" w:sz="4" w:space="0" w:color="auto"/>
-              <w:left w:val="single" w:sz="4" w:space="0" w:color="auto"/>
-              <w:bottom w:val="single" w:sz="4" w:space="0" w:color="auto"/>
-              <w:right w:val="single" w:sz="4" w:space="0" w:color="auto"/>
-            </w:tcBorders>
-            <w:tcMar>
-              <w:top w:w="0" w:type="dxa"/>
-              <w:left w:w="108" w:type="dxa"/>
-              <w:bottom w:w="0" w:type="dxa"/>
-              <w:right w:w="108" w:type="dxa"/>
-            </w:tcMar>
             <w:vAlign w:val="center"/>
           </w:tcPr>
           <w:p>
@@ -3191,18 +2279,6 @@
         <w:tc>
           <w:tcPr>
             <w:tcW w:w="1126" w:type="pct"/>
-            <w:tcBorders>
-              <w:top w:val="single" w:sz="4" w:space="0" w:color="auto"/>
-              <w:left w:val="single" w:sz="4" w:space="0" w:color="auto"/>
-              <w:bottom w:val="single" w:sz="4" w:space="0" w:color="auto"/>
-              <w:right w:val="single" w:sz="4" w:space="0" w:color="auto"/>
-            </w:tcBorders>
-            <w:tcMar>
-              <w:top w:w="0" w:type="dxa"/>
-              <w:left w:w="108" w:type="dxa"/>
-              <w:bottom w:w="0" w:type="dxa"/>
-              <w:right w:w="108" w:type="dxa"/>
-            </w:tcMar>
           </w:tcPr>
           <w:p>
             <w:pPr>
@@ -3219,18 +2295,6 @@
         <w:tc>
           <w:tcPr>
             <w:tcW w:w="1024" w:type="pct"/>
-            <w:tcBorders>
-              <w:top w:val="single" w:sz="4" w:space="0" w:color="auto"/>
-              <w:left w:val="single" w:sz="4" w:space="0" w:color="auto"/>
-              <w:bottom w:val="single" w:sz="4" w:space="0" w:color="auto"/>
-              <w:right w:val="single" w:sz="4" w:space="0" w:color="auto"/>
-            </w:tcBorders>
-            <w:tcMar>
-              <w:top w:w="0" w:type="dxa"/>
-              <w:left w:w="108" w:type="dxa"/>
-              <w:bottom w:w="0" w:type="dxa"/>
-              <w:right w:w="108" w:type="dxa"/>
-            </w:tcMar>
           </w:tcPr>
           <w:p>
             <w:pPr>
@@ -3252,18 +2316,6 @@
         <w:tc>
           <w:tcPr>
             <w:tcW w:w="2850" w:type="pct"/>
-            <w:tcBorders>
-              <w:top w:val="single" w:sz="4" w:space="0" w:color="auto"/>
-              <w:left w:val="single" w:sz="4" w:space="0" w:color="auto"/>
-              <w:bottom w:val="single" w:sz="4" w:space="0" w:color="auto"/>
-              <w:right w:val="single" w:sz="4" w:space="0" w:color="auto"/>
-            </w:tcBorders>
-            <w:tcMar>
-              <w:top w:w="0" w:type="dxa"/>
-              <w:left w:w="108" w:type="dxa"/>
-              <w:bottom w:w="0" w:type="dxa"/>
-              <w:right w:w="108" w:type="dxa"/>
-            </w:tcMar>
             <w:vAlign w:val="center"/>
           </w:tcPr>
           <w:p>
@@ -3290,18 +2342,6 @@
         <w:tc>
           <w:tcPr>
             <w:tcW w:w="1126" w:type="pct"/>
-            <w:tcBorders>
-              <w:top w:val="single" w:sz="4" w:space="0" w:color="auto"/>
-              <w:left w:val="single" w:sz="4" w:space="0" w:color="auto"/>
-              <w:bottom w:val="single" w:sz="4" w:space="0" w:color="auto"/>
-              <w:right w:val="single" w:sz="4" w:space="0" w:color="auto"/>
-            </w:tcBorders>
-            <w:tcMar>
-              <w:top w:w="0" w:type="dxa"/>
-              <w:left w:w="108" w:type="dxa"/>
-              <w:bottom w:w="0" w:type="dxa"/>
-              <w:right w:w="108" w:type="dxa"/>
-            </w:tcMar>
           </w:tcPr>
           <w:p>
             <w:pPr>
@@ -3318,18 +2358,6 @@
         <w:tc>
           <w:tcPr>
             <w:tcW w:w="1024" w:type="pct"/>
-            <w:tcBorders>
-              <w:top w:val="single" w:sz="4" w:space="0" w:color="auto"/>
-              <w:left w:val="single" w:sz="4" w:space="0" w:color="auto"/>
-              <w:bottom w:val="single" w:sz="4" w:space="0" w:color="auto"/>
-              <w:right w:val="single" w:sz="4" w:space="0" w:color="auto"/>
-            </w:tcBorders>
-            <w:tcMar>
-              <w:top w:w="0" w:type="dxa"/>
-              <w:left w:w="108" w:type="dxa"/>
-              <w:bottom w:w="0" w:type="dxa"/>
-              <w:right w:w="108" w:type="dxa"/>
-            </w:tcMar>
           </w:tcPr>
           <w:p>
             <w:pPr>
@@ -3351,18 +2379,6 @@
         <w:tc>
           <w:tcPr>
             <w:tcW w:w="2850" w:type="pct"/>
-            <w:tcBorders>
-              <w:top w:val="single" w:sz="4" w:space="0" w:color="auto"/>
-              <w:left w:val="single" w:sz="4" w:space="0" w:color="auto"/>
-              <w:bottom w:val="single" w:sz="4" w:space="0" w:color="auto"/>
-              <w:right w:val="single" w:sz="4" w:space="0" w:color="auto"/>
-            </w:tcBorders>
-            <w:tcMar>
-              <w:top w:w="0" w:type="dxa"/>
-              <w:left w:w="108" w:type="dxa"/>
-              <w:bottom w:w="0" w:type="dxa"/>
-              <w:right w:w="108" w:type="dxa"/>
-            </w:tcMar>
             <w:vAlign w:val="center"/>
           </w:tcPr>
           <w:p>
@@ -3389,18 +2405,6 @@
         <w:tc>
           <w:tcPr>
             <w:tcW w:w="1126" w:type="pct"/>
-            <w:tcBorders>
-              <w:top w:val="single" w:sz="4" w:space="0" w:color="auto"/>
-              <w:left w:val="single" w:sz="4" w:space="0" w:color="auto"/>
-              <w:bottom w:val="single" w:sz="4" w:space="0" w:color="auto"/>
-              <w:right w:val="single" w:sz="4" w:space="0" w:color="auto"/>
-            </w:tcBorders>
-            <w:tcMar>
-              <w:top w:w="0" w:type="dxa"/>
-              <w:left w:w="108" w:type="dxa"/>
-              <w:bottom w:w="0" w:type="dxa"/>
-              <w:right w:w="108" w:type="dxa"/>
-            </w:tcMar>
           </w:tcPr>
           <w:p>
             <w:pPr>
@@ -3417,18 +2421,6 @@
         <w:tc>
           <w:tcPr>
             <w:tcW w:w="1024" w:type="pct"/>
-            <w:tcBorders>
-              <w:top w:val="single" w:sz="4" w:space="0" w:color="auto"/>
-              <w:left w:val="single" w:sz="4" w:space="0" w:color="auto"/>
-              <w:bottom w:val="single" w:sz="4" w:space="0" w:color="auto"/>
-              <w:right w:val="single" w:sz="4" w:space="0" w:color="auto"/>
-            </w:tcBorders>
-            <w:tcMar>
-              <w:top w:w="0" w:type="dxa"/>
-              <w:left w:w="108" w:type="dxa"/>
-              <w:bottom w:w="0" w:type="dxa"/>
-              <w:right w:w="108" w:type="dxa"/>
-            </w:tcMar>
           </w:tcPr>
           <w:p>
             <w:pPr>
@@ -3450,18 +2442,6 @@
         <w:tc>
           <w:tcPr>
             <w:tcW w:w="2850" w:type="pct"/>
-            <w:tcBorders>
-              <w:top w:val="single" w:sz="4" w:space="0" w:color="auto"/>
-              <w:left w:val="single" w:sz="4" w:space="0" w:color="auto"/>
-              <w:bottom w:val="single" w:sz="4" w:space="0" w:color="auto"/>
-              <w:right w:val="single" w:sz="4" w:space="0" w:color="auto"/>
-            </w:tcBorders>
-            <w:tcMar>
-              <w:top w:w="0" w:type="dxa"/>
-              <w:left w:w="108" w:type="dxa"/>
-              <w:bottom w:w="0" w:type="dxa"/>
-              <w:right w:w="108" w:type="dxa"/>
-            </w:tcMar>
             <w:vAlign w:val="center"/>
           </w:tcPr>
           <w:p>
@@ -3488,18 +2468,6 @@
         <w:tc>
           <w:tcPr>
             <w:tcW w:w="1126" w:type="pct"/>
-            <w:tcBorders>
-              <w:top w:val="single" w:sz="4" w:space="0" w:color="auto"/>
-              <w:left w:val="single" w:sz="4" w:space="0" w:color="auto"/>
-              <w:bottom w:val="single" w:sz="4" w:space="0" w:color="auto"/>
-              <w:right w:val="single" w:sz="4" w:space="0" w:color="auto"/>
-            </w:tcBorders>
-            <w:tcMar>
-              <w:top w:w="0" w:type="dxa"/>
-              <w:left w:w="108" w:type="dxa"/>
-              <w:bottom w:w="0" w:type="dxa"/>
-              <w:right w:w="108" w:type="dxa"/>
-            </w:tcMar>
           </w:tcPr>
           <w:p>
             <w:pPr>
@@ -3516,18 +2484,6 @@
         <w:tc>
           <w:tcPr>
             <w:tcW w:w="1024" w:type="pct"/>
-            <w:tcBorders>
-              <w:top w:val="single" w:sz="4" w:space="0" w:color="auto"/>
-              <w:left w:val="single" w:sz="4" w:space="0" w:color="auto"/>
-              <w:bottom w:val="single" w:sz="4" w:space="0" w:color="auto"/>
-              <w:right w:val="single" w:sz="4" w:space="0" w:color="auto"/>
-            </w:tcBorders>
-            <w:tcMar>
-              <w:top w:w="0" w:type="dxa"/>
-              <w:left w:w="108" w:type="dxa"/>
-              <w:bottom w:w="0" w:type="dxa"/>
-              <w:right w:w="108" w:type="dxa"/>
-            </w:tcMar>
           </w:tcPr>
           <w:p>
             <w:pPr>
@@ -3549,18 +2505,6 @@
         <w:tc>
           <w:tcPr>
             <w:tcW w:w="2850" w:type="pct"/>
-            <w:tcBorders>
-              <w:top w:val="single" w:sz="4" w:space="0" w:color="auto"/>
-              <w:left w:val="single" w:sz="4" w:space="0" w:color="auto"/>
-              <w:bottom w:val="single" w:sz="4" w:space="0" w:color="auto"/>
-              <w:right w:val="single" w:sz="4" w:space="0" w:color="auto"/>
-            </w:tcBorders>
-            <w:tcMar>
-              <w:top w:w="0" w:type="dxa"/>
-              <w:left w:w="108" w:type="dxa"/>
-              <w:bottom w:w="0" w:type="dxa"/>
-              <w:right w:w="108" w:type="dxa"/>
-            </w:tcMar>
             <w:vAlign w:val="center"/>
           </w:tcPr>
           <w:p>
@@ -3587,18 +2531,6 @@
         <w:tc>
           <w:tcPr>
             <w:tcW w:w="1126" w:type="pct"/>
-            <w:tcBorders>
-              <w:top w:val="single" w:sz="4" w:space="0" w:color="auto"/>
-              <w:left w:val="single" w:sz="4" w:space="0" w:color="auto"/>
-              <w:bottom w:val="single" w:sz="4" w:space="0" w:color="auto"/>
-              <w:right w:val="single" w:sz="4" w:space="0" w:color="auto"/>
-            </w:tcBorders>
-            <w:tcMar>
-              <w:top w:w="0" w:type="dxa"/>
-              <w:left w:w="108" w:type="dxa"/>
-              <w:bottom w:w="0" w:type="dxa"/>
-              <w:right w:w="108" w:type="dxa"/>
-            </w:tcMar>
           </w:tcPr>
           <w:p>
             <w:pPr>
@@ -3615,18 +2547,6 @@
         <w:tc>
           <w:tcPr>
             <w:tcW w:w="1024" w:type="pct"/>
-            <w:tcBorders>
-              <w:top w:val="single" w:sz="4" w:space="0" w:color="auto"/>
-              <w:left w:val="single" w:sz="4" w:space="0" w:color="auto"/>
-              <w:bottom w:val="single" w:sz="4" w:space="0" w:color="auto"/>
-              <w:right w:val="single" w:sz="4" w:space="0" w:color="auto"/>
-            </w:tcBorders>
-            <w:tcMar>
-              <w:top w:w="0" w:type="dxa"/>
-              <w:left w:w="108" w:type="dxa"/>
-              <w:bottom w:w="0" w:type="dxa"/>
-              <w:right w:w="108" w:type="dxa"/>
-            </w:tcMar>
           </w:tcPr>
           <w:p>
             <w:pPr>
@@ -3648,18 +2568,6 @@
         <w:tc>
           <w:tcPr>
             <w:tcW w:w="2850" w:type="pct"/>
-            <w:tcBorders>
-              <w:top w:val="single" w:sz="4" w:space="0" w:color="auto"/>
-              <w:left w:val="single" w:sz="4" w:space="0" w:color="auto"/>
-              <w:bottom w:val="single" w:sz="4" w:space="0" w:color="auto"/>
-              <w:right w:val="single" w:sz="4" w:space="0" w:color="auto"/>
-            </w:tcBorders>
-            <w:tcMar>
-              <w:top w:w="0" w:type="dxa"/>
-              <w:left w:w="108" w:type="dxa"/>
-              <w:bottom w:w="0" w:type="dxa"/>
-              <w:right w:w="108" w:type="dxa"/>
-            </w:tcMar>
             <w:vAlign w:val="center"/>
           </w:tcPr>
           <w:p>
@@ -3686,18 +2594,6 @@
         <w:tc>
           <w:tcPr>
             <w:tcW w:w="1126" w:type="pct"/>
-            <w:tcBorders>
-              <w:top w:val="single" w:sz="4" w:space="0" w:color="auto"/>
-              <w:left w:val="single" w:sz="4" w:space="0" w:color="auto"/>
-              <w:bottom w:val="single" w:sz="4" w:space="0" w:color="auto"/>
-              <w:right w:val="single" w:sz="4" w:space="0" w:color="auto"/>
-            </w:tcBorders>
-            <w:tcMar>
-              <w:top w:w="0" w:type="dxa"/>
-              <w:left w:w="108" w:type="dxa"/>
-              <w:bottom w:w="0" w:type="dxa"/>
-              <w:right w:w="108" w:type="dxa"/>
-            </w:tcMar>
           </w:tcPr>
           <w:p>
             <w:pPr>
@@ -3714,18 +2610,6 @@
         <w:tc>
           <w:tcPr>
             <w:tcW w:w="1024" w:type="pct"/>
-            <w:tcBorders>
-              <w:top w:val="single" w:sz="4" w:space="0" w:color="auto"/>
-              <w:left w:val="single" w:sz="4" w:space="0" w:color="auto"/>
-              <w:bottom w:val="single" w:sz="4" w:space="0" w:color="auto"/>
-              <w:right w:val="single" w:sz="4" w:space="0" w:color="auto"/>
-            </w:tcBorders>
-            <w:tcMar>
-              <w:top w:w="0" w:type="dxa"/>
-              <w:left w:w="108" w:type="dxa"/>
-              <w:bottom w:w="0" w:type="dxa"/>
-              <w:right w:w="108" w:type="dxa"/>
-            </w:tcMar>
           </w:tcPr>
           <w:p>
             <w:pPr>
@@ -3747,18 +2631,6 @@
         <w:tc>
           <w:tcPr>
             <w:tcW w:w="2850" w:type="pct"/>
-            <w:tcBorders>
-              <w:top w:val="single" w:sz="4" w:space="0" w:color="auto"/>
-              <w:left w:val="single" w:sz="4" w:space="0" w:color="auto"/>
-              <w:bottom w:val="single" w:sz="4" w:space="0" w:color="auto"/>
-              <w:right w:val="single" w:sz="4" w:space="0" w:color="auto"/>
-            </w:tcBorders>
-            <w:tcMar>
-              <w:top w:w="0" w:type="dxa"/>
-              <w:left w:w="108" w:type="dxa"/>
-              <w:bottom w:w="0" w:type="dxa"/>
-              <w:right w:w="108" w:type="dxa"/>
-            </w:tcMar>
             <w:vAlign w:val="center"/>
           </w:tcPr>
           <w:p>
@@ -3785,18 +2657,6 @@
         <w:tc>
           <w:tcPr>
             <w:tcW w:w="1126" w:type="pct"/>
-            <w:tcBorders>
-              <w:top w:val="single" w:sz="4" w:space="0" w:color="auto"/>
-              <w:left w:val="single" w:sz="4" w:space="0" w:color="auto"/>
-              <w:bottom w:val="single" w:sz="4" w:space="0" w:color="auto"/>
-              <w:right w:val="single" w:sz="4" w:space="0" w:color="auto"/>
-            </w:tcBorders>
-            <w:tcMar>
-              <w:top w:w="0" w:type="dxa"/>
-              <w:left w:w="108" w:type="dxa"/>
-              <w:bottom w:w="0" w:type="dxa"/>
-              <w:right w:w="108" w:type="dxa"/>
-            </w:tcMar>
           </w:tcPr>
           <w:p>
             <w:pPr>
@@ -3813,18 +2673,6 @@
         <w:tc>
           <w:tcPr>
             <w:tcW w:w="1024" w:type="pct"/>
-            <w:tcBorders>
-              <w:top w:val="single" w:sz="4" w:space="0" w:color="auto"/>
-              <w:left w:val="single" w:sz="4" w:space="0" w:color="auto"/>
-              <w:bottom w:val="single" w:sz="4" w:space="0" w:color="auto"/>
-              <w:right w:val="single" w:sz="4" w:space="0" w:color="auto"/>
-            </w:tcBorders>
-            <w:tcMar>
-              <w:top w:w="0" w:type="dxa"/>
-              <w:left w:w="108" w:type="dxa"/>
-              <w:bottom w:w="0" w:type="dxa"/>
-              <w:right w:w="108" w:type="dxa"/>
-            </w:tcMar>
           </w:tcPr>
           <w:p>
             <w:pPr>
@@ -3846,18 +2694,6 @@
         <w:tc>
           <w:tcPr>
             <w:tcW w:w="2850" w:type="pct"/>
-            <w:tcBorders>
-              <w:top w:val="single" w:sz="4" w:space="0" w:color="auto"/>
-              <w:left w:val="single" w:sz="4" w:space="0" w:color="auto"/>
-              <w:bottom w:val="single" w:sz="4" w:space="0" w:color="auto"/>
-              <w:right w:val="single" w:sz="4" w:space="0" w:color="auto"/>
-            </w:tcBorders>
-            <w:tcMar>
-              <w:top w:w="0" w:type="dxa"/>
-              <w:left w:w="108" w:type="dxa"/>
-              <w:bottom w:w="0" w:type="dxa"/>
-              <w:right w:w="108" w:type="dxa"/>
-            </w:tcMar>
             <w:vAlign w:val="center"/>
           </w:tcPr>
           <w:p>
@@ -3884,18 +2720,6 @@
         <w:tc>
           <w:tcPr>
             <w:tcW w:w="1126" w:type="pct"/>
-            <w:tcBorders>
-              <w:top w:val="single" w:sz="4" w:space="0" w:color="auto"/>
-              <w:left w:val="single" w:sz="4" w:space="0" w:color="auto"/>
-              <w:bottom w:val="single" w:sz="4" w:space="0" w:color="auto"/>
-              <w:right w:val="single" w:sz="4" w:space="0" w:color="auto"/>
-            </w:tcBorders>
-            <w:tcMar>
-              <w:top w:w="0" w:type="dxa"/>
-              <w:left w:w="108" w:type="dxa"/>
-              <w:bottom w:w="0" w:type="dxa"/>
-              <w:right w:w="108" w:type="dxa"/>
-            </w:tcMar>
           </w:tcPr>
           <w:p>
             <w:pPr>
@@ -3912,18 +2736,6 @@
         <w:tc>
           <w:tcPr>
             <w:tcW w:w="1024" w:type="pct"/>
-            <w:tcBorders>
-              <w:top w:val="single" w:sz="4" w:space="0" w:color="auto"/>
-              <w:left w:val="single" w:sz="4" w:space="0" w:color="auto"/>
-              <w:bottom w:val="single" w:sz="4" w:space="0" w:color="auto"/>
-              <w:right w:val="single" w:sz="4" w:space="0" w:color="auto"/>
-            </w:tcBorders>
-            <w:tcMar>
-              <w:top w:w="0" w:type="dxa"/>
-              <w:left w:w="108" w:type="dxa"/>
-              <w:bottom w:w="0" w:type="dxa"/>
-              <w:right w:w="108" w:type="dxa"/>
-            </w:tcMar>
           </w:tcPr>
           <w:p>
             <w:pPr>
@@ -3945,18 +2757,6 @@
         <w:tc>
           <w:tcPr>
             <w:tcW w:w="2850" w:type="pct"/>
-            <w:tcBorders>
-              <w:top w:val="single" w:sz="4" w:space="0" w:color="auto"/>
-              <w:left w:val="single" w:sz="4" w:space="0" w:color="auto"/>
-              <w:bottom w:val="single" w:sz="4" w:space="0" w:color="auto"/>
-              <w:right w:val="single" w:sz="4" w:space="0" w:color="auto"/>
-            </w:tcBorders>
-            <w:tcMar>
-              <w:top w:w="0" w:type="dxa"/>
-              <w:left w:w="108" w:type="dxa"/>
-              <w:bottom w:w="0" w:type="dxa"/>
-              <w:right w:w="108" w:type="dxa"/>
-            </w:tcMar>
             <w:vAlign w:val="center"/>
           </w:tcPr>
           <w:p>
@@ -3983,18 +2783,6 @@
         <w:tc>
           <w:tcPr>
             <w:tcW w:w="1126" w:type="pct"/>
-            <w:tcBorders>
-              <w:top w:val="single" w:sz="4" w:space="0" w:color="auto"/>
-              <w:left w:val="single" w:sz="4" w:space="0" w:color="auto"/>
-              <w:bottom w:val="single" w:sz="4" w:space="0" w:color="auto"/>
-              <w:right w:val="single" w:sz="4" w:space="0" w:color="auto"/>
-            </w:tcBorders>
-            <w:tcMar>
-              <w:top w:w="0" w:type="dxa"/>
-              <w:left w:w="108" w:type="dxa"/>
-              <w:bottom w:w="0" w:type="dxa"/>
-              <w:right w:w="108" w:type="dxa"/>
-            </w:tcMar>
           </w:tcPr>
           <w:p>
             <w:pPr>
@@ -4011,18 +2799,6 @@
         <w:tc>
           <w:tcPr>
             <w:tcW w:w="1024" w:type="pct"/>
-            <w:tcBorders>
-              <w:top w:val="single" w:sz="4" w:space="0" w:color="auto"/>
-              <w:left w:val="single" w:sz="4" w:space="0" w:color="auto"/>
-              <w:bottom w:val="single" w:sz="4" w:space="0" w:color="auto"/>
-              <w:right w:val="single" w:sz="4" w:space="0" w:color="auto"/>
-            </w:tcBorders>
-            <w:tcMar>
-              <w:top w:w="0" w:type="dxa"/>
-              <w:left w:w="108" w:type="dxa"/>
-              <w:bottom w:w="0" w:type="dxa"/>
-              <w:right w:w="108" w:type="dxa"/>
-            </w:tcMar>
           </w:tcPr>
           <w:p>
             <w:pPr>
@@ -4044,18 +2820,6 @@
         <w:tc>
           <w:tcPr>
             <w:tcW w:w="2850" w:type="pct"/>
-            <w:tcBorders>
-              <w:top w:val="single" w:sz="4" w:space="0" w:color="auto"/>
-              <w:left w:val="single" w:sz="4" w:space="0" w:color="auto"/>
-              <w:bottom w:val="single" w:sz="4" w:space="0" w:color="auto"/>
-              <w:right w:val="single" w:sz="4" w:space="0" w:color="auto"/>
-            </w:tcBorders>
-            <w:tcMar>
-              <w:top w:w="0" w:type="dxa"/>
-              <w:left w:w="108" w:type="dxa"/>
-              <w:bottom w:w="0" w:type="dxa"/>
-              <w:right w:w="108" w:type="dxa"/>
-            </w:tcMar>
             <w:vAlign w:val="center"/>
           </w:tcPr>
           <w:p>
@@ -4082,18 +2846,6 @@
         <w:tc>
           <w:tcPr>
             <w:tcW w:w="1126" w:type="pct"/>
-            <w:tcBorders>
-              <w:top w:val="single" w:sz="4" w:space="0" w:color="auto"/>
-              <w:left w:val="single" w:sz="4" w:space="0" w:color="auto"/>
-              <w:bottom w:val="single" w:sz="4" w:space="0" w:color="auto"/>
-              <w:right w:val="single" w:sz="4" w:space="0" w:color="auto"/>
-            </w:tcBorders>
-            <w:tcMar>
-              <w:top w:w="0" w:type="dxa"/>
-              <w:left w:w="108" w:type="dxa"/>
-              <w:bottom w:w="0" w:type="dxa"/>
-              <w:right w:w="108" w:type="dxa"/>
-            </w:tcMar>
           </w:tcPr>
           <w:p>
             <w:pPr>
@@ -4110,18 +2862,6 @@
         <w:tc>
           <w:tcPr>
             <w:tcW w:w="1024" w:type="pct"/>
-            <w:tcBorders>
-              <w:top w:val="single" w:sz="4" w:space="0" w:color="auto"/>
-              <w:left w:val="single" w:sz="4" w:space="0" w:color="auto"/>
-              <w:bottom w:val="single" w:sz="4" w:space="0" w:color="auto"/>
-              <w:right w:val="single" w:sz="4" w:space="0" w:color="auto"/>
-            </w:tcBorders>
-            <w:tcMar>
-              <w:top w:w="0" w:type="dxa"/>
-              <w:left w:w="108" w:type="dxa"/>
-              <w:bottom w:w="0" w:type="dxa"/>
-              <w:right w:w="108" w:type="dxa"/>
-            </w:tcMar>
           </w:tcPr>
           <w:p>
             <w:pPr>
@@ -4143,18 +2883,6 @@
         <w:tc>
           <w:tcPr>
             <w:tcW w:w="2850" w:type="pct"/>
-            <w:tcBorders>
-              <w:top w:val="single" w:sz="4" w:space="0" w:color="auto"/>
-              <w:left w:val="single" w:sz="4" w:space="0" w:color="auto"/>
-              <w:bottom w:val="single" w:sz="4" w:space="0" w:color="auto"/>
-              <w:right w:val="single" w:sz="4" w:space="0" w:color="auto"/>
-            </w:tcBorders>
-            <w:tcMar>
-              <w:top w:w="0" w:type="dxa"/>
-              <w:left w:w="108" w:type="dxa"/>
-              <w:bottom w:w="0" w:type="dxa"/>
-              <w:right w:w="108" w:type="dxa"/>
-            </w:tcMar>
             <w:vAlign w:val="center"/>
           </w:tcPr>
           <w:p>
@@ -4181,18 +2909,6 @@
         <w:tc>
           <w:tcPr>
             <w:tcW w:w="1126" w:type="pct"/>
-            <w:tcBorders>
-              <w:top w:val="single" w:sz="4" w:space="0" w:color="auto"/>
-              <w:left w:val="single" w:sz="4" w:space="0" w:color="auto"/>
-              <w:bottom w:val="single" w:sz="4" w:space="0" w:color="auto"/>
-              <w:right w:val="single" w:sz="4" w:space="0" w:color="auto"/>
-            </w:tcBorders>
-            <w:tcMar>
-              <w:top w:w="0" w:type="dxa"/>
-              <w:left w:w="108" w:type="dxa"/>
-              <w:bottom w:w="0" w:type="dxa"/>
-              <w:right w:w="108" w:type="dxa"/>
-            </w:tcMar>
           </w:tcPr>
           <w:p>
             <w:pPr>
@@ -4209,18 +2925,6 @@
         <w:tc>
           <w:tcPr>
             <w:tcW w:w="1024" w:type="pct"/>
-            <w:tcBorders>
-              <w:top w:val="single" w:sz="4" w:space="0" w:color="auto"/>
-              <w:left w:val="single" w:sz="4" w:space="0" w:color="auto"/>
-              <w:bottom w:val="single" w:sz="4" w:space="0" w:color="auto"/>
-              <w:right w:val="single" w:sz="4" w:space="0" w:color="auto"/>
-            </w:tcBorders>
-            <w:tcMar>
-              <w:top w:w="0" w:type="dxa"/>
-              <w:left w:w="108" w:type="dxa"/>
-              <w:bottom w:w="0" w:type="dxa"/>
-              <w:right w:w="108" w:type="dxa"/>
-            </w:tcMar>
           </w:tcPr>
           <w:p>
             <w:pPr>
@@ -4242,18 +2946,6 @@
         <w:tc>
           <w:tcPr>
             <w:tcW w:w="2850" w:type="pct"/>
-            <w:tcBorders>
-              <w:top w:val="single" w:sz="4" w:space="0" w:color="auto"/>
-              <w:left w:val="single" w:sz="4" w:space="0" w:color="auto"/>
-              <w:bottom w:val="single" w:sz="4" w:space="0" w:color="auto"/>
-              <w:right w:val="single" w:sz="4" w:space="0" w:color="auto"/>
-            </w:tcBorders>
-            <w:tcMar>
-              <w:top w:w="0" w:type="dxa"/>
-              <w:left w:w="108" w:type="dxa"/>
-              <w:bottom w:w="0" w:type="dxa"/>
-              <w:right w:w="108" w:type="dxa"/>
-            </w:tcMar>
             <w:vAlign w:val="center"/>
           </w:tcPr>
           <w:p>
@@ -4280,18 +2972,6 @@
         <w:tc>
           <w:tcPr>
             <w:tcW w:w="1126" w:type="pct"/>
-            <w:tcBorders>
-              <w:top w:val="single" w:sz="4" w:space="0" w:color="auto"/>
-              <w:left w:val="single" w:sz="4" w:space="0" w:color="auto"/>
-              <w:bottom w:val="single" w:sz="4" w:space="0" w:color="auto"/>
-              <w:right w:val="single" w:sz="4" w:space="0" w:color="auto"/>
-            </w:tcBorders>
-            <w:tcMar>
-              <w:top w:w="0" w:type="dxa"/>
-              <w:left w:w="108" w:type="dxa"/>
-              <w:bottom w:w="0" w:type="dxa"/>
-              <w:right w:w="108" w:type="dxa"/>
-            </w:tcMar>
           </w:tcPr>
           <w:p>
             <w:pPr>
@@ -4308,18 +2988,6 @@
         <w:tc>
           <w:tcPr>
             <w:tcW w:w="1024" w:type="pct"/>
-            <w:tcBorders>
-              <w:top w:val="single" w:sz="4" w:space="0" w:color="auto"/>
-              <w:left w:val="single" w:sz="4" w:space="0" w:color="auto"/>
-              <w:bottom w:val="single" w:sz="4" w:space="0" w:color="auto"/>
-              <w:right w:val="single" w:sz="4" w:space="0" w:color="auto"/>
-            </w:tcBorders>
-            <w:tcMar>
-              <w:top w:w="0" w:type="dxa"/>
-              <w:left w:w="108" w:type="dxa"/>
-              <w:bottom w:w="0" w:type="dxa"/>
-              <w:right w:w="108" w:type="dxa"/>
-            </w:tcMar>
           </w:tcPr>
           <w:p>
             <w:pPr>
@@ -4341,18 +3009,6 @@
         <w:tc>
           <w:tcPr>
             <w:tcW w:w="2850" w:type="pct"/>
-            <w:tcBorders>
-              <w:top w:val="single" w:sz="4" w:space="0" w:color="auto"/>
-              <w:left w:val="single" w:sz="4" w:space="0" w:color="auto"/>
-              <w:bottom w:val="single" w:sz="4" w:space="0" w:color="auto"/>
-              <w:right w:val="single" w:sz="4" w:space="0" w:color="auto"/>
-            </w:tcBorders>
-            <w:tcMar>
-              <w:top w:w="0" w:type="dxa"/>
-              <w:left w:w="108" w:type="dxa"/>
-              <w:bottom w:w="0" w:type="dxa"/>
-              <w:right w:w="108" w:type="dxa"/>
-            </w:tcMar>
             <w:vAlign w:val="center"/>
           </w:tcPr>
           <w:p>
@@ -4379,18 +3035,6 @@
         <w:tc>
           <w:tcPr>
             <w:tcW w:w="1126" w:type="pct"/>
-            <w:tcBorders>
-              <w:top w:val="single" w:sz="4" w:space="0" w:color="auto"/>
-              <w:left w:val="single" w:sz="4" w:space="0" w:color="auto"/>
-              <w:bottom w:val="single" w:sz="4" w:space="0" w:color="auto"/>
-              <w:right w:val="single" w:sz="4" w:space="0" w:color="auto"/>
-            </w:tcBorders>
-            <w:tcMar>
-              <w:top w:w="0" w:type="dxa"/>
-              <w:left w:w="108" w:type="dxa"/>
-              <w:bottom w:w="0" w:type="dxa"/>
-              <w:right w:w="108" w:type="dxa"/>
-            </w:tcMar>
           </w:tcPr>
           <w:p>
             <w:pPr>
@@ -4407,18 +3051,6 @@
         <w:tc>
           <w:tcPr>
             <w:tcW w:w="1024" w:type="pct"/>
-            <w:tcBorders>
-              <w:top w:val="single" w:sz="4" w:space="0" w:color="auto"/>
-              <w:left w:val="single" w:sz="4" w:space="0" w:color="auto"/>
-              <w:bottom w:val="single" w:sz="4" w:space="0" w:color="auto"/>
-              <w:right w:val="single" w:sz="4" w:space="0" w:color="auto"/>
-            </w:tcBorders>
-            <w:tcMar>
-              <w:top w:w="0" w:type="dxa"/>
-              <w:left w:w="108" w:type="dxa"/>
-              <w:bottom w:w="0" w:type="dxa"/>
-              <w:right w:w="108" w:type="dxa"/>
-            </w:tcMar>
           </w:tcPr>
           <w:p>
             <w:pPr>
@@ -4440,18 +3072,6 @@
         <w:tc>
           <w:tcPr>
             <w:tcW w:w="2850" w:type="pct"/>
-            <w:tcBorders>
-              <w:top w:val="single" w:sz="4" w:space="0" w:color="auto"/>
-              <w:left w:val="single" w:sz="4" w:space="0" w:color="auto"/>
-              <w:bottom w:val="single" w:sz="4" w:space="0" w:color="auto"/>
-              <w:right w:val="single" w:sz="4" w:space="0" w:color="auto"/>
-            </w:tcBorders>
-            <w:tcMar>
-              <w:top w:w="0" w:type="dxa"/>
-              <w:left w:w="108" w:type="dxa"/>
-              <w:bottom w:w="0" w:type="dxa"/>
-              <w:right w:w="108" w:type="dxa"/>
-            </w:tcMar>
             <w:vAlign w:val="center"/>
           </w:tcPr>
           <w:p>
@@ -4478,18 +3098,6 @@
         <w:tc>
           <w:tcPr>
             <w:tcW w:w="1126" w:type="pct"/>
-            <w:tcBorders>
-              <w:top w:val="single" w:sz="4" w:space="0" w:color="auto"/>
-              <w:left w:val="single" w:sz="4" w:space="0" w:color="auto"/>
-              <w:bottom w:val="single" w:sz="4" w:space="0" w:color="auto"/>
-              <w:right w:val="single" w:sz="4" w:space="0" w:color="auto"/>
-            </w:tcBorders>
-            <w:tcMar>
-              <w:top w:w="0" w:type="dxa"/>
-              <w:left w:w="108" w:type="dxa"/>
-              <w:bottom w:w="0" w:type="dxa"/>
-              <w:right w:w="108" w:type="dxa"/>
-            </w:tcMar>
           </w:tcPr>
           <w:p>
             <w:pPr>
@@ -4506,18 +3114,6 @@
         <w:tc>
           <w:tcPr>
             <w:tcW w:w="1024" w:type="pct"/>
-            <w:tcBorders>
-              <w:top w:val="single" w:sz="4" w:space="0" w:color="auto"/>
-              <w:left w:val="single" w:sz="4" w:space="0" w:color="auto"/>
-              <w:bottom w:val="single" w:sz="4" w:space="0" w:color="auto"/>
-              <w:right w:val="single" w:sz="4" w:space="0" w:color="auto"/>
-            </w:tcBorders>
-            <w:tcMar>
-              <w:top w:w="0" w:type="dxa"/>
-              <w:left w:w="108" w:type="dxa"/>
-              <w:bottom w:w="0" w:type="dxa"/>
-              <w:right w:w="108" w:type="dxa"/>
-            </w:tcMar>
           </w:tcPr>
           <w:p>
             <w:pPr>
@@ -4539,18 +3135,6 @@
         <w:tc>
           <w:tcPr>
             <w:tcW w:w="2850" w:type="pct"/>
-            <w:tcBorders>
-              <w:top w:val="single" w:sz="4" w:space="0" w:color="auto"/>
-              <w:left w:val="single" w:sz="4" w:space="0" w:color="auto"/>
-              <w:bottom w:val="single" w:sz="4" w:space="0" w:color="auto"/>
-              <w:right w:val="single" w:sz="4" w:space="0" w:color="auto"/>
-            </w:tcBorders>
-            <w:tcMar>
-              <w:top w:w="0" w:type="dxa"/>
-              <w:left w:w="108" w:type="dxa"/>
-              <w:bottom w:w="0" w:type="dxa"/>
-              <w:right w:w="108" w:type="dxa"/>
-            </w:tcMar>
             <w:vAlign w:val="center"/>
           </w:tcPr>
           <w:p>
@@ -4577,18 +3161,6 @@
         <w:tc>
           <w:tcPr>
             <w:tcW w:w="1126" w:type="pct"/>
-            <w:tcBorders>
-              <w:top w:val="single" w:sz="4" w:space="0" w:color="auto"/>
-              <w:left w:val="single" w:sz="4" w:space="0" w:color="auto"/>
-              <w:bottom w:val="single" w:sz="4" w:space="0" w:color="auto"/>
-              <w:right w:val="single" w:sz="4" w:space="0" w:color="auto"/>
-            </w:tcBorders>
-            <w:tcMar>
-              <w:top w:w="0" w:type="dxa"/>
-              <w:left w:w="108" w:type="dxa"/>
-              <w:bottom w:w="0" w:type="dxa"/>
-              <w:right w:w="108" w:type="dxa"/>
-            </w:tcMar>
           </w:tcPr>
           <w:p>
             <w:pPr>
@@ -4605,18 +3177,6 @@
         <w:tc>
           <w:tcPr>
             <w:tcW w:w="1024" w:type="pct"/>
-            <w:tcBorders>
-              <w:top w:val="single" w:sz="4" w:space="0" w:color="auto"/>
-              <w:left w:val="single" w:sz="4" w:space="0" w:color="auto"/>
-              <w:bottom w:val="single" w:sz="4" w:space="0" w:color="auto"/>
-              <w:right w:val="single" w:sz="4" w:space="0" w:color="auto"/>
-            </w:tcBorders>
-            <w:tcMar>
-              <w:top w:w="0" w:type="dxa"/>
-              <w:left w:w="108" w:type="dxa"/>
-              <w:bottom w:w="0" w:type="dxa"/>
-              <w:right w:w="108" w:type="dxa"/>
-            </w:tcMar>
           </w:tcPr>
           <w:p>
             <w:pPr>
@@ -4638,18 +3198,6 @@
         <w:tc>
           <w:tcPr>
             <w:tcW w:w="2850" w:type="pct"/>
-            <w:tcBorders>
-              <w:top w:val="single" w:sz="4" w:space="0" w:color="auto"/>
-              <w:left w:val="single" w:sz="4" w:space="0" w:color="auto"/>
-              <w:bottom w:val="single" w:sz="4" w:space="0" w:color="auto"/>
-              <w:right w:val="single" w:sz="4" w:space="0" w:color="auto"/>
-            </w:tcBorders>
-            <w:tcMar>
-              <w:top w:w="0" w:type="dxa"/>
-              <w:left w:w="108" w:type="dxa"/>
-              <w:bottom w:w="0" w:type="dxa"/>
-              <w:right w:w="108" w:type="dxa"/>
-            </w:tcMar>
             <w:vAlign w:val="center"/>
           </w:tcPr>
           <w:p>
@@ -4676,18 +3224,6 @@
         <w:tc>
           <w:tcPr>
             <w:tcW w:w="1126" w:type="pct"/>
-            <w:tcBorders>
-              <w:top w:val="single" w:sz="4" w:space="0" w:color="auto"/>
-              <w:left w:val="single" w:sz="4" w:space="0" w:color="auto"/>
-              <w:bottom w:val="single" w:sz="4" w:space="0" w:color="auto"/>
-              <w:right w:val="single" w:sz="4" w:space="0" w:color="auto"/>
-            </w:tcBorders>
-            <w:tcMar>
-              <w:top w:w="0" w:type="dxa"/>
-              <w:left w:w="108" w:type="dxa"/>
-              <w:bottom w:w="0" w:type="dxa"/>
-              <w:right w:w="108" w:type="dxa"/>
-            </w:tcMar>
           </w:tcPr>
           <w:p>
             <w:pPr>
@@ -4704,18 +3240,6 @@
         <w:tc>
           <w:tcPr>
             <w:tcW w:w="1024" w:type="pct"/>
-            <w:tcBorders>
-              <w:top w:val="single" w:sz="4" w:space="0" w:color="auto"/>
-              <w:left w:val="single" w:sz="4" w:space="0" w:color="auto"/>
-              <w:bottom w:val="single" w:sz="4" w:space="0" w:color="auto"/>
-              <w:right w:val="single" w:sz="4" w:space="0" w:color="auto"/>
-            </w:tcBorders>
-            <w:tcMar>
-              <w:top w:w="0" w:type="dxa"/>
-              <w:left w:w="108" w:type="dxa"/>
-              <w:bottom w:w="0" w:type="dxa"/>
-              <w:right w:w="108" w:type="dxa"/>
-            </w:tcMar>
           </w:tcPr>
           <w:p>
             <w:pPr>
@@ -4737,18 +3261,6 @@
         <w:tc>
           <w:tcPr>
             <w:tcW w:w="2850" w:type="pct"/>
-            <w:tcBorders>
-              <w:top w:val="single" w:sz="4" w:space="0" w:color="auto"/>
-              <w:left w:val="single" w:sz="4" w:space="0" w:color="auto"/>
-              <w:bottom w:val="single" w:sz="4" w:space="0" w:color="auto"/>
-              <w:right w:val="single" w:sz="4" w:space="0" w:color="auto"/>
-            </w:tcBorders>
-            <w:tcMar>
-              <w:top w:w="0" w:type="dxa"/>
-              <w:left w:w="108" w:type="dxa"/>
-              <w:bottom w:w="0" w:type="dxa"/>
-              <w:right w:w="108" w:type="dxa"/>
-            </w:tcMar>
             <w:vAlign w:val="center"/>
           </w:tcPr>
           <w:p>
@@ -4775,18 +3287,6 @@
         <w:tc>
           <w:tcPr>
             <w:tcW w:w="1126" w:type="pct"/>
-            <w:tcBorders>
-              <w:top w:val="single" w:sz="4" w:space="0" w:color="auto"/>
-              <w:left w:val="single" w:sz="4" w:space="0" w:color="auto"/>
-              <w:bottom w:val="single" w:sz="4" w:space="0" w:color="auto"/>
-              <w:right w:val="single" w:sz="4" w:space="0" w:color="auto"/>
-            </w:tcBorders>
-            <w:tcMar>
-              <w:top w:w="0" w:type="dxa"/>
-              <w:left w:w="108" w:type="dxa"/>
-              <w:bottom w:w="0" w:type="dxa"/>
-              <w:right w:w="108" w:type="dxa"/>
-            </w:tcMar>
           </w:tcPr>
           <w:p>
             <w:pPr>
@@ -4803,18 +3303,636 @@
         <w:tc>
           <w:tcPr>
             <w:tcW w:w="1024" w:type="pct"/>
-            <w:tcBorders>
-              <w:top w:val="single" w:sz="4" w:space="0" w:color="auto"/>
-              <w:left w:val="single" w:sz="4" w:space="0" w:color="auto"/>
-              <w:bottom w:val="single" w:sz="4" w:space="0" w:color="auto"/>
-              <w:right w:val="single" w:sz="4" w:space="0" w:color="auto"/>
-            </w:tcBorders>
-            <w:tcMar>
-              <w:top w:w="0" w:type="dxa"/>
-              <w:left w:w="108" w:type="dxa"/>
-              <w:bottom w:w="0" w:type="dxa"/>
-              <w:right w:w="108" w:type="dxa"/>
-            </w:tcMar>
+          </w:tcPr>
+          <w:p>
+            <w:pPr>
+              <w:spacing w:line="360" w:lineRule="auto"/>
+              <w:jc w:val="both"/>
+              <w:rPr>
+                <w:rFonts w:ascii="Arial" w:hAnsi="Arial" w:cs="Arial"/>
+                <w:sz w:val="16"/>
+                <w:szCs w:val="16"/>
+              </w:rPr>
+            </w:pPr>
+          </w:p>
+        </w:tc>
+      </w:tr>
+      <w:tr>
+        <w:trPr>
+          <w:trHeight w:val="245"/>
+        </w:trPr>
+        <w:tc>
+          <w:tcPr>
+            <w:tcW w:w="2850" w:type="pct"/>
+            <w:vAlign w:val="center"/>
+          </w:tcPr>
+          <w:p>
+            <w:pPr>
+              <w:pStyle w:val="ListParagraph"/>
+              <w:numPr>
+                <w:ilvl w:val="0"/>
+                <w:numId w:val="1"/>
+              </w:numPr>
+              <w:tabs>
+                <w:tab w:val="clear" w:pos="720"/>
+                <w:tab w:val="num" w:pos="72"/>
+              </w:tabs>
+              <w:spacing w:line="360" w:lineRule="auto"/>
+              <w:ind w:left="252" w:hanging="252"/>
+              <w:rPr>
+                <w:rFonts w:ascii="Arial" w:hAnsi="Arial" w:cs="Arial"/>
+                <w:sz w:val="16"/>
+                <w:szCs w:val="16"/>
+              </w:rPr>
+            </w:pPr>
+          </w:p>
+        </w:tc>
+        <w:tc>
+          <w:tcPr>
+            <w:tcW w:w="1126" w:type="pct"/>
+          </w:tcPr>
+          <w:p>
+            <w:pPr>
+              <w:spacing w:line="360" w:lineRule="auto"/>
+              <w:jc w:val="both"/>
+              <w:rPr>
+                <w:rFonts w:ascii="Arial" w:hAnsi="Arial" w:cs="Arial"/>
+                <w:sz w:val="16"/>
+                <w:szCs w:val="16"/>
+              </w:rPr>
+            </w:pPr>
+          </w:p>
+        </w:tc>
+        <w:tc>
+          <w:tcPr>
+            <w:tcW w:w="1024" w:type="pct"/>
+          </w:tcPr>
+          <w:p>
+            <w:pPr>
+              <w:spacing w:line="360" w:lineRule="auto"/>
+              <w:jc w:val="both"/>
+              <w:rPr>
+                <w:rFonts w:ascii="Arial" w:hAnsi="Arial" w:cs="Arial"/>
+                <w:sz w:val="16"/>
+                <w:szCs w:val="16"/>
+              </w:rPr>
+            </w:pPr>
+          </w:p>
+        </w:tc>
+      </w:tr>
+      <w:tr>
+        <w:trPr>
+          <w:trHeight w:val="245"/>
+        </w:trPr>
+        <w:tc>
+          <w:tcPr>
+            <w:tcW w:w="2850" w:type="pct"/>
+            <w:vAlign w:val="center"/>
+          </w:tcPr>
+          <w:p>
+            <w:pPr>
+              <w:pStyle w:val="ListParagraph"/>
+              <w:numPr>
+                <w:ilvl w:val="0"/>
+                <w:numId w:val="1"/>
+              </w:numPr>
+              <w:tabs>
+                <w:tab w:val="clear" w:pos="720"/>
+                <w:tab w:val="num" w:pos="72"/>
+              </w:tabs>
+              <w:spacing w:line="360" w:lineRule="auto"/>
+              <w:ind w:left="252" w:hanging="252"/>
+              <w:rPr>
+                <w:rFonts w:ascii="Arial" w:hAnsi="Arial" w:cs="Arial"/>
+                <w:sz w:val="16"/>
+                <w:szCs w:val="16"/>
+              </w:rPr>
+            </w:pPr>
+          </w:p>
+        </w:tc>
+        <w:tc>
+          <w:tcPr>
+            <w:tcW w:w="1126" w:type="pct"/>
+          </w:tcPr>
+          <w:p>
+            <w:pPr>
+              <w:spacing w:line="360" w:lineRule="auto"/>
+              <w:jc w:val="both"/>
+              <w:rPr>
+                <w:rFonts w:ascii="Arial" w:hAnsi="Arial" w:cs="Arial"/>
+                <w:sz w:val="16"/>
+                <w:szCs w:val="16"/>
+              </w:rPr>
+            </w:pPr>
+          </w:p>
+        </w:tc>
+        <w:tc>
+          <w:tcPr>
+            <w:tcW w:w="1024" w:type="pct"/>
+          </w:tcPr>
+          <w:p>
+            <w:pPr>
+              <w:spacing w:line="360" w:lineRule="auto"/>
+              <w:jc w:val="both"/>
+              <w:rPr>
+                <w:rFonts w:ascii="Arial" w:hAnsi="Arial" w:cs="Arial"/>
+                <w:sz w:val="16"/>
+                <w:szCs w:val="16"/>
+              </w:rPr>
+            </w:pPr>
+          </w:p>
+        </w:tc>
+      </w:tr>
+      <w:tr>
+        <w:trPr>
+          <w:trHeight w:val="245"/>
+        </w:trPr>
+        <w:tc>
+          <w:tcPr>
+            <w:tcW w:w="2850" w:type="pct"/>
+            <w:vAlign w:val="center"/>
+          </w:tcPr>
+          <w:p>
+            <w:pPr>
+              <w:pStyle w:val="ListParagraph"/>
+              <w:numPr>
+                <w:ilvl w:val="0"/>
+                <w:numId w:val="1"/>
+              </w:numPr>
+              <w:tabs>
+                <w:tab w:val="clear" w:pos="720"/>
+                <w:tab w:val="num" w:pos="72"/>
+              </w:tabs>
+              <w:spacing w:line="360" w:lineRule="auto"/>
+              <w:ind w:left="252" w:hanging="252"/>
+              <w:rPr>
+                <w:rFonts w:ascii="Arial" w:hAnsi="Arial" w:cs="Arial"/>
+                <w:sz w:val="16"/>
+                <w:szCs w:val="16"/>
+              </w:rPr>
+            </w:pPr>
+          </w:p>
+        </w:tc>
+        <w:tc>
+          <w:tcPr>
+            <w:tcW w:w="1126" w:type="pct"/>
+          </w:tcPr>
+          <w:p>
+            <w:pPr>
+              <w:spacing w:line="360" w:lineRule="auto"/>
+              <w:jc w:val="both"/>
+              <w:rPr>
+                <w:rFonts w:ascii="Arial" w:hAnsi="Arial" w:cs="Arial"/>
+                <w:sz w:val="16"/>
+                <w:szCs w:val="16"/>
+              </w:rPr>
+            </w:pPr>
+          </w:p>
+        </w:tc>
+        <w:tc>
+          <w:tcPr>
+            <w:tcW w:w="1024" w:type="pct"/>
+          </w:tcPr>
+          <w:p>
+            <w:pPr>
+              <w:spacing w:line="360" w:lineRule="auto"/>
+              <w:jc w:val="both"/>
+              <w:rPr>
+                <w:rFonts w:ascii="Arial" w:hAnsi="Arial" w:cs="Arial"/>
+                <w:sz w:val="16"/>
+                <w:szCs w:val="16"/>
+              </w:rPr>
+            </w:pPr>
+          </w:p>
+        </w:tc>
+      </w:tr>
+      <w:tr>
+        <w:trPr>
+          <w:trHeight w:val="245"/>
+        </w:trPr>
+        <w:tc>
+          <w:tcPr>
+            <w:tcW w:w="2850" w:type="pct"/>
+            <w:vAlign w:val="center"/>
+          </w:tcPr>
+          <w:p>
+            <w:pPr>
+              <w:pStyle w:val="ListParagraph"/>
+              <w:numPr>
+                <w:ilvl w:val="0"/>
+                <w:numId w:val="1"/>
+              </w:numPr>
+              <w:tabs>
+                <w:tab w:val="clear" w:pos="720"/>
+                <w:tab w:val="num" w:pos="72"/>
+              </w:tabs>
+              <w:spacing w:line="360" w:lineRule="auto"/>
+              <w:ind w:left="252" w:hanging="252"/>
+              <w:rPr>
+                <w:rFonts w:ascii="Arial" w:hAnsi="Arial" w:cs="Arial"/>
+                <w:sz w:val="16"/>
+                <w:szCs w:val="16"/>
+              </w:rPr>
+            </w:pPr>
+          </w:p>
+        </w:tc>
+        <w:tc>
+          <w:tcPr>
+            <w:tcW w:w="1126" w:type="pct"/>
+          </w:tcPr>
+          <w:p>
+            <w:pPr>
+              <w:spacing w:line="360" w:lineRule="auto"/>
+              <w:jc w:val="both"/>
+              <w:rPr>
+                <w:rFonts w:ascii="Arial" w:hAnsi="Arial" w:cs="Arial"/>
+                <w:sz w:val="16"/>
+                <w:szCs w:val="16"/>
+              </w:rPr>
+            </w:pPr>
+          </w:p>
+        </w:tc>
+        <w:tc>
+          <w:tcPr>
+            <w:tcW w:w="1024" w:type="pct"/>
+          </w:tcPr>
+          <w:p>
+            <w:pPr>
+              <w:spacing w:line="360" w:lineRule="auto"/>
+              <w:jc w:val="both"/>
+              <w:rPr>
+                <w:rFonts w:ascii="Arial" w:hAnsi="Arial" w:cs="Arial"/>
+                <w:sz w:val="16"/>
+                <w:szCs w:val="16"/>
+              </w:rPr>
+            </w:pPr>
+          </w:p>
+        </w:tc>
+      </w:tr>
+      <w:tr>
+        <w:trPr>
+          <w:trHeight w:val="245"/>
+        </w:trPr>
+        <w:tc>
+          <w:tcPr>
+            <w:tcW w:w="2850" w:type="pct"/>
+            <w:vAlign w:val="center"/>
+          </w:tcPr>
+          <w:p>
+            <w:pPr>
+              <w:pStyle w:val="ListParagraph"/>
+              <w:numPr>
+                <w:ilvl w:val="0"/>
+                <w:numId w:val="1"/>
+              </w:numPr>
+              <w:tabs>
+                <w:tab w:val="clear" w:pos="720"/>
+                <w:tab w:val="num" w:pos="72"/>
+              </w:tabs>
+              <w:spacing w:line="360" w:lineRule="auto"/>
+              <w:ind w:left="252" w:hanging="252"/>
+              <w:rPr>
+                <w:rFonts w:ascii="Arial" w:hAnsi="Arial" w:cs="Arial"/>
+                <w:sz w:val="16"/>
+                <w:szCs w:val="16"/>
+              </w:rPr>
+            </w:pPr>
+          </w:p>
+        </w:tc>
+        <w:tc>
+          <w:tcPr>
+            <w:tcW w:w="1126" w:type="pct"/>
+          </w:tcPr>
+          <w:p>
+            <w:pPr>
+              <w:spacing w:line="360" w:lineRule="auto"/>
+              <w:jc w:val="both"/>
+              <w:rPr>
+                <w:rFonts w:ascii="Arial" w:hAnsi="Arial" w:cs="Arial"/>
+                <w:sz w:val="16"/>
+                <w:szCs w:val="16"/>
+              </w:rPr>
+            </w:pPr>
+          </w:p>
+        </w:tc>
+        <w:tc>
+          <w:tcPr>
+            <w:tcW w:w="1024" w:type="pct"/>
+          </w:tcPr>
+          <w:p>
+            <w:pPr>
+              <w:spacing w:line="360" w:lineRule="auto"/>
+              <w:jc w:val="both"/>
+              <w:rPr>
+                <w:rFonts w:ascii="Arial" w:hAnsi="Arial" w:cs="Arial"/>
+                <w:sz w:val="16"/>
+                <w:szCs w:val="16"/>
+              </w:rPr>
+            </w:pPr>
+          </w:p>
+        </w:tc>
+      </w:tr>
+      <w:tr>
+        <w:trPr>
+          <w:trHeight w:val="245"/>
+        </w:trPr>
+        <w:tc>
+          <w:tcPr>
+            <w:tcW w:w="2850" w:type="pct"/>
+            <w:vAlign w:val="center"/>
+          </w:tcPr>
+          <w:p>
+            <w:pPr>
+              <w:pStyle w:val="ListParagraph"/>
+              <w:numPr>
+                <w:ilvl w:val="0"/>
+                <w:numId w:val="1"/>
+              </w:numPr>
+              <w:tabs>
+                <w:tab w:val="clear" w:pos="720"/>
+                <w:tab w:val="num" w:pos="72"/>
+              </w:tabs>
+              <w:spacing w:line="360" w:lineRule="auto"/>
+              <w:ind w:left="252" w:hanging="252"/>
+              <w:rPr>
+                <w:rFonts w:ascii="Arial" w:hAnsi="Arial" w:cs="Arial"/>
+                <w:sz w:val="16"/>
+                <w:szCs w:val="16"/>
+              </w:rPr>
+            </w:pPr>
+          </w:p>
+        </w:tc>
+        <w:tc>
+          <w:tcPr>
+            <w:tcW w:w="1126" w:type="pct"/>
+          </w:tcPr>
+          <w:p>
+            <w:pPr>
+              <w:spacing w:line="360" w:lineRule="auto"/>
+              <w:jc w:val="both"/>
+              <w:rPr>
+                <w:rFonts w:ascii="Arial" w:hAnsi="Arial" w:cs="Arial"/>
+                <w:sz w:val="16"/>
+                <w:szCs w:val="16"/>
+              </w:rPr>
+            </w:pPr>
+          </w:p>
+        </w:tc>
+        <w:tc>
+          <w:tcPr>
+            <w:tcW w:w="1024" w:type="pct"/>
+          </w:tcPr>
+          <w:p>
+            <w:pPr>
+              <w:spacing w:line="360" w:lineRule="auto"/>
+              <w:jc w:val="both"/>
+              <w:rPr>
+                <w:rFonts w:ascii="Arial" w:hAnsi="Arial" w:cs="Arial"/>
+                <w:sz w:val="16"/>
+                <w:szCs w:val="16"/>
+              </w:rPr>
+            </w:pPr>
+          </w:p>
+        </w:tc>
+      </w:tr>
+      <w:tr>
+        <w:trPr>
+          <w:trHeight w:val="245"/>
+        </w:trPr>
+        <w:tc>
+          <w:tcPr>
+            <w:tcW w:w="2850" w:type="pct"/>
+            <w:vAlign w:val="center"/>
+          </w:tcPr>
+          <w:p>
+            <w:pPr>
+              <w:pStyle w:val="ListParagraph"/>
+              <w:numPr>
+                <w:ilvl w:val="0"/>
+                <w:numId w:val="1"/>
+              </w:numPr>
+              <w:tabs>
+                <w:tab w:val="clear" w:pos="720"/>
+                <w:tab w:val="num" w:pos="72"/>
+              </w:tabs>
+              <w:spacing w:line="360" w:lineRule="auto"/>
+              <w:ind w:left="252" w:hanging="252"/>
+              <w:rPr>
+                <w:rFonts w:ascii="Arial" w:hAnsi="Arial" w:cs="Arial"/>
+                <w:sz w:val="16"/>
+                <w:szCs w:val="16"/>
+              </w:rPr>
+            </w:pPr>
+          </w:p>
+        </w:tc>
+        <w:tc>
+          <w:tcPr>
+            <w:tcW w:w="1126" w:type="pct"/>
+          </w:tcPr>
+          <w:p>
+            <w:pPr>
+              <w:spacing w:line="360" w:lineRule="auto"/>
+              <w:jc w:val="both"/>
+              <w:rPr>
+                <w:rFonts w:ascii="Arial" w:hAnsi="Arial" w:cs="Arial"/>
+                <w:sz w:val="16"/>
+                <w:szCs w:val="16"/>
+              </w:rPr>
+            </w:pPr>
+          </w:p>
+        </w:tc>
+        <w:tc>
+          <w:tcPr>
+            <w:tcW w:w="1024" w:type="pct"/>
+          </w:tcPr>
+          <w:p>
+            <w:pPr>
+              <w:spacing w:line="360" w:lineRule="auto"/>
+              <w:jc w:val="both"/>
+              <w:rPr>
+                <w:rFonts w:ascii="Arial" w:hAnsi="Arial" w:cs="Arial"/>
+                <w:sz w:val="16"/>
+                <w:szCs w:val="16"/>
+              </w:rPr>
+            </w:pPr>
+          </w:p>
+        </w:tc>
+      </w:tr>
+      <w:tr>
+        <w:trPr>
+          <w:trHeight w:val="245"/>
+        </w:trPr>
+        <w:tc>
+          <w:tcPr>
+            <w:tcW w:w="2850" w:type="pct"/>
+            <w:vAlign w:val="center"/>
+          </w:tcPr>
+          <w:p>
+            <w:pPr>
+              <w:pStyle w:val="ListParagraph"/>
+              <w:numPr>
+                <w:ilvl w:val="0"/>
+                <w:numId w:val="1"/>
+              </w:numPr>
+              <w:tabs>
+                <w:tab w:val="clear" w:pos="720"/>
+                <w:tab w:val="num" w:pos="72"/>
+              </w:tabs>
+              <w:spacing w:line="360" w:lineRule="auto"/>
+              <w:ind w:left="252" w:hanging="252"/>
+              <w:rPr>
+                <w:rFonts w:ascii="Arial" w:hAnsi="Arial" w:cs="Arial"/>
+                <w:sz w:val="16"/>
+                <w:szCs w:val="16"/>
+              </w:rPr>
+            </w:pPr>
+          </w:p>
+        </w:tc>
+        <w:tc>
+          <w:tcPr>
+            <w:tcW w:w="1126" w:type="pct"/>
+          </w:tcPr>
+          <w:p>
+            <w:pPr>
+              <w:spacing w:line="360" w:lineRule="auto"/>
+              <w:jc w:val="both"/>
+              <w:rPr>
+                <w:rFonts w:ascii="Arial" w:hAnsi="Arial" w:cs="Arial"/>
+                <w:sz w:val="16"/>
+                <w:szCs w:val="16"/>
+              </w:rPr>
+            </w:pPr>
+          </w:p>
+        </w:tc>
+        <w:tc>
+          <w:tcPr>
+            <w:tcW w:w="1024" w:type="pct"/>
+          </w:tcPr>
+          <w:p>
+            <w:pPr>
+              <w:spacing w:line="360" w:lineRule="auto"/>
+              <w:jc w:val="both"/>
+              <w:rPr>
+                <w:rFonts w:ascii="Arial" w:hAnsi="Arial" w:cs="Arial"/>
+                <w:sz w:val="16"/>
+                <w:szCs w:val="16"/>
+              </w:rPr>
+            </w:pPr>
+          </w:p>
+        </w:tc>
+      </w:tr>
+      <w:tr>
+        <w:trPr>
+          <w:trHeight w:val="245"/>
+        </w:trPr>
+        <w:tc>
+          <w:tcPr>
+            <w:tcW w:w="2850" w:type="pct"/>
+            <w:vAlign w:val="center"/>
+          </w:tcPr>
+          <w:p>
+            <w:pPr>
+              <w:pStyle w:val="ListParagraph"/>
+              <w:numPr>
+                <w:ilvl w:val="0"/>
+                <w:numId w:val="1"/>
+              </w:numPr>
+              <w:tabs>
+                <w:tab w:val="clear" w:pos="720"/>
+                <w:tab w:val="num" w:pos="72"/>
+              </w:tabs>
+              <w:spacing w:line="360" w:lineRule="auto"/>
+              <w:ind w:left="252" w:hanging="252"/>
+              <w:rPr>
+                <w:rFonts w:ascii="Arial" w:hAnsi="Arial" w:cs="Arial"/>
+                <w:sz w:val="16"/>
+                <w:szCs w:val="16"/>
+              </w:rPr>
+            </w:pPr>
+          </w:p>
+        </w:tc>
+        <w:tc>
+          <w:tcPr>
+            <w:tcW w:w="1126" w:type="pct"/>
+          </w:tcPr>
+          <w:p>
+            <w:pPr>
+              <w:spacing w:line="360" w:lineRule="auto"/>
+              <w:jc w:val="both"/>
+              <w:rPr>
+                <w:rFonts w:ascii="Arial" w:hAnsi="Arial" w:cs="Arial"/>
+                <w:sz w:val="16"/>
+                <w:szCs w:val="16"/>
+              </w:rPr>
+            </w:pPr>
+          </w:p>
+        </w:tc>
+        <w:tc>
+          <w:tcPr>
+            <w:tcW w:w="1024" w:type="pct"/>
+          </w:tcPr>
+          <w:p>
+            <w:pPr>
+              <w:spacing w:line="360" w:lineRule="auto"/>
+              <w:jc w:val="both"/>
+              <w:rPr>
+                <w:rFonts w:ascii="Arial" w:hAnsi="Arial" w:cs="Arial"/>
+                <w:sz w:val="16"/>
+                <w:szCs w:val="16"/>
+              </w:rPr>
+            </w:pPr>
+          </w:p>
+        </w:tc>
+      </w:tr>
+      <w:tr>
+        <w:trPr>
+          <w:trHeight w:val="245"/>
+        </w:trPr>
+        <w:tc>
+          <w:tcPr>
+            <w:tcW w:w="2850" w:type="pct"/>
+            <w:vAlign w:val="center"/>
+          </w:tcPr>
+          <w:p>
+            <w:pPr>
+              <w:pStyle w:val="ListParagraph"/>
+              <w:numPr>
+                <w:ilvl w:val="0"/>
+                <w:numId w:val="1"/>
+              </w:numPr>
+              <w:tabs>
+                <w:tab w:val="clear" w:pos="720"/>
+                <w:tab w:val="num" w:pos="72"/>
+              </w:tabs>
+              <w:spacing w:line="360" w:lineRule="auto"/>
+              <w:ind w:left="252" w:hanging="252"/>
+              <w:rPr>
+                <w:rFonts w:ascii="Arial" w:hAnsi="Arial" w:cs="Arial"/>
+                <w:sz w:val="16"/>
+                <w:szCs w:val="16"/>
+              </w:rPr>
+            </w:pPr>
+          </w:p>
+        </w:tc>
+        <w:tc>
+          <w:tcPr>
+            <w:tcW w:w="1126" w:type="pct"/>
+          </w:tcPr>
+          <w:p>
+            <w:pPr>
+              <w:spacing w:line="360" w:lineRule="auto"/>
+              <w:jc w:val="both"/>
+              <w:rPr>
+                <w:rFonts w:ascii="Arial" w:hAnsi="Arial" w:cs="Arial"/>
+                <w:sz w:val="16"/>
+                <w:szCs w:val="16"/>
+              </w:rPr>
+            </w:pPr>
+          </w:p>
+        </w:tc>
+        <w:tc>
+          <w:tcPr>
+            <w:tcW w:w="1024" w:type="pct"/>
           </w:tcPr>
           <w:p>
             <w:pPr>
@@ -4843,8 +3961,9 @@
     <w:sectPr>
       <w:headerReference w:type="default" r:id="rId7"/>
       <w:footerReference w:type="default" r:id="rId8"/>
-      <w:pgSz w:w="11909" w:h="16834"/>
+      <w:pgSz w:w="11909" w:h="16834" w:code="9"/>
       <w:pgMar w:top="1728" w:right="1080" w:bottom="576" w:left="2160" w:header="432" w:footer="432" w:gutter="0"/>
+      <w:cols w:space="720"/>
       <w:docGrid w:linePitch="360"/>
     </w:sectPr>
   </w:body>
@@ -4871,7 +3990,7 @@
 </file>
 
 <file path=word/footer1.xml><?xml version="1.0" encoding="utf-8"?>
-<w:ftr xmlns:wpc="http://schemas.microsoft.com/office/word/2010/wordprocessingCanvas" xmlns:mc="http://schemas.openxmlformats.org/markup-compatibility/2006" xmlns:o="urn:schemas-microsoft-com:office:office" xmlns:r="http://schemas.openxmlformats.org/officeDocument/2006/relationships" xmlns:m="http://schemas.openxmlformats.org/officeDocument/2006/math" xmlns:v="urn:schemas-microsoft-com:vml" xmlns:wp14="http://schemas.microsoft.com/office/word/2010/wordprocessingDrawing" xmlns:wp="http://schemas.openxmlformats.org/drawingml/2006/wordprocessingDrawing" xmlns:w10="urn:schemas-microsoft-com:office:word" xmlns:w="http://schemas.openxmlformats.org/wordprocessingml/2006/main" xmlns:w14="http://schemas.microsoft.com/office/word/2010/wordml" xmlns:w15="http://schemas.microsoft.com/office/word/2012/wordml" xmlns:w16se="http://schemas.microsoft.com/office/word/2015/wordml/symex" xmlns:w16cid="http://schemas.microsoft.com/office/word/2016/wordml/cid" xmlns:w16="http://schemas.microsoft.com/office/word/2018/wordml" xmlns:w16cex="http://schemas.microsoft.com/office/word/2018/wordml/cex" xmlns:w16sdtdh="http://schemas.microsoft.com/office/word/2020/wordml/sdtdatahash" xmlns:wne="http://schemas.microsoft.com/office/word/2006/wordml" xmlns:wpg="http://schemas.microsoft.com/office/word/2010/wordprocessingGroup" xmlns:wps="http://schemas.microsoft.com/office/word/2010/wordprocessingShape">
+<w:ftr xmlns:wpc="http://schemas.microsoft.com/office/word/2010/wordprocessingCanvas" xmlns:cx="http://schemas.microsoft.com/office/drawing/2014/chartex" xmlns:cx1="http://schemas.microsoft.com/office/drawing/2015/9/8/chartex" xmlns:cx2="http://schemas.microsoft.com/office/drawing/2015/10/21/chartex" xmlns:cx3="http://schemas.microsoft.com/office/drawing/2016/5/9/chartex" xmlns:cx4="http://schemas.microsoft.com/office/drawing/2016/5/10/chartex" xmlns:cx5="http://schemas.microsoft.com/office/drawing/2016/5/11/chartex" xmlns:cx6="http://schemas.microsoft.com/office/drawing/2016/5/12/chartex" xmlns:cx7="http://schemas.microsoft.com/office/drawing/2016/5/13/chartex" xmlns:cx8="http://schemas.microsoft.com/office/drawing/2016/5/14/chartex" xmlns:mc="http://schemas.openxmlformats.org/markup-compatibility/2006" xmlns:aink="http://schemas.microsoft.com/office/drawing/2016/ink" xmlns:am3d="http://schemas.microsoft.com/office/drawing/2017/model3d" xmlns:o="urn:schemas-microsoft-com:office:office" xmlns:oel="http://schemas.microsoft.com/office/2019/extlst" xmlns:r="http://schemas.openxmlformats.org/officeDocument/2006/relationships" xmlns:m="http://schemas.openxmlformats.org/officeDocument/2006/math" xmlns:v="urn:schemas-microsoft-com:vml" xmlns:wp14="http://schemas.microsoft.com/office/word/2010/wordprocessingDrawing" xmlns:wp="http://schemas.openxmlformats.org/drawingml/2006/wordprocessingDrawing" xmlns:w10="urn:schemas-microsoft-com:office:word" xmlns:w="http://schemas.openxmlformats.org/wordprocessingml/2006/main" xmlns:w14="http://schemas.microsoft.com/office/word/2010/wordml" xmlns:w15="http://schemas.microsoft.com/office/word/2012/wordml" xmlns:w16cex="http://schemas.microsoft.com/office/word/2018/wordml/cex" xmlns:w16cid="http://schemas.microsoft.com/office/word/2016/wordml/cid" xmlns:w16="http://schemas.microsoft.com/office/word/2018/wordml" xmlns:w16du="http://schemas.microsoft.com/office/word/2023/wordml/word16du" xmlns:w16sdtdh="http://schemas.microsoft.com/office/word/2020/wordml/sdtdatahash" xmlns:w16sdtfl="http://schemas.microsoft.com/office/word/2024/wordml/sdtformatlock" xmlns:w16se="http://schemas.microsoft.com/office/word/2015/wordml/symex" xmlns:wpg="http://schemas.microsoft.com/office/word/2010/wordprocessingGroup" xmlns:wpi="http://schemas.microsoft.com/office/word/2010/wordprocessingInk" xmlns:wne="http://schemas.microsoft.com/office/word/2006/wordml" xmlns:wps="http://schemas.microsoft.com/office/word/2010/wordprocessingShape" mc:Ignorable="w14 w15 w16se w16cid w16 w16cex w16sdtdh w16sdtfl w16du wp14">
   <w:p>
     <w:pPr>
       <w:pStyle w:val="Footer"/>
@@ -4960,7 +4079,7 @@
 </file>
 
 <file path=word/header1.xml><?xml version="1.0" encoding="utf-8"?>
-<w:hdr xmlns:wpc="http://schemas.microsoft.com/office/word/2010/wordprocessingCanvas" xmlns:mc="http://schemas.openxmlformats.org/markup-compatibility/2006" xmlns:o="urn:schemas-microsoft-com:office:office" xmlns:r="http://schemas.openxmlformats.org/officeDocument/2006/relationships" xmlns:m="http://schemas.openxmlformats.org/officeDocument/2006/math" xmlns:v="urn:schemas-microsoft-com:vml" xmlns:wp14="http://schemas.microsoft.com/office/word/2010/wordprocessingDrawing" xmlns:wp="http://schemas.openxmlformats.org/drawingml/2006/wordprocessingDrawing" xmlns:w10="urn:schemas-microsoft-com:office:word" xmlns:w="http://schemas.openxmlformats.org/wordprocessingml/2006/main" xmlns:w14="http://schemas.microsoft.com/office/word/2010/wordml" xmlns:w15="http://schemas.microsoft.com/office/word/2012/wordml" xmlns:w16se="http://schemas.microsoft.com/office/word/2015/wordml/symex" xmlns:w16cid="http://schemas.microsoft.com/office/word/2016/wordml/cid" xmlns:w16="http://schemas.microsoft.com/office/word/2018/wordml" xmlns:w16cex="http://schemas.microsoft.com/office/word/2018/wordml/cex" xmlns:w16sdtdh="http://schemas.microsoft.com/office/word/2020/wordml/sdtdatahash" xmlns:wne="http://schemas.microsoft.com/office/word/2006/wordml" xmlns:wpg="http://schemas.microsoft.com/office/word/2010/wordprocessingGroup" xmlns:wps="http://schemas.microsoft.com/office/word/2010/wordprocessingShape">
+<w:hdr xmlns:wpc="http://schemas.microsoft.com/office/word/2010/wordprocessingCanvas" xmlns:cx="http://schemas.microsoft.com/office/drawing/2014/chartex" xmlns:cx1="http://schemas.microsoft.com/office/drawing/2015/9/8/chartex" xmlns:cx2="http://schemas.microsoft.com/office/drawing/2015/10/21/chartex" xmlns:cx3="http://schemas.microsoft.com/office/drawing/2016/5/9/chartex" xmlns:cx4="http://schemas.microsoft.com/office/drawing/2016/5/10/chartex" xmlns:cx5="http://schemas.microsoft.com/office/drawing/2016/5/11/chartex" xmlns:cx6="http://schemas.microsoft.com/office/drawing/2016/5/12/chartex" xmlns:cx7="http://schemas.microsoft.com/office/drawing/2016/5/13/chartex" xmlns:cx8="http://schemas.microsoft.com/office/drawing/2016/5/14/chartex" xmlns:mc="http://schemas.openxmlformats.org/markup-compatibility/2006" xmlns:aink="http://schemas.microsoft.com/office/drawing/2016/ink" xmlns:am3d="http://schemas.microsoft.com/office/drawing/2017/model3d" xmlns:o="urn:schemas-microsoft-com:office:office" xmlns:oel="http://schemas.microsoft.com/office/2019/extlst" xmlns:r="http://schemas.openxmlformats.org/officeDocument/2006/relationships" xmlns:m="http://schemas.openxmlformats.org/officeDocument/2006/math" xmlns:v="urn:schemas-microsoft-com:vml" xmlns:wp14="http://schemas.microsoft.com/office/word/2010/wordprocessingDrawing" xmlns:wp="http://schemas.openxmlformats.org/drawingml/2006/wordprocessingDrawing" xmlns:w10="urn:schemas-microsoft-com:office:word" xmlns:w="http://schemas.openxmlformats.org/wordprocessingml/2006/main" xmlns:w14="http://schemas.microsoft.com/office/word/2010/wordml" xmlns:w15="http://schemas.microsoft.com/office/word/2012/wordml" xmlns:w16cex="http://schemas.microsoft.com/office/word/2018/wordml/cex" xmlns:w16cid="http://schemas.microsoft.com/office/word/2016/wordml/cid" xmlns:w16="http://schemas.microsoft.com/office/word/2018/wordml" xmlns:w16du="http://schemas.microsoft.com/office/word/2023/wordml/word16du" xmlns:w16sdtdh="http://schemas.microsoft.com/office/word/2020/wordml/sdtdatahash" xmlns:w16sdtfl="http://schemas.microsoft.com/office/word/2024/wordml/sdtformatlock" xmlns:w16se="http://schemas.microsoft.com/office/word/2015/wordml/symex" xmlns:wpg="http://schemas.microsoft.com/office/word/2010/wordprocessingGroup" xmlns:wpi="http://schemas.microsoft.com/office/word/2010/wordprocessingInk" xmlns:wne="http://schemas.microsoft.com/office/word/2006/wordml" xmlns:wps="http://schemas.microsoft.com/office/word/2010/wordprocessingShape" mc:Ignorable="w14 w15 w16se w16cid w16 w16cex w16sdtdh w16sdtfl w16du wp14">
   <w:p>
     <w:pPr>
       <w:jc w:val="center"/>
@@ -4972,12 +4091,13 @@
     </w:pPr>
     <w:r>
       <w:rPr>
-        <w:rFonts w:ascii="Bookman Old Style" w:hAnsi="Bookman Old Style" w:eastAsia="Times New Roman"/>
+        <w:rFonts w:ascii="Bookman Old Style" w:eastAsia="Times New Roman" w:hAnsi="Bookman Old Style"/>
+        <w:noProof/>
         <w:sz w:val="28"/>
         <w:szCs w:val="28"/>
       </w:rPr>
       <w:drawing>
-        <wp:anchor distT="0" distB="0" distL="114300" distR="114300" simplePos="0" relativeHeight="251658240" behindDoc="0" locked="0" layoutInCell="1" allowOverlap="1">
+        <wp:anchor distT="0" distB="0" distL="114300" distR="114300" simplePos="0" relativeHeight="251658240" behindDoc="0" locked="0" layoutInCell="1" allowOverlap="1" wp14:anchorId="72478C17" wp14:editId="3DD630F6">
           <wp:simplePos x="0" y="0"/>
           <wp:positionH relativeFrom="column">
             <wp:posOffset>399415</wp:posOffset>
@@ -4988,7 +4108,7 @@
           <wp:extent cx="1028700" cy="911860"/>
           <wp:effectExtent l="0" t="0" r="0" b="2540"/>
           <wp:wrapNone/>
-          <wp:docPr id="10" name="image2.jpeg" descr="logo-CvSU-2"/>
+          <wp:docPr id="10" name="Picture 10" descr="logo-CvSU-2"/>
           <wp:cNvGraphicFramePr>
             <a:graphicFrameLocks xmlns:a="http://schemas.openxmlformats.org/drawingml/2006/main" noChangeAspect="1"/>
           </wp:cNvGraphicFramePr>
@@ -4996,16 +4116,25 @@
             <a:graphicData uri="http://schemas.openxmlformats.org/drawingml/2006/picture">
               <pic:pic xmlns:pic="http://schemas.openxmlformats.org/drawingml/2006/picture">
                 <pic:nvPicPr>
-                  <pic:cNvPr id="10" name="image2.jpeg" descr="logo-CvSU-2"/>
-                  <pic:cNvPicPr/>
+                  <pic:cNvPr id="0" name="Picture 2" descr="logo-CvSU-2"/>
+                  <pic:cNvPicPr>
+                    <a:picLocks noChangeAspect="1" noChangeArrowheads="1"/>
+                  </pic:cNvPicPr>
                 </pic:nvPicPr>
                 <pic:blipFill>
-                  <a:blip r:embed="rId4"/>
+                  <a:blip r:embed="rId1">
+                    <a:extLst>
+                      <a:ext uri="{28A0092B-C50C-407E-A947-70E740481C1C}">
+                        <a14:useLocalDpi xmlns:a14="http://schemas.microsoft.com/office/drawing/2010/main" val="0"/>
+                      </a:ext>
+                    </a:extLst>
+                  </a:blip>
+                  <a:srcRect/>
                   <a:stretch>
                     <a:fillRect/>
                   </a:stretch>
                 </pic:blipFill>
-                <pic:spPr>
+                <pic:spPr bwMode="auto">
                   <a:xfrm>
                     <a:off x="0" y="0"/>
                     <a:ext cx="1028700" cy="911860"/>
@@ -5013,16 +4142,24 @@
                   <a:prstGeom prst="rect">
                     <a:avLst/>
                   </a:prstGeom>
+                  <a:noFill/>
                 </pic:spPr>
               </pic:pic>
             </a:graphicData>
           </a:graphic>
+          <wp14:sizeRelH relativeFrom="page">
+            <wp14:pctWidth>0</wp14:pctWidth>
+          </wp14:sizeRelH>
+          <wp14:sizeRelV relativeFrom="page">
+            <wp14:pctHeight>0</wp14:pctHeight>
+          </wp14:sizeRelV>
         </wp:anchor>
       </w:drawing>
     </w:r>
     <w:r>
       <w:rPr>
         <w:rFonts w:ascii="Century Gothic" w:hAnsi="Century Gothic"/>
+        <w:snapToGrid w:val="0"/>
         <w:color w:val="000000"/>
       </w:rPr>
       <w:t>Republic of the Philippines</w:t>
@@ -5034,9 +4171,19 @@
       <w:rPr>
         <w:rFonts w:ascii="Bookman Old Style" w:hAnsi="Bookman Old Style"/>
         <w:b/>
+        <w:snapToGrid w:val="0"/>
         <w:color w:val="000000"/>
       </w:rPr>
     </w:pPr>
+    <w:r>
+      <w:rPr>
+        <w:rFonts w:ascii="Bookman Old Style" w:hAnsi="Bookman Old Style"/>
+        <w:b/>
+        <w:sz w:val="28"/>
+        <w:szCs w:val="28"/>
+      </w:rPr>
+      <w:t>CAVITE STATE UNIVERSITY</w:t>
+    </w:r>
   </w:p>
   <w:p>
     <w:pPr>
@@ -5044,6 +4191,7 @@
       <w:rPr>
         <w:rFonts w:ascii="Century Gothic" w:hAnsi="Century Gothic"/>
         <w:b/>
+        <w:snapToGrid w:val="0"/>
         <w:color w:val="000000"/>
       </w:rPr>
     </w:pPr>
@@ -5051,6 +4199,7 @@
       <w:rPr>
         <w:rFonts w:ascii="Century Gothic" w:hAnsi="Century Gothic"/>
         <w:b/>
+        <w:snapToGrid w:val="0"/>
         <w:color w:val="000000"/>
       </w:rPr>
       <w:t>Don Severino delas Alas Campus</w:t>
@@ -5060,13 +4209,15 @@
     <w:pPr>
       <w:jc w:val="center"/>
       <w:rPr>
-        <w:rFonts w:ascii="Arial" w:hAnsi="Arial" w:eastAsia="Times New Roman" w:cs="Arial"/>
+        <w:rFonts w:ascii="Arial" w:eastAsia="Times New Roman" w:hAnsi="Arial" w:cs="Arial"/>
+        <w:snapToGrid w:val="0"/>
         <w:color w:val="000000"/>
       </w:rPr>
     </w:pPr>
     <w:r>
       <w:rPr>
         <w:rFonts w:ascii="Century Gothic" w:hAnsi="Century Gothic"/>
+        <w:snapToGrid w:val="0"/>
         <w:color w:val="000000"/>
         <w:sz w:val="20"/>
         <w:szCs w:val="20"/>
@@ -5080,7 +4231,8 @@
         <w:tab w:val="left" w:pos="360"/>
       </w:tabs>
       <w:rPr>
-        <w:rFonts w:ascii="Arial" w:hAnsi="Arial" w:eastAsia="Times New Roman" w:cs="Arial"/>
+        <w:rFonts w:ascii="Arial" w:eastAsia="Times New Roman" w:hAnsi="Arial" w:cs="Arial"/>
+        <w:snapToGrid w:val="0"/>
         <w:color w:val="000000"/>
       </w:rPr>
     </w:pPr>
@@ -5091,7 +4243,8 @@
         <w:tab w:val="left" w:pos="360"/>
       </w:tabs>
       <w:rPr>
-        <w:rFonts w:ascii="Arial" w:hAnsi="Arial" w:eastAsia="Times New Roman" w:cs="Arial"/>
+        <w:rFonts w:ascii="Arial" w:eastAsia="Times New Roman" w:hAnsi="Arial" w:cs="Arial"/>
+        <w:snapToGrid w:val="0"/>
         <w:color w:val="000000"/>
       </w:rPr>
     </w:pPr>
@@ -5100,13 +4253,13 @@
     <w:pPr>
       <w:jc w:val="center"/>
       <w:rPr>
-        <w:rFonts w:ascii="Arial" w:hAnsi="Arial" w:eastAsia="Times New Roman" w:cs="Arial"/>
+        <w:rFonts w:ascii="Arial" w:eastAsia="Times New Roman" w:hAnsi="Arial" w:cs="Arial"/>
         <w:b/>
       </w:rPr>
     </w:pPr>
     <w:r>
       <w:rPr>
-        <w:rFonts w:ascii="Arial" w:hAnsi="Arial" w:eastAsia="Times New Roman" w:cs="Arial"/>
+        <w:rFonts w:ascii="Arial" w:eastAsia="Times New Roman" w:hAnsi="Arial" w:cs="Arial"/>
         <w:b/>
       </w:rPr>
       <w:t>COLLEGE OF ENGINEERING AND INFORMATION TECHNOLOGY</w:t>
@@ -5116,7 +4269,7 @@
     <w:pPr>
       <w:jc w:val="center"/>
       <w:rPr>
-        <w:rFonts w:ascii="Arial" w:hAnsi="Arial" w:eastAsia="Times New Roman" w:cs="Arial"/>
+        <w:rFonts w:ascii="Arial" w:eastAsia="Times New Roman" w:hAnsi="Arial" w:cs="Arial"/>
         <w:b/>
       </w:rPr>
     </w:pPr>
@@ -5126,16 +4279,23 @@
       <w:pStyle w:val="Header"/>
       <w:jc w:val="center"/>
       <w:rPr>
-        <w:rFonts w:ascii="Arial" w:hAnsi="Arial" w:eastAsia="Times New Roman" w:cs="Arial"/>
+        <w:rFonts w:ascii="Arial" w:eastAsia="Times New Roman" w:hAnsi="Arial" w:cs="Arial"/>
         <w:b/>
       </w:rPr>
     </w:pPr>
     <w:r>
       <w:rPr>
-        <w:rFonts w:ascii="Arial" w:hAnsi="Arial" w:eastAsia="Times New Roman" w:cs="Arial"/>
+        <w:rFonts w:ascii="Arial" w:eastAsia="Times New Roman" w:hAnsi="Arial" w:cs="Arial"/>
         <w:b/>
       </w:rPr>
-      <w:t>FINAL GRADE DISCUSSION AND ACKNOWLEDGMENT FORM</w:t>
+      <w:t xml:space="preserve">FINAL </w:t>
+    </w:r>
+    <w:r>
+      <w:rPr>
+        <w:rFonts w:ascii="Arial" w:eastAsia="Times New Roman" w:hAnsi="Arial" w:cs="Arial"/>
+        <w:b/>
+      </w:rPr>
+      <w:t>GRADE DISCUSSION AND ACKNOWLEDGMENT FORM</w:t>
     </w:r>
   </w:p>
   <w:p>
@@ -5151,7 +4311,7 @@
 </file>
 
 <file path=word/numbering.xml><?xml version="1.0" encoding="utf-8"?>
-<w:numbering xmlns:wpc="http://schemas.microsoft.com/office/word/2010/wordprocessingCanvas" xmlns:cx="http://schemas.microsoft.com/office/drawing/2014/chartex" xmlns:cx1="http://schemas.microsoft.com/office/drawing/2015/9/8/chartex" xmlns:cx2="http://schemas.microsoft.com/office/drawing/2015/10/21/chartex" xmlns:cx3="http://schemas.microsoft.com/office/drawing/2016/5/9/chartex" xmlns:cx4="http://schemas.microsoft.com/office/drawing/2016/5/10/chartex" xmlns:cx5="http://schemas.microsoft.com/office/drawing/2016/5/11/chartex" xmlns:cx6="http://schemas.microsoft.com/office/drawing/2016/5/12/chartex" xmlns:cx7="http://schemas.microsoft.com/office/drawing/2016/5/13/chartex" xmlns:cx8="http://schemas.microsoft.com/office/drawing/2016/5/14/chartex" xmlns:mc="http://schemas.openxmlformats.org/markup-compatibility/2006" xmlns:aink="http://schemas.microsoft.com/office/drawing/2016/ink" xmlns:am3d="http://schemas.microsoft.com/office/drawing/2017/model3d" xmlns:o="urn:schemas-microsoft-com:office:office" xmlns:r="http://schemas.openxmlformats.org/officeDocument/2006/relationships" xmlns:m="http://schemas.openxmlformats.org/officeDocument/2006/math" xmlns:v="urn:schemas-microsoft-com:vml" xmlns:wp14="http://schemas.microsoft.com/office/word/2010/wordprocessingDrawing" xmlns:wp="http://schemas.openxmlformats.org/drawingml/2006/wordprocessingDrawing" xmlns:w10="urn:schemas-microsoft-com:office:word" xmlns:w="http://schemas.openxmlformats.org/wordprocessingml/2006/main" xmlns:w14="http://schemas.microsoft.com/office/word/2010/wordml" xmlns:w15="http://schemas.microsoft.com/office/word/2012/wordml" xmlns:w16cex="http://schemas.microsoft.com/office/word/2018/wordml/cex" xmlns:w16cid="http://schemas.microsoft.com/office/word/2016/wordml/cid" xmlns:w16="http://schemas.microsoft.com/office/word/2018/wordml" xmlns:w16se="http://schemas.microsoft.com/office/word/2015/wordml/symex" xmlns:wpg="http://schemas.microsoft.com/office/word/2010/wordprocessingGroup" xmlns:wpi="http://schemas.microsoft.com/office/word/2010/wordprocessingInk" xmlns:wne="http://schemas.microsoft.com/office/word/2006/wordml" xmlns:wps="http://schemas.microsoft.com/office/word/2010/wordprocessingShape" mc:Ignorable="w14 w15 w16se w16cid w16 w16cex wp14">
+<w:numbering xmlns:wpc="http://schemas.microsoft.com/office/word/2010/wordprocessingCanvas" xmlns:cx="http://schemas.microsoft.com/office/drawing/2014/chartex" xmlns:cx1="http://schemas.microsoft.com/office/drawing/2015/9/8/chartex" xmlns:cx2="http://schemas.microsoft.com/office/drawing/2015/10/21/chartex" xmlns:cx3="http://schemas.microsoft.com/office/drawing/2016/5/9/chartex" xmlns:cx4="http://schemas.microsoft.com/office/drawing/2016/5/10/chartex" xmlns:cx5="http://schemas.microsoft.com/office/drawing/2016/5/11/chartex" xmlns:cx6="http://schemas.microsoft.com/office/drawing/2016/5/12/chartex" xmlns:cx7="http://schemas.microsoft.com/office/drawing/2016/5/13/chartex" xmlns:cx8="http://schemas.microsoft.com/office/drawing/2016/5/14/chartex" xmlns:mc="http://schemas.openxmlformats.org/markup-compatibility/2006" xmlns:aink="http://schemas.microsoft.com/office/drawing/2016/ink" xmlns:am3d="http://schemas.microsoft.com/office/drawing/2017/model3d" xmlns:o="urn:schemas-microsoft-com:office:office" xmlns:oel="http://schemas.microsoft.com/office/2019/extlst" xmlns:r="http://schemas.openxmlformats.org/officeDocument/2006/relationships" xmlns:m="http://schemas.openxmlformats.org/officeDocument/2006/math" xmlns:v="urn:schemas-microsoft-com:vml" xmlns:wp14="http://schemas.microsoft.com/office/word/2010/wordprocessingDrawing" xmlns:wp="http://schemas.openxmlformats.org/drawingml/2006/wordprocessingDrawing" xmlns:w10="urn:schemas-microsoft-com:office:word" xmlns:w="http://schemas.openxmlformats.org/wordprocessingml/2006/main" xmlns:w14="http://schemas.microsoft.com/office/word/2010/wordml" xmlns:w15="http://schemas.microsoft.com/office/word/2012/wordml" xmlns:w16cex="http://schemas.microsoft.com/office/word/2018/wordml/cex" xmlns:w16cid="http://schemas.microsoft.com/office/word/2016/wordml/cid" xmlns:w16="http://schemas.microsoft.com/office/word/2018/wordml" xmlns:w16du="http://schemas.microsoft.com/office/word/2023/wordml/word16du" xmlns:w16sdtdh="http://schemas.microsoft.com/office/word/2020/wordml/sdtdatahash" xmlns:w16sdtfl="http://schemas.microsoft.com/office/word/2024/wordml/sdtformatlock" xmlns:w16se="http://schemas.microsoft.com/office/word/2015/wordml/symex" xmlns:wpg="http://schemas.microsoft.com/office/word/2010/wordprocessingGroup" xmlns:wpi="http://schemas.microsoft.com/office/word/2010/wordprocessingInk" xmlns:wne="http://schemas.microsoft.com/office/word/2006/wordml" xmlns:wps="http://schemas.microsoft.com/office/word/2010/wordprocessingShape" mc:Ignorable="w14 w15 w16se w16cid w16 w16cex w16sdtdh w16sdtfl w16du wp14">
   <w:abstractNum w:abstractNumId="0" w15:restartNumberingAfterBreak="0">
     <w:nsid w:val="0E6F5C24"/>
     <w:multiLevelType w:val="hybridMultilevel"/>
@@ -5355,17 +4515,17 @@
       </w:pPr>
     </w:lvl>
   </w:abstractNum>
-  <w:num w:numId="1">
+  <w:num w:numId="1" w16cid:durableId="4207846">
     <w:abstractNumId w:val="1"/>
   </w:num>
-  <w:num w:numId="2">
+  <w:num w:numId="2" w16cid:durableId="409811935">
     <w:abstractNumId w:val="0"/>
   </w:num>
 </w:numbering>
 </file>
 
 <file path=word/styles.xml><?xml version="1.0" encoding="utf-8"?>
-<w:styles xmlns:mc="http://schemas.openxmlformats.org/markup-compatibility/2006" xmlns:r="http://schemas.openxmlformats.org/officeDocument/2006/relationships" xmlns:w="http://schemas.openxmlformats.org/wordprocessingml/2006/main" xmlns:w14="http://schemas.microsoft.com/office/word/2010/wordml" xmlns:w15="http://schemas.microsoft.com/office/word/2012/wordml" xmlns:w16cex="http://schemas.microsoft.com/office/word/2018/wordml/cex" xmlns:w16cid="http://schemas.microsoft.com/office/word/2016/wordml/cid" xmlns:w16="http://schemas.microsoft.com/office/word/2018/wordml" xmlns:w16se="http://schemas.microsoft.com/office/word/2015/wordml/symex" mc:Ignorable="w14 w15 w16se w16cid w16 w16cex">
+<w:styles xmlns:mc="http://schemas.openxmlformats.org/markup-compatibility/2006" xmlns:r="http://schemas.openxmlformats.org/officeDocument/2006/relationships" xmlns:w="http://schemas.openxmlformats.org/wordprocessingml/2006/main" xmlns:w14="http://schemas.microsoft.com/office/word/2010/wordml" xmlns:w15="http://schemas.microsoft.com/office/word/2012/wordml" xmlns:w16cex="http://schemas.microsoft.com/office/word/2018/wordml/cex" xmlns:w16cid="http://schemas.microsoft.com/office/word/2016/wordml/cid" xmlns:w16="http://schemas.microsoft.com/office/word/2018/wordml" xmlns:w16du="http://schemas.microsoft.com/office/word/2023/wordml/word16du" xmlns:w16sdtdh="http://schemas.microsoft.com/office/word/2020/wordml/sdtdatahash" xmlns:w16sdtfl="http://schemas.microsoft.com/office/word/2024/wordml/sdtformatlock" xmlns:w16se="http://schemas.microsoft.com/office/word/2015/wordml/symex" mc:Ignorable="w14 w15 w16se w16cid w16 w16cex w16sdtdh w16sdtfl w16du">
   <w:docDefaults>
     <w:rPrDefault>
       <w:rPr>

</xml_diff>

<commit_message>
59: modularize backend into modules package, restore output parity, enforce 9/8/7/6 pt dynamic font ladder, clean templates, and add parity regression tests
</commit_message>
<xml_diff>
--- a/templates/Final-Grade-Discussion_LATEST.docx
+++ b/templates/Final-Grade-Discussion_LATEST.docx
@@ -380,65 +380,6 @@
               </w:rPr>
               <w:t>SUBJECT CODE / TITLE</w:t>
             </w:r>
-          </w:p>
-        </w:tc>
-        <w:tc>
-          <w:tcPr>
-            <w:tcW w:w="283" w:type="dxa"/>
-          </w:tcPr>
-          <w:p>
-            <w:pPr>
-              <w:jc w:val="both"/>
-              <w:rPr>
-                <w:rFonts w:ascii="Arial" w:hAnsi="Arial" w:cs="Arial"/>
-                <w:sz w:val="20"/>
-                <w:szCs w:val="20"/>
-              </w:rPr>
-            </w:pPr>
-            <w:r>
-              <w:rPr>
-                <w:rFonts w:ascii="Arial" w:hAnsi="Arial" w:cs="Arial"/>
-                <w:sz w:val="20"/>
-                <w:szCs w:val="20"/>
-              </w:rPr>
-              <w:t>:</w:t>
-            </w:r>
-          </w:p>
-        </w:tc>
-        <w:tc>
-          <w:tcPr>
-            <w:tcW w:w="4241" w:type="dxa"/>
-            <w:tcBorders>
-              <w:top w:val="single" w:sz="4" w:space="0" w:color="auto"/>
-              <w:bottom w:val="single" w:sz="4" w:space="0" w:color="auto"/>
-            </w:tcBorders>
-          </w:tcPr>
-          <w:p>
-            <w:pPr>
-              <w:jc w:val="both"/>
-              <w:rPr>
-                <w:rFonts w:ascii="Arial" w:hAnsi="Arial" w:cs="Arial"/>
-                <w:sz w:val="20"/>
-                <w:szCs w:val="20"/>
-              </w:rPr>
-            </w:pPr>
-          </w:p>
-        </w:tc>
-      </w:tr>
-      <w:tr>
-        <w:tc>
-          <w:tcPr>
-            <w:tcW w:w="4361" w:type="dxa"/>
-          </w:tcPr>
-          <w:p>
-            <w:pPr>
-              <w:jc w:val="both"/>
-              <w:rPr>
-                <w:rFonts w:ascii="Arial" w:hAnsi="Arial" w:cs="Arial"/>
-                <w:sz w:val="20"/>
-                <w:szCs w:val="20"/>
-              </w:rPr>
-            </w:pPr>
           </w:p>
         </w:tc>
         <w:tc>

</xml_diff>

<commit_message>
60: restore exact font size and typography parity matching SCHOOL FILES 2026 reference across all document types
</commit_message>
<xml_diff>
--- a/templates/Final-Grade-Discussion_LATEST.docx
+++ b/templates/Final-Grade-Discussion_LATEST.docx
@@ -1,165 +1,72 @@
 
 <file path=word/document.xml><?xml version="1.0" encoding="utf-8"?>
-<w:document xmlns:wpc="http://schemas.microsoft.com/office/word/2010/wordprocessingCanvas" xmlns:cx="http://schemas.microsoft.com/office/drawing/2014/chartex" xmlns:cx1="http://schemas.microsoft.com/office/drawing/2015/9/8/chartex" xmlns:cx2="http://schemas.microsoft.com/office/drawing/2015/10/21/chartex" xmlns:cx3="http://schemas.microsoft.com/office/drawing/2016/5/9/chartex" xmlns:cx4="http://schemas.microsoft.com/office/drawing/2016/5/10/chartex" xmlns:cx5="http://schemas.microsoft.com/office/drawing/2016/5/11/chartex" xmlns:cx6="http://schemas.microsoft.com/office/drawing/2016/5/12/chartex" xmlns:cx7="http://schemas.microsoft.com/office/drawing/2016/5/13/chartex" xmlns:cx8="http://schemas.microsoft.com/office/drawing/2016/5/14/chartex" xmlns:mc="http://schemas.openxmlformats.org/markup-compatibility/2006" xmlns:aink="http://schemas.microsoft.com/office/drawing/2016/ink" xmlns:am3d="http://schemas.microsoft.com/office/drawing/2017/model3d" xmlns:o="urn:schemas-microsoft-com:office:office" xmlns:oel="http://schemas.microsoft.com/office/2019/extlst" xmlns:r="http://schemas.openxmlformats.org/officeDocument/2006/relationships" xmlns:m="http://schemas.openxmlformats.org/officeDocument/2006/math" xmlns:v="urn:schemas-microsoft-com:vml" xmlns:wp14="http://schemas.microsoft.com/office/word/2010/wordprocessingDrawing" xmlns:wp="http://schemas.openxmlformats.org/drawingml/2006/wordprocessingDrawing" xmlns:w10="urn:schemas-microsoft-com:office:word" xmlns:w="http://schemas.openxmlformats.org/wordprocessingml/2006/main" xmlns:w14="http://schemas.microsoft.com/office/word/2010/wordml" xmlns:w15="http://schemas.microsoft.com/office/word/2012/wordml" xmlns:w16cex="http://schemas.microsoft.com/office/word/2018/wordml/cex" xmlns:w16cid="http://schemas.microsoft.com/office/word/2016/wordml/cid" xmlns:w16="http://schemas.microsoft.com/office/word/2018/wordml" xmlns:w16du="http://schemas.microsoft.com/office/word/2023/wordml/word16du" xmlns:w16sdtdh="http://schemas.microsoft.com/office/word/2020/wordml/sdtdatahash" xmlns:w16sdtfl="http://schemas.microsoft.com/office/word/2024/wordml/sdtformatlock" xmlns:w16se="http://schemas.microsoft.com/office/word/2015/wordml/symex" xmlns:wpg="http://schemas.microsoft.com/office/word/2010/wordprocessingGroup" xmlns:wpi="http://schemas.microsoft.com/office/word/2010/wordprocessingInk" xmlns:wne="http://schemas.microsoft.com/office/word/2006/wordml" xmlns:wps="http://schemas.microsoft.com/office/word/2010/wordprocessingShape" mc:Ignorable="w14 w15 w16se w16cid w16 w16cex w16sdtdh w16sdtfl w16du wp14">
+<w:document xmlns:wpc="http://schemas.microsoft.com/office/word/2010/wordprocessingCanvas" xmlns:mc="http://schemas.openxmlformats.org/markup-compatibility/2006" xmlns:o="urn:schemas-microsoft-com:office:office" xmlns:r="http://schemas.openxmlformats.org/officeDocument/2006/relationships" xmlns:m="http://schemas.openxmlformats.org/officeDocument/2006/math" xmlns:v="urn:schemas-microsoft-com:vml" xmlns:wp14="http://schemas.microsoft.com/office/word/2010/wordprocessingDrawing" xmlns:wp="http://schemas.openxmlformats.org/drawingml/2006/wordprocessingDrawing" xmlns:w10="urn:schemas-microsoft-com:office:word" xmlns:w="http://schemas.openxmlformats.org/wordprocessingml/2006/main" xmlns:w14="http://schemas.microsoft.com/office/word/2010/wordml" xmlns:w15="http://schemas.microsoft.com/office/word/2012/wordml" xmlns:w16se="http://schemas.microsoft.com/office/word/2015/wordml/symex" xmlns:w16cid="http://schemas.microsoft.com/office/word/2016/wordml/cid" xmlns:w16="http://schemas.microsoft.com/office/word/2018/wordml" xmlns:w16cex="http://schemas.microsoft.com/office/word/2018/wordml/cex" xmlns:w16sdtdh="http://schemas.microsoft.com/office/word/2020/wordml/sdtdatahash" xmlns:wne="http://schemas.microsoft.com/office/word/2006/wordml" xmlns:wpg="http://schemas.microsoft.com/office/word/2010/wordprocessingGroup" xmlns:wps="http://schemas.microsoft.com/office/word/2010/wordprocessingShape" mc:Ignorable="w14 w15 w16se w16cid w16 w16cex w16sdtdh wp14">
   <w:body>
     <w:p>
-      <w:pPr>
-        <w:jc w:val="both"/>
-        <w:rPr>
-          <w:rFonts w:ascii="Arial" w:hAnsi="Arial" w:cs="Arial"/>
-          <w:b/>
-          <w:sz w:val="12"/>
-          <w:szCs w:val="20"/>
-        </w:rPr>
-      </w:pPr>
       <w:r>
-        <w:rPr>
-          <w:rFonts w:ascii="Arial" w:hAnsi="Arial" w:cs="Arial"/>
-          <w:b/>
-          <w:noProof/>
-          <w:sz w:val="12"/>
-          <w:szCs w:val="20"/>
-        </w:rPr>
-        <mc:AlternateContent>
-          <mc:Choice Requires="wps">
-            <w:drawing>
-              <wp:anchor distT="0" distB="0" distL="114300" distR="114300" simplePos="0" relativeHeight="251658240" behindDoc="0" locked="0" layoutInCell="1" allowOverlap="1" wp14:anchorId="0D881622" wp14:editId="38C5BC31">
-                <wp:simplePos x="0" y="0"/>
-                <wp:positionH relativeFrom="column">
-                  <wp:posOffset>4312969</wp:posOffset>
-                </wp:positionH>
-                <wp:positionV relativeFrom="paragraph">
-                  <wp:posOffset>-1542513</wp:posOffset>
-                </wp:positionV>
-                <wp:extent cx="1508760" cy="247015"/>
-                <wp:effectExtent l="0" t="0" r="15240" b="24765"/>
-                <wp:wrapNone/>
-                <wp:docPr id="307" name="Text Box 307"/>
-                <wp:cNvGraphicFramePr>
-                  <a:graphicFrameLocks xmlns:a="http://schemas.openxmlformats.org/drawingml/2006/main"/>
-                </wp:cNvGraphicFramePr>
-                <a:graphic xmlns:a="http://schemas.openxmlformats.org/drawingml/2006/main">
-                  <a:graphicData uri="http://schemas.microsoft.com/office/word/2010/wordprocessingShape">
-                    <wps:wsp>
-                      <wps:cNvSpPr txBox="1">
-                        <a:spLocks noChangeArrowheads="1"/>
-                      </wps:cNvSpPr>
-                      <wps:spPr bwMode="auto">
-                        <a:xfrm>
-                          <a:off x="0" y="0"/>
-                          <a:ext cx="1508760" cy="247015"/>
-                        </a:xfrm>
-                        <a:prstGeom prst="rect">
-                          <a:avLst/>
-                        </a:prstGeom>
-                        <a:solidFill>
-                          <a:srgbClr val="FFFFFF"/>
-                        </a:solidFill>
-                        <a:ln w="9525">
-                          <a:solidFill>
-                            <a:schemeClr val="bg1"/>
-                          </a:solidFill>
-                          <a:miter lim="800000"/>
-                          <a:headEnd/>
-                          <a:tailEnd/>
-                        </a:ln>
-                      </wps:spPr>
-                      <wps:txbx>
-                        <w:txbxContent>
-                          <w:p>
-                            <w:pPr>
-                              <w:jc w:val="center"/>
-                              <w:rPr>
-                                <w:i/>
-                                <w:sz w:val="18"/>
-                                <w:szCs w:val="18"/>
-                              </w:rPr>
-                            </w:pPr>
-                            <w:r>
-                              <w:rPr>
-                                <w:rFonts w:ascii="Arial" w:hAnsi="Arial" w:cs="Arial"/>
-                                <w:i/>
-                                <w:sz w:val="18"/>
-                                <w:szCs w:val="18"/>
-                              </w:rPr>
-                              <w:t xml:space="preserve">CEIT- QF - </w:t>
-                            </w:r>
-                            <w:r>
-                              <w:rPr>
-                                <w:rFonts w:ascii="Arial" w:hAnsi="Arial" w:cs="Arial"/>
-                                <w:i/>
-                                <w:sz w:val="18"/>
-                                <w:szCs w:val="18"/>
-                              </w:rPr>
-                              <w:t>xx</w:t>
-                            </w:r>
-                          </w:p>
-                        </w:txbxContent>
-                      </wps:txbx>
-                      <wps:bodyPr rot="0" vert="horz" wrap="square" lIns="91440" tIns="45720" rIns="91440" bIns="45720" anchor="t" anchorCtr="0">
-                        <a:spAutoFit/>
-                      </wps:bodyPr>
-                    </wps:wsp>
-                  </a:graphicData>
-                </a:graphic>
-                <wp14:sizeRelH relativeFrom="margin">
-                  <wp14:pctWidth>0</wp14:pctWidth>
-                </wp14:sizeRelH>
-                <wp14:sizeRelV relativeFrom="margin">
-                  <wp14:pctHeight>20000</wp14:pctHeight>
-                </wp14:sizeRelV>
-              </wp:anchor>
-            </w:drawing>
-          </mc:Choice>
-          <mc:Fallback>
-            <w:pict>
-              <v:shapetype w14:anchorId="0D881622" id="_x0000_t202" coordsize="21600,21600" o:spt="202" path="m,l,21600r21600,l21600,xe">
-                <v:stroke joinstyle="miter"/>
-                <v:path gradientshapeok="t" o:connecttype="rect"/>
-              </v:shapetype>
-              <v:shape id="Text Box 307" o:spid="_x0000_s1026" type="#_x0000_t202" style="position:absolute;left:0;text-align:left;margin-left:339.6pt;margin-top:-121.45pt;width:118.8pt;height:19.45pt;z-index:251658240;visibility:visible;mso-wrap-style:square;mso-width-percent:0;mso-height-percent:200;mso-wrap-distance-left:9pt;mso-wrap-distance-top:0;mso-wrap-distance-right:9pt;mso-wrap-distance-bottom:0;mso-position-horizontal:absolute;mso-position-horizontal-relative:text;mso-position-vertical:absolute;mso-position-vertical-relative:text;mso-width-percent:0;mso-height-percent:200;mso-width-relative:margin;mso-height-relative:margin;v-text-anchor:top" o:gfxdata="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" strokecolor="white [3212]">
-                <v:textbox style="mso-fit-shape-to-text:t">
-                  <w:txbxContent>
-                    <w:p>
-                      <w:pPr>
-                        <w:jc w:val="center"/>
-                        <w:rPr>
-                          <w:i/>
-                          <w:sz w:val="18"/>
-                          <w:szCs w:val="18"/>
-                        </w:rPr>
-                      </w:pPr>
-                      <w:r>
-                        <w:rPr>
-                          <w:rFonts w:ascii="Arial" w:hAnsi="Arial" w:cs="Arial"/>
-                          <w:i/>
-                          <w:sz w:val="18"/>
-                          <w:szCs w:val="18"/>
-                        </w:rPr>
-                        <w:t xml:space="preserve">CEIT- QF - </w:t>
-                      </w:r>
-                      <w:r>
-                        <w:rPr>
-                          <w:rFonts w:ascii="Arial" w:hAnsi="Arial" w:cs="Arial"/>
-                          <w:i/>
-                          <w:sz w:val="18"/>
-                          <w:szCs w:val="18"/>
-                        </w:rPr>
-                        <w:t>xx</w:t>
-                      </w:r>
-                    </w:p>
-                  </w:txbxContent>
-                </v:textbox>
-              </v:shape>
-            </w:pict>
-          </mc:Fallback>
-        </mc:AlternateContent>
+        <w:drawing>
+          <wp:anchor distT="0" distB="0" distL="114300" distR="114300" simplePos="0" relativeHeight="251658240" behindDoc="0" locked="0" layoutInCell="1" allowOverlap="1">
+            <wp:simplePos x="0" y="0"/>
+            <wp:positionH relativeFrom="column">
+              <wp:posOffset>4312969</wp:posOffset>
+            </wp:positionH>
+            <wp:positionV relativeFrom="paragraph">
+              <wp:posOffset>-1542513</wp:posOffset>
+            </wp:positionV>
+            <wp:extent cx="1504950" cy="247650"/>
+            <wp:effectExtent l="0" t="0" r="0" b="0"/>
+            <wp:wrapNone/>
+            <wp:docPr id="100000" name="Picture 100000"/>
+            <wp:cNvGraphicFramePr>
+              <a:graphicFrameLocks xmlns:a="http://schemas.openxmlformats.org/drawingml/2006/main" noChangeAspect="1"/>
+            </wp:cNvGraphicFramePr>
+            <a:graphic xmlns:a="http://schemas.openxmlformats.org/drawingml/2006/main">
+              <a:graphicData uri="http://schemas.openxmlformats.org/drawingml/2006/picture">
+                <pic:pic xmlns:pic="http://schemas.openxmlformats.org/drawingml/2006/picture">
+                  <pic:nvPicPr>
+                    <pic:cNvPr id="100000" name="image100000"/>
+                    <pic:cNvPicPr/>
+                  </pic:nvPicPr>
+                  <pic:blipFill>
+                    <a:blip r:embed="rId1"/>
+                    <a:stretch>
+                      <a:fillRect/>
+                    </a:stretch>
+                  </pic:blipFill>
+                  <pic:spPr>
+                    <a:xfrm>
+                      <a:off x="0" y="0"/>
+                      <a:ext cx="1504950" cy="247650"/>
+                    </a:xfrm>
+                    <a:prstGeom prst="rect">
+                      <a:avLst/>
+                    </a:prstGeom>
+                  </pic:spPr>
+                </pic:pic>
+              </a:graphicData>
+            </a:graphic>
+          </wp:anchor>
+        </w:drawing>
       </w:r>
     </w:p>
     <w:tbl>
       <w:tblPr>
         <w:tblW w:w="0" w:type="auto"/>
-        <w:tblLook w:val="04A0" w:firstRow="1" w:lastRow="0" w:firstColumn="1" w:lastColumn="0" w:noHBand="0" w:noVBand="1"/>
+        <w:tblBorders>
+          <w:top w:val="single" w:sz="4" w:space="0" w:color="auto"/>
+          <w:left w:val="single" w:sz="4" w:space="0" w:color="auto"/>
+          <w:bottom w:val="single" w:sz="4" w:space="0" w:color="auto"/>
+          <w:right w:val="single" w:sz="4" w:space="0" w:color="auto"/>
+          <w:insideH w:val="single" w:sz="4" w:space="0" w:color="auto"/>
+          <w:insideV w:val="single" w:sz="4" w:space="0" w:color="auto"/>
+        </w:tblBorders>
+        <w:tblCellMar>
+          <w:top w:w="0" w:type="dxa"/>
+          <w:left w:w="108" w:type="dxa"/>
+          <w:bottom w:w="0" w:type="dxa"/>
+          <w:right w:w="108" w:type="dxa"/>
+        </w:tblCellMar>
+        <w:tblLook w:firstRow="1" w:firstColumn="1" w:noVBand="1"/>
       </w:tblPr>
       <w:tblGrid>
         <w:gridCol w:w="4285"/>
@@ -170,6 +77,18 @@
         <w:tc>
           <w:tcPr>
             <w:tcW w:w="4361" w:type="dxa"/>
+            <w:tcBorders>
+              <w:top w:val="none"/>
+              <w:left w:val="none"/>
+              <w:bottom w:val="none"/>
+              <w:right w:val="none"/>
+            </w:tcBorders>
+            <w:tcMar>
+              <w:top w:w="0" w:type="dxa"/>
+              <w:left w:w="108" w:type="dxa"/>
+              <w:bottom w:w="0" w:type="dxa"/>
+              <w:right w:w="108" w:type="dxa"/>
+            </w:tcMar>
           </w:tcPr>
           <w:p>
             <w:pPr>
@@ -182,7 +101,9 @@
             </w:pPr>
             <w:r>
               <w:rPr>
-                <w:rFonts w:ascii="Arial" w:hAnsi="Arial" w:cs="Arial"/>
+                <w:rFonts w:ascii="Arial" w:hAnsi="Arial" w:eastAsia="Calibri" w:cs="Arial" w:eastAsiaTheme="minorHAnsi"/>
+                <w:sz w:val="22"/>
+                <w:szCs w:val="22"/>
               </w:rPr>
               <w:t>INSTRUCTOR’S NAME/SIGNATURE</w:t>
             </w:r>
@@ -191,6 +112,18 @@
         <w:tc>
           <w:tcPr>
             <w:tcW w:w="283" w:type="dxa"/>
+            <w:tcBorders>
+              <w:top w:val="none"/>
+              <w:left w:val="none"/>
+              <w:bottom w:val="none"/>
+              <w:right w:val="none"/>
+            </w:tcBorders>
+            <w:tcMar>
+              <w:top w:w="0" w:type="dxa"/>
+              <w:left w:w="108" w:type="dxa"/>
+              <w:bottom w:w="0" w:type="dxa"/>
+              <w:right w:w="108" w:type="dxa"/>
+            </w:tcMar>
           </w:tcPr>
           <w:p>
             <w:pPr>
@@ -203,7 +136,7 @@
             </w:pPr>
             <w:r>
               <w:rPr>
-                <w:rFonts w:ascii="Arial" w:hAnsi="Arial" w:cs="Arial"/>
+                <w:rFonts w:ascii="Arial" w:hAnsi="Arial" w:eastAsia="Calibri" w:cs="Arial" w:eastAsiaTheme="minorHAnsi"/>
                 <w:sz w:val="20"/>
                 <w:szCs w:val="20"/>
               </w:rPr>
@@ -215,8 +148,17 @@
           <w:tcPr>
             <w:tcW w:w="4241" w:type="dxa"/>
             <w:tcBorders>
-              <w:bottom w:val="single" w:sz="4" w:space="0" w:color="auto"/>
-            </w:tcBorders>
+              <w:top w:val="none"/>
+              <w:left w:val="none"/>
+              <w:bottom w:val="single" w:sz="4" w:color="000000"/>
+              <w:right w:val="none"/>
+            </w:tcBorders>
+            <w:tcMar>
+              <w:top w:w="0" w:type="dxa"/>
+              <w:left w:w="108" w:type="dxa"/>
+              <w:bottom w:w="0" w:type="dxa"/>
+              <w:right w:w="108" w:type="dxa"/>
+            </w:tcMar>
           </w:tcPr>
           <w:p>
             <w:pPr>
@@ -234,6 +176,18 @@
         <w:tc>
           <w:tcPr>
             <w:tcW w:w="4361" w:type="dxa"/>
+            <w:tcBorders>
+              <w:top w:val="none"/>
+              <w:left w:val="none"/>
+              <w:bottom w:val="none"/>
+              <w:right w:val="none"/>
+            </w:tcBorders>
+            <w:tcMar>
+              <w:top w:w="0" w:type="dxa"/>
+              <w:left w:w="108" w:type="dxa"/>
+              <w:bottom w:w="0" w:type="dxa"/>
+              <w:right w:w="108" w:type="dxa"/>
+            </w:tcMar>
           </w:tcPr>
           <w:p>
             <w:pPr>
@@ -246,7 +200,9 @@
             </w:pPr>
             <w:r>
               <w:rPr>
-                <w:rFonts w:ascii="Arial" w:hAnsi="Arial" w:cs="Arial"/>
+                <w:rFonts w:ascii="Arial" w:hAnsi="Arial" w:eastAsia="Calibri" w:cs="Arial" w:eastAsiaTheme="minorHAnsi"/>
+                <w:sz w:val="22"/>
+                <w:szCs w:val="22"/>
               </w:rPr>
               <w:t>COURSE / YEAR / SECTION</w:t>
             </w:r>
@@ -255,6 +211,18 @@
         <w:tc>
           <w:tcPr>
             <w:tcW w:w="283" w:type="dxa"/>
+            <w:tcBorders>
+              <w:top w:val="none"/>
+              <w:left w:val="none"/>
+              <w:bottom w:val="none"/>
+              <w:right w:val="none"/>
+            </w:tcBorders>
+            <w:tcMar>
+              <w:top w:w="0" w:type="dxa"/>
+              <w:left w:w="108" w:type="dxa"/>
+              <w:bottom w:w="0" w:type="dxa"/>
+              <w:right w:w="108" w:type="dxa"/>
+            </w:tcMar>
           </w:tcPr>
           <w:p>
             <w:pPr>
@@ -267,7 +235,7 @@
             </w:pPr>
             <w:r>
               <w:rPr>
-                <w:rFonts w:ascii="Arial" w:hAnsi="Arial" w:cs="Arial"/>
+                <w:rFonts w:ascii="Arial" w:hAnsi="Arial" w:eastAsia="Calibri" w:cs="Arial" w:eastAsiaTheme="minorHAnsi"/>
                 <w:sz w:val="20"/>
                 <w:szCs w:val="20"/>
               </w:rPr>
@@ -279,9 +247,17 @@
           <w:tcPr>
             <w:tcW w:w="4241" w:type="dxa"/>
             <w:tcBorders>
-              <w:top w:val="single" w:sz="4" w:space="0" w:color="auto"/>
-              <w:bottom w:val="single" w:sz="4" w:space="0" w:color="auto"/>
-            </w:tcBorders>
+              <w:top w:val="single" w:sz="4" w:color="000000"/>
+              <w:left w:val="none"/>
+              <w:bottom w:val="single" w:sz="4" w:color="000000"/>
+              <w:right w:val="none"/>
+            </w:tcBorders>
+            <w:tcMar>
+              <w:top w:w="0" w:type="dxa"/>
+              <w:left w:w="108" w:type="dxa"/>
+              <w:bottom w:w="0" w:type="dxa"/>
+              <w:right w:w="108" w:type="dxa"/>
+            </w:tcMar>
           </w:tcPr>
           <w:p>
             <w:pPr>
@@ -299,6 +275,18 @@
         <w:tc>
           <w:tcPr>
             <w:tcW w:w="4361" w:type="dxa"/>
+            <w:tcBorders>
+              <w:top w:val="none"/>
+              <w:left w:val="none"/>
+              <w:bottom w:val="none"/>
+              <w:right w:val="none"/>
+            </w:tcBorders>
+            <w:tcMar>
+              <w:top w:w="0" w:type="dxa"/>
+              <w:left w:w="108" w:type="dxa"/>
+              <w:bottom w:w="0" w:type="dxa"/>
+              <w:right w:w="108" w:type="dxa"/>
+            </w:tcMar>
           </w:tcPr>
           <w:p>
             <w:pPr>
@@ -311,7 +299,9 @@
             </w:pPr>
             <w:r>
               <w:rPr>
-                <w:rFonts w:ascii="Arial" w:hAnsi="Arial" w:cs="Arial"/>
+                <w:rFonts w:ascii="Arial" w:hAnsi="Arial" w:eastAsia="Calibri" w:cs="Arial" w:eastAsiaTheme="minorHAnsi"/>
+                <w:sz w:val="22"/>
+                <w:szCs w:val="22"/>
               </w:rPr>
               <w:t>SCHEDULE CODE</w:t>
             </w:r>
@@ -320,6 +310,18 @@
         <w:tc>
           <w:tcPr>
             <w:tcW w:w="283" w:type="dxa"/>
+            <w:tcBorders>
+              <w:top w:val="none"/>
+              <w:left w:val="none"/>
+              <w:bottom w:val="none"/>
+              <w:right w:val="none"/>
+            </w:tcBorders>
+            <w:tcMar>
+              <w:top w:w="0" w:type="dxa"/>
+              <w:left w:w="108" w:type="dxa"/>
+              <w:bottom w:w="0" w:type="dxa"/>
+              <w:right w:w="108" w:type="dxa"/>
+            </w:tcMar>
           </w:tcPr>
           <w:p>
             <w:pPr>
@@ -332,7 +334,7 @@
             </w:pPr>
             <w:r>
               <w:rPr>
-                <w:rFonts w:ascii="Arial" w:hAnsi="Arial" w:cs="Arial"/>
+                <w:rFonts w:ascii="Arial" w:hAnsi="Arial" w:eastAsia="Calibri" w:cs="Arial" w:eastAsiaTheme="minorHAnsi"/>
                 <w:sz w:val="20"/>
                 <w:szCs w:val="20"/>
               </w:rPr>
@@ -344,9 +346,17 @@
           <w:tcPr>
             <w:tcW w:w="4241" w:type="dxa"/>
             <w:tcBorders>
-              <w:top w:val="single" w:sz="4" w:space="0" w:color="auto"/>
-              <w:bottom w:val="single" w:sz="4" w:space="0" w:color="auto"/>
-            </w:tcBorders>
+              <w:top w:val="single" w:sz="4" w:color="000000"/>
+              <w:left w:val="none"/>
+              <w:bottom w:val="single" w:sz="4" w:color="000000"/>
+              <w:right w:val="none"/>
+            </w:tcBorders>
+            <w:tcMar>
+              <w:top w:w="0" w:type="dxa"/>
+              <w:left w:w="108" w:type="dxa"/>
+              <w:bottom w:w="0" w:type="dxa"/>
+              <w:right w:w="108" w:type="dxa"/>
+            </w:tcMar>
           </w:tcPr>
           <w:p>
             <w:pPr>
@@ -364,6 +374,18 @@
         <w:tc>
           <w:tcPr>
             <w:tcW w:w="4361" w:type="dxa"/>
+            <w:tcBorders>
+              <w:top w:val="none"/>
+              <w:left w:val="none"/>
+              <w:bottom w:val="none"/>
+              <w:right w:val="none"/>
+            </w:tcBorders>
+            <w:tcMar>
+              <w:top w:w="0" w:type="dxa"/>
+              <w:left w:w="108" w:type="dxa"/>
+              <w:bottom w:w="0" w:type="dxa"/>
+              <w:right w:w="108" w:type="dxa"/>
+            </w:tcMar>
           </w:tcPr>
           <w:p>
             <w:pPr>
@@ -376,7 +398,9 @@
             </w:pPr>
             <w:r>
               <w:rPr>
-                <w:rFonts w:ascii="Arial" w:hAnsi="Arial" w:cs="Arial"/>
+                <w:rFonts w:ascii="Arial" w:hAnsi="Arial" w:eastAsia="Calibri" w:cs="Arial" w:eastAsiaTheme="minorHAnsi"/>
+                <w:sz w:val="22"/>
+                <w:szCs w:val="22"/>
               </w:rPr>
               <w:t>SUBJECT CODE / TITLE</w:t>
             </w:r>
@@ -385,6 +409,18 @@
         <w:tc>
           <w:tcPr>
             <w:tcW w:w="283" w:type="dxa"/>
+            <w:tcBorders>
+              <w:top w:val="none"/>
+              <w:left w:val="none"/>
+              <w:bottom w:val="none"/>
+              <w:right w:val="none"/>
+            </w:tcBorders>
+            <w:tcMar>
+              <w:top w:w="0" w:type="dxa"/>
+              <w:left w:w="108" w:type="dxa"/>
+              <w:bottom w:w="0" w:type="dxa"/>
+              <w:right w:w="108" w:type="dxa"/>
+            </w:tcMar>
           </w:tcPr>
           <w:p>
             <w:pPr>
@@ -397,7 +433,7 @@
             </w:pPr>
             <w:r>
               <w:rPr>
-                <w:rFonts w:ascii="Arial" w:hAnsi="Arial" w:cs="Arial"/>
+                <w:rFonts w:ascii="Arial" w:hAnsi="Arial" w:eastAsia="Calibri" w:cs="Arial" w:eastAsiaTheme="minorHAnsi"/>
                 <w:sz w:val="20"/>
                 <w:szCs w:val="20"/>
               </w:rPr>
@@ -409,9 +445,17 @@
           <w:tcPr>
             <w:tcW w:w="4241" w:type="dxa"/>
             <w:tcBorders>
-              <w:top w:val="single" w:sz="4" w:space="0" w:color="auto"/>
-              <w:bottom w:val="single" w:sz="4" w:space="0" w:color="auto"/>
-            </w:tcBorders>
+              <w:top w:val="single" w:sz="4" w:color="000000"/>
+              <w:left w:val="none"/>
+              <w:bottom w:val="single" w:sz="4" w:color="000000"/>
+              <w:right w:val="none"/>
+            </w:tcBorders>
+            <w:tcMar>
+              <w:top w:w="0" w:type="dxa"/>
+              <w:left w:w="108" w:type="dxa"/>
+              <w:bottom w:w="0" w:type="dxa"/>
+              <w:right w:w="108" w:type="dxa"/>
+            </w:tcMar>
           </w:tcPr>
           <w:p>
             <w:pPr>
@@ -429,6 +473,18 @@
         <w:tc>
           <w:tcPr>
             <w:tcW w:w="4361" w:type="dxa"/>
+            <w:tcBorders>
+              <w:top w:val="none"/>
+              <w:left w:val="none"/>
+              <w:bottom w:val="none"/>
+              <w:right w:val="none"/>
+            </w:tcBorders>
+            <w:tcMar>
+              <w:top w:w="0" w:type="dxa"/>
+              <w:left w:w="108" w:type="dxa"/>
+              <w:bottom w:w="0" w:type="dxa"/>
+              <w:right w:w="108" w:type="dxa"/>
+            </w:tcMar>
           </w:tcPr>
           <w:p>
             <w:pPr>
@@ -441,7 +497,9 @@
             </w:pPr>
             <w:r>
               <w:rPr>
-                <w:rFonts w:ascii="Arial" w:hAnsi="Arial" w:cs="Arial"/>
+                <w:rFonts w:ascii="Arial" w:hAnsi="Arial" w:eastAsia="Calibri" w:cs="Arial" w:eastAsiaTheme="minorHAnsi"/>
+                <w:sz w:val="22"/>
+                <w:szCs w:val="22"/>
               </w:rPr>
               <w:t>SEMESTER / ACADEMIC YEAR</w:t>
             </w:r>
@@ -450,6 +508,18 @@
         <w:tc>
           <w:tcPr>
             <w:tcW w:w="283" w:type="dxa"/>
+            <w:tcBorders>
+              <w:top w:val="none"/>
+              <w:left w:val="none"/>
+              <w:bottom w:val="none"/>
+              <w:right w:val="none"/>
+            </w:tcBorders>
+            <w:tcMar>
+              <w:top w:w="0" w:type="dxa"/>
+              <w:left w:w="108" w:type="dxa"/>
+              <w:bottom w:w="0" w:type="dxa"/>
+              <w:right w:w="108" w:type="dxa"/>
+            </w:tcMar>
           </w:tcPr>
           <w:p>
             <w:pPr>
@@ -462,7 +532,7 @@
             </w:pPr>
             <w:r>
               <w:rPr>
-                <w:rFonts w:ascii="Arial" w:hAnsi="Arial" w:cs="Arial"/>
+                <w:rFonts w:ascii="Arial" w:hAnsi="Arial" w:eastAsia="Calibri" w:cs="Arial" w:eastAsiaTheme="minorHAnsi"/>
                 <w:sz w:val="20"/>
                 <w:szCs w:val="20"/>
               </w:rPr>
@@ -474,9 +544,17 @@
           <w:tcPr>
             <w:tcW w:w="4241" w:type="dxa"/>
             <w:tcBorders>
-              <w:top w:val="single" w:sz="4" w:space="0" w:color="auto"/>
-              <w:bottom w:val="single" w:sz="4" w:space="0" w:color="auto"/>
-            </w:tcBorders>
+              <w:top w:val="single" w:sz="4" w:color="000000"/>
+              <w:left w:val="none"/>
+              <w:bottom w:val="single" w:sz="4" w:color="000000"/>
+              <w:right w:val="none"/>
+            </w:tcBorders>
+            <w:tcMar>
+              <w:top w:w="0" w:type="dxa"/>
+              <w:left w:w="108" w:type="dxa"/>
+              <w:bottom w:w="0" w:type="dxa"/>
+              <w:right w:w="108" w:type="dxa"/>
+            </w:tcMar>
           </w:tcPr>
           <w:p>
             <w:pPr>
@@ -494,6 +572,18 @@
         <w:tc>
           <w:tcPr>
             <w:tcW w:w="4361" w:type="dxa"/>
+            <w:tcBorders>
+              <w:top w:val="none"/>
+              <w:left w:val="none"/>
+              <w:bottom w:val="none"/>
+              <w:right w:val="none"/>
+            </w:tcBorders>
+            <w:tcMar>
+              <w:top w:w="0" w:type="dxa"/>
+              <w:left w:w="108" w:type="dxa"/>
+              <w:bottom w:w="0" w:type="dxa"/>
+              <w:right w:w="108" w:type="dxa"/>
+            </w:tcMar>
           </w:tcPr>
           <w:p>
             <w:pPr>
@@ -506,7 +596,9 @@
             </w:pPr>
             <w:r>
               <w:rPr>
-                <w:rFonts w:ascii="Arial" w:hAnsi="Arial" w:cs="Arial"/>
+                <w:rFonts w:ascii="Arial" w:hAnsi="Arial" w:eastAsia="Calibri" w:cs="Arial" w:eastAsiaTheme="minorHAnsi"/>
+                <w:sz w:val="22"/>
+                <w:szCs w:val="22"/>
               </w:rPr>
               <w:t>DATE</w:t>
             </w:r>
@@ -515,6 +607,18 @@
         <w:tc>
           <w:tcPr>
             <w:tcW w:w="283" w:type="dxa"/>
+            <w:tcBorders>
+              <w:top w:val="none"/>
+              <w:left w:val="none"/>
+              <w:bottom w:val="none"/>
+              <w:right w:val="none"/>
+            </w:tcBorders>
+            <w:tcMar>
+              <w:top w:w="0" w:type="dxa"/>
+              <w:left w:w="108" w:type="dxa"/>
+              <w:bottom w:w="0" w:type="dxa"/>
+              <w:right w:w="108" w:type="dxa"/>
+            </w:tcMar>
           </w:tcPr>
           <w:p>
             <w:pPr>
@@ -527,7 +631,7 @@
             </w:pPr>
             <w:r>
               <w:rPr>
-                <w:rFonts w:ascii="Arial" w:hAnsi="Arial" w:cs="Arial"/>
+                <w:rFonts w:ascii="Arial" w:hAnsi="Arial" w:eastAsia="Calibri" w:cs="Arial" w:eastAsiaTheme="minorHAnsi"/>
                 <w:sz w:val="20"/>
                 <w:szCs w:val="20"/>
               </w:rPr>
@@ -539,9 +643,17 @@
           <w:tcPr>
             <w:tcW w:w="4241" w:type="dxa"/>
             <w:tcBorders>
-              <w:top w:val="single" w:sz="4" w:space="0" w:color="auto"/>
-              <w:bottom w:val="single" w:sz="4" w:space="0" w:color="auto"/>
-            </w:tcBorders>
+              <w:top w:val="single" w:sz="4" w:color="000000"/>
+              <w:left w:val="none"/>
+              <w:bottom w:val="single" w:sz="4" w:color="000000"/>
+              <w:right w:val="none"/>
+            </w:tcBorders>
+            <w:tcMar>
+              <w:top w:w="0" w:type="dxa"/>
+              <w:left w:w="108" w:type="dxa"/>
+              <w:bottom w:w="0" w:type="dxa"/>
+              <w:right w:w="108" w:type="dxa"/>
+            </w:tcMar>
           </w:tcPr>
           <w:p>
             <w:pPr>
@@ -586,45 +698,13 @@
       </w:pPr>
       <w:r>
         <w:rPr>
-          <w:rFonts w:ascii="Arial" w:hAnsi="Arial" w:cs="Arial"/>
+          <w:rFonts w:ascii="Arial" w:hAnsi="Arial" w:eastAsia="Calibri" w:cs="Arial" w:eastAsiaTheme="minorHAnsi"/>
           <w:i/>
+          <w:iCs/>
+          <w:sz w:val="22"/>
+          <w:szCs w:val="22"/>
         </w:rPr>
-        <w:t xml:space="preserve">This serves as confirmation that the instructor of this subject has presented and discussed the </w:t>
-      </w:r>
-      <w:r>
-        <w:rPr>
-          <w:rFonts w:ascii="Arial" w:hAnsi="Arial" w:cs="Arial"/>
-          <w:i/>
-        </w:rPr>
-        <w:t>Final</w:t>
-      </w:r>
-      <w:r>
-        <w:rPr>
-          <w:rFonts w:ascii="Arial" w:hAnsi="Arial" w:cs="Arial"/>
-          <w:i/>
-        </w:rPr>
-        <w:t xml:space="preserve"> </w:t>
-      </w:r>
-      <w:r>
-        <w:rPr>
-          <w:rFonts w:ascii="Arial" w:hAnsi="Arial" w:cs="Arial"/>
-          <w:i/>
-        </w:rPr>
-        <w:t>G</w:t>
-      </w:r>
-      <w:r>
-        <w:rPr>
-          <w:rFonts w:ascii="Arial" w:hAnsi="Arial" w:cs="Arial"/>
-          <w:i/>
-        </w:rPr>
-        <w:t>rades</w:t>
-      </w:r>
-      <w:r>
-        <w:rPr>
-          <w:rFonts w:ascii="Arial" w:hAnsi="Arial" w:cs="Arial"/>
-          <w:i/>
-        </w:rPr>
-        <w:t>. By affixing our signatures opposite our names, we acknowledge receipt and understanding of the grades presented.</w:t>
+        <w:t>This serves as confirmation that the instructor of this subject has presented and discussed the Final Grades. By affixing our signatures opposite our names, we acknowledge receipt and understanding of the grades presented.</w:t>
       </w:r>
     </w:p>
     <w:p>
@@ -665,7 +745,13 @@
           <w:insideH w:val="single" w:sz="4" w:space="0" w:color="auto"/>
           <w:insideV w:val="single" w:sz="4" w:space="0" w:color="auto"/>
         </w:tblBorders>
-        <w:tblLook w:val="01E0" w:firstRow="1" w:lastRow="1" w:firstColumn="1" w:lastColumn="1" w:noHBand="0" w:noVBand="0"/>
+        <w:tblCellMar>
+          <w:top w:w="0" w:type="dxa"/>
+          <w:left w:w="108" w:type="dxa"/>
+          <w:bottom w:w="0" w:type="dxa"/>
+          <w:right w:w="108" w:type="dxa"/>
+        </w:tblCellMar>
+        <w:tblLook w:firstRow="1" w:lastRow="1" w:firstColumn="1" w:lastColumn="1"/>
       </w:tblPr>
       <w:tblGrid>
         <w:gridCol w:w="4936"/>
@@ -679,6 +765,18 @@
         <w:tc>
           <w:tcPr>
             <w:tcW w:w="2850" w:type="pct"/>
+            <w:tcBorders>
+              <w:top w:val="single" w:sz="4" w:space="0" w:color="auto"/>
+              <w:left w:val="single" w:sz="4" w:space="0" w:color="auto"/>
+              <w:bottom w:val="single" w:sz="4" w:space="0" w:color="auto"/>
+              <w:right w:val="single" w:sz="4" w:space="0" w:color="auto"/>
+            </w:tcBorders>
+            <w:tcMar>
+              <w:top w:w="0" w:type="dxa"/>
+              <w:left w:w="108" w:type="dxa"/>
+              <w:bottom w:w="0" w:type="dxa"/>
+              <w:right w:w="108" w:type="dxa"/>
+            </w:tcMar>
             <w:vAlign w:val="center"/>
           </w:tcPr>
           <w:p>
@@ -691,8 +789,11 @@
             </w:pPr>
             <w:r>
               <w:rPr>
-                <w:rFonts w:ascii="Arial" w:hAnsi="Arial" w:cs="Arial"/>
+                <w:rFonts w:ascii="Arial" w:hAnsi="Arial" w:eastAsia="Calibri" w:cs="Arial" w:eastAsiaTheme="minorHAnsi"/>
                 <w:b/>
+                <w:bCs/>
+                <w:sz w:val="22"/>
+                <w:szCs w:val="22"/>
               </w:rPr>
               <w:t>NAME OF STUDENTS</w:t>
             </w:r>
@@ -701,6 +802,18 @@
         <w:tc>
           <w:tcPr>
             <w:tcW w:w="1126" w:type="pct"/>
+            <w:tcBorders>
+              <w:top w:val="single" w:sz="4" w:space="0" w:color="auto"/>
+              <w:left w:val="single" w:sz="4" w:space="0" w:color="auto"/>
+              <w:bottom w:val="single" w:sz="4" w:space="0" w:color="auto"/>
+              <w:right w:val="single" w:sz="4" w:space="0" w:color="auto"/>
+            </w:tcBorders>
+            <w:tcMar>
+              <w:top w:w="0" w:type="dxa"/>
+              <w:left w:w="108" w:type="dxa"/>
+              <w:bottom w:w="0" w:type="dxa"/>
+              <w:right w:w="108" w:type="dxa"/>
+            </w:tcMar>
             <w:vAlign w:val="center"/>
           </w:tcPr>
           <w:p>
@@ -713,8 +826,11 @@
             </w:pPr>
             <w:r>
               <w:rPr>
-                <w:rFonts w:ascii="Arial" w:hAnsi="Arial" w:cs="Arial"/>
+                <w:rFonts w:ascii="Arial" w:hAnsi="Arial" w:eastAsia="Calibri" w:cs="Arial" w:eastAsiaTheme="minorHAnsi"/>
                 <w:b/>
+                <w:bCs/>
+                <w:sz w:val="22"/>
+                <w:szCs w:val="22"/>
               </w:rPr>
               <w:t>STUDENT NUMBER</w:t>
             </w:r>
@@ -723,6 +839,18 @@
         <w:tc>
           <w:tcPr>
             <w:tcW w:w="1024" w:type="pct"/>
+            <w:tcBorders>
+              <w:top w:val="single" w:sz="4" w:space="0" w:color="auto"/>
+              <w:left w:val="single" w:sz="4" w:space="0" w:color="auto"/>
+              <w:bottom w:val="single" w:sz="4" w:space="0" w:color="auto"/>
+              <w:right w:val="single" w:sz="4" w:space="0" w:color="auto"/>
+            </w:tcBorders>
+            <w:tcMar>
+              <w:top w:w="0" w:type="dxa"/>
+              <w:left w:w="108" w:type="dxa"/>
+              <w:bottom w:w="0" w:type="dxa"/>
+              <w:right w:w="108" w:type="dxa"/>
+            </w:tcMar>
             <w:vAlign w:val="center"/>
           </w:tcPr>
           <w:p>
@@ -735,8 +863,11 @@
             </w:pPr>
             <w:r>
               <w:rPr>
-                <w:rFonts w:ascii="Arial" w:hAnsi="Arial" w:cs="Arial"/>
+                <w:rFonts w:ascii="Arial" w:hAnsi="Arial" w:eastAsia="Calibri" w:cs="Arial" w:eastAsiaTheme="minorHAnsi"/>
                 <w:b/>
+                <w:bCs/>
+                <w:sz w:val="22"/>
+                <w:szCs w:val="22"/>
               </w:rPr>
               <w:t>SIGNATURE</w:t>
             </w:r>
@@ -750,6 +881,18 @@
         <w:tc>
           <w:tcPr>
             <w:tcW w:w="2850" w:type="pct"/>
+            <w:tcBorders>
+              <w:top w:val="single" w:sz="4" w:space="0" w:color="auto"/>
+              <w:left w:val="single" w:sz="4" w:space="0" w:color="auto"/>
+              <w:bottom w:val="single" w:sz="4" w:space="0" w:color="auto"/>
+              <w:right w:val="single" w:sz="4" w:space="0" w:color="auto"/>
+            </w:tcBorders>
+            <w:tcMar>
+              <w:top w:w="0" w:type="dxa"/>
+              <w:left w:w="108" w:type="dxa"/>
+              <w:bottom w:w="0" w:type="dxa"/>
+              <w:right w:w="108" w:type="dxa"/>
+            </w:tcMar>
             <w:vAlign w:val="center"/>
           </w:tcPr>
           <w:p>
@@ -775,6 +918,18 @@
         <w:tc>
           <w:tcPr>
             <w:tcW w:w="1126" w:type="pct"/>
+            <w:tcBorders>
+              <w:top w:val="single" w:sz="4" w:space="0" w:color="auto"/>
+              <w:left w:val="single" w:sz="4" w:space="0" w:color="auto"/>
+              <w:bottom w:val="single" w:sz="4" w:space="0" w:color="auto"/>
+              <w:right w:val="single" w:sz="4" w:space="0" w:color="auto"/>
+            </w:tcBorders>
+            <w:tcMar>
+              <w:top w:w="0" w:type="dxa"/>
+              <w:left w:w="108" w:type="dxa"/>
+              <w:bottom w:w="0" w:type="dxa"/>
+              <w:right w:w="108" w:type="dxa"/>
+            </w:tcMar>
           </w:tcPr>
           <w:p>
             <w:pPr>
@@ -791,6 +946,18 @@
         <w:tc>
           <w:tcPr>
             <w:tcW w:w="1024" w:type="pct"/>
+            <w:tcBorders>
+              <w:top w:val="single" w:sz="4" w:space="0" w:color="auto"/>
+              <w:left w:val="single" w:sz="4" w:space="0" w:color="auto"/>
+              <w:bottom w:val="single" w:sz="4" w:space="0" w:color="auto"/>
+              <w:right w:val="single" w:sz="4" w:space="0" w:color="auto"/>
+            </w:tcBorders>
+            <w:tcMar>
+              <w:top w:w="0" w:type="dxa"/>
+              <w:left w:w="108" w:type="dxa"/>
+              <w:bottom w:w="0" w:type="dxa"/>
+              <w:right w:w="108" w:type="dxa"/>
+            </w:tcMar>
           </w:tcPr>
           <w:p>
             <w:pPr>
@@ -812,6 +979,18 @@
         <w:tc>
           <w:tcPr>
             <w:tcW w:w="2850" w:type="pct"/>
+            <w:tcBorders>
+              <w:top w:val="single" w:sz="4" w:space="0" w:color="auto"/>
+              <w:left w:val="single" w:sz="4" w:space="0" w:color="auto"/>
+              <w:bottom w:val="single" w:sz="4" w:space="0" w:color="auto"/>
+              <w:right w:val="single" w:sz="4" w:space="0" w:color="auto"/>
+            </w:tcBorders>
+            <w:tcMar>
+              <w:top w:w="0" w:type="dxa"/>
+              <w:left w:w="108" w:type="dxa"/>
+              <w:bottom w:w="0" w:type="dxa"/>
+              <w:right w:w="108" w:type="dxa"/>
+            </w:tcMar>
             <w:vAlign w:val="center"/>
           </w:tcPr>
           <w:p>
@@ -837,6 +1016,18 @@
         <w:tc>
           <w:tcPr>
             <w:tcW w:w="1126" w:type="pct"/>
+            <w:tcBorders>
+              <w:top w:val="single" w:sz="4" w:space="0" w:color="auto"/>
+              <w:left w:val="single" w:sz="4" w:space="0" w:color="auto"/>
+              <w:bottom w:val="single" w:sz="4" w:space="0" w:color="auto"/>
+              <w:right w:val="single" w:sz="4" w:space="0" w:color="auto"/>
+            </w:tcBorders>
+            <w:tcMar>
+              <w:top w:w="0" w:type="dxa"/>
+              <w:left w:w="108" w:type="dxa"/>
+              <w:bottom w:w="0" w:type="dxa"/>
+              <w:right w:w="108" w:type="dxa"/>
+            </w:tcMar>
           </w:tcPr>
           <w:p>
             <w:pPr>
@@ -853,6 +1044,18 @@
         <w:tc>
           <w:tcPr>
             <w:tcW w:w="1024" w:type="pct"/>
+            <w:tcBorders>
+              <w:top w:val="single" w:sz="4" w:space="0" w:color="auto"/>
+              <w:left w:val="single" w:sz="4" w:space="0" w:color="auto"/>
+              <w:bottom w:val="single" w:sz="4" w:space="0" w:color="auto"/>
+              <w:right w:val="single" w:sz="4" w:space="0" w:color="auto"/>
+            </w:tcBorders>
+            <w:tcMar>
+              <w:top w:w="0" w:type="dxa"/>
+              <w:left w:w="108" w:type="dxa"/>
+              <w:bottom w:w="0" w:type="dxa"/>
+              <w:right w:w="108" w:type="dxa"/>
+            </w:tcMar>
           </w:tcPr>
           <w:p>
             <w:pPr>
@@ -874,6 +1077,18 @@
         <w:tc>
           <w:tcPr>
             <w:tcW w:w="2850" w:type="pct"/>
+            <w:tcBorders>
+              <w:top w:val="single" w:sz="4" w:space="0" w:color="auto"/>
+              <w:left w:val="single" w:sz="4" w:space="0" w:color="auto"/>
+              <w:bottom w:val="single" w:sz="4" w:space="0" w:color="auto"/>
+              <w:right w:val="single" w:sz="4" w:space="0" w:color="auto"/>
+            </w:tcBorders>
+            <w:tcMar>
+              <w:top w:w="0" w:type="dxa"/>
+              <w:left w:w="108" w:type="dxa"/>
+              <w:bottom w:w="0" w:type="dxa"/>
+              <w:right w:w="108" w:type="dxa"/>
+            </w:tcMar>
             <w:vAlign w:val="center"/>
           </w:tcPr>
           <w:p>
@@ -899,6 +1114,18 @@
         <w:tc>
           <w:tcPr>
             <w:tcW w:w="1126" w:type="pct"/>
+            <w:tcBorders>
+              <w:top w:val="single" w:sz="4" w:space="0" w:color="auto"/>
+              <w:left w:val="single" w:sz="4" w:space="0" w:color="auto"/>
+              <w:bottom w:val="single" w:sz="4" w:space="0" w:color="auto"/>
+              <w:right w:val="single" w:sz="4" w:space="0" w:color="auto"/>
+            </w:tcBorders>
+            <w:tcMar>
+              <w:top w:w="0" w:type="dxa"/>
+              <w:left w:w="108" w:type="dxa"/>
+              <w:bottom w:w="0" w:type="dxa"/>
+              <w:right w:w="108" w:type="dxa"/>
+            </w:tcMar>
           </w:tcPr>
           <w:p>
             <w:pPr>
@@ -915,6 +1142,18 @@
         <w:tc>
           <w:tcPr>
             <w:tcW w:w="1024" w:type="pct"/>
+            <w:tcBorders>
+              <w:top w:val="single" w:sz="4" w:space="0" w:color="auto"/>
+              <w:left w:val="single" w:sz="4" w:space="0" w:color="auto"/>
+              <w:bottom w:val="single" w:sz="4" w:space="0" w:color="auto"/>
+              <w:right w:val="single" w:sz="4" w:space="0" w:color="auto"/>
+            </w:tcBorders>
+            <w:tcMar>
+              <w:top w:w="0" w:type="dxa"/>
+              <w:left w:w="108" w:type="dxa"/>
+              <w:bottom w:w="0" w:type="dxa"/>
+              <w:right w:w="108" w:type="dxa"/>
+            </w:tcMar>
           </w:tcPr>
           <w:p>
             <w:pPr>
@@ -936,6 +1175,18 @@
         <w:tc>
           <w:tcPr>
             <w:tcW w:w="2850" w:type="pct"/>
+            <w:tcBorders>
+              <w:top w:val="single" w:sz="4" w:space="0" w:color="auto"/>
+              <w:left w:val="single" w:sz="4" w:space="0" w:color="auto"/>
+              <w:bottom w:val="single" w:sz="4" w:space="0" w:color="auto"/>
+              <w:right w:val="single" w:sz="4" w:space="0" w:color="auto"/>
+            </w:tcBorders>
+            <w:tcMar>
+              <w:top w:w="0" w:type="dxa"/>
+              <w:left w:w="108" w:type="dxa"/>
+              <w:bottom w:w="0" w:type="dxa"/>
+              <w:right w:w="108" w:type="dxa"/>
+            </w:tcMar>
             <w:vAlign w:val="center"/>
           </w:tcPr>
           <w:p>
@@ -961,6 +1212,18 @@
         <w:tc>
           <w:tcPr>
             <w:tcW w:w="1126" w:type="pct"/>
+            <w:tcBorders>
+              <w:top w:val="single" w:sz="4" w:space="0" w:color="auto"/>
+              <w:left w:val="single" w:sz="4" w:space="0" w:color="auto"/>
+              <w:bottom w:val="single" w:sz="4" w:space="0" w:color="auto"/>
+              <w:right w:val="single" w:sz="4" w:space="0" w:color="auto"/>
+            </w:tcBorders>
+            <w:tcMar>
+              <w:top w:w="0" w:type="dxa"/>
+              <w:left w:w="108" w:type="dxa"/>
+              <w:bottom w:w="0" w:type="dxa"/>
+              <w:right w:w="108" w:type="dxa"/>
+            </w:tcMar>
           </w:tcPr>
           <w:p>
             <w:pPr>
@@ -977,6 +1240,18 @@
         <w:tc>
           <w:tcPr>
             <w:tcW w:w="1024" w:type="pct"/>
+            <w:tcBorders>
+              <w:top w:val="single" w:sz="4" w:space="0" w:color="auto"/>
+              <w:left w:val="single" w:sz="4" w:space="0" w:color="auto"/>
+              <w:bottom w:val="single" w:sz="4" w:space="0" w:color="auto"/>
+              <w:right w:val="single" w:sz="4" w:space="0" w:color="auto"/>
+            </w:tcBorders>
+            <w:tcMar>
+              <w:top w:w="0" w:type="dxa"/>
+              <w:left w:w="108" w:type="dxa"/>
+              <w:bottom w:w="0" w:type="dxa"/>
+              <w:right w:w="108" w:type="dxa"/>
+            </w:tcMar>
           </w:tcPr>
           <w:p>
             <w:pPr>
@@ -998,6 +1273,18 @@
         <w:tc>
           <w:tcPr>
             <w:tcW w:w="2850" w:type="pct"/>
+            <w:tcBorders>
+              <w:top w:val="single" w:sz="4" w:space="0" w:color="auto"/>
+              <w:left w:val="single" w:sz="4" w:space="0" w:color="auto"/>
+              <w:bottom w:val="single" w:sz="4" w:space="0" w:color="auto"/>
+              <w:right w:val="single" w:sz="4" w:space="0" w:color="auto"/>
+            </w:tcBorders>
+            <w:tcMar>
+              <w:top w:w="0" w:type="dxa"/>
+              <w:left w:w="108" w:type="dxa"/>
+              <w:bottom w:w="0" w:type="dxa"/>
+              <w:right w:w="108" w:type="dxa"/>
+            </w:tcMar>
             <w:vAlign w:val="center"/>
           </w:tcPr>
           <w:p>
@@ -1023,6 +1310,18 @@
         <w:tc>
           <w:tcPr>
             <w:tcW w:w="1126" w:type="pct"/>
+            <w:tcBorders>
+              <w:top w:val="single" w:sz="4" w:space="0" w:color="auto"/>
+              <w:left w:val="single" w:sz="4" w:space="0" w:color="auto"/>
+              <w:bottom w:val="single" w:sz="4" w:space="0" w:color="auto"/>
+              <w:right w:val="single" w:sz="4" w:space="0" w:color="auto"/>
+            </w:tcBorders>
+            <w:tcMar>
+              <w:top w:w="0" w:type="dxa"/>
+              <w:left w:w="108" w:type="dxa"/>
+              <w:bottom w:w="0" w:type="dxa"/>
+              <w:right w:w="108" w:type="dxa"/>
+            </w:tcMar>
             <w:vAlign w:val="center"/>
           </w:tcPr>
           <w:p>
@@ -1040,6 +1339,18 @@
         <w:tc>
           <w:tcPr>
             <w:tcW w:w="1024" w:type="pct"/>
+            <w:tcBorders>
+              <w:top w:val="single" w:sz="4" w:space="0" w:color="auto"/>
+              <w:left w:val="single" w:sz="4" w:space="0" w:color="auto"/>
+              <w:bottom w:val="single" w:sz="4" w:space="0" w:color="auto"/>
+              <w:right w:val="single" w:sz="4" w:space="0" w:color="auto"/>
+            </w:tcBorders>
+            <w:tcMar>
+              <w:top w:w="0" w:type="dxa"/>
+              <w:left w:w="108" w:type="dxa"/>
+              <w:bottom w:w="0" w:type="dxa"/>
+              <w:right w:w="108" w:type="dxa"/>
+            </w:tcMar>
             <w:vAlign w:val="center"/>
           </w:tcPr>
           <w:p>
@@ -1062,6 +1373,18 @@
         <w:tc>
           <w:tcPr>
             <w:tcW w:w="2850" w:type="pct"/>
+            <w:tcBorders>
+              <w:top w:val="single" w:sz="4" w:space="0" w:color="auto"/>
+              <w:left w:val="single" w:sz="4" w:space="0" w:color="auto"/>
+              <w:bottom w:val="single" w:sz="4" w:space="0" w:color="auto"/>
+              <w:right w:val="single" w:sz="4" w:space="0" w:color="auto"/>
+            </w:tcBorders>
+            <w:tcMar>
+              <w:top w:w="0" w:type="dxa"/>
+              <w:left w:w="108" w:type="dxa"/>
+              <w:bottom w:w="0" w:type="dxa"/>
+              <w:right w:w="108" w:type="dxa"/>
+            </w:tcMar>
             <w:vAlign w:val="center"/>
           </w:tcPr>
           <w:p>
@@ -1087,6 +1410,18 @@
         <w:tc>
           <w:tcPr>
             <w:tcW w:w="1126" w:type="pct"/>
+            <w:tcBorders>
+              <w:top w:val="single" w:sz="4" w:space="0" w:color="auto"/>
+              <w:left w:val="single" w:sz="4" w:space="0" w:color="auto"/>
+              <w:bottom w:val="single" w:sz="4" w:space="0" w:color="auto"/>
+              <w:right w:val="single" w:sz="4" w:space="0" w:color="auto"/>
+            </w:tcBorders>
+            <w:tcMar>
+              <w:top w:w="0" w:type="dxa"/>
+              <w:left w:w="108" w:type="dxa"/>
+              <w:bottom w:w="0" w:type="dxa"/>
+              <w:right w:w="108" w:type="dxa"/>
+            </w:tcMar>
             <w:vAlign w:val="center"/>
           </w:tcPr>
           <w:p>
@@ -1104,6 +1439,18 @@
         <w:tc>
           <w:tcPr>
             <w:tcW w:w="1024" w:type="pct"/>
+            <w:tcBorders>
+              <w:top w:val="single" w:sz="4" w:space="0" w:color="auto"/>
+              <w:left w:val="single" w:sz="4" w:space="0" w:color="auto"/>
+              <w:bottom w:val="single" w:sz="4" w:space="0" w:color="auto"/>
+              <w:right w:val="single" w:sz="4" w:space="0" w:color="auto"/>
+            </w:tcBorders>
+            <w:tcMar>
+              <w:top w:w="0" w:type="dxa"/>
+              <w:left w:w="108" w:type="dxa"/>
+              <w:bottom w:w="0" w:type="dxa"/>
+              <w:right w:w="108" w:type="dxa"/>
+            </w:tcMar>
             <w:vAlign w:val="center"/>
           </w:tcPr>
           <w:p>
@@ -1126,6 +1473,18 @@
         <w:tc>
           <w:tcPr>
             <w:tcW w:w="2850" w:type="pct"/>
+            <w:tcBorders>
+              <w:top w:val="single" w:sz="4" w:space="0" w:color="auto"/>
+              <w:left w:val="single" w:sz="4" w:space="0" w:color="auto"/>
+              <w:bottom w:val="single" w:sz="4" w:space="0" w:color="auto"/>
+              <w:right w:val="single" w:sz="4" w:space="0" w:color="auto"/>
+            </w:tcBorders>
+            <w:tcMar>
+              <w:top w:w="0" w:type="dxa"/>
+              <w:left w:w="108" w:type="dxa"/>
+              <w:bottom w:w="0" w:type="dxa"/>
+              <w:right w:w="108" w:type="dxa"/>
+            </w:tcMar>
             <w:vAlign w:val="center"/>
           </w:tcPr>
           <w:p>
@@ -1151,6 +1510,18 @@
         <w:tc>
           <w:tcPr>
             <w:tcW w:w="1126" w:type="pct"/>
+            <w:tcBorders>
+              <w:top w:val="single" w:sz="4" w:space="0" w:color="auto"/>
+              <w:left w:val="single" w:sz="4" w:space="0" w:color="auto"/>
+              <w:bottom w:val="single" w:sz="4" w:space="0" w:color="auto"/>
+              <w:right w:val="single" w:sz="4" w:space="0" w:color="auto"/>
+            </w:tcBorders>
+            <w:tcMar>
+              <w:top w:w="0" w:type="dxa"/>
+              <w:left w:w="108" w:type="dxa"/>
+              <w:bottom w:w="0" w:type="dxa"/>
+              <w:right w:w="108" w:type="dxa"/>
+            </w:tcMar>
           </w:tcPr>
           <w:p>
             <w:pPr>
@@ -1167,6 +1538,18 @@
         <w:tc>
           <w:tcPr>
             <w:tcW w:w="1024" w:type="pct"/>
+            <w:tcBorders>
+              <w:top w:val="single" w:sz="4" w:space="0" w:color="auto"/>
+              <w:left w:val="single" w:sz="4" w:space="0" w:color="auto"/>
+              <w:bottom w:val="single" w:sz="4" w:space="0" w:color="auto"/>
+              <w:right w:val="single" w:sz="4" w:space="0" w:color="auto"/>
+            </w:tcBorders>
+            <w:tcMar>
+              <w:top w:w="0" w:type="dxa"/>
+              <w:left w:w="108" w:type="dxa"/>
+              <w:bottom w:w="0" w:type="dxa"/>
+              <w:right w:w="108" w:type="dxa"/>
+            </w:tcMar>
           </w:tcPr>
           <w:p>
             <w:pPr>
@@ -1188,6 +1571,18 @@
         <w:tc>
           <w:tcPr>
             <w:tcW w:w="2850" w:type="pct"/>
+            <w:tcBorders>
+              <w:top w:val="single" w:sz="4" w:space="0" w:color="auto"/>
+              <w:left w:val="single" w:sz="4" w:space="0" w:color="auto"/>
+              <w:bottom w:val="single" w:sz="4" w:space="0" w:color="auto"/>
+              <w:right w:val="single" w:sz="4" w:space="0" w:color="auto"/>
+            </w:tcBorders>
+            <w:tcMar>
+              <w:top w:w="0" w:type="dxa"/>
+              <w:left w:w="108" w:type="dxa"/>
+              <w:bottom w:w="0" w:type="dxa"/>
+              <w:right w:w="108" w:type="dxa"/>
+            </w:tcMar>
             <w:vAlign w:val="center"/>
           </w:tcPr>
           <w:p>
@@ -1213,6 +1608,18 @@
         <w:tc>
           <w:tcPr>
             <w:tcW w:w="1126" w:type="pct"/>
+            <w:tcBorders>
+              <w:top w:val="single" w:sz="4" w:space="0" w:color="auto"/>
+              <w:left w:val="single" w:sz="4" w:space="0" w:color="auto"/>
+              <w:bottom w:val="single" w:sz="4" w:space="0" w:color="auto"/>
+              <w:right w:val="single" w:sz="4" w:space="0" w:color="auto"/>
+            </w:tcBorders>
+            <w:tcMar>
+              <w:top w:w="0" w:type="dxa"/>
+              <w:left w:w="108" w:type="dxa"/>
+              <w:bottom w:w="0" w:type="dxa"/>
+              <w:right w:w="108" w:type="dxa"/>
+            </w:tcMar>
           </w:tcPr>
           <w:p>
             <w:pPr>
@@ -1229,6 +1636,18 @@
         <w:tc>
           <w:tcPr>
             <w:tcW w:w="1024" w:type="pct"/>
+            <w:tcBorders>
+              <w:top w:val="single" w:sz="4" w:space="0" w:color="auto"/>
+              <w:left w:val="single" w:sz="4" w:space="0" w:color="auto"/>
+              <w:bottom w:val="single" w:sz="4" w:space="0" w:color="auto"/>
+              <w:right w:val="single" w:sz="4" w:space="0" w:color="auto"/>
+            </w:tcBorders>
+            <w:tcMar>
+              <w:top w:w="0" w:type="dxa"/>
+              <w:left w:w="108" w:type="dxa"/>
+              <w:bottom w:w="0" w:type="dxa"/>
+              <w:right w:w="108" w:type="dxa"/>
+            </w:tcMar>
           </w:tcPr>
           <w:p>
             <w:pPr>
@@ -1250,6 +1669,18 @@
         <w:tc>
           <w:tcPr>
             <w:tcW w:w="2850" w:type="pct"/>
+            <w:tcBorders>
+              <w:top w:val="single" w:sz="4" w:space="0" w:color="auto"/>
+              <w:left w:val="single" w:sz="4" w:space="0" w:color="auto"/>
+              <w:bottom w:val="single" w:sz="4" w:space="0" w:color="auto"/>
+              <w:right w:val="single" w:sz="4" w:space="0" w:color="auto"/>
+            </w:tcBorders>
+            <w:tcMar>
+              <w:top w:w="0" w:type="dxa"/>
+              <w:left w:w="108" w:type="dxa"/>
+              <w:bottom w:w="0" w:type="dxa"/>
+              <w:right w:w="108" w:type="dxa"/>
+            </w:tcMar>
             <w:vAlign w:val="center"/>
           </w:tcPr>
           <w:p>
@@ -1275,6 +1706,18 @@
         <w:tc>
           <w:tcPr>
             <w:tcW w:w="1126" w:type="pct"/>
+            <w:tcBorders>
+              <w:top w:val="single" w:sz="4" w:space="0" w:color="auto"/>
+              <w:left w:val="single" w:sz="4" w:space="0" w:color="auto"/>
+              <w:bottom w:val="single" w:sz="4" w:space="0" w:color="auto"/>
+              <w:right w:val="single" w:sz="4" w:space="0" w:color="auto"/>
+            </w:tcBorders>
+            <w:tcMar>
+              <w:top w:w="0" w:type="dxa"/>
+              <w:left w:w="108" w:type="dxa"/>
+              <w:bottom w:w="0" w:type="dxa"/>
+              <w:right w:w="108" w:type="dxa"/>
+            </w:tcMar>
           </w:tcPr>
           <w:p>
             <w:pPr>
@@ -1291,6 +1734,18 @@
         <w:tc>
           <w:tcPr>
             <w:tcW w:w="1024" w:type="pct"/>
+            <w:tcBorders>
+              <w:top w:val="single" w:sz="4" w:space="0" w:color="auto"/>
+              <w:left w:val="single" w:sz="4" w:space="0" w:color="auto"/>
+              <w:bottom w:val="single" w:sz="4" w:space="0" w:color="auto"/>
+              <w:right w:val="single" w:sz="4" w:space="0" w:color="auto"/>
+            </w:tcBorders>
+            <w:tcMar>
+              <w:top w:w="0" w:type="dxa"/>
+              <w:left w:w="108" w:type="dxa"/>
+              <w:bottom w:w="0" w:type="dxa"/>
+              <w:right w:w="108" w:type="dxa"/>
+            </w:tcMar>
           </w:tcPr>
           <w:p>
             <w:pPr>
@@ -1312,6 +1767,18 @@
         <w:tc>
           <w:tcPr>
             <w:tcW w:w="2850" w:type="pct"/>
+            <w:tcBorders>
+              <w:top w:val="single" w:sz="4" w:space="0" w:color="auto"/>
+              <w:left w:val="single" w:sz="4" w:space="0" w:color="auto"/>
+              <w:bottom w:val="single" w:sz="4" w:space="0" w:color="auto"/>
+              <w:right w:val="single" w:sz="4" w:space="0" w:color="auto"/>
+            </w:tcBorders>
+            <w:tcMar>
+              <w:top w:w="0" w:type="dxa"/>
+              <w:left w:w="108" w:type="dxa"/>
+              <w:bottom w:w="0" w:type="dxa"/>
+              <w:right w:w="108" w:type="dxa"/>
+            </w:tcMar>
             <w:vAlign w:val="center"/>
           </w:tcPr>
           <w:p>
@@ -1338,6 +1805,18 @@
         <w:tc>
           <w:tcPr>
             <w:tcW w:w="1126" w:type="pct"/>
+            <w:tcBorders>
+              <w:top w:val="single" w:sz="4" w:space="0" w:color="auto"/>
+              <w:left w:val="single" w:sz="4" w:space="0" w:color="auto"/>
+              <w:bottom w:val="single" w:sz="4" w:space="0" w:color="auto"/>
+              <w:right w:val="single" w:sz="4" w:space="0" w:color="auto"/>
+            </w:tcBorders>
+            <w:tcMar>
+              <w:top w:w="0" w:type="dxa"/>
+              <w:left w:w="108" w:type="dxa"/>
+              <w:bottom w:w="0" w:type="dxa"/>
+              <w:right w:w="108" w:type="dxa"/>
+            </w:tcMar>
           </w:tcPr>
           <w:p>
             <w:pPr>
@@ -1354,6 +1833,18 @@
         <w:tc>
           <w:tcPr>
             <w:tcW w:w="1024" w:type="pct"/>
+            <w:tcBorders>
+              <w:top w:val="single" w:sz="4" w:space="0" w:color="auto"/>
+              <w:left w:val="single" w:sz="4" w:space="0" w:color="auto"/>
+              <w:bottom w:val="single" w:sz="4" w:space="0" w:color="auto"/>
+              <w:right w:val="single" w:sz="4" w:space="0" w:color="auto"/>
+            </w:tcBorders>
+            <w:tcMar>
+              <w:top w:w="0" w:type="dxa"/>
+              <w:left w:w="108" w:type="dxa"/>
+              <w:bottom w:w="0" w:type="dxa"/>
+              <w:right w:w="108" w:type="dxa"/>
+            </w:tcMar>
           </w:tcPr>
           <w:p>
             <w:pPr>
@@ -1375,6 +1866,18 @@
         <w:tc>
           <w:tcPr>
             <w:tcW w:w="2850" w:type="pct"/>
+            <w:tcBorders>
+              <w:top w:val="single" w:sz="4" w:space="0" w:color="auto"/>
+              <w:left w:val="single" w:sz="4" w:space="0" w:color="auto"/>
+              <w:bottom w:val="single" w:sz="4" w:space="0" w:color="auto"/>
+              <w:right w:val="single" w:sz="4" w:space="0" w:color="auto"/>
+            </w:tcBorders>
+            <w:tcMar>
+              <w:top w:w="0" w:type="dxa"/>
+              <w:left w:w="108" w:type="dxa"/>
+              <w:bottom w:w="0" w:type="dxa"/>
+              <w:right w:w="108" w:type="dxa"/>
+            </w:tcMar>
             <w:vAlign w:val="center"/>
           </w:tcPr>
           <w:p>
@@ -1401,6 +1904,18 @@
         <w:tc>
           <w:tcPr>
             <w:tcW w:w="1126" w:type="pct"/>
+            <w:tcBorders>
+              <w:top w:val="single" w:sz="4" w:space="0" w:color="auto"/>
+              <w:left w:val="single" w:sz="4" w:space="0" w:color="auto"/>
+              <w:bottom w:val="single" w:sz="4" w:space="0" w:color="auto"/>
+              <w:right w:val="single" w:sz="4" w:space="0" w:color="auto"/>
+            </w:tcBorders>
+            <w:tcMar>
+              <w:top w:w="0" w:type="dxa"/>
+              <w:left w:w="108" w:type="dxa"/>
+              <w:bottom w:w="0" w:type="dxa"/>
+              <w:right w:w="108" w:type="dxa"/>
+            </w:tcMar>
           </w:tcPr>
           <w:p>
             <w:pPr>
@@ -1417,6 +1932,18 @@
         <w:tc>
           <w:tcPr>
             <w:tcW w:w="1024" w:type="pct"/>
+            <w:tcBorders>
+              <w:top w:val="single" w:sz="4" w:space="0" w:color="auto"/>
+              <w:left w:val="single" w:sz="4" w:space="0" w:color="auto"/>
+              <w:bottom w:val="single" w:sz="4" w:space="0" w:color="auto"/>
+              <w:right w:val="single" w:sz="4" w:space="0" w:color="auto"/>
+            </w:tcBorders>
+            <w:tcMar>
+              <w:top w:w="0" w:type="dxa"/>
+              <w:left w:w="108" w:type="dxa"/>
+              <w:bottom w:w="0" w:type="dxa"/>
+              <w:right w:w="108" w:type="dxa"/>
+            </w:tcMar>
           </w:tcPr>
           <w:p>
             <w:pPr>
@@ -1438,6 +1965,18 @@
         <w:tc>
           <w:tcPr>
             <w:tcW w:w="2850" w:type="pct"/>
+            <w:tcBorders>
+              <w:top w:val="single" w:sz="4" w:space="0" w:color="auto"/>
+              <w:left w:val="single" w:sz="4" w:space="0" w:color="auto"/>
+              <w:bottom w:val="single" w:sz="4" w:space="0" w:color="auto"/>
+              <w:right w:val="single" w:sz="4" w:space="0" w:color="auto"/>
+            </w:tcBorders>
+            <w:tcMar>
+              <w:top w:w="0" w:type="dxa"/>
+              <w:left w:w="108" w:type="dxa"/>
+              <w:bottom w:w="0" w:type="dxa"/>
+              <w:right w:w="108" w:type="dxa"/>
+            </w:tcMar>
             <w:vAlign w:val="center"/>
           </w:tcPr>
           <w:p>
@@ -1464,6 +2003,18 @@
         <w:tc>
           <w:tcPr>
             <w:tcW w:w="1126" w:type="pct"/>
+            <w:tcBorders>
+              <w:top w:val="single" w:sz="4" w:space="0" w:color="auto"/>
+              <w:left w:val="single" w:sz="4" w:space="0" w:color="auto"/>
+              <w:bottom w:val="single" w:sz="4" w:space="0" w:color="auto"/>
+              <w:right w:val="single" w:sz="4" w:space="0" w:color="auto"/>
+            </w:tcBorders>
+            <w:tcMar>
+              <w:top w:w="0" w:type="dxa"/>
+              <w:left w:w="108" w:type="dxa"/>
+              <w:bottom w:w="0" w:type="dxa"/>
+              <w:right w:w="108" w:type="dxa"/>
+            </w:tcMar>
           </w:tcPr>
           <w:p>
             <w:pPr>
@@ -1480,6 +2031,18 @@
         <w:tc>
           <w:tcPr>
             <w:tcW w:w="1024" w:type="pct"/>
+            <w:tcBorders>
+              <w:top w:val="single" w:sz="4" w:space="0" w:color="auto"/>
+              <w:left w:val="single" w:sz="4" w:space="0" w:color="auto"/>
+              <w:bottom w:val="single" w:sz="4" w:space="0" w:color="auto"/>
+              <w:right w:val="single" w:sz="4" w:space="0" w:color="auto"/>
+            </w:tcBorders>
+            <w:tcMar>
+              <w:top w:w="0" w:type="dxa"/>
+              <w:left w:w="108" w:type="dxa"/>
+              <w:bottom w:w="0" w:type="dxa"/>
+              <w:right w:w="108" w:type="dxa"/>
+            </w:tcMar>
           </w:tcPr>
           <w:p>
             <w:pPr>
@@ -1501,6 +2064,18 @@
         <w:tc>
           <w:tcPr>
             <w:tcW w:w="2850" w:type="pct"/>
+            <w:tcBorders>
+              <w:top w:val="single" w:sz="4" w:space="0" w:color="auto"/>
+              <w:left w:val="single" w:sz="4" w:space="0" w:color="auto"/>
+              <w:bottom w:val="single" w:sz="4" w:space="0" w:color="auto"/>
+              <w:right w:val="single" w:sz="4" w:space="0" w:color="auto"/>
+            </w:tcBorders>
+            <w:tcMar>
+              <w:top w:w="0" w:type="dxa"/>
+              <w:left w:w="108" w:type="dxa"/>
+              <w:bottom w:w="0" w:type="dxa"/>
+              <w:right w:w="108" w:type="dxa"/>
+            </w:tcMar>
             <w:vAlign w:val="center"/>
           </w:tcPr>
           <w:p>
@@ -1527,6 +2102,18 @@
         <w:tc>
           <w:tcPr>
             <w:tcW w:w="1126" w:type="pct"/>
+            <w:tcBorders>
+              <w:top w:val="single" w:sz="4" w:space="0" w:color="auto"/>
+              <w:left w:val="single" w:sz="4" w:space="0" w:color="auto"/>
+              <w:bottom w:val="single" w:sz="4" w:space="0" w:color="auto"/>
+              <w:right w:val="single" w:sz="4" w:space="0" w:color="auto"/>
+            </w:tcBorders>
+            <w:tcMar>
+              <w:top w:w="0" w:type="dxa"/>
+              <w:left w:w="108" w:type="dxa"/>
+              <w:bottom w:w="0" w:type="dxa"/>
+              <w:right w:w="108" w:type="dxa"/>
+            </w:tcMar>
           </w:tcPr>
           <w:p>
             <w:pPr>
@@ -1543,6 +2130,18 @@
         <w:tc>
           <w:tcPr>
             <w:tcW w:w="1024" w:type="pct"/>
+            <w:tcBorders>
+              <w:top w:val="single" w:sz="4" w:space="0" w:color="auto"/>
+              <w:left w:val="single" w:sz="4" w:space="0" w:color="auto"/>
+              <w:bottom w:val="single" w:sz="4" w:space="0" w:color="auto"/>
+              <w:right w:val="single" w:sz="4" w:space="0" w:color="auto"/>
+            </w:tcBorders>
+            <w:tcMar>
+              <w:top w:w="0" w:type="dxa"/>
+              <w:left w:w="108" w:type="dxa"/>
+              <w:bottom w:w="0" w:type="dxa"/>
+              <w:right w:w="108" w:type="dxa"/>
+            </w:tcMar>
           </w:tcPr>
           <w:p>
             <w:pPr>
@@ -1564,6 +2163,18 @@
         <w:tc>
           <w:tcPr>
             <w:tcW w:w="2850" w:type="pct"/>
+            <w:tcBorders>
+              <w:top w:val="single" w:sz="4" w:space="0" w:color="auto"/>
+              <w:left w:val="single" w:sz="4" w:space="0" w:color="auto"/>
+              <w:bottom w:val="single" w:sz="4" w:space="0" w:color="auto"/>
+              <w:right w:val="single" w:sz="4" w:space="0" w:color="auto"/>
+            </w:tcBorders>
+            <w:tcMar>
+              <w:top w:w="0" w:type="dxa"/>
+              <w:left w:w="108" w:type="dxa"/>
+              <w:bottom w:w="0" w:type="dxa"/>
+              <w:right w:w="108" w:type="dxa"/>
+            </w:tcMar>
             <w:vAlign w:val="center"/>
           </w:tcPr>
           <w:p>
@@ -1590,6 +2201,18 @@
         <w:tc>
           <w:tcPr>
             <w:tcW w:w="1126" w:type="pct"/>
+            <w:tcBorders>
+              <w:top w:val="single" w:sz="4" w:space="0" w:color="auto"/>
+              <w:left w:val="single" w:sz="4" w:space="0" w:color="auto"/>
+              <w:bottom w:val="single" w:sz="4" w:space="0" w:color="auto"/>
+              <w:right w:val="single" w:sz="4" w:space="0" w:color="auto"/>
+            </w:tcBorders>
+            <w:tcMar>
+              <w:top w:w="0" w:type="dxa"/>
+              <w:left w:w="108" w:type="dxa"/>
+              <w:bottom w:w="0" w:type="dxa"/>
+              <w:right w:w="108" w:type="dxa"/>
+            </w:tcMar>
           </w:tcPr>
           <w:p>
             <w:pPr>
@@ -1606,6 +2229,18 @@
         <w:tc>
           <w:tcPr>
             <w:tcW w:w="1024" w:type="pct"/>
+            <w:tcBorders>
+              <w:top w:val="single" w:sz="4" w:space="0" w:color="auto"/>
+              <w:left w:val="single" w:sz="4" w:space="0" w:color="auto"/>
+              <w:bottom w:val="single" w:sz="4" w:space="0" w:color="auto"/>
+              <w:right w:val="single" w:sz="4" w:space="0" w:color="auto"/>
+            </w:tcBorders>
+            <w:tcMar>
+              <w:top w:w="0" w:type="dxa"/>
+              <w:left w:w="108" w:type="dxa"/>
+              <w:bottom w:w="0" w:type="dxa"/>
+              <w:right w:w="108" w:type="dxa"/>
+            </w:tcMar>
           </w:tcPr>
           <w:p>
             <w:pPr>
@@ -1627,6 +2262,18 @@
         <w:tc>
           <w:tcPr>
             <w:tcW w:w="2850" w:type="pct"/>
+            <w:tcBorders>
+              <w:top w:val="single" w:sz="4" w:space="0" w:color="auto"/>
+              <w:left w:val="single" w:sz="4" w:space="0" w:color="auto"/>
+              <w:bottom w:val="single" w:sz="4" w:space="0" w:color="auto"/>
+              <w:right w:val="single" w:sz="4" w:space="0" w:color="auto"/>
+            </w:tcBorders>
+            <w:tcMar>
+              <w:top w:w="0" w:type="dxa"/>
+              <w:left w:w="108" w:type="dxa"/>
+              <w:bottom w:w="0" w:type="dxa"/>
+              <w:right w:w="108" w:type="dxa"/>
+            </w:tcMar>
             <w:vAlign w:val="center"/>
           </w:tcPr>
           <w:p>
@@ -1653,6 +2300,18 @@
         <w:tc>
           <w:tcPr>
             <w:tcW w:w="1126" w:type="pct"/>
+            <w:tcBorders>
+              <w:top w:val="single" w:sz="4" w:space="0" w:color="auto"/>
+              <w:left w:val="single" w:sz="4" w:space="0" w:color="auto"/>
+              <w:bottom w:val="single" w:sz="4" w:space="0" w:color="auto"/>
+              <w:right w:val="single" w:sz="4" w:space="0" w:color="auto"/>
+            </w:tcBorders>
+            <w:tcMar>
+              <w:top w:w="0" w:type="dxa"/>
+              <w:left w:w="108" w:type="dxa"/>
+              <w:bottom w:w="0" w:type="dxa"/>
+              <w:right w:w="108" w:type="dxa"/>
+            </w:tcMar>
           </w:tcPr>
           <w:p>
             <w:pPr>
@@ -1669,6 +2328,18 @@
         <w:tc>
           <w:tcPr>
             <w:tcW w:w="1024" w:type="pct"/>
+            <w:tcBorders>
+              <w:top w:val="single" w:sz="4" w:space="0" w:color="auto"/>
+              <w:left w:val="single" w:sz="4" w:space="0" w:color="auto"/>
+              <w:bottom w:val="single" w:sz="4" w:space="0" w:color="auto"/>
+              <w:right w:val="single" w:sz="4" w:space="0" w:color="auto"/>
+            </w:tcBorders>
+            <w:tcMar>
+              <w:top w:w="0" w:type="dxa"/>
+              <w:left w:w="108" w:type="dxa"/>
+              <w:bottom w:w="0" w:type="dxa"/>
+              <w:right w:w="108" w:type="dxa"/>
+            </w:tcMar>
           </w:tcPr>
           <w:p>
             <w:pPr>
@@ -1690,6 +2361,18 @@
         <w:tc>
           <w:tcPr>
             <w:tcW w:w="2850" w:type="pct"/>
+            <w:tcBorders>
+              <w:top w:val="single" w:sz="4" w:space="0" w:color="auto"/>
+              <w:left w:val="single" w:sz="4" w:space="0" w:color="auto"/>
+              <w:bottom w:val="single" w:sz="4" w:space="0" w:color="auto"/>
+              <w:right w:val="single" w:sz="4" w:space="0" w:color="auto"/>
+            </w:tcBorders>
+            <w:tcMar>
+              <w:top w:w="0" w:type="dxa"/>
+              <w:left w:w="108" w:type="dxa"/>
+              <w:bottom w:w="0" w:type="dxa"/>
+              <w:right w:w="108" w:type="dxa"/>
+            </w:tcMar>
             <w:vAlign w:val="center"/>
           </w:tcPr>
           <w:p>
@@ -1716,6 +2399,18 @@
         <w:tc>
           <w:tcPr>
             <w:tcW w:w="1126" w:type="pct"/>
+            <w:tcBorders>
+              <w:top w:val="single" w:sz="4" w:space="0" w:color="auto"/>
+              <w:left w:val="single" w:sz="4" w:space="0" w:color="auto"/>
+              <w:bottom w:val="single" w:sz="4" w:space="0" w:color="auto"/>
+              <w:right w:val="single" w:sz="4" w:space="0" w:color="auto"/>
+            </w:tcBorders>
+            <w:tcMar>
+              <w:top w:w="0" w:type="dxa"/>
+              <w:left w:w="108" w:type="dxa"/>
+              <w:bottom w:w="0" w:type="dxa"/>
+              <w:right w:w="108" w:type="dxa"/>
+            </w:tcMar>
           </w:tcPr>
           <w:p>
             <w:pPr>
@@ -1732,6 +2427,18 @@
         <w:tc>
           <w:tcPr>
             <w:tcW w:w="1024" w:type="pct"/>
+            <w:tcBorders>
+              <w:top w:val="single" w:sz="4" w:space="0" w:color="auto"/>
+              <w:left w:val="single" w:sz="4" w:space="0" w:color="auto"/>
+              <w:bottom w:val="single" w:sz="4" w:space="0" w:color="auto"/>
+              <w:right w:val="single" w:sz="4" w:space="0" w:color="auto"/>
+            </w:tcBorders>
+            <w:tcMar>
+              <w:top w:w="0" w:type="dxa"/>
+              <w:left w:w="108" w:type="dxa"/>
+              <w:bottom w:w="0" w:type="dxa"/>
+              <w:right w:w="108" w:type="dxa"/>
+            </w:tcMar>
           </w:tcPr>
           <w:p>
             <w:pPr>
@@ -1753,6 +2460,18 @@
         <w:tc>
           <w:tcPr>
             <w:tcW w:w="2850" w:type="pct"/>
+            <w:tcBorders>
+              <w:top w:val="single" w:sz="4" w:space="0" w:color="auto"/>
+              <w:left w:val="single" w:sz="4" w:space="0" w:color="auto"/>
+              <w:bottom w:val="single" w:sz="4" w:space="0" w:color="auto"/>
+              <w:right w:val="single" w:sz="4" w:space="0" w:color="auto"/>
+            </w:tcBorders>
+            <w:tcMar>
+              <w:top w:w="0" w:type="dxa"/>
+              <w:left w:w="108" w:type="dxa"/>
+              <w:bottom w:w="0" w:type="dxa"/>
+              <w:right w:w="108" w:type="dxa"/>
+            </w:tcMar>
             <w:vAlign w:val="center"/>
           </w:tcPr>
           <w:p>
@@ -1779,6 +2498,18 @@
         <w:tc>
           <w:tcPr>
             <w:tcW w:w="1126" w:type="pct"/>
+            <w:tcBorders>
+              <w:top w:val="single" w:sz="4" w:space="0" w:color="auto"/>
+              <w:left w:val="single" w:sz="4" w:space="0" w:color="auto"/>
+              <w:bottom w:val="single" w:sz="4" w:space="0" w:color="auto"/>
+              <w:right w:val="single" w:sz="4" w:space="0" w:color="auto"/>
+            </w:tcBorders>
+            <w:tcMar>
+              <w:top w:w="0" w:type="dxa"/>
+              <w:left w:w="108" w:type="dxa"/>
+              <w:bottom w:w="0" w:type="dxa"/>
+              <w:right w:w="108" w:type="dxa"/>
+            </w:tcMar>
           </w:tcPr>
           <w:p>
             <w:pPr>
@@ -1795,6 +2526,18 @@
         <w:tc>
           <w:tcPr>
             <w:tcW w:w="1024" w:type="pct"/>
+            <w:tcBorders>
+              <w:top w:val="single" w:sz="4" w:space="0" w:color="auto"/>
+              <w:left w:val="single" w:sz="4" w:space="0" w:color="auto"/>
+              <w:bottom w:val="single" w:sz="4" w:space="0" w:color="auto"/>
+              <w:right w:val="single" w:sz="4" w:space="0" w:color="auto"/>
+            </w:tcBorders>
+            <w:tcMar>
+              <w:top w:w="0" w:type="dxa"/>
+              <w:left w:w="108" w:type="dxa"/>
+              <w:bottom w:w="0" w:type="dxa"/>
+              <w:right w:w="108" w:type="dxa"/>
+            </w:tcMar>
           </w:tcPr>
           <w:p>
             <w:pPr>
@@ -1816,6 +2559,18 @@
         <w:tc>
           <w:tcPr>
             <w:tcW w:w="2850" w:type="pct"/>
+            <w:tcBorders>
+              <w:top w:val="single" w:sz="4" w:space="0" w:color="auto"/>
+              <w:left w:val="single" w:sz="4" w:space="0" w:color="auto"/>
+              <w:bottom w:val="single" w:sz="4" w:space="0" w:color="auto"/>
+              <w:right w:val="single" w:sz="4" w:space="0" w:color="auto"/>
+            </w:tcBorders>
+            <w:tcMar>
+              <w:top w:w="0" w:type="dxa"/>
+              <w:left w:w="108" w:type="dxa"/>
+              <w:bottom w:w="0" w:type="dxa"/>
+              <w:right w:w="108" w:type="dxa"/>
+            </w:tcMar>
             <w:vAlign w:val="center"/>
           </w:tcPr>
           <w:p>
@@ -1842,6 +2597,18 @@
         <w:tc>
           <w:tcPr>
             <w:tcW w:w="1126" w:type="pct"/>
+            <w:tcBorders>
+              <w:top w:val="single" w:sz="4" w:space="0" w:color="auto"/>
+              <w:left w:val="single" w:sz="4" w:space="0" w:color="auto"/>
+              <w:bottom w:val="single" w:sz="4" w:space="0" w:color="auto"/>
+              <w:right w:val="single" w:sz="4" w:space="0" w:color="auto"/>
+            </w:tcBorders>
+            <w:tcMar>
+              <w:top w:w="0" w:type="dxa"/>
+              <w:left w:w="108" w:type="dxa"/>
+              <w:bottom w:w="0" w:type="dxa"/>
+              <w:right w:w="108" w:type="dxa"/>
+            </w:tcMar>
           </w:tcPr>
           <w:p>
             <w:pPr>
@@ -1858,6 +2625,18 @@
         <w:tc>
           <w:tcPr>
             <w:tcW w:w="1024" w:type="pct"/>
+            <w:tcBorders>
+              <w:top w:val="single" w:sz="4" w:space="0" w:color="auto"/>
+              <w:left w:val="single" w:sz="4" w:space="0" w:color="auto"/>
+              <w:bottom w:val="single" w:sz="4" w:space="0" w:color="auto"/>
+              <w:right w:val="single" w:sz="4" w:space="0" w:color="auto"/>
+            </w:tcBorders>
+            <w:tcMar>
+              <w:top w:w="0" w:type="dxa"/>
+              <w:left w:w="108" w:type="dxa"/>
+              <w:bottom w:w="0" w:type="dxa"/>
+              <w:right w:w="108" w:type="dxa"/>
+            </w:tcMar>
           </w:tcPr>
           <w:p>
             <w:pPr>
@@ -1879,6 +2658,18 @@
         <w:tc>
           <w:tcPr>
             <w:tcW w:w="2850" w:type="pct"/>
+            <w:tcBorders>
+              <w:top w:val="single" w:sz="4" w:space="0" w:color="auto"/>
+              <w:left w:val="single" w:sz="4" w:space="0" w:color="auto"/>
+              <w:bottom w:val="single" w:sz="4" w:space="0" w:color="auto"/>
+              <w:right w:val="single" w:sz="4" w:space="0" w:color="auto"/>
+            </w:tcBorders>
+            <w:tcMar>
+              <w:top w:w="0" w:type="dxa"/>
+              <w:left w:w="108" w:type="dxa"/>
+              <w:bottom w:w="0" w:type="dxa"/>
+              <w:right w:w="108" w:type="dxa"/>
+            </w:tcMar>
             <w:vAlign w:val="center"/>
           </w:tcPr>
           <w:p>
@@ -1905,6 +2696,18 @@
         <w:tc>
           <w:tcPr>
             <w:tcW w:w="1126" w:type="pct"/>
+            <w:tcBorders>
+              <w:top w:val="single" w:sz="4" w:space="0" w:color="auto"/>
+              <w:left w:val="single" w:sz="4" w:space="0" w:color="auto"/>
+              <w:bottom w:val="single" w:sz="4" w:space="0" w:color="auto"/>
+              <w:right w:val="single" w:sz="4" w:space="0" w:color="auto"/>
+            </w:tcBorders>
+            <w:tcMar>
+              <w:top w:w="0" w:type="dxa"/>
+              <w:left w:w="108" w:type="dxa"/>
+              <w:bottom w:w="0" w:type="dxa"/>
+              <w:right w:w="108" w:type="dxa"/>
+            </w:tcMar>
           </w:tcPr>
           <w:p>
             <w:pPr>
@@ -1921,6 +2724,18 @@
         <w:tc>
           <w:tcPr>
             <w:tcW w:w="1024" w:type="pct"/>
+            <w:tcBorders>
+              <w:top w:val="single" w:sz="4" w:space="0" w:color="auto"/>
+              <w:left w:val="single" w:sz="4" w:space="0" w:color="auto"/>
+              <w:bottom w:val="single" w:sz="4" w:space="0" w:color="auto"/>
+              <w:right w:val="single" w:sz="4" w:space="0" w:color="auto"/>
+            </w:tcBorders>
+            <w:tcMar>
+              <w:top w:w="0" w:type="dxa"/>
+              <w:left w:w="108" w:type="dxa"/>
+              <w:bottom w:w="0" w:type="dxa"/>
+              <w:right w:w="108" w:type="dxa"/>
+            </w:tcMar>
           </w:tcPr>
           <w:p>
             <w:pPr>
@@ -1942,6 +2757,18 @@
         <w:tc>
           <w:tcPr>
             <w:tcW w:w="2850" w:type="pct"/>
+            <w:tcBorders>
+              <w:top w:val="single" w:sz="4" w:space="0" w:color="auto"/>
+              <w:left w:val="single" w:sz="4" w:space="0" w:color="auto"/>
+              <w:bottom w:val="single" w:sz="4" w:space="0" w:color="auto"/>
+              <w:right w:val="single" w:sz="4" w:space="0" w:color="auto"/>
+            </w:tcBorders>
+            <w:tcMar>
+              <w:top w:w="0" w:type="dxa"/>
+              <w:left w:w="108" w:type="dxa"/>
+              <w:bottom w:w="0" w:type="dxa"/>
+              <w:right w:w="108" w:type="dxa"/>
+            </w:tcMar>
             <w:vAlign w:val="center"/>
           </w:tcPr>
           <w:p>
@@ -1968,6 +2795,18 @@
         <w:tc>
           <w:tcPr>
             <w:tcW w:w="1126" w:type="pct"/>
+            <w:tcBorders>
+              <w:top w:val="single" w:sz="4" w:space="0" w:color="auto"/>
+              <w:left w:val="single" w:sz="4" w:space="0" w:color="auto"/>
+              <w:bottom w:val="single" w:sz="4" w:space="0" w:color="auto"/>
+              <w:right w:val="single" w:sz="4" w:space="0" w:color="auto"/>
+            </w:tcBorders>
+            <w:tcMar>
+              <w:top w:w="0" w:type="dxa"/>
+              <w:left w:w="108" w:type="dxa"/>
+              <w:bottom w:w="0" w:type="dxa"/>
+              <w:right w:w="108" w:type="dxa"/>
+            </w:tcMar>
           </w:tcPr>
           <w:p>
             <w:pPr>
@@ -1984,6 +2823,18 @@
         <w:tc>
           <w:tcPr>
             <w:tcW w:w="1024" w:type="pct"/>
+            <w:tcBorders>
+              <w:top w:val="single" w:sz="4" w:space="0" w:color="auto"/>
+              <w:left w:val="single" w:sz="4" w:space="0" w:color="auto"/>
+              <w:bottom w:val="single" w:sz="4" w:space="0" w:color="auto"/>
+              <w:right w:val="single" w:sz="4" w:space="0" w:color="auto"/>
+            </w:tcBorders>
+            <w:tcMar>
+              <w:top w:w="0" w:type="dxa"/>
+              <w:left w:w="108" w:type="dxa"/>
+              <w:bottom w:w="0" w:type="dxa"/>
+              <w:right w:w="108" w:type="dxa"/>
+            </w:tcMar>
           </w:tcPr>
           <w:p>
             <w:pPr>
@@ -2005,6 +2856,18 @@
         <w:tc>
           <w:tcPr>
             <w:tcW w:w="2850" w:type="pct"/>
+            <w:tcBorders>
+              <w:top w:val="single" w:sz="4" w:space="0" w:color="auto"/>
+              <w:left w:val="single" w:sz="4" w:space="0" w:color="auto"/>
+              <w:bottom w:val="single" w:sz="4" w:space="0" w:color="auto"/>
+              <w:right w:val="single" w:sz="4" w:space="0" w:color="auto"/>
+            </w:tcBorders>
+            <w:tcMar>
+              <w:top w:w="0" w:type="dxa"/>
+              <w:left w:w="108" w:type="dxa"/>
+              <w:bottom w:w="0" w:type="dxa"/>
+              <w:right w:w="108" w:type="dxa"/>
+            </w:tcMar>
             <w:vAlign w:val="center"/>
           </w:tcPr>
           <w:p>
@@ -2031,6 +2894,18 @@
         <w:tc>
           <w:tcPr>
             <w:tcW w:w="1126" w:type="pct"/>
+            <w:tcBorders>
+              <w:top w:val="single" w:sz="4" w:space="0" w:color="auto"/>
+              <w:left w:val="single" w:sz="4" w:space="0" w:color="auto"/>
+              <w:bottom w:val="single" w:sz="4" w:space="0" w:color="auto"/>
+              <w:right w:val="single" w:sz="4" w:space="0" w:color="auto"/>
+            </w:tcBorders>
+            <w:tcMar>
+              <w:top w:w="0" w:type="dxa"/>
+              <w:left w:w="108" w:type="dxa"/>
+              <w:bottom w:w="0" w:type="dxa"/>
+              <w:right w:w="108" w:type="dxa"/>
+            </w:tcMar>
           </w:tcPr>
           <w:p>
             <w:pPr>
@@ -2047,6 +2922,18 @@
         <w:tc>
           <w:tcPr>
             <w:tcW w:w="1024" w:type="pct"/>
+            <w:tcBorders>
+              <w:top w:val="single" w:sz="4" w:space="0" w:color="auto"/>
+              <w:left w:val="single" w:sz="4" w:space="0" w:color="auto"/>
+              <w:bottom w:val="single" w:sz="4" w:space="0" w:color="auto"/>
+              <w:right w:val="single" w:sz="4" w:space="0" w:color="auto"/>
+            </w:tcBorders>
+            <w:tcMar>
+              <w:top w:w="0" w:type="dxa"/>
+              <w:left w:w="108" w:type="dxa"/>
+              <w:bottom w:w="0" w:type="dxa"/>
+              <w:right w:w="108" w:type="dxa"/>
+            </w:tcMar>
           </w:tcPr>
           <w:p>
             <w:pPr>
@@ -2068,6 +2955,18 @@
         <w:tc>
           <w:tcPr>
             <w:tcW w:w="2850" w:type="pct"/>
+            <w:tcBorders>
+              <w:top w:val="single" w:sz="4" w:space="0" w:color="auto"/>
+              <w:left w:val="single" w:sz="4" w:space="0" w:color="auto"/>
+              <w:bottom w:val="single" w:sz="4" w:space="0" w:color="auto"/>
+              <w:right w:val="single" w:sz="4" w:space="0" w:color="auto"/>
+            </w:tcBorders>
+            <w:tcMar>
+              <w:top w:w="0" w:type="dxa"/>
+              <w:left w:w="108" w:type="dxa"/>
+              <w:bottom w:w="0" w:type="dxa"/>
+              <w:right w:w="108" w:type="dxa"/>
+            </w:tcMar>
             <w:vAlign w:val="center"/>
           </w:tcPr>
           <w:p>
@@ -2094,6 +2993,18 @@
         <w:tc>
           <w:tcPr>
             <w:tcW w:w="1126" w:type="pct"/>
+            <w:tcBorders>
+              <w:top w:val="single" w:sz="4" w:space="0" w:color="auto"/>
+              <w:left w:val="single" w:sz="4" w:space="0" w:color="auto"/>
+              <w:bottom w:val="single" w:sz="4" w:space="0" w:color="auto"/>
+              <w:right w:val="single" w:sz="4" w:space="0" w:color="auto"/>
+            </w:tcBorders>
+            <w:tcMar>
+              <w:top w:w="0" w:type="dxa"/>
+              <w:left w:w="108" w:type="dxa"/>
+              <w:bottom w:w="0" w:type="dxa"/>
+              <w:right w:w="108" w:type="dxa"/>
+            </w:tcMar>
           </w:tcPr>
           <w:p>
             <w:pPr>
@@ -2110,6 +3021,18 @@
         <w:tc>
           <w:tcPr>
             <w:tcW w:w="1024" w:type="pct"/>
+            <w:tcBorders>
+              <w:top w:val="single" w:sz="4" w:space="0" w:color="auto"/>
+              <w:left w:val="single" w:sz="4" w:space="0" w:color="auto"/>
+              <w:bottom w:val="single" w:sz="4" w:space="0" w:color="auto"/>
+              <w:right w:val="single" w:sz="4" w:space="0" w:color="auto"/>
+            </w:tcBorders>
+            <w:tcMar>
+              <w:top w:w="0" w:type="dxa"/>
+              <w:left w:w="108" w:type="dxa"/>
+              <w:bottom w:w="0" w:type="dxa"/>
+              <w:right w:w="108" w:type="dxa"/>
+            </w:tcMar>
           </w:tcPr>
           <w:p>
             <w:pPr>
@@ -2131,6 +3054,18 @@
         <w:tc>
           <w:tcPr>
             <w:tcW w:w="2850" w:type="pct"/>
+            <w:tcBorders>
+              <w:top w:val="single" w:sz="4" w:space="0" w:color="auto"/>
+              <w:left w:val="single" w:sz="4" w:space="0" w:color="auto"/>
+              <w:bottom w:val="single" w:sz="4" w:space="0" w:color="auto"/>
+              <w:right w:val="single" w:sz="4" w:space="0" w:color="auto"/>
+            </w:tcBorders>
+            <w:tcMar>
+              <w:top w:w="0" w:type="dxa"/>
+              <w:left w:w="108" w:type="dxa"/>
+              <w:bottom w:w="0" w:type="dxa"/>
+              <w:right w:w="108" w:type="dxa"/>
+            </w:tcMar>
             <w:vAlign w:val="center"/>
           </w:tcPr>
           <w:p>
@@ -2157,6 +3092,18 @@
         <w:tc>
           <w:tcPr>
             <w:tcW w:w="1126" w:type="pct"/>
+            <w:tcBorders>
+              <w:top w:val="single" w:sz="4" w:space="0" w:color="auto"/>
+              <w:left w:val="single" w:sz="4" w:space="0" w:color="auto"/>
+              <w:bottom w:val="single" w:sz="4" w:space="0" w:color="auto"/>
+              <w:right w:val="single" w:sz="4" w:space="0" w:color="auto"/>
+            </w:tcBorders>
+            <w:tcMar>
+              <w:top w:w="0" w:type="dxa"/>
+              <w:left w:w="108" w:type="dxa"/>
+              <w:bottom w:w="0" w:type="dxa"/>
+              <w:right w:w="108" w:type="dxa"/>
+            </w:tcMar>
           </w:tcPr>
           <w:p>
             <w:pPr>
@@ -2173,6 +3120,18 @@
         <w:tc>
           <w:tcPr>
             <w:tcW w:w="1024" w:type="pct"/>
+            <w:tcBorders>
+              <w:top w:val="single" w:sz="4" w:space="0" w:color="auto"/>
+              <w:left w:val="single" w:sz="4" w:space="0" w:color="auto"/>
+              <w:bottom w:val="single" w:sz="4" w:space="0" w:color="auto"/>
+              <w:right w:val="single" w:sz="4" w:space="0" w:color="auto"/>
+            </w:tcBorders>
+            <w:tcMar>
+              <w:top w:w="0" w:type="dxa"/>
+              <w:left w:w="108" w:type="dxa"/>
+              <w:bottom w:w="0" w:type="dxa"/>
+              <w:right w:w="108" w:type="dxa"/>
+            </w:tcMar>
           </w:tcPr>
           <w:p>
             <w:pPr>
@@ -2194,6 +3153,18 @@
         <w:tc>
           <w:tcPr>
             <w:tcW w:w="2850" w:type="pct"/>
+            <w:tcBorders>
+              <w:top w:val="single" w:sz="4" w:space="0" w:color="auto"/>
+              <w:left w:val="single" w:sz="4" w:space="0" w:color="auto"/>
+              <w:bottom w:val="single" w:sz="4" w:space="0" w:color="auto"/>
+              <w:right w:val="single" w:sz="4" w:space="0" w:color="auto"/>
+            </w:tcBorders>
+            <w:tcMar>
+              <w:top w:w="0" w:type="dxa"/>
+              <w:left w:w="108" w:type="dxa"/>
+              <w:bottom w:w="0" w:type="dxa"/>
+              <w:right w:w="108" w:type="dxa"/>
+            </w:tcMar>
             <w:vAlign w:val="center"/>
           </w:tcPr>
           <w:p>
@@ -2220,6 +3191,18 @@
         <w:tc>
           <w:tcPr>
             <w:tcW w:w="1126" w:type="pct"/>
+            <w:tcBorders>
+              <w:top w:val="single" w:sz="4" w:space="0" w:color="auto"/>
+              <w:left w:val="single" w:sz="4" w:space="0" w:color="auto"/>
+              <w:bottom w:val="single" w:sz="4" w:space="0" w:color="auto"/>
+              <w:right w:val="single" w:sz="4" w:space="0" w:color="auto"/>
+            </w:tcBorders>
+            <w:tcMar>
+              <w:top w:w="0" w:type="dxa"/>
+              <w:left w:w="108" w:type="dxa"/>
+              <w:bottom w:w="0" w:type="dxa"/>
+              <w:right w:w="108" w:type="dxa"/>
+            </w:tcMar>
           </w:tcPr>
           <w:p>
             <w:pPr>
@@ -2236,6 +3219,18 @@
         <w:tc>
           <w:tcPr>
             <w:tcW w:w="1024" w:type="pct"/>
+            <w:tcBorders>
+              <w:top w:val="single" w:sz="4" w:space="0" w:color="auto"/>
+              <w:left w:val="single" w:sz="4" w:space="0" w:color="auto"/>
+              <w:bottom w:val="single" w:sz="4" w:space="0" w:color="auto"/>
+              <w:right w:val="single" w:sz="4" w:space="0" w:color="auto"/>
+            </w:tcBorders>
+            <w:tcMar>
+              <w:top w:w="0" w:type="dxa"/>
+              <w:left w:w="108" w:type="dxa"/>
+              <w:bottom w:w="0" w:type="dxa"/>
+              <w:right w:w="108" w:type="dxa"/>
+            </w:tcMar>
           </w:tcPr>
           <w:p>
             <w:pPr>
@@ -2257,6 +3252,18 @@
         <w:tc>
           <w:tcPr>
             <w:tcW w:w="2850" w:type="pct"/>
+            <w:tcBorders>
+              <w:top w:val="single" w:sz="4" w:space="0" w:color="auto"/>
+              <w:left w:val="single" w:sz="4" w:space="0" w:color="auto"/>
+              <w:bottom w:val="single" w:sz="4" w:space="0" w:color="auto"/>
+              <w:right w:val="single" w:sz="4" w:space="0" w:color="auto"/>
+            </w:tcBorders>
+            <w:tcMar>
+              <w:top w:w="0" w:type="dxa"/>
+              <w:left w:w="108" w:type="dxa"/>
+              <w:bottom w:w="0" w:type="dxa"/>
+              <w:right w:w="108" w:type="dxa"/>
+            </w:tcMar>
             <w:vAlign w:val="center"/>
           </w:tcPr>
           <w:p>
@@ -2283,6 +3290,18 @@
         <w:tc>
           <w:tcPr>
             <w:tcW w:w="1126" w:type="pct"/>
+            <w:tcBorders>
+              <w:top w:val="single" w:sz="4" w:space="0" w:color="auto"/>
+              <w:left w:val="single" w:sz="4" w:space="0" w:color="auto"/>
+              <w:bottom w:val="single" w:sz="4" w:space="0" w:color="auto"/>
+              <w:right w:val="single" w:sz="4" w:space="0" w:color="auto"/>
+            </w:tcBorders>
+            <w:tcMar>
+              <w:top w:w="0" w:type="dxa"/>
+              <w:left w:w="108" w:type="dxa"/>
+              <w:bottom w:w="0" w:type="dxa"/>
+              <w:right w:w="108" w:type="dxa"/>
+            </w:tcMar>
           </w:tcPr>
           <w:p>
             <w:pPr>
@@ -2299,6 +3318,18 @@
         <w:tc>
           <w:tcPr>
             <w:tcW w:w="1024" w:type="pct"/>
+            <w:tcBorders>
+              <w:top w:val="single" w:sz="4" w:space="0" w:color="auto"/>
+              <w:left w:val="single" w:sz="4" w:space="0" w:color="auto"/>
+              <w:bottom w:val="single" w:sz="4" w:space="0" w:color="auto"/>
+              <w:right w:val="single" w:sz="4" w:space="0" w:color="auto"/>
+            </w:tcBorders>
+            <w:tcMar>
+              <w:top w:w="0" w:type="dxa"/>
+              <w:left w:w="108" w:type="dxa"/>
+              <w:bottom w:w="0" w:type="dxa"/>
+              <w:right w:w="108" w:type="dxa"/>
+            </w:tcMar>
           </w:tcPr>
           <w:p>
             <w:pPr>
@@ -2320,6 +3351,18 @@
         <w:tc>
           <w:tcPr>
             <w:tcW w:w="2850" w:type="pct"/>
+            <w:tcBorders>
+              <w:top w:val="single" w:sz="4" w:space="0" w:color="auto"/>
+              <w:left w:val="single" w:sz="4" w:space="0" w:color="auto"/>
+              <w:bottom w:val="single" w:sz="4" w:space="0" w:color="auto"/>
+              <w:right w:val="single" w:sz="4" w:space="0" w:color="auto"/>
+            </w:tcBorders>
+            <w:tcMar>
+              <w:top w:w="0" w:type="dxa"/>
+              <w:left w:w="108" w:type="dxa"/>
+              <w:bottom w:w="0" w:type="dxa"/>
+              <w:right w:w="108" w:type="dxa"/>
+            </w:tcMar>
             <w:vAlign w:val="center"/>
           </w:tcPr>
           <w:p>
@@ -2346,6 +3389,18 @@
         <w:tc>
           <w:tcPr>
             <w:tcW w:w="1126" w:type="pct"/>
+            <w:tcBorders>
+              <w:top w:val="single" w:sz="4" w:space="0" w:color="auto"/>
+              <w:left w:val="single" w:sz="4" w:space="0" w:color="auto"/>
+              <w:bottom w:val="single" w:sz="4" w:space="0" w:color="auto"/>
+              <w:right w:val="single" w:sz="4" w:space="0" w:color="auto"/>
+            </w:tcBorders>
+            <w:tcMar>
+              <w:top w:w="0" w:type="dxa"/>
+              <w:left w:w="108" w:type="dxa"/>
+              <w:bottom w:w="0" w:type="dxa"/>
+              <w:right w:w="108" w:type="dxa"/>
+            </w:tcMar>
           </w:tcPr>
           <w:p>
             <w:pPr>
@@ -2362,6 +3417,18 @@
         <w:tc>
           <w:tcPr>
             <w:tcW w:w="1024" w:type="pct"/>
+            <w:tcBorders>
+              <w:top w:val="single" w:sz="4" w:space="0" w:color="auto"/>
+              <w:left w:val="single" w:sz="4" w:space="0" w:color="auto"/>
+              <w:bottom w:val="single" w:sz="4" w:space="0" w:color="auto"/>
+              <w:right w:val="single" w:sz="4" w:space="0" w:color="auto"/>
+            </w:tcBorders>
+            <w:tcMar>
+              <w:top w:w="0" w:type="dxa"/>
+              <w:left w:w="108" w:type="dxa"/>
+              <w:bottom w:w="0" w:type="dxa"/>
+              <w:right w:w="108" w:type="dxa"/>
+            </w:tcMar>
           </w:tcPr>
           <w:p>
             <w:pPr>
@@ -2383,6 +3450,18 @@
         <w:tc>
           <w:tcPr>
             <w:tcW w:w="2850" w:type="pct"/>
+            <w:tcBorders>
+              <w:top w:val="single" w:sz="4" w:space="0" w:color="auto"/>
+              <w:left w:val="single" w:sz="4" w:space="0" w:color="auto"/>
+              <w:bottom w:val="single" w:sz="4" w:space="0" w:color="auto"/>
+              <w:right w:val="single" w:sz="4" w:space="0" w:color="auto"/>
+            </w:tcBorders>
+            <w:tcMar>
+              <w:top w:w="0" w:type="dxa"/>
+              <w:left w:w="108" w:type="dxa"/>
+              <w:bottom w:w="0" w:type="dxa"/>
+              <w:right w:w="108" w:type="dxa"/>
+            </w:tcMar>
             <w:vAlign w:val="center"/>
           </w:tcPr>
           <w:p>
@@ -2409,6 +3488,18 @@
         <w:tc>
           <w:tcPr>
             <w:tcW w:w="1126" w:type="pct"/>
+            <w:tcBorders>
+              <w:top w:val="single" w:sz="4" w:space="0" w:color="auto"/>
+              <w:left w:val="single" w:sz="4" w:space="0" w:color="auto"/>
+              <w:bottom w:val="single" w:sz="4" w:space="0" w:color="auto"/>
+              <w:right w:val="single" w:sz="4" w:space="0" w:color="auto"/>
+            </w:tcBorders>
+            <w:tcMar>
+              <w:top w:w="0" w:type="dxa"/>
+              <w:left w:w="108" w:type="dxa"/>
+              <w:bottom w:w="0" w:type="dxa"/>
+              <w:right w:w="108" w:type="dxa"/>
+            </w:tcMar>
           </w:tcPr>
           <w:p>
             <w:pPr>
@@ -2425,6 +3516,18 @@
         <w:tc>
           <w:tcPr>
             <w:tcW w:w="1024" w:type="pct"/>
+            <w:tcBorders>
+              <w:top w:val="single" w:sz="4" w:space="0" w:color="auto"/>
+              <w:left w:val="single" w:sz="4" w:space="0" w:color="auto"/>
+              <w:bottom w:val="single" w:sz="4" w:space="0" w:color="auto"/>
+              <w:right w:val="single" w:sz="4" w:space="0" w:color="auto"/>
+            </w:tcBorders>
+            <w:tcMar>
+              <w:top w:w="0" w:type="dxa"/>
+              <w:left w:w="108" w:type="dxa"/>
+              <w:bottom w:w="0" w:type="dxa"/>
+              <w:right w:w="108" w:type="dxa"/>
+            </w:tcMar>
           </w:tcPr>
           <w:p>
             <w:pPr>
@@ -2446,6 +3549,18 @@
         <w:tc>
           <w:tcPr>
             <w:tcW w:w="2850" w:type="pct"/>
+            <w:tcBorders>
+              <w:top w:val="single" w:sz="4" w:space="0" w:color="auto"/>
+              <w:left w:val="single" w:sz="4" w:space="0" w:color="auto"/>
+              <w:bottom w:val="single" w:sz="4" w:space="0" w:color="auto"/>
+              <w:right w:val="single" w:sz="4" w:space="0" w:color="auto"/>
+            </w:tcBorders>
+            <w:tcMar>
+              <w:top w:w="0" w:type="dxa"/>
+              <w:left w:w="108" w:type="dxa"/>
+              <w:bottom w:w="0" w:type="dxa"/>
+              <w:right w:w="108" w:type="dxa"/>
+            </w:tcMar>
             <w:vAlign w:val="center"/>
           </w:tcPr>
           <w:p>
@@ -2472,6 +3587,18 @@
         <w:tc>
           <w:tcPr>
             <w:tcW w:w="1126" w:type="pct"/>
+            <w:tcBorders>
+              <w:top w:val="single" w:sz="4" w:space="0" w:color="auto"/>
+              <w:left w:val="single" w:sz="4" w:space="0" w:color="auto"/>
+              <w:bottom w:val="single" w:sz="4" w:space="0" w:color="auto"/>
+              <w:right w:val="single" w:sz="4" w:space="0" w:color="auto"/>
+            </w:tcBorders>
+            <w:tcMar>
+              <w:top w:w="0" w:type="dxa"/>
+              <w:left w:w="108" w:type="dxa"/>
+              <w:bottom w:w="0" w:type="dxa"/>
+              <w:right w:w="108" w:type="dxa"/>
+            </w:tcMar>
           </w:tcPr>
           <w:p>
             <w:pPr>
@@ -2488,6 +3615,18 @@
         <w:tc>
           <w:tcPr>
             <w:tcW w:w="1024" w:type="pct"/>
+            <w:tcBorders>
+              <w:top w:val="single" w:sz="4" w:space="0" w:color="auto"/>
+              <w:left w:val="single" w:sz="4" w:space="0" w:color="auto"/>
+              <w:bottom w:val="single" w:sz="4" w:space="0" w:color="auto"/>
+              <w:right w:val="single" w:sz="4" w:space="0" w:color="auto"/>
+            </w:tcBorders>
+            <w:tcMar>
+              <w:top w:w="0" w:type="dxa"/>
+              <w:left w:w="108" w:type="dxa"/>
+              <w:bottom w:w="0" w:type="dxa"/>
+              <w:right w:w="108" w:type="dxa"/>
+            </w:tcMar>
           </w:tcPr>
           <w:p>
             <w:pPr>
@@ -2509,6 +3648,18 @@
         <w:tc>
           <w:tcPr>
             <w:tcW w:w="2850" w:type="pct"/>
+            <w:tcBorders>
+              <w:top w:val="single" w:sz="4" w:space="0" w:color="auto"/>
+              <w:left w:val="single" w:sz="4" w:space="0" w:color="auto"/>
+              <w:bottom w:val="single" w:sz="4" w:space="0" w:color="auto"/>
+              <w:right w:val="single" w:sz="4" w:space="0" w:color="auto"/>
+            </w:tcBorders>
+            <w:tcMar>
+              <w:top w:w="0" w:type="dxa"/>
+              <w:left w:w="108" w:type="dxa"/>
+              <w:bottom w:w="0" w:type="dxa"/>
+              <w:right w:w="108" w:type="dxa"/>
+            </w:tcMar>
             <w:vAlign w:val="center"/>
           </w:tcPr>
           <w:p>
@@ -2535,6 +3686,18 @@
         <w:tc>
           <w:tcPr>
             <w:tcW w:w="1126" w:type="pct"/>
+            <w:tcBorders>
+              <w:top w:val="single" w:sz="4" w:space="0" w:color="auto"/>
+              <w:left w:val="single" w:sz="4" w:space="0" w:color="auto"/>
+              <w:bottom w:val="single" w:sz="4" w:space="0" w:color="auto"/>
+              <w:right w:val="single" w:sz="4" w:space="0" w:color="auto"/>
+            </w:tcBorders>
+            <w:tcMar>
+              <w:top w:w="0" w:type="dxa"/>
+              <w:left w:w="108" w:type="dxa"/>
+              <w:bottom w:w="0" w:type="dxa"/>
+              <w:right w:w="108" w:type="dxa"/>
+            </w:tcMar>
           </w:tcPr>
           <w:p>
             <w:pPr>
@@ -2551,6 +3714,18 @@
         <w:tc>
           <w:tcPr>
             <w:tcW w:w="1024" w:type="pct"/>
+            <w:tcBorders>
+              <w:top w:val="single" w:sz="4" w:space="0" w:color="auto"/>
+              <w:left w:val="single" w:sz="4" w:space="0" w:color="auto"/>
+              <w:bottom w:val="single" w:sz="4" w:space="0" w:color="auto"/>
+              <w:right w:val="single" w:sz="4" w:space="0" w:color="auto"/>
+            </w:tcBorders>
+            <w:tcMar>
+              <w:top w:w="0" w:type="dxa"/>
+              <w:left w:w="108" w:type="dxa"/>
+              <w:bottom w:w="0" w:type="dxa"/>
+              <w:right w:w="108" w:type="dxa"/>
+            </w:tcMar>
           </w:tcPr>
           <w:p>
             <w:pPr>
@@ -2572,6 +3747,18 @@
         <w:tc>
           <w:tcPr>
             <w:tcW w:w="2850" w:type="pct"/>
+            <w:tcBorders>
+              <w:top w:val="single" w:sz="4" w:space="0" w:color="auto"/>
+              <w:left w:val="single" w:sz="4" w:space="0" w:color="auto"/>
+              <w:bottom w:val="single" w:sz="4" w:space="0" w:color="auto"/>
+              <w:right w:val="single" w:sz="4" w:space="0" w:color="auto"/>
+            </w:tcBorders>
+            <w:tcMar>
+              <w:top w:w="0" w:type="dxa"/>
+              <w:left w:w="108" w:type="dxa"/>
+              <w:bottom w:w="0" w:type="dxa"/>
+              <w:right w:w="108" w:type="dxa"/>
+            </w:tcMar>
             <w:vAlign w:val="center"/>
           </w:tcPr>
           <w:p>
@@ -2598,6 +3785,18 @@
         <w:tc>
           <w:tcPr>
             <w:tcW w:w="1126" w:type="pct"/>
+            <w:tcBorders>
+              <w:top w:val="single" w:sz="4" w:space="0" w:color="auto"/>
+              <w:left w:val="single" w:sz="4" w:space="0" w:color="auto"/>
+              <w:bottom w:val="single" w:sz="4" w:space="0" w:color="auto"/>
+              <w:right w:val="single" w:sz="4" w:space="0" w:color="auto"/>
+            </w:tcBorders>
+            <w:tcMar>
+              <w:top w:w="0" w:type="dxa"/>
+              <w:left w:w="108" w:type="dxa"/>
+              <w:bottom w:w="0" w:type="dxa"/>
+              <w:right w:w="108" w:type="dxa"/>
+            </w:tcMar>
           </w:tcPr>
           <w:p>
             <w:pPr>
@@ -2614,6 +3813,18 @@
         <w:tc>
           <w:tcPr>
             <w:tcW w:w="1024" w:type="pct"/>
+            <w:tcBorders>
+              <w:top w:val="single" w:sz="4" w:space="0" w:color="auto"/>
+              <w:left w:val="single" w:sz="4" w:space="0" w:color="auto"/>
+              <w:bottom w:val="single" w:sz="4" w:space="0" w:color="auto"/>
+              <w:right w:val="single" w:sz="4" w:space="0" w:color="auto"/>
+            </w:tcBorders>
+            <w:tcMar>
+              <w:top w:w="0" w:type="dxa"/>
+              <w:left w:w="108" w:type="dxa"/>
+              <w:bottom w:w="0" w:type="dxa"/>
+              <w:right w:w="108" w:type="dxa"/>
+            </w:tcMar>
           </w:tcPr>
           <w:p>
             <w:pPr>
@@ -2635,6 +3846,18 @@
         <w:tc>
           <w:tcPr>
             <w:tcW w:w="2850" w:type="pct"/>
+            <w:tcBorders>
+              <w:top w:val="single" w:sz="4" w:space="0" w:color="auto"/>
+              <w:left w:val="single" w:sz="4" w:space="0" w:color="auto"/>
+              <w:bottom w:val="single" w:sz="4" w:space="0" w:color="auto"/>
+              <w:right w:val="single" w:sz="4" w:space="0" w:color="auto"/>
+            </w:tcBorders>
+            <w:tcMar>
+              <w:top w:w="0" w:type="dxa"/>
+              <w:left w:w="108" w:type="dxa"/>
+              <w:bottom w:w="0" w:type="dxa"/>
+              <w:right w:w="108" w:type="dxa"/>
+            </w:tcMar>
             <w:vAlign w:val="center"/>
           </w:tcPr>
           <w:p>
@@ -2661,6 +3884,18 @@
         <w:tc>
           <w:tcPr>
             <w:tcW w:w="1126" w:type="pct"/>
+            <w:tcBorders>
+              <w:top w:val="single" w:sz="4" w:space="0" w:color="auto"/>
+              <w:left w:val="single" w:sz="4" w:space="0" w:color="auto"/>
+              <w:bottom w:val="single" w:sz="4" w:space="0" w:color="auto"/>
+              <w:right w:val="single" w:sz="4" w:space="0" w:color="auto"/>
+            </w:tcBorders>
+            <w:tcMar>
+              <w:top w:w="0" w:type="dxa"/>
+              <w:left w:w="108" w:type="dxa"/>
+              <w:bottom w:w="0" w:type="dxa"/>
+              <w:right w:w="108" w:type="dxa"/>
+            </w:tcMar>
           </w:tcPr>
           <w:p>
             <w:pPr>
@@ -2677,6 +3912,18 @@
         <w:tc>
           <w:tcPr>
             <w:tcW w:w="1024" w:type="pct"/>
+            <w:tcBorders>
+              <w:top w:val="single" w:sz="4" w:space="0" w:color="auto"/>
+              <w:left w:val="single" w:sz="4" w:space="0" w:color="auto"/>
+              <w:bottom w:val="single" w:sz="4" w:space="0" w:color="auto"/>
+              <w:right w:val="single" w:sz="4" w:space="0" w:color="auto"/>
+            </w:tcBorders>
+            <w:tcMar>
+              <w:top w:w="0" w:type="dxa"/>
+              <w:left w:w="108" w:type="dxa"/>
+              <w:bottom w:w="0" w:type="dxa"/>
+              <w:right w:w="108" w:type="dxa"/>
+            </w:tcMar>
           </w:tcPr>
           <w:p>
             <w:pPr>
@@ -2698,6 +3945,18 @@
         <w:tc>
           <w:tcPr>
             <w:tcW w:w="2850" w:type="pct"/>
+            <w:tcBorders>
+              <w:top w:val="single" w:sz="4" w:space="0" w:color="auto"/>
+              <w:left w:val="single" w:sz="4" w:space="0" w:color="auto"/>
+              <w:bottom w:val="single" w:sz="4" w:space="0" w:color="auto"/>
+              <w:right w:val="single" w:sz="4" w:space="0" w:color="auto"/>
+            </w:tcBorders>
+            <w:tcMar>
+              <w:top w:w="0" w:type="dxa"/>
+              <w:left w:w="108" w:type="dxa"/>
+              <w:bottom w:w="0" w:type="dxa"/>
+              <w:right w:w="108" w:type="dxa"/>
+            </w:tcMar>
             <w:vAlign w:val="center"/>
           </w:tcPr>
           <w:p>
@@ -2724,6 +3983,18 @@
         <w:tc>
           <w:tcPr>
             <w:tcW w:w="1126" w:type="pct"/>
+            <w:tcBorders>
+              <w:top w:val="single" w:sz="4" w:space="0" w:color="auto"/>
+              <w:left w:val="single" w:sz="4" w:space="0" w:color="auto"/>
+              <w:bottom w:val="single" w:sz="4" w:space="0" w:color="auto"/>
+              <w:right w:val="single" w:sz="4" w:space="0" w:color="auto"/>
+            </w:tcBorders>
+            <w:tcMar>
+              <w:top w:w="0" w:type="dxa"/>
+              <w:left w:w="108" w:type="dxa"/>
+              <w:bottom w:w="0" w:type="dxa"/>
+              <w:right w:w="108" w:type="dxa"/>
+            </w:tcMar>
           </w:tcPr>
           <w:p>
             <w:pPr>
@@ -2740,6 +4011,18 @@
         <w:tc>
           <w:tcPr>
             <w:tcW w:w="1024" w:type="pct"/>
+            <w:tcBorders>
+              <w:top w:val="single" w:sz="4" w:space="0" w:color="auto"/>
+              <w:left w:val="single" w:sz="4" w:space="0" w:color="auto"/>
+              <w:bottom w:val="single" w:sz="4" w:space="0" w:color="auto"/>
+              <w:right w:val="single" w:sz="4" w:space="0" w:color="auto"/>
+            </w:tcBorders>
+            <w:tcMar>
+              <w:top w:w="0" w:type="dxa"/>
+              <w:left w:w="108" w:type="dxa"/>
+              <w:bottom w:w="0" w:type="dxa"/>
+              <w:right w:w="108" w:type="dxa"/>
+            </w:tcMar>
           </w:tcPr>
           <w:p>
             <w:pPr>
@@ -2761,6 +4044,18 @@
         <w:tc>
           <w:tcPr>
             <w:tcW w:w="2850" w:type="pct"/>
+            <w:tcBorders>
+              <w:top w:val="single" w:sz="4" w:space="0" w:color="auto"/>
+              <w:left w:val="single" w:sz="4" w:space="0" w:color="auto"/>
+              <w:bottom w:val="single" w:sz="4" w:space="0" w:color="auto"/>
+              <w:right w:val="single" w:sz="4" w:space="0" w:color="auto"/>
+            </w:tcBorders>
+            <w:tcMar>
+              <w:top w:w="0" w:type="dxa"/>
+              <w:left w:w="108" w:type="dxa"/>
+              <w:bottom w:w="0" w:type="dxa"/>
+              <w:right w:w="108" w:type="dxa"/>
+            </w:tcMar>
             <w:vAlign w:val="center"/>
           </w:tcPr>
           <w:p>
@@ -2787,6 +4082,18 @@
         <w:tc>
           <w:tcPr>
             <w:tcW w:w="1126" w:type="pct"/>
+            <w:tcBorders>
+              <w:top w:val="single" w:sz="4" w:space="0" w:color="auto"/>
+              <w:left w:val="single" w:sz="4" w:space="0" w:color="auto"/>
+              <w:bottom w:val="single" w:sz="4" w:space="0" w:color="auto"/>
+              <w:right w:val="single" w:sz="4" w:space="0" w:color="auto"/>
+            </w:tcBorders>
+            <w:tcMar>
+              <w:top w:w="0" w:type="dxa"/>
+              <w:left w:w="108" w:type="dxa"/>
+              <w:bottom w:w="0" w:type="dxa"/>
+              <w:right w:w="108" w:type="dxa"/>
+            </w:tcMar>
           </w:tcPr>
           <w:p>
             <w:pPr>
@@ -2803,6 +4110,18 @@
         <w:tc>
           <w:tcPr>
             <w:tcW w:w="1024" w:type="pct"/>
+            <w:tcBorders>
+              <w:top w:val="single" w:sz="4" w:space="0" w:color="auto"/>
+              <w:left w:val="single" w:sz="4" w:space="0" w:color="auto"/>
+              <w:bottom w:val="single" w:sz="4" w:space="0" w:color="auto"/>
+              <w:right w:val="single" w:sz="4" w:space="0" w:color="auto"/>
+            </w:tcBorders>
+            <w:tcMar>
+              <w:top w:w="0" w:type="dxa"/>
+              <w:left w:w="108" w:type="dxa"/>
+              <w:bottom w:w="0" w:type="dxa"/>
+              <w:right w:w="108" w:type="dxa"/>
+            </w:tcMar>
           </w:tcPr>
           <w:p>
             <w:pPr>
@@ -2824,6 +4143,18 @@
         <w:tc>
           <w:tcPr>
             <w:tcW w:w="2850" w:type="pct"/>
+            <w:tcBorders>
+              <w:top w:val="single" w:sz="4" w:space="0" w:color="auto"/>
+              <w:left w:val="single" w:sz="4" w:space="0" w:color="auto"/>
+              <w:bottom w:val="single" w:sz="4" w:space="0" w:color="auto"/>
+              <w:right w:val="single" w:sz="4" w:space="0" w:color="auto"/>
+            </w:tcBorders>
+            <w:tcMar>
+              <w:top w:w="0" w:type="dxa"/>
+              <w:left w:w="108" w:type="dxa"/>
+              <w:bottom w:w="0" w:type="dxa"/>
+              <w:right w:w="108" w:type="dxa"/>
+            </w:tcMar>
             <w:vAlign w:val="center"/>
           </w:tcPr>
           <w:p>
@@ -2850,6 +4181,18 @@
         <w:tc>
           <w:tcPr>
             <w:tcW w:w="1126" w:type="pct"/>
+            <w:tcBorders>
+              <w:top w:val="single" w:sz="4" w:space="0" w:color="auto"/>
+              <w:left w:val="single" w:sz="4" w:space="0" w:color="auto"/>
+              <w:bottom w:val="single" w:sz="4" w:space="0" w:color="auto"/>
+              <w:right w:val="single" w:sz="4" w:space="0" w:color="auto"/>
+            </w:tcBorders>
+            <w:tcMar>
+              <w:top w:w="0" w:type="dxa"/>
+              <w:left w:w="108" w:type="dxa"/>
+              <w:bottom w:w="0" w:type="dxa"/>
+              <w:right w:w="108" w:type="dxa"/>
+            </w:tcMar>
           </w:tcPr>
           <w:p>
             <w:pPr>
@@ -2866,6 +4209,18 @@
         <w:tc>
           <w:tcPr>
             <w:tcW w:w="1024" w:type="pct"/>
+            <w:tcBorders>
+              <w:top w:val="single" w:sz="4" w:space="0" w:color="auto"/>
+              <w:left w:val="single" w:sz="4" w:space="0" w:color="auto"/>
+              <w:bottom w:val="single" w:sz="4" w:space="0" w:color="auto"/>
+              <w:right w:val="single" w:sz="4" w:space="0" w:color="auto"/>
+            </w:tcBorders>
+            <w:tcMar>
+              <w:top w:w="0" w:type="dxa"/>
+              <w:left w:w="108" w:type="dxa"/>
+              <w:bottom w:w="0" w:type="dxa"/>
+              <w:right w:w="108" w:type="dxa"/>
+            </w:tcMar>
           </w:tcPr>
           <w:p>
             <w:pPr>
@@ -2887,6 +4242,18 @@
         <w:tc>
           <w:tcPr>
             <w:tcW w:w="2850" w:type="pct"/>
+            <w:tcBorders>
+              <w:top w:val="single" w:sz="4" w:space="0" w:color="auto"/>
+              <w:left w:val="single" w:sz="4" w:space="0" w:color="auto"/>
+              <w:bottom w:val="single" w:sz="4" w:space="0" w:color="auto"/>
+              <w:right w:val="single" w:sz="4" w:space="0" w:color="auto"/>
+            </w:tcBorders>
+            <w:tcMar>
+              <w:top w:w="0" w:type="dxa"/>
+              <w:left w:w="108" w:type="dxa"/>
+              <w:bottom w:w="0" w:type="dxa"/>
+              <w:right w:w="108" w:type="dxa"/>
+            </w:tcMar>
             <w:vAlign w:val="center"/>
           </w:tcPr>
           <w:p>
@@ -2913,6 +4280,18 @@
         <w:tc>
           <w:tcPr>
             <w:tcW w:w="1126" w:type="pct"/>
+            <w:tcBorders>
+              <w:top w:val="single" w:sz="4" w:space="0" w:color="auto"/>
+              <w:left w:val="single" w:sz="4" w:space="0" w:color="auto"/>
+              <w:bottom w:val="single" w:sz="4" w:space="0" w:color="auto"/>
+              <w:right w:val="single" w:sz="4" w:space="0" w:color="auto"/>
+            </w:tcBorders>
+            <w:tcMar>
+              <w:top w:w="0" w:type="dxa"/>
+              <w:left w:w="108" w:type="dxa"/>
+              <w:bottom w:w="0" w:type="dxa"/>
+              <w:right w:w="108" w:type="dxa"/>
+            </w:tcMar>
           </w:tcPr>
           <w:p>
             <w:pPr>
@@ -2929,6 +4308,18 @@
         <w:tc>
           <w:tcPr>
             <w:tcW w:w="1024" w:type="pct"/>
+            <w:tcBorders>
+              <w:top w:val="single" w:sz="4" w:space="0" w:color="auto"/>
+              <w:left w:val="single" w:sz="4" w:space="0" w:color="auto"/>
+              <w:bottom w:val="single" w:sz="4" w:space="0" w:color="auto"/>
+              <w:right w:val="single" w:sz="4" w:space="0" w:color="auto"/>
+            </w:tcBorders>
+            <w:tcMar>
+              <w:top w:w="0" w:type="dxa"/>
+              <w:left w:w="108" w:type="dxa"/>
+              <w:bottom w:w="0" w:type="dxa"/>
+              <w:right w:w="108" w:type="dxa"/>
+            </w:tcMar>
           </w:tcPr>
           <w:p>
             <w:pPr>
@@ -2950,6 +4341,18 @@
         <w:tc>
           <w:tcPr>
             <w:tcW w:w="2850" w:type="pct"/>
+            <w:tcBorders>
+              <w:top w:val="single" w:sz="4" w:space="0" w:color="auto"/>
+              <w:left w:val="single" w:sz="4" w:space="0" w:color="auto"/>
+              <w:bottom w:val="single" w:sz="4" w:space="0" w:color="auto"/>
+              <w:right w:val="single" w:sz="4" w:space="0" w:color="auto"/>
+            </w:tcBorders>
+            <w:tcMar>
+              <w:top w:w="0" w:type="dxa"/>
+              <w:left w:w="108" w:type="dxa"/>
+              <w:bottom w:w="0" w:type="dxa"/>
+              <w:right w:w="108" w:type="dxa"/>
+            </w:tcMar>
             <w:vAlign w:val="center"/>
           </w:tcPr>
           <w:p>
@@ -2976,6 +4379,18 @@
         <w:tc>
           <w:tcPr>
             <w:tcW w:w="1126" w:type="pct"/>
+            <w:tcBorders>
+              <w:top w:val="single" w:sz="4" w:space="0" w:color="auto"/>
+              <w:left w:val="single" w:sz="4" w:space="0" w:color="auto"/>
+              <w:bottom w:val="single" w:sz="4" w:space="0" w:color="auto"/>
+              <w:right w:val="single" w:sz="4" w:space="0" w:color="auto"/>
+            </w:tcBorders>
+            <w:tcMar>
+              <w:top w:w="0" w:type="dxa"/>
+              <w:left w:w="108" w:type="dxa"/>
+              <w:bottom w:w="0" w:type="dxa"/>
+              <w:right w:w="108" w:type="dxa"/>
+            </w:tcMar>
           </w:tcPr>
           <w:p>
             <w:pPr>
@@ -2992,6 +4407,18 @@
         <w:tc>
           <w:tcPr>
             <w:tcW w:w="1024" w:type="pct"/>
+            <w:tcBorders>
+              <w:top w:val="single" w:sz="4" w:space="0" w:color="auto"/>
+              <w:left w:val="single" w:sz="4" w:space="0" w:color="auto"/>
+              <w:bottom w:val="single" w:sz="4" w:space="0" w:color="auto"/>
+              <w:right w:val="single" w:sz="4" w:space="0" w:color="auto"/>
+            </w:tcBorders>
+            <w:tcMar>
+              <w:top w:w="0" w:type="dxa"/>
+              <w:left w:w="108" w:type="dxa"/>
+              <w:bottom w:w="0" w:type="dxa"/>
+              <w:right w:w="108" w:type="dxa"/>
+            </w:tcMar>
           </w:tcPr>
           <w:p>
             <w:pPr>
@@ -3013,6 +4440,18 @@
         <w:tc>
           <w:tcPr>
             <w:tcW w:w="2850" w:type="pct"/>
+            <w:tcBorders>
+              <w:top w:val="single" w:sz="4" w:space="0" w:color="auto"/>
+              <w:left w:val="single" w:sz="4" w:space="0" w:color="auto"/>
+              <w:bottom w:val="single" w:sz="4" w:space="0" w:color="auto"/>
+              <w:right w:val="single" w:sz="4" w:space="0" w:color="auto"/>
+            </w:tcBorders>
+            <w:tcMar>
+              <w:top w:w="0" w:type="dxa"/>
+              <w:left w:w="108" w:type="dxa"/>
+              <w:bottom w:w="0" w:type="dxa"/>
+              <w:right w:w="108" w:type="dxa"/>
+            </w:tcMar>
             <w:vAlign w:val="center"/>
           </w:tcPr>
           <w:p>
@@ -3039,6 +4478,18 @@
         <w:tc>
           <w:tcPr>
             <w:tcW w:w="1126" w:type="pct"/>
+            <w:tcBorders>
+              <w:top w:val="single" w:sz="4" w:space="0" w:color="auto"/>
+              <w:left w:val="single" w:sz="4" w:space="0" w:color="auto"/>
+              <w:bottom w:val="single" w:sz="4" w:space="0" w:color="auto"/>
+              <w:right w:val="single" w:sz="4" w:space="0" w:color="auto"/>
+            </w:tcBorders>
+            <w:tcMar>
+              <w:top w:w="0" w:type="dxa"/>
+              <w:left w:w="108" w:type="dxa"/>
+              <w:bottom w:w="0" w:type="dxa"/>
+              <w:right w:w="108" w:type="dxa"/>
+            </w:tcMar>
           </w:tcPr>
           <w:p>
             <w:pPr>
@@ -3055,6 +4506,18 @@
         <w:tc>
           <w:tcPr>
             <w:tcW w:w="1024" w:type="pct"/>
+            <w:tcBorders>
+              <w:top w:val="single" w:sz="4" w:space="0" w:color="auto"/>
+              <w:left w:val="single" w:sz="4" w:space="0" w:color="auto"/>
+              <w:bottom w:val="single" w:sz="4" w:space="0" w:color="auto"/>
+              <w:right w:val="single" w:sz="4" w:space="0" w:color="auto"/>
+            </w:tcBorders>
+            <w:tcMar>
+              <w:top w:w="0" w:type="dxa"/>
+              <w:left w:w="108" w:type="dxa"/>
+              <w:bottom w:w="0" w:type="dxa"/>
+              <w:right w:w="108" w:type="dxa"/>
+            </w:tcMar>
           </w:tcPr>
           <w:p>
             <w:pPr>
@@ -3076,6 +4539,18 @@
         <w:tc>
           <w:tcPr>
             <w:tcW w:w="2850" w:type="pct"/>
+            <w:tcBorders>
+              <w:top w:val="single" w:sz="4" w:space="0" w:color="auto"/>
+              <w:left w:val="single" w:sz="4" w:space="0" w:color="auto"/>
+              <w:bottom w:val="single" w:sz="4" w:space="0" w:color="auto"/>
+              <w:right w:val="single" w:sz="4" w:space="0" w:color="auto"/>
+            </w:tcBorders>
+            <w:tcMar>
+              <w:top w:w="0" w:type="dxa"/>
+              <w:left w:w="108" w:type="dxa"/>
+              <w:bottom w:w="0" w:type="dxa"/>
+              <w:right w:w="108" w:type="dxa"/>
+            </w:tcMar>
             <w:vAlign w:val="center"/>
           </w:tcPr>
           <w:p>
@@ -3102,6 +4577,18 @@
         <w:tc>
           <w:tcPr>
             <w:tcW w:w="1126" w:type="pct"/>
+            <w:tcBorders>
+              <w:top w:val="single" w:sz="4" w:space="0" w:color="auto"/>
+              <w:left w:val="single" w:sz="4" w:space="0" w:color="auto"/>
+              <w:bottom w:val="single" w:sz="4" w:space="0" w:color="auto"/>
+              <w:right w:val="single" w:sz="4" w:space="0" w:color="auto"/>
+            </w:tcBorders>
+            <w:tcMar>
+              <w:top w:w="0" w:type="dxa"/>
+              <w:left w:w="108" w:type="dxa"/>
+              <w:bottom w:w="0" w:type="dxa"/>
+              <w:right w:w="108" w:type="dxa"/>
+            </w:tcMar>
           </w:tcPr>
           <w:p>
             <w:pPr>
@@ -3118,6 +4605,18 @@
         <w:tc>
           <w:tcPr>
             <w:tcW w:w="1024" w:type="pct"/>
+            <w:tcBorders>
+              <w:top w:val="single" w:sz="4" w:space="0" w:color="auto"/>
+              <w:left w:val="single" w:sz="4" w:space="0" w:color="auto"/>
+              <w:bottom w:val="single" w:sz="4" w:space="0" w:color="auto"/>
+              <w:right w:val="single" w:sz="4" w:space="0" w:color="auto"/>
+            </w:tcBorders>
+            <w:tcMar>
+              <w:top w:w="0" w:type="dxa"/>
+              <w:left w:w="108" w:type="dxa"/>
+              <w:bottom w:w="0" w:type="dxa"/>
+              <w:right w:w="108" w:type="dxa"/>
+            </w:tcMar>
           </w:tcPr>
           <w:p>
             <w:pPr>
@@ -3139,6 +4638,18 @@
         <w:tc>
           <w:tcPr>
             <w:tcW w:w="2850" w:type="pct"/>
+            <w:tcBorders>
+              <w:top w:val="single" w:sz="4" w:space="0" w:color="auto"/>
+              <w:left w:val="single" w:sz="4" w:space="0" w:color="auto"/>
+              <w:bottom w:val="single" w:sz="4" w:space="0" w:color="auto"/>
+              <w:right w:val="single" w:sz="4" w:space="0" w:color="auto"/>
+            </w:tcBorders>
+            <w:tcMar>
+              <w:top w:w="0" w:type="dxa"/>
+              <w:left w:w="108" w:type="dxa"/>
+              <w:bottom w:w="0" w:type="dxa"/>
+              <w:right w:w="108" w:type="dxa"/>
+            </w:tcMar>
             <w:vAlign w:val="center"/>
           </w:tcPr>
           <w:p>
@@ -3165,6 +4676,18 @@
         <w:tc>
           <w:tcPr>
             <w:tcW w:w="1126" w:type="pct"/>
+            <w:tcBorders>
+              <w:top w:val="single" w:sz="4" w:space="0" w:color="auto"/>
+              <w:left w:val="single" w:sz="4" w:space="0" w:color="auto"/>
+              <w:bottom w:val="single" w:sz="4" w:space="0" w:color="auto"/>
+              <w:right w:val="single" w:sz="4" w:space="0" w:color="auto"/>
+            </w:tcBorders>
+            <w:tcMar>
+              <w:top w:w="0" w:type="dxa"/>
+              <w:left w:w="108" w:type="dxa"/>
+              <w:bottom w:w="0" w:type="dxa"/>
+              <w:right w:w="108" w:type="dxa"/>
+            </w:tcMar>
           </w:tcPr>
           <w:p>
             <w:pPr>
@@ -3181,6 +4704,18 @@
         <w:tc>
           <w:tcPr>
             <w:tcW w:w="1024" w:type="pct"/>
+            <w:tcBorders>
+              <w:top w:val="single" w:sz="4" w:space="0" w:color="auto"/>
+              <w:left w:val="single" w:sz="4" w:space="0" w:color="auto"/>
+              <w:bottom w:val="single" w:sz="4" w:space="0" w:color="auto"/>
+              <w:right w:val="single" w:sz="4" w:space="0" w:color="auto"/>
+            </w:tcBorders>
+            <w:tcMar>
+              <w:top w:w="0" w:type="dxa"/>
+              <w:left w:w="108" w:type="dxa"/>
+              <w:bottom w:w="0" w:type="dxa"/>
+              <w:right w:w="108" w:type="dxa"/>
+            </w:tcMar>
           </w:tcPr>
           <w:p>
             <w:pPr>
@@ -3202,6 +4737,18 @@
         <w:tc>
           <w:tcPr>
             <w:tcW w:w="2850" w:type="pct"/>
+            <w:tcBorders>
+              <w:top w:val="single" w:sz="4" w:space="0" w:color="auto"/>
+              <w:left w:val="single" w:sz="4" w:space="0" w:color="auto"/>
+              <w:bottom w:val="single" w:sz="4" w:space="0" w:color="auto"/>
+              <w:right w:val="single" w:sz="4" w:space="0" w:color="auto"/>
+            </w:tcBorders>
+            <w:tcMar>
+              <w:top w:w="0" w:type="dxa"/>
+              <w:left w:w="108" w:type="dxa"/>
+              <w:bottom w:w="0" w:type="dxa"/>
+              <w:right w:w="108" w:type="dxa"/>
+            </w:tcMar>
             <w:vAlign w:val="center"/>
           </w:tcPr>
           <w:p>
@@ -3228,6 +4775,18 @@
         <w:tc>
           <w:tcPr>
             <w:tcW w:w="1126" w:type="pct"/>
+            <w:tcBorders>
+              <w:top w:val="single" w:sz="4" w:space="0" w:color="auto"/>
+              <w:left w:val="single" w:sz="4" w:space="0" w:color="auto"/>
+              <w:bottom w:val="single" w:sz="4" w:space="0" w:color="auto"/>
+              <w:right w:val="single" w:sz="4" w:space="0" w:color="auto"/>
+            </w:tcBorders>
+            <w:tcMar>
+              <w:top w:w="0" w:type="dxa"/>
+              <w:left w:w="108" w:type="dxa"/>
+              <w:bottom w:w="0" w:type="dxa"/>
+              <w:right w:w="108" w:type="dxa"/>
+            </w:tcMar>
           </w:tcPr>
           <w:p>
             <w:pPr>
@@ -3244,636 +4803,18 @@
         <w:tc>
           <w:tcPr>
             <w:tcW w:w="1024" w:type="pct"/>
-          </w:tcPr>
-          <w:p>
-            <w:pPr>
-              <w:spacing w:line="360" w:lineRule="auto"/>
-              <w:jc w:val="both"/>
-              <w:rPr>
-                <w:rFonts w:ascii="Arial" w:hAnsi="Arial" w:cs="Arial"/>
-                <w:sz w:val="16"/>
-                <w:szCs w:val="16"/>
-              </w:rPr>
-            </w:pPr>
-          </w:p>
-        </w:tc>
-      </w:tr>
-      <w:tr>
-        <w:trPr>
-          <w:trHeight w:val="245"/>
-        </w:trPr>
-        <w:tc>
-          <w:tcPr>
-            <w:tcW w:w="2850" w:type="pct"/>
-            <w:vAlign w:val="center"/>
-          </w:tcPr>
-          <w:p>
-            <w:pPr>
-              <w:pStyle w:val="ListParagraph"/>
-              <w:numPr>
-                <w:ilvl w:val="0"/>
-                <w:numId w:val="1"/>
-              </w:numPr>
-              <w:tabs>
-                <w:tab w:val="clear" w:pos="720"/>
-                <w:tab w:val="num" w:pos="72"/>
-              </w:tabs>
-              <w:spacing w:line="360" w:lineRule="auto"/>
-              <w:ind w:left="252" w:hanging="252"/>
-              <w:rPr>
-                <w:rFonts w:ascii="Arial" w:hAnsi="Arial" w:cs="Arial"/>
-                <w:sz w:val="16"/>
-                <w:szCs w:val="16"/>
-              </w:rPr>
-            </w:pPr>
-          </w:p>
-        </w:tc>
-        <w:tc>
-          <w:tcPr>
-            <w:tcW w:w="1126" w:type="pct"/>
-          </w:tcPr>
-          <w:p>
-            <w:pPr>
-              <w:spacing w:line="360" w:lineRule="auto"/>
-              <w:jc w:val="both"/>
-              <w:rPr>
-                <w:rFonts w:ascii="Arial" w:hAnsi="Arial" w:cs="Arial"/>
-                <w:sz w:val="16"/>
-                <w:szCs w:val="16"/>
-              </w:rPr>
-            </w:pPr>
-          </w:p>
-        </w:tc>
-        <w:tc>
-          <w:tcPr>
-            <w:tcW w:w="1024" w:type="pct"/>
-          </w:tcPr>
-          <w:p>
-            <w:pPr>
-              <w:spacing w:line="360" w:lineRule="auto"/>
-              <w:jc w:val="both"/>
-              <w:rPr>
-                <w:rFonts w:ascii="Arial" w:hAnsi="Arial" w:cs="Arial"/>
-                <w:sz w:val="16"/>
-                <w:szCs w:val="16"/>
-              </w:rPr>
-            </w:pPr>
-          </w:p>
-        </w:tc>
-      </w:tr>
-      <w:tr>
-        <w:trPr>
-          <w:trHeight w:val="245"/>
-        </w:trPr>
-        <w:tc>
-          <w:tcPr>
-            <w:tcW w:w="2850" w:type="pct"/>
-            <w:vAlign w:val="center"/>
-          </w:tcPr>
-          <w:p>
-            <w:pPr>
-              <w:pStyle w:val="ListParagraph"/>
-              <w:numPr>
-                <w:ilvl w:val="0"/>
-                <w:numId w:val="1"/>
-              </w:numPr>
-              <w:tabs>
-                <w:tab w:val="clear" w:pos="720"/>
-                <w:tab w:val="num" w:pos="72"/>
-              </w:tabs>
-              <w:spacing w:line="360" w:lineRule="auto"/>
-              <w:ind w:left="252" w:hanging="252"/>
-              <w:rPr>
-                <w:rFonts w:ascii="Arial" w:hAnsi="Arial" w:cs="Arial"/>
-                <w:sz w:val="16"/>
-                <w:szCs w:val="16"/>
-              </w:rPr>
-            </w:pPr>
-          </w:p>
-        </w:tc>
-        <w:tc>
-          <w:tcPr>
-            <w:tcW w:w="1126" w:type="pct"/>
-          </w:tcPr>
-          <w:p>
-            <w:pPr>
-              <w:spacing w:line="360" w:lineRule="auto"/>
-              <w:jc w:val="both"/>
-              <w:rPr>
-                <w:rFonts w:ascii="Arial" w:hAnsi="Arial" w:cs="Arial"/>
-                <w:sz w:val="16"/>
-                <w:szCs w:val="16"/>
-              </w:rPr>
-            </w:pPr>
-          </w:p>
-        </w:tc>
-        <w:tc>
-          <w:tcPr>
-            <w:tcW w:w="1024" w:type="pct"/>
-          </w:tcPr>
-          <w:p>
-            <w:pPr>
-              <w:spacing w:line="360" w:lineRule="auto"/>
-              <w:jc w:val="both"/>
-              <w:rPr>
-                <w:rFonts w:ascii="Arial" w:hAnsi="Arial" w:cs="Arial"/>
-                <w:sz w:val="16"/>
-                <w:szCs w:val="16"/>
-              </w:rPr>
-            </w:pPr>
-          </w:p>
-        </w:tc>
-      </w:tr>
-      <w:tr>
-        <w:trPr>
-          <w:trHeight w:val="245"/>
-        </w:trPr>
-        <w:tc>
-          <w:tcPr>
-            <w:tcW w:w="2850" w:type="pct"/>
-            <w:vAlign w:val="center"/>
-          </w:tcPr>
-          <w:p>
-            <w:pPr>
-              <w:pStyle w:val="ListParagraph"/>
-              <w:numPr>
-                <w:ilvl w:val="0"/>
-                <w:numId w:val="1"/>
-              </w:numPr>
-              <w:tabs>
-                <w:tab w:val="clear" w:pos="720"/>
-                <w:tab w:val="num" w:pos="72"/>
-              </w:tabs>
-              <w:spacing w:line="360" w:lineRule="auto"/>
-              <w:ind w:left="252" w:hanging="252"/>
-              <w:rPr>
-                <w:rFonts w:ascii="Arial" w:hAnsi="Arial" w:cs="Arial"/>
-                <w:sz w:val="16"/>
-                <w:szCs w:val="16"/>
-              </w:rPr>
-            </w:pPr>
-          </w:p>
-        </w:tc>
-        <w:tc>
-          <w:tcPr>
-            <w:tcW w:w="1126" w:type="pct"/>
-          </w:tcPr>
-          <w:p>
-            <w:pPr>
-              <w:spacing w:line="360" w:lineRule="auto"/>
-              <w:jc w:val="both"/>
-              <w:rPr>
-                <w:rFonts w:ascii="Arial" w:hAnsi="Arial" w:cs="Arial"/>
-                <w:sz w:val="16"/>
-                <w:szCs w:val="16"/>
-              </w:rPr>
-            </w:pPr>
-          </w:p>
-        </w:tc>
-        <w:tc>
-          <w:tcPr>
-            <w:tcW w:w="1024" w:type="pct"/>
-          </w:tcPr>
-          <w:p>
-            <w:pPr>
-              <w:spacing w:line="360" w:lineRule="auto"/>
-              <w:jc w:val="both"/>
-              <w:rPr>
-                <w:rFonts w:ascii="Arial" w:hAnsi="Arial" w:cs="Arial"/>
-                <w:sz w:val="16"/>
-                <w:szCs w:val="16"/>
-              </w:rPr>
-            </w:pPr>
-          </w:p>
-        </w:tc>
-      </w:tr>
-      <w:tr>
-        <w:trPr>
-          <w:trHeight w:val="245"/>
-        </w:trPr>
-        <w:tc>
-          <w:tcPr>
-            <w:tcW w:w="2850" w:type="pct"/>
-            <w:vAlign w:val="center"/>
-          </w:tcPr>
-          <w:p>
-            <w:pPr>
-              <w:pStyle w:val="ListParagraph"/>
-              <w:numPr>
-                <w:ilvl w:val="0"/>
-                <w:numId w:val="1"/>
-              </w:numPr>
-              <w:tabs>
-                <w:tab w:val="clear" w:pos="720"/>
-                <w:tab w:val="num" w:pos="72"/>
-              </w:tabs>
-              <w:spacing w:line="360" w:lineRule="auto"/>
-              <w:ind w:left="252" w:hanging="252"/>
-              <w:rPr>
-                <w:rFonts w:ascii="Arial" w:hAnsi="Arial" w:cs="Arial"/>
-                <w:sz w:val="16"/>
-                <w:szCs w:val="16"/>
-              </w:rPr>
-            </w:pPr>
-          </w:p>
-        </w:tc>
-        <w:tc>
-          <w:tcPr>
-            <w:tcW w:w="1126" w:type="pct"/>
-          </w:tcPr>
-          <w:p>
-            <w:pPr>
-              <w:spacing w:line="360" w:lineRule="auto"/>
-              <w:jc w:val="both"/>
-              <w:rPr>
-                <w:rFonts w:ascii="Arial" w:hAnsi="Arial" w:cs="Arial"/>
-                <w:sz w:val="16"/>
-                <w:szCs w:val="16"/>
-              </w:rPr>
-            </w:pPr>
-          </w:p>
-        </w:tc>
-        <w:tc>
-          <w:tcPr>
-            <w:tcW w:w="1024" w:type="pct"/>
-          </w:tcPr>
-          <w:p>
-            <w:pPr>
-              <w:spacing w:line="360" w:lineRule="auto"/>
-              <w:jc w:val="both"/>
-              <w:rPr>
-                <w:rFonts w:ascii="Arial" w:hAnsi="Arial" w:cs="Arial"/>
-                <w:sz w:val="16"/>
-                <w:szCs w:val="16"/>
-              </w:rPr>
-            </w:pPr>
-          </w:p>
-        </w:tc>
-      </w:tr>
-      <w:tr>
-        <w:trPr>
-          <w:trHeight w:val="245"/>
-        </w:trPr>
-        <w:tc>
-          <w:tcPr>
-            <w:tcW w:w="2850" w:type="pct"/>
-            <w:vAlign w:val="center"/>
-          </w:tcPr>
-          <w:p>
-            <w:pPr>
-              <w:pStyle w:val="ListParagraph"/>
-              <w:numPr>
-                <w:ilvl w:val="0"/>
-                <w:numId w:val="1"/>
-              </w:numPr>
-              <w:tabs>
-                <w:tab w:val="clear" w:pos="720"/>
-                <w:tab w:val="num" w:pos="72"/>
-              </w:tabs>
-              <w:spacing w:line="360" w:lineRule="auto"/>
-              <w:ind w:left="252" w:hanging="252"/>
-              <w:rPr>
-                <w:rFonts w:ascii="Arial" w:hAnsi="Arial" w:cs="Arial"/>
-                <w:sz w:val="16"/>
-                <w:szCs w:val="16"/>
-              </w:rPr>
-            </w:pPr>
-          </w:p>
-        </w:tc>
-        <w:tc>
-          <w:tcPr>
-            <w:tcW w:w="1126" w:type="pct"/>
-          </w:tcPr>
-          <w:p>
-            <w:pPr>
-              <w:spacing w:line="360" w:lineRule="auto"/>
-              <w:jc w:val="both"/>
-              <w:rPr>
-                <w:rFonts w:ascii="Arial" w:hAnsi="Arial" w:cs="Arial"/>
-                <w:sz w:val="16"/>
-                <w:szCs w:val="16"/>
-              </w:rPr>
-            </w:pPr>
-          </w:p>
-        </w:tc>
-        <w:tc>
-          <w:tcPr>
-            <w:tcW w:w="1024" w:type="pct"/>
-          </w:tcPr>
-          <w:p>
-            <w:pPr>
-              <w:spacing w:line="360" w:lineRule="auto"/>
-              <w:jc w:val="both"/>
-              <w:rPr>
-                <w:rFonts w:ascii="Arial" w:hAnsi="Arial" w:cs="Arial"/>
-                <w:sz w:val="16"/>
-                <w:szCs w:val="16"/>
-              </w:rPr>
-            </w:pPr>
-          </w:p>
-        </w:tc>
-      </w:tr>
-      <w:tr>
-        <w:trPr>
-          <w:trHeight w:val="245"/>
-        </w:trPr>
-        <w:tc>
-          <w:tcPr>
-            <w:tcW w:w="2850" w:type="pct"/>
-            <w:vAlign w:val="center"/>
-          </w:tcPr>
-          <w:p>
-            <w:pPr>
-              <w:pStyle w:val="ListParagraph"/>
-              <w:numPr>
-                <w:ilvl w:val="0"/>
-                <w:numId w:val="1"/>
-              </w:numPr>
-              <w:tabs>
-                <w:tab w:val="clear" w:pos="720"/>
-                <w:tab w:val="num" w:pos="72"/>
-              </w:tabs>
-              <w:spacing w:line="360" w:lineRule="auto"/>
-              <w:ind w:left="252" w:hanging="252"/>
-              <w:rPr>
-                <w:rFonts w:ascii="Arial" w:hAnsi="Arial" w:cs="Arial"/>
-                <w:sz w:val="16"/>
-                <w:szCs w:val="16"/>
-              </w:rPr>
-            </w:pPr>
-          </w:p>
-        </w:tc>
-        <w:tc>
-          <w:tcPr>
-            <w:tcW w:w="1126" w:type="pct"/>
-          </w:tcPr>
-          <w:p>
-            <w:pPr>
-              <w:spacing w:line="360" w:lineRule="auto"/>
-              <w:jc w:val="both"/>
-              <w:rPr>
-                <w:rFonts w:ascii="Arial" w:hAnsi="Arial" w:cs="Arial"/>
-                <w:sz w:val="16"/>
-                <w:szCs w:val="16"/>
-              </w:rPr>
-            </w:pPr>
-          </w:p>
-        </w:tc>
-        <w:tc>
-          <w:tcPr>
-            <w:tcW w:w="1024" w:type="pct"/>
-          </w:tcPr>
-          <w:p>
-            <w:pPr>
-              <w:spacing w:line="360" w:lineRule="auto"/>
-              <w:jc w:val="both"/>
-              <w:rPr>
-                <w:rFonts w:ascii="Arial" w:hAnsi="Arial" w:cs="Arial"/>
-                <w:sz w:val="16"/>
-                <w:szCs w:val="16"/>
-              </w:rPr>
-            </w:pPr>
-          </w:p>
-        </w:tc>
-      </w:tr>
-      <w:tr>
-        <w:trPr>
-          <w:trHeight w:val="245"/>
-        </w:trPr>
-        <w:tc>
-          <w:tcPr>
-            <w:tcW w:w="2850" w:type="pct"/>
-            <w:vAlign w:val="center"/>
-          </w:tcPr>
-          <w:p>
-            <w:pPr>
-              <w:pStyle w:val="ListParagraph"/>
-              <w:numPr>
-                <w:ilvl w:val="0"/>
-                <w:numId w:val="1"/>
-              </w:numPr>
-              <w:tabs>
-                <w:tab w:val="clear" w:pos="720"/>
-                <w:tab w:val="num" w:pos="72"/>
-              </w:tabs>
-              <w:spacing w:line="360" w:lineRule="auto"/>
-              <w:ind w:left="252" w:hanging="252"/>
-              <w:rPr>
-                <w:rFonts w:ascii="Arial" w:hAnsi="Arial" w:cs="Arial"/>
-                <w:sz w:val="16"/>
-                <w:szCs w:val="16"/>
-              </w:rPr>
-            </w:pPr>
-          </w:p>
-        </w:tc>
-        <w:tc>
-          <w:tcPr>
-            <w:tcW w:w="1126" w:type="pct"/>
-          </w:tcPr>
-          <w:p>
-            <w:pPr>
-              <w:spacing w:line="360" w:lineRule="auto"/>
-              <w:jc w:val="both"/>
-              <w:rPr>
-                <w:rFonts w:ascii="Arial" w:hAnsi="Arial" w:cs="Arial"/>
-                <w:sz w:val="16"/>
-                <w:szCs w:val="16"/>
-              </w:rPr>
-            </w:pPr>
-          </w:p>
-        </w:tc>
-        <w:tc>
-          <w:tcPr>
-            <w:tcW w:w="1024" w:type="pct"/>
-          </w:tcPr>
-          <w:p>
-            <w:pPr>
-              <w:spacing w:line="360" w:lineRule="auto"/>
-              <w:jc w:val="both"/>
-              <w:rPr>
-                <w:rFonts w:ascii="Arial" w:hAnsi="Arial" w:cs="Arial"/>
-                <w:sz w:val="16"/>
-                <w:szCs w:val="16"/>
-              </w:rPr>
-            </w:pPr>
-          </w:p>
-        </w:tc>
-      </w:tr>
-      <w:tr>
-        <w:trPr>
-          <w:trHeight w:val="245"/>
-        </w:trPr>
-        <w:tc>
-          <w:tcPr>
-            <w:tcW w:w="2850" w:type="pct"/>
-            <w:vAlign w:val="center"/>
-          </w:tcPr>
-          <w:p>
-            <w:pPr>
-              <w:pStyle w:val="ListParagraph"/>
-              <w:numPr>
-                <w:ilvl w:val="0"/>
-                <w:numId w:val="1"/>
-              </w:numPr>
-              <w:tabs>
-                <w:tab w:val="clear" w:pos="720"/>
-                <w:tab w:val="num" w:pos="72"/>
-              </w:tabs>
-              <w:spacing w:line="360" w:lineRule="auto"/>
-              <w:ind w:left="252" w:hanging="252"/>
-              <w:rPr>
-                <w:rFonts w:ascii="Arial" w:hAnsi="Arial" w:cs="Arial"/>
-                <w:sz w:val="16"/>
-                <w:szCs w:val="16"/>
-              </w:rPr>
-            </w:pPr>
-          </w:p>
-        </w:tc>
-        <w:tc>
-          <w:tcPr>
-            <w:tcW w:w="1126" w:type="pct"/>
-          </w:tcPr>
-          <w:p>
-            <w:pPr>
-              <w:spacing w:line="360" w:lineRule="auto"/>
-              <w:jc w:val="both"/>
-              <w:rPr>
-                <w:rFonts w:ascii="Arial" w:hAnsi="Arial" w:cs="Arial"/>
-                <w:sz w:val="16"/>
-                <w:szCs w:val="16"/>
-              </w:rPr>
-            </w:pPr>
-          </w:p>
-        </w:tc>
-        <w:tc>
-          <w:tcPr>
-            <w:tcW w:w="1024" w:type="pct"/>
-          </w:tcPr>
-          <w:p>
-            <w:pPr>
-              <w:spacing w:line="360" w:lineRule="auto"/>
-              <w:jc w:val="both"/>
-              <w:rPr>
-                <w:rFonts w:ascii="Arial" w:hAnsi="Arial" w:cs="Arial"/>
-                <w:sz w:val="16"/>
-                <w:szCs w:val="16"/>
-              </w:rPr>
-            </w:pPr>
-          </w:p>
-        </w:tc>
-      </w:tr>
-      <w:tr>
-        <w:trPr>
-          <w:trHeight w:val="245"/>
-        </w:trPr>
-        <w:tc>
-          <w:tcPr>
-            <w:tcW w:w="2850" w:type="pct"/>
-            <w:vAlign w:val="center"/>
-          </w:tcPr>
-          <w:p>
-            <w:pPr>
-              <w:pStyle w:val="ListParagraph"/>
-              <w:numPr>
-                <w:ilvl w:val="0"/>
-                <w:numId w:val="1"/>
-              </w:numPr>
-              <w:tabs>
-                <w:tab w:val="clear" w:pos="720"/>
-                <w:tab w:val="num" w:pos="72"/>
-              </w:tabs>
-              <w:spacing w:line="360" w:lineRule="auto"/>
-              <w:ind w:left="252" w:hanging="252"/>
-              <w:rPr>
-                <w:rFonts w:ascii="Arial" w:hAnsi="Arial" w:cs="Arial"/>
-                <w:sz w:val="16"/>
-                <w:szCs w:val="16"/>
-              </w:rPr>
-            </w:pPr>
-          </w:p>
-        </w:tc>
-        <w:tc>
-          <w:tcPr>
-            <w:tcW w:w="1126" w:type="pct"/>
-          </w:tcPr>
-          <w:p>
-            <w:pPr>
-              <w:spacing w:line="360" w:lineRule="auto"/>
-              <w:jc w:val="both"/>
-              <w:rPr>
-                <w:rFonts w:ascii="Arial" w:hAnsi="Arial" w:cs="Arial"/>
-                <w:sz w:val="16"/>
-                <w:szCs w:val="16"/>
-              </w:rPr>
-            </w:pPr>
-          </w:p>
-        </w:tc>
-        <w:tc>
-          <w:tcPr>
-            <w:tcW w:w="1024" w:type="pct"/>
-          </w:tcPr>
-          <w:p>
-            <w:pPr>
-              <w:spacing w:line="360" w:lineRule="auto"/>
-              <w:jc w:val="both"/>
-              <w:rPr>
-                <w:rFonts w:ascii="Arial" w:hAnsi="Arial" w:cs="Arial"/>
-                <w:sz w:val="16"/>
-                <w:szCs w:val="16"/>
-              </w:rPr>
-            </w:pPr>
-          </w:p>
-        </w:tc>
-      </w:tr>
-      <w:tr>
-        <w:trPr>
-          <w:trHeight w:val="245"/>
-        </w:trPr>
-        <w:tc>
-          <w:tcPr>
-            <w:tcW w:w="2850" w:type="pct"/>
-            <w:vAlign w:val="center"/>
-          </w:tcPr>
-          <w:p>
-            <w:pPr>
-              <w:pStyle w:val="ListParagraph"/>
-              <w:numPr>
-                <w:ilvl w:val="0"/>
-                <w:numId w:val="1"/>
-              </w:numPr>
-              <w:tabs>
-                <w:tab w:val="clear" w:pos="720"/>
-                <w:tab w:val="num" w:pos="72"/>
-              </w:tabs>
-              <w:spacing w:line="360" w:lineRule="auto"/>
-              <w:ind w:left="252" w:hanging="252"/>
-              <w:rPr>
-                <w:rFonts w:ascii="Arial" w:hAnsi="Arial" w:cs="Arial"/>
-                <w:sz w:val="16"/>
-                <w:szCs w:val="16"/>
-              </w:rPr>
-            </w:pPr>
-          </w:p>
-        </w:tc>
-        <w:tc>
-          <w:tcPr>
-            <w:tcW w:w="1126" w:type="pct"/>
-          </w:tcPr>
-          <w:p>
-            <w:pPr>
-              <w:spacing w:line="360" w:lineRule="auto"/>
-              <w:jc w:val="both"/>
-              <w:rPr>
-                <w:rFonts w:ascii="Arial" w:hAnsi="Arial" w:cs="Arial"/>
-                <w:sz w:val="16"/>
-                <w:szCs w:val="16"/>
-              </w:rPr>
-            </w:pPr>
-          </w:p>
-        </w:tc>
-        <w:tc>
-          <w:tcPr>
-            <w:tcW w:w="1024" w:type="pct"/>
+            <w:tcBorders>
+              <w:top w:val="single" w:sz="4" w:space="0" w:color="auto"/>
+              <w:left w:val="single" w:sz="4" w:space="0" w:color="auto"/>
+              <w:bottom w:val="single" w:sz="4" w:space="0" w:color="auto"/>
+              <w:right w:val="single" w:sz="4" w:space="0" w:color="auto"/>
+            </w:tcBorders>
+            <w:tcMar>
+              <w:top w:w="0" w:type="dxa"/>
+              <w:left w:w="108" w:type="dxa"/>
+              <w:bottom w:w="0" w:type="dxa"/>
+              <w:right w:w="108" w:type="dxa"/>
+            </w:tcMar>
           </w:tcPr>
           <w:p>
             <w:pPr>
@@ -3902,9 +4843,8 @@
     <w:sectPr>
       <w:headerReference w:type="default" r:id="rId7"/>
       <w:footerReference w:type="default" r:id="rId8"/>
-      <w:pgSz w:w="11909" w:h="16834" w:code="9"/>
+      <w:pgSz w:w="11909" w:h="16834"/>
       <w:pgMar w:top="1728" w:right="1080" w:bottom="576" w:left="2160" w:header="432" w:footer="432" w:gutter="0"/>
-      <w:cols w:space="720"/>
       <w:docGrid w:linePitch="360"/>
     </w:sectPr>
   </w:body>
@@ -3931,7 +4871,7 @@
 </file>
 
 <file path=word/footer1.xml><?xml version="1.0" encoding="utf-8"?>
-<w:ftr xmlns:wpc="http://schemas.microsoft.com/office/word/2010/wordprocessingCanvas" xmlns:cx="http://schemas.microsoft.com/office/drawing/2014/chartex" xmlns:cx1="http://schemas.microsoft.com/office/drawing/2015/9/8/chartex" xmlns:cx2="http://schemas.microsoft.com/office/drawing/2015/10/21/chartex" xmlns:cx3="http://schemas.microsoft.com/office/drawing/2016/5/9/chartex" xmlns:cx4="http://schemas.microsoft.com/office/drawing/2016/5/10/chartex" xmlns:cx5="http://schemas.microsoft.com/office/drawing/2016/5/11/chartex" xmlns:cx6="http://schemas.microsoft.com/office/drawing/2016/5/12/chartex" xmlns:cx7="http://schemas.microsoft.com/office/drawing/2016/5/13/chartex" xmlns:cx8="http://schemas.microsoft.com/office/drawing/2016/5/14/chartex" xmlns:mc="http://schemas.openxmlformats.org/markup-compatibility/2006" xmlns:aink="http://schemas.microsoft.com/office/drawing/2016/ink" xmlns:am3d="http://schemas.microsoft.com/office/drawing/2017/model3d" xmlns:o="urn:schemas-microsoft-com:office:office" xmlns:oel="http://schemas.microsoft.com/office/2019/extlst" xmlns:r="http://schemas.openxmlformats.org/officeDocument/2006/relationships" xmlns:m="http://schemas.openxmlformats.org/officeDocument/2006/math" xmlns:v="urn:schemas-microsoft-com:vml" xmlns:wp14="http://schemas.microsoft.com/office/word/2010/wordprocessingDrawing" xmlns:wp="http://schemas.openxmlformats.org/drawingml/2006/wordprocessingDrawing" xmlns:w10="urn:schemas-microsoft-com:office:word" xmlns:w="http://schemas.openxmlformats.org/wordprocessingml/2006/main" xmlns:w14="http://schemas.microsoft.com/office/word/2010/wordml" xmlns:w15="http://schemas.microsoft.com/office/word/2012/wordml" xmlns:w16cex="http://schemas.microsoft.com/office/word/2018/wordml/cex" xmlns:w16cid="http://schemas.microsoft.com/office/word/2016/wordml/cid" xmlns:w16="http://schemas.microsoft.com/office/word/2018/wordml" xmlns:w16du="http://schemas.microsoft.com/office/word/2023/wordml/word16du" xmlns:w16sdtdh="http://schemas.microsoft.com/office/word/2020/wordml/sdtdatahash" xmlns:w16sdtfl="http://schemas.microsoft.com/office/word/2024/wordml/sdtformatlock" xmlns:w16se="http://schemas.microsoft.com/office/word/2015/wordml/symex" xmlns:wpg="http://schemas.microsoft.com/office/word/2010/wordprocessingGroup" xmlns:wpi="http://schemas.microsoft.com/office/word/2010/wordprocessingInk" xmlns:wne="http://schemas.microsoft.com/office/word/2006/wordml" xmlns:wps="http://schemas.microsoft.com/office/word/2010/wordprocessingShape" mc:Ignorable="w14 w15 w16se w16cid w16 w16cex w16sdtdh w16sdtfl w16du wp14">
+<w:ftr xmlns:wpc="http://schemas.microsoft.com/office/word/2010/wordprocessingCanvas" xmlns:mc="http://schemas.openxmlformats.org/markup-compatibility/2006" xmlns:o="urn:schemas-microsoft-com:office:office" xmlns:r="http://schemas.openxmlformats.org/officeDocument/2006/relationships" xmlns:m="http://schemas.openxmlformats.org/officeDocument/2006/math" xmlns:v="urn:schemas-microsoft-com:vml" xmlns:wp14="http://schemas.microsoft.com/office/word/2010/wordprocessingDrawing" xmlns:wp="http://schemas.openxmlformats.org/drawingml/2006/wordprocessingDrawing" xmlns:w10="urn:schemas-microsoft-com:office:word" xmlns:w="http://schemas.openxmlformats.org/wordprocessingml/2006/main" xmlns:w14="http://schemas.microsoft.com/office/word/2010/wordml" xmlns:w15="http://schemas.microsoft.com/office/word/2012/wordml" xmlns:w16se="http://schemas.microsoft.com/office/word/2015/wordml/symex" xmlns:w16cid="http://schemas.microsoft.com/office/word/2016/wordml/cid" xmlns:w16="http://schemas.microsoft.com/office/word/2018/wordml" xmlns:w16cex="http://schemas.microsoft.com/office/word/2018/wordml/cex" xmlns:w16sdtdh="http://schemas.microsoft.com/office/word/2020/wordml/sdtdatahash" xmlns:wne="http://schemas.microsoft.com/office/word/2006/wordml" xmlns:wpg="http://schemas.microsoft.com/office/word/2010/wordprocessingGroup" xmlns:wps="http://schemas.microsoft.com/office/word/2010/wordprocessingShape">
   <w:p>
     <w:pPr>
       <w:pStyle w:val="Footer"/>
@@ -4020,7 +4960,7 @@
 </file>
 
 <file path=word/header1.xml><?xml version="1.0" encoding="utf-8"?>
-<w:hdr xmlns:wpc="http://schemas.microsoft.com/office/word/2010/wordprocessingCanvas" xmlns:cx="http://schemas.microsoft.com/office/drawing/2014/chartex" xmlns:cx1="http://schemas.microsoft.com/office/drawing/2015/9/8/chartex" xmlns:cx2="http://schemas.microsoft.com/office/drawing/2015/10/21/chartex" xmlns:cx3="http://schemas.microsoft.com/office/drawing/2016/5/9/chartex" xmlns:cx4="http://schemas.microsoft.com/office/drawing/2016/5/10/chartex" xmlns:cx5="http://schemas.microsoft.com/office/drawing/2016/5/11/chartex" xmlns:cx6="http://schemas.microsoft.com/office/drawing/2016/5/12/chartex" xmlns:cx7="http://schemas.microsoft.com/office/drawing/2016/5/13/chartex" xmlns:cx8="http://schemas.microsoft.com/office/drawing/2016/5/14/chartex" xmlns:mc="http://schemas.openxmlformats.org/markup-compatibility/2006" xmlns:aink="http://schemas.microsoft.com/office/drawing/2016/ink" xmlns:am3d="http://schemas.microsoft.com/office/drawing/2017/model3d" xmlns:o="urn:schemas-microsoft-com:office:office" xmlns:oel="http://schemas.microsoft.com/office/2019/extlst" xmlns:r="http://schemas.openxmlformats.org/officeDocument/2006/relationships" xmlns:m="http://schemas.openxmlformats.org/officeDocument/2006/math" xmlns:v="urn:schemas-microsoft-com:vml" xmlns:wp14="http://schemas.microsoft.com/office/word/2010/wordprocessingDrawing" xmlns:wp="http://schemas.openxmlformats.org/drawingml/2006/wordprocessingDrawing" xmlns:w10="urn:schemas-microsoft-com:office:word" xmlns:w="http://schemas.openxmlformats.org/wordprocessingml/2006/main" xmlns:w14="http://schemas.microsoft.com/office/word/2010/wordml" xmlns:w15="http://schemas.microsoft.com/office/word/2012/wordml" xmlns:w16cex="http://schemas.microsoft.com/office/word/2018/wordml/cex" xmlns:w16cid="http://schemas.microsoft.com/office/word/2016/wordml/cid" xmlns:w16="http://schemas.microsoft.com/office/word/2018/wordml" xmlns:w16du="http://schemas.microsoft.com/office/word/2023/wordml/word16du" xmlns:w16sdtdh="http://schemas.microsoft.com/office/word/2020/wordml/sdtdatahash" xmlns:w16sdtfl="http://schemas.microsoft.com/office/word/2024/wordml/sdtformatlock" xmlns:w16se="http://schemas.microsoft.com/office/word/2015/wordml/symex" xmlns:wpg="http://schemas.microsoft.com/office/word/2010/wordprocessingGroup" xmlns:wpi="http://schemas.microsoft.com/office/word/2010/wordprocessingInk" xmlns:wne="http://schemas.microsoft.com/office/word/2006/wordml" xmlns:wps="http://schemas.microsoft.com/office/word/2010/wordprocessingShape" mc:Ignorable="w14 w15 w16se w16cid w16 w16cex w16sdtdh w16sdtfl w16du wp14">
+<w:hdr xmlns:wpc="http://schemas.microsoft.com/office/word/2010/wordprocessingCanvas" xmlns:mc="http://schemas.openxmlformats.org/markup-compatibility/2006" xmlns:o="urn:schemas-microsoft-com:office:office" xmlns:r="http://schemas.openxmlformats.org/officeDocument/2006/relationships" xmlns:m="http://schemas.openxmlformats.org/officeDocument/2006/math" xmlns:v="urn:schemas-microsoft-com:vml" xmlns:wp14="http://schemas.microsoft.com/office/word/2010/wordprocessingDrawing" xmlns:wp="http://schemas.openxmlformats.org/drawingml/2006/wordprocessingDrawing" xmlns:w10="urn:schemas-microsoft-com:office:word" xmlns:w="http://schemas.openxmlformats.org/wordprocessingml/2006/main" xmlns:w14="http://schemas.microsoft.com/office/word/2010/wordml" xmlns:w15="http://schemas.microsoft.com/office/word/2012/wordml" xmlns:w16se="http://schemas.microsoft.com/office/word/2015/wordml/symex" xmlns:w16cid="http://schemas.microsoft.com/office/word/2016/wordml/cid" xmlns:w16="http://schemas.microsoft.com/office/word/2018/wordml" xmlns:w16cex="http://schemas.microsoft.com/office/word/2018/wordml/cex" xmlns:w16sdtdh="http://schemas.microsoft.com/office/word/2020/wordml/sdtdatahash" xmlns:wne="http://schemas.microsoft.com/office/word/2006/wordml" xmlns:wpg="http://schemas.microsoft.com/office/word/2010/wordprocessingGroup" xmlns:wps="http://schemas.microsoft.com/office/word/2010/wordprocessingShape">
   <w:p>
     <w:pPr>
       <w:jc w:val="center"/>
@@ -4032,13 +4972,12 @@
     </w:pPr>
     <w:r>
       <w:rPr>
-        <w:rFonts w:ascii="Bookman Old Style" w:eastAsia="Times New Roman" w:hAnsi="Bookman Old Style"/>
-        <w:noProof/>
+        <w:rFonts w:ascii="Bookman Old Style" w:hAnsi="Bookman Old Style" w:eastAsia="Times New Roman"/>
         <w:sz w:val="28"/>
         <w:szCs w:val="28"/>
       </w:rPr>
       <w:drawing>
-        <wp:anchor distT="0" distB="0" distL="114300" distR="114300" simplePos="0" relativeHeight="251658240" behindDoc="0" locked="0" layoutInCell="1" allowOverlap="1" wp14:anchorId="72478C17" wp14:editId="3DD630F6">
+        <wp:anchor distT="0" distB="0" distL="114300" distR="114300" simplePos="0" relativeHeight="251658240" behindDoc="0" locked="0" layoutInCell="1" allowOverlap="1">
           <wp:simplePos x="0" y="0"/>
           <wp:positionH relativeFrom="column">
             <wp:posOffset>399415</wp:posOffset>
@@ -4049,7 +4988,7 @@
           <wp:extent cx="1028700" cy="911860"/>
           <wp:effectExtent l="0" t="0" r="0" b="2540"/>
           <wp:wrapNone/>
-          <wp:docPr id="10" name="Picture 10" descr="logo-CvSU-2"/>
+          <wp:docPr id="10" name="image2.jpeg" descr="logo-CvSU-2"/>
           <wp:cNvGraphicFramePr>
             <a:graphicFrameLocks xmlns:a="http://schemas.openxmlformats.org/drawingml/2006/main" noChangeAspect="1"/>
           </wp:cNvGraphicFramePr>
@@ -4057,25 +4996,16 @@
             <a:graphicData uri="http://schemas.openxmlformats.org/drawingml/2006/picture">
               <pic:pic xmlns:pic="http://schemas.openxmlformats.org/drawingml/2006/picture">
                 <pic:nvPicPr>
-                  <pic:cNvPr id="0" name="Picture 2" descr="logo-CvSU-2"/>
-                  <pic:cNvPicPr>
-                    <a:picLocks noChangeAspect="1" noChangeArrowheads="1"/>
-                  </pic:cNvPicPr>
+                  <pic:cNvPr id="10" name="image2.jpeg" descr="logo-CvSU-2"/>
+                  <pic:cNvPicPr/>
                 </pic:nvPicPr>
                 <pic:blipFill>
-                  <a:blip r:embed="rId1">
-                    <a:extLst>
-                      <a:ext uri="{28A0092B-C50C-407E-A947-70E740481C1C}">
-                        <a14:useLocalDpi xmlns:a14="http://schemas.microsoft.com/office/drawing/2010/main" val="0"/>
-                      </a:ext>
-                    </a:extLst>
-                  </a:blip>
-                  <a:srcRect/>
+                  <a:blip r:embed="rId4"/>
                   <a:stretch>
                     <a:fillRect/>
                   </a:stretch>
                 </pic:blipFill>
-                <pic:spPr bwMode="auto">
+                <pic:spPr>
                   <a:xfrm>
                     <a:off x="0" y="0"/>
                     <a:ext cx="1028700" cy="911860"/>
@@ -4083,24 +5013,16 @@
                   <a:prstGeom prst="rect">
                     <a:avLst/>
                   </a:prstGeom>
-                  <a:noFill/>
                 </pic:spPr>
               </pic:pic>
             </a:graphicData>
           </a:graphic>
-          <wp14:sizeRelH relativeFrom="page">
-            <wp14:pctWidth>0</wp14:pctWidth>
-          </wp14:sizeRelH>
-          <wp14:sizeRelV relativeFrom="page">
-            <wp14:pctHeight>0</wp14:pctHeight>
-          </wp14:sizeRelV>
         </wp:anchor>
       </w:drawing>
     </w:r>
     <w:r>
       <w:rPr>
         <w:rFonts w:ascii="Century Gothic" w:hAnsi="Century Gothic"/>
-        <w:snapToGrid w:val="0"/>
         <w:color w:val="000000"/>
       </w:rPr>
       <w:t>Republic of the Philippines</w:t>
@@ -4112,19 +5034,9 @@
       <w:rPr>
         <w:rFonts w:ascii="Bookman Old Style" w:hAnsi="Bookman Old Style"/>
         <w:b/>
-        <w:snapToGrid w:val="0"/>
         <w:color w:val="000000"/>
       </w:rPr>
     </w:pPr>
-    <w:r>
-      <w:rPr>
-        <w:rFonts w:ascii="Bookman Old Style" w:hAnsi="Bookman Old Style"/>
-        <w:b/>
-        <w:sz w:val="28"/>
-        <w:szCs w:val="28"/>
-      </w:rPr>
-      <w:t>CAVITE STATE UNIVERSITY</w:t>
-    </w:r>
   </w:p>
   <w:p>
     <w:pPr>
@@ -4132,7 +5044,6 @@
       <w:rPr>
         <w:rFonts w:ascii="Century Gothic" w:hAnsi="Century Gothic"/>
         <w:b/>
-        <w:snapToGrid w:val="0"/>
         <w:color w:val="000000"/>
       </w:rPr>
     </w:pPr>
@@ -4140,7 +5051,6 @@
       <w:rPr>
         <w:rFonts w:ascii="Century Gothic" w:hAnsi="Century Gothic"/>
         <w:b/>
-        <w:snapToGrid w:val="0"/>
         <w:color w:val="000000"/>
       </w:rPr>
       <w:t>Don Severino delas Alas Campus</w:t>
@@ -4150,15 +5060,13 @@
     <w:pPr>
       <w:jc w:val="center"/>
       <w:rPr>
-        <w:rFonts w:ascii="Arial" w:eastAsia="Times New Roman" w:hAnsi="Arial" w:cs="Arial"/>
-        <w:snapToGrid w:val="0"/>
+        <w:rFonts w:ascii="Arial" w:hAnsi="Arial" w:eastAsia="Times New Roman" w:cs="Arial"/>
         <w:color w:val="000000"/>
       </w:rPr>
     </w:pPr>
     <w:r>
       <w:rPr>
         <w:rFonts w:ascii="Century Gothic" w:hAnsi="Century Gothic"/>
-        <w:snapToGrid w:val="0"/>
         <w:color w:val="000000"/>
         <w:sz w:val="20"/>
         <w:szCs w:val="20"/>
@@ -4172,8 +5080,7 @@
         <w:tab w:val="left" w:pos="360"/>
       </w:tabs>
       <w:rPr>
-        <w:rFonts w:ascii="Arial" w:eastAsia="Times New Roman" w:hAnsi="Arial" w:cs="Arial"/>
-        <w:snapToGrid w:val="0"/>
+        <w:rFonts w:ascii="Arial" w:hAnsi="Arial" w:eastAsia="Times New Roman" w:cs="Arial"/>
         <w:color w:val="000000"/>
       </w:rPr>
     </w:pPr>
@@ -4184,8 +5091,7 @@
         <w:tab w:val="left" w:pos="360"/>
       </w:tabs>
       <w:rPr>
-        <w:rFonts w:ascii="Arial" w:eastAsia="Times New Roman" w:hAnsi="Arial" w:cs="Arial"/>
-        <w:snapToGrid w:val="0"/>
+        <w:rFonts w:ascii="Arial" w:hAnsi="Arial" w:eastAsia="Times New Roman" w:cs="Arial"/>
         <w:color w:val="000000"/>
       </w:rPr>
     </w:pPr>
@@ -4194,13 +5100,13 @@
     <w:pPr>
       <w:jc w:val="center"/>
       <w:rPr>
-        <w:rFonts w:ascii="Arial" w:eastAsia="Times New Roman" w:hAnsi="Arial" w:cs="Arial"/>
+        <w:rFonts w:ascii="Arial" w:hAnsi="Arial" w:eastAsia="Times New Roman" w:cs="Arial"/>
         <w:b/>
       </w:rPr>
     </w:pPr>
     <w:r>
       <w:rPr>
-        <w:rFonts w:ascii="Arial" w:eastAsia="Times New Roman" w:hAnsi="Arial" w:cs="Arial"/>
+        <w:rFonts w:ascii="Arial" w:hAnsi="Arial" w:eastAsia="Times New Roman" w:cs="Arial"/>
         <w:b/>
       </w:rPr>
       <w:t>COLLEGE OF ENGINEERING AND INFORMATION TECHNOLOGY</w:t>
@@ -4210,7 +5116,7 @@
     <w:pPr>
       <w:jc w:val="center"/>
       <w:rPr>
-        <w:rFonts w:ascii="Arial" w:eastAsia="Times New Roman" w:hAnsi="Arial" w:cs="Arial"/>
+        <w:rFonts w:ascii="Arial" w:hAnsi="Arial" w:eastAsia="Times New Roman" w:cs="Arial"/>
         <w:b/>
       </w:rPr>
     </w:pPr>
@@ -4220,23 +5126,16 @@
       <w:pStyle w:val="Header"/>
       <w:jc w:val="center"/>
       <w:rPr>
-        <w:rFonts w:ascii="Arial" w:eastAsia="Times New Roman" w:hAnsi="Arial" w:cs="Arial"/>
+        <w:rFonts w:ascii="Arial" w:hAnsi="Arial" w:eastAsia="Times New Roman" w:cs="Arial"/>
         <w:b/>
       </w:rPr>
     </w:pPr>
     <w:r>
       <w:rPr>
-        <w:rFonts w:ascii="Arial" w:eastAsia="Times New Roman" w:hAnsi="Arial" w:cs="Arial"/>
+        <w:rFonts w:ascii="Arial" w:hAnsi="Arial" w:eastAsia="Times New Roman" w:cs="Arial"/>
         <w:b/>
       </w:rPr>
-      <w:t xml:space="preserve">FINAL </w:t>
-    </w:r>
-    <w:r>
-      <w:rPr>
-        <w:rFonts w:ascii="Arial" w:eastAsia="Times New Roman" w:hAnsi="Arial" w:cs="Arial"/>
-        <w:b/>
-      </w:rPr>
-      <w:t>GRADE DISCUSSION AND ACKNOWLEDGMENT FORM</w:t>
+      <w:t>FINAL GRADE DISCUSSION AND ACKNOWLEDGMENT FORM</w:t>
     </w:r>
   </w:p>
   <w:p>
@@ -4252,7 +5151,7 @@
 </file>
 
 <file path=word/numbering.xml><?xml version="1.0" encoding="utf-8"?>
-<w:numbering xmlns:wpc="http://schemas.microsoft.com/office/word/2010/wordprocessingCanvas" xmlns:cx="http://schemas.microsoft.com/office/drawing/2014/chartex" xmlns:cx1="http://schemas.microsoft.com/office/drawing/2015/9/8/chartex" xmlns:cx2="http://schemas.microsoft.com/office/drawing/2015/10/21/chartex" xmlns:cx3="http://schemas.microsoft.com/office/drawing/2016/5/9/chartex" xmlns:cx4="http://schemas.microsoft.com/office/drawing/2016/5/10/chartex" xmlns:cx5="http://schemas.microsoft.com/office/drawing/2016/5/11/chartex" xmlns:cx6="http://schemas.microsoft.com/office/drawing/2016/5/12/chartex" xmlns:cx7="http://schemas.microsoft.com/office/drawing/2016/5/13/chartex" xmlns:cx8="http://schemas.microsoft.com/office/drawing/2016/5/14/chartex" xmlns:mc="http://schemas.openxmlformats.org/markup-compatibility/2006" xmlns:aink="http://schemas.microsoft.com/office/drawing/2016/ink" xmlns:am3d="http://schemas.microsoft.com/office/drawing/2017/model3d" xmlns:o="urn:schemas-microsoft-com:office:office" xmlns:oel="http://schemas.microsoft.com/office/2019/extlst" xmlns:r="http://schemas.openxmlformats.org/officeDocument/2006/relationships" xmlns:m="http://schemas.openxmlformats.org/officeDocument/2006/math" xmlns:v="urn:schemas-microsoft-com:vml" xmlns:wp14="http://schemas.microsoft.com/office/word/2010/wordprocessingDrawing" xmlns:wp="http://schemas.openxmlformats.org/drawingml/2006/wordprocessingDrawing" xmlns:w10="urn:schemas-microsoft-com:office:word" xmlns:w="http://schemas.openxmlformats.org/wordprocessingml/2006/main" xmlns:w14="http://schemas.microsoft.com/office/word/2010/wordml" xmlns:w15="http://schemas.microsoft.com/office/word/2012/wordml" xmlns:w16cex="http://schemas.microsoft.com/office/word/2018/wordml/cex" xmlns:w16cid="http://schemas.microsoft.com/office/word/2016/wordml/cid" xmlns:w16="http://schemas.microsoft.com/office/word/2018/wordml" xmlns:w16du="http://schemas.microsoft.com/office/word/2023/wordml/word16du" xmlns:w16sdtdh="http://schemas.microsoft.com/office/word/2020/wordml/sdtdatahash" xmlns:w16sdtfl="http://schemas.microsoft.com/office/word/2024/wordml/sdtformatlock" xmlns:w16se="http://schemas.microsoft.com/office/word/2015/wordml/symex" xmlns:wpg="http://schemas.microsoft.com/office/word/2010/wordprocessingGroup" xmlns:wpi="http://schemas.microsoft.com/office/word/2010/wordprocessingInk" xmlns:wne="http://schemas.microsoft.com/office/word/2006/wordml" xmlns:wps="http://schemas.microsoft.com/office/word/2010/wordprocessingShape" mc:Ignorable="w14 w15 w16se w16cid w16 w16cex w16sdtdh w16sdtfl w16du wp14">
+<w:numbering xmlns:wpc="http://schemas.microsoft.com/office/word/2010/wordprocessingCanvas" xmlns:cx="http://schemas.microsoft.com/office/drawing/2014/chartex" xmlns:cx1="http://schemas.microsoft.com/office/drawing/2015/9/8/chartex" xmlns:cx2="http://schemas.microsoft.com/office/drawing/2015/10/21/chartex" xmlns:cx3="http://schemas.microsoft.com/office/drawing/2016/5/9/chartex" xmlns:cx4="http://schemas.microsoft.com/office/drawing/2016/5/10/chartex" xmlns:cx5="http://schemas.microsoft.com/office/drawing/2016/5/11/chartex" xmlns:cx6="http://schemas.microsoft.com/office/drawing/2016/5/12/chartex" xmlns:cx7="http://schemas.microsoft.com/office/drawing/2016/5/13/chartex" xmlns:cx8="http://schemas.microsoft.com/office/drawing/2016/5/14/chartex" xmlns:mc="http://schemas.openxmlformats.org/markup-compatibility/2006" xmlns:aink="http://schemas.microsoft.com/office/drawing/2016/ink" xmlns:am3d="http://schemas.microsoft.com/office/drawing/2017/model3d" xmlns:o="urn:schemas-microsoft-com:office:office" xmlns:r="http://schemas.openxmlformats.org/officeDocument/2006/relationships" xmlns:m="http://schemas.openxmlformats.org/officeDocument/2006/math" xmlns:v="urn:schemas-microsoft-com:vml" xmlns:wp14="http://schemas.microsoft.com/office/word/2010/wordprocessingDrawing" xmlns:wp="http://schemas.openxmlformats.org/drawingml/2006/wordprocessingDrawing" xmlns:w10="urn:schemas-microsoft-com:office:word" xmlns:w="http://schemas.openxmlformats.org/wordprocessingml/2006/main" xmlns:w14="http://schemas.microsoft.com/office/word/2010/wordml" xmlns:w15="http://schemas.microsoft.com/office/word/2012/wordml" xmlns:w16cex="http://schemas.microsoft.com/office/word/2018/wordml/cex" xmlns:w16cid="http://schemas.microsoft.com/office/word/2016/wordml/cid" xmlns:w16="http://schemas.microsoft.com/office/word/2018/wordml" xmlns:w16se="http://schemas.microsoft.com/office/word/2015/wordml/symex" xmlns:wpg="http://schemas.microsoft.com/office/word/2010/wordprocessingGroup" xmlns:wpi="http://schemas.microsoft.com/office/word/2010/wordprocessingInk" xmlns:wne="http://schemas.microsoft.com/office/word/2006/wordml" xmlns:wps="http://schemas.microsoft.com/office/word/2010/wordprocessingShape" mc:Ignorable="w14 w15 w16se w16cid w16 w16cex wp14">
   <w:abstractNum w:abstractNumId="0" w15:restartNumberingAfterBreak="0">
     <w:nsid w:val="0E6F5C24"/>
     <w:multiLevelType w:val="hybridMultilevel"/>
@@ -4456,17 +5355,17 @@
       </w:pPr>
     </w:lvl>
   </w:abstractNum>
-  <w:num w:numId="1" w16cid:durableId="4207846">
+  <w:num w:numId="1">
     <w:abstractNumId w:val="1"/>
   </w:num>
-  <w:num w:numId="2" w16cid:durableId="409811935">
+  <w:num w:numId="2">
     <w:abstractNumId w:val="0"/>
   </w:num>
 </w:numbering>
 </file>
 
 <file path=word/styles.xml><?xml version="1.0" encoding="utf-8"?>
-<w:styles xmlns:mc="http://schemas.openxmlformats.org/markup-compatibility/2006" xmlns:r="http://schemas.openxmlformats.org/officeDocument/2006/relationships" xmlns:w="http://schemas.openxmlformats.org/wordprocessingml/2006/main" xmlns:w14="http://schemas.microsoft.com/office/word/2010/wordml" xmlns:w15="http://schemas.microsoft.com/office/word/2012/wordml" xmlns:w16cex="http://schemas.microsoft.com/office/word/2018/wordml/cex" xmlns:w16cid="http://schemas.microsoft.com/office/word/2016/wordml/cid" xmlns:w16="http://schemas.microsoft.com/office/word/2018/wordml" xmlns:w16du="http://schemas.microsoft.com/office/word/2023/wordml/word16du" xmlns:w16sdtdh="http://schemas.microsoft.com/office/word/2020/wordml/sdtdatahash" xmlns:w16sdtfl="http://schemas.microsoft.com/office/word/2024/wordml/sdtformatlock" xmlns:w16se="http://schemas.microsoft.com/office/word/2015/wordml/symex" mc:Ignorable="w14 w15 w16se w16cid w16 w16cex w16sdtdh w16sdtfl w16du">
+<w:styles xmlns:mc="http://schemas.openxmlformats.org/markup-compatibility/2006" xmlns:r="http://schemas.openxmlformats.org/officeDocument/2006/relationships" xmlns:w="http://schemas.openxmlformats.org/wordprocessingml/2006/main" xmlns:w14="http://schemas.microsoft.com/office/word/2010/wordml" xmlns:w15="http://schemas.microsoft.com/office/word/2012/wordml" xmlns:w16cex="http://schemas.microsoft.com/office/word/2018/wordml/cex" xmlns:w16cid="http://schemas.microsoft.com/office/word/2016/wordml/cid" xmlns:w16="http://schemas.microsoft.com/office/word/2018/wordml" xmlns:w16se="http://schemas.microsoft.com/office/word/2015/wordml/symex" mc:Ignorable="w14 w15 w16se w16cid w16 w16cex">
   <w:docDefaults>
     <w:rPrDefault>
       <w:rPr>

</xml_diff>

<commit_message>
126: update compiled standalone executable and optimize CEIT template assets
</commit_message>
<xml_diff>
--- a/templates/Final-Grade-Discussion_LATEST.docx
+++ b/templates/Final-Grade-Discussion_LATEST.docx
@@ -1,54 +1,8 @@
 
 <file path=word/document.xml><?xml version="1.0" encoding="utf-8"?>
-<w:document xmlns:wpc="http://schemas.microsoft.com/office/word/2010/wordprocessingCanvas" xmlns:mc="http://schemas.openxmlformats.org/markup-compatibility/2006" xmlns:o="urn:schemas-microsoft-com:office:office" xmlns:r="http://schemas.openxmlformats.org/officeDocument/2006/relationships" xmlns:m="http://schemas.openxmlformats.org/officeDocument/2006/math" xmlns:v="urn:schemas-microsoft-com:vml" xmlns:wp14="http://schemas.microsoft.com/office/word/2010/wordprocessingDrawing" xmlns:wp="http://schemas.openxmlformats.org/drawingml/2006/wordprocessingDrawing" xmlns:w10="urn:schemas-microsoft-com:office:word" xmlns:w="http://schemas.openxmlformats.org/wordprocessingml/2006/main" xmlns:w14="http://schemas.microsoft.com/office/word/2010/wordml" xmlns:w15="http://schemas.microsoft.com/office/word/2012/wordml" xmlns:w16se="http://schemas.microsoft.com/office/word/2015/wordml/symex" xmlns:w16cid="http://schemas.microsoft.com/office/word/2016/wordml/cid" xmlns:w16="http://schemas.microsoft.com/office/word/2018/wordml" xmlns:w16cex="http://schemas.microsoft.com/office/word/2018/wordml/cex" xmlns:w16sdtdh="http://schemas.microsoft.com/office/word/2020/wordml/sdtdatahash" xmlns:wne="http://schemas.microsoft.com/office/word/2006/wordml" xmlns:wpg="http://schemas.microsoft.com/office/word/2010/wordprocessingGroup" xmlns:wps="http://schemas.microsoft.com/office/word/2010/wordprocessingShape" mc:Ignorable="w14 w15 w16se w16cid w16 w16cex w16sdtdh wp14">
+<w:document xmlns:wpc="http://schemas.microsoft.com/office/word/2010/wordprocessingCanvas" xmlns:cx="http://schemas.microsoft.com/office/drawing/2014/chartex" xmlns:cx1="http://schemas.microsoft.com/office/drawing/2015/9/8/chartex" xmlns:cx2="http://schemas.microsoft.com/office/drawing/2015/10/21/chartex" xmlns:cx3="http://schemas.microsoft.com/office/drawing/2016/5/9/chartex" xmlns:cx4="http://schemas.microsoft.com/office/drawing/2016/5/10/chartex" xmlns:cx5="http://schemas.microsoft.com/office/drawing/2016/5/11/chartex" xmlns:cx6="http://schemas.microsoft.com/office/drawing/2016/5/12/chartex" xmlns:cx7="http://schemas.microsoft.com/office/drawing/2016/5/13/chartex" xmlns:cx8="http://schemas.microsoft.com/office/drawing/2016/5/14/chartex" xmlns:mc="http://schemas.openxmlformats.org/markup-compatibility/2006" xmlns:aink="http://schemas.microsoft.com/office/drawing/2016/ink" xmlns:am3d="http://schemas.microsoft.com/office/drawing/2017/model3d" xmlns:o="urn:schemas-microsoft-com:office:office" xmlns:oel="http://schemas.microsoft.com/office/2019/extlst" xmlns:r="http://schemas.openxmlformats.org/officeDocument/2006/relationships" xmlns:m="http://schemas.openxmlformats.org/officeDocument/2006/math" xmlns:v="urn:schemas-microsoft-com:vml" xmlns:wp14="http://schemas.microsoft.com/office/word/2010/wordprocessingDrawing" xmlns:wp="http://schemas.openxmlformats.org/drawingml/2006/wordprocessingDrawing" xmlns:w10="urn:schemas-microsoft-com:office:word" xmlns:w="http://schemas.openxmlformats.org/wordprocessingml/2006/main" xmlns:w14="http://schemas.microsoft.com/office/word/2010/wordml" xmlns:w15="http://schemas.microsoft.com/office/word/2012/wordml" xmlns:w16cex="http://schemas.microsoft.com/office/word/2018/wordml/cex" xmlns:w16cid="http://schemas.microsoft.com/office/word/2016/wordml/cid" xmlns:w16="http://schemas.microsoft.com/office/word/2018/wordml" xmlns:w16du="http://schemas.microsoft.com/office/word/2023/wordml/word16du" xmlns:w16sdtdh="http://schemas.microsoft.com/office/word/2020/wordml/sdtdatahash" xmlns:w16sdtfl="http://schemas.microsoft.com/office/word/2024/wordml/sdtformatlock" xmlns:w16se="http://schemas.microsoft.com/office/word/2015/wordml/symex" xmlns:wpg="http://schemas.microsoft.com/office/word/2010/wordprocessingGroup" xmlns:wpi="http://schemas.microsoft.com/office/word/2010/wordprocessingInk" xmlns:wne="http://schemas.microsoft.com/office/word/2006/wordml" xmlns:wps="http://schemas.microsoft.com/office/word/2010/wordprocessingShape" mc:Ignorable="w14 w15 w16se w16cid w16 w16cex w16sdtdh w16sdtfl w16du wp14">
   <w:body>
-    <w:p>
-      <w:r>
-        <w:drawing>
-          <wp:anchor distT="0" distB="0" distL="114300" distR="114300" simplePos="0" relativeHeight="251658240" behindDoc="0" locked="0" layoutInCell="1" allowOverlap="1">
-            <wp:simplePos x="0" y="0"/>
-            <wp:positionH relativeFrom="column">
-              <wp:posOffset>4312969</wp:posOffset>
-            </wp:positionH>
-            <wp:positionV relativeFrom="paragraph">
-              <wp:posOffset>-1542513</wp:posOffset>
-            </wp:positionV>
-            <wp:extent cx="1504950" cy="247650"/>
-            <wp:effectExtent l="0" t="0" r="0" b="0"/>
-            <wp:wrapNone/>
-            <wp:docPr id="100000" name="Picture 100000"/>
-            <wp:cNvGraphicFramePr>
-              <a:graphicFrameLocks xmlns:a="http://schemas.openxmlformats.org/drawingml/2006/main" noChangeAspect="1"/>
-            </wp:cNvGraphicFramePr>
-            <a:graphic xmlns:a="http://schemas.openxmlformats.org/drawingml/2006/main">
-              <a:graphicData uri="http://schemas.openxmlformats.org/drawingml/2006/picture">
-                <pic:pic xmlns:pic="http://schemas.openxmlformats.org/drawingml/2006/picture">
-                  <pic:nvPicPr>
-                    <pic:cNvPr id="100000" name="image100000"/>
-                    <pic:cNvPicPr/>
-                  </pic:nvPicPr>
-                  <pic:blipFill>
-                    <a:blip r:embed="rId1"/>
-                    <a:stretch>
-                      <a:fillRect/>
-                    </a:stretch>
-                  </pic:blipFill>
-                  <pic:spPr>
-                    <a:xfrm>
-                      <a:off x="0" y="0"/>
-                      <a:ext cx="1504950" cy="247650"/>
-                    </a:xfrm>
-                    <a:prstGeom prst="rect">
-                      <a:avLst/>
-                    </a:prstGeom>
-                  </pic:spPr>
-                </pic:pic>
-              </a:graphicData>
-            </a:graphic>
-          </wp:anchor>
-        </w:drawing>
-      </w:r>
-    </w:p>
+    <w:p/>
     <w:tbl>
       <w:tblPr>
         <w:tblW w:w="0" w:type="auto"/>
@@ -60,29 +14,17 @@
           <w:insideH w:val="single" w:sz="4" w:space="0" w:color="auto"/>
           <w:insideV w:val="single" w:sz="4" w:space="0" w:color="auto"/>
         </w:tblBorders>
-        <w:tblCellMar>
-          <w:top w:w="0" w:type="dxa"/>
-          <w:left w:w="108" w:type="dxa"/>
-          <w:bottom w:w="0" w:type="dxa"/>
-          <w:right w:w="108" w:type="dxa"/>
-        </w:tblCellMar>
-        <w:tblLook w:firstRow="1" w:firstColumn="1" w:noVBand="1"/>
+        <w:tblLook w:val="07E0" w:firstRow="1" w:lastRow="1" w:firstColumn="1" w:lastColumn="1" w:noHBand="1" w:noVBand="1"/>
       </w:tblPr>
       <w:tblGrid>
-        <w:gridCol w:w="4285"/>
+        <w:gridCol w:w="4282"/>
         <w:gridCol w:w="283"/>
-        <w:gridCol w:w="4101"/>
+        <w:gridCol w:w="4094"/>
       </w:tblGrid>
       <w:tr>
         <w:tc>
           <w:tcPr>
             <w:tcW w:w="4361" w:type="dxa"/>
-            <w:tcBorders>
-              <w:top w:val="none"/>
-              <w:left w:val="none"/>
-              <w:bottom w:val="none"/>
-              <w:right w:val="none"/>
-            </w:tcBorders>
             <w:tcMar>
               <w:top w:w="0" w:type="dxa"/>
               <w:left w:w="108" w:type="dxa"/>
@@ -101,9 +43,7 @@
             </w:pPr>
             <w:r>
               <w:rPr>
-                <w:rFonts w:ascii="Arial" w:hAnsi="Arial" w:eastAsia="Calibri" w:cs="Arial" w:eastAsiaTheme="minorHAnsi"/>
-                <w:sz w:val="22"/>
-                <w:szCs w:val="22"/>
+                <w:rFonts w:ascii="Arial" w:hAnsi="Arial" w:cs="Arial"/>
               </w:rPr>
               <w:t>INSTRUCTOR’S NAME/SIGNATURE</w:t>
             </w:r>
@@ -112,12 +52,6 @@
         <w:tc>
           <w:tcPr>
             <w:tcW w:w="283" w:type="dxa"/>
-            <w:tcBorders>
-              <w:top w:val="none"/>
-              <w:left w:val="none"/>
-              <w:bottom w:val="none"/>
-              <w:right w:val="none"/>
-            </w:tcBorders>
             <w:tcMar>
               <w:top w:w="0" w:type="dxa"/>
               <w:left w:w="108" w:type="dxa"/>
@@ -136,7 +70,7 @@
             </w:pPr>
             <w:r>
               <w:rPr>
-                <w:rFonts w:ascii="Arial" w:hAnsi="Arial" w:eastAsia="Calibri" w:cs="Arial" w:eastAsiaTheme="minorHAnsi"/>
+                <w:rFonts w:ascii="Arial" w:hAnsi="Arial" w:cs="Arial"/>
                 <w:sz w:val="20"/>
                 <w:szCs w:val="20"/>
               </w:rPr>
@@ -148,10 +82,7 @@
           <w:tcPr>
             <w:tcW w:w="4241" w:type="dxa"/>
             <w:tcBorders>
-              <w:top w:val="none"/>
-              <w:left w:val="none"/>
-              <w:bottom w:val="single" w:sz="4" w:color="000000"/>
-              <w:right w:val="none"/>
+              <w:bottom w:val="single" w:sz="4" w:space="0" w:color="000000"/>
             </w:tcBorders>
             <w:tcMar>
               <w:top w:w="0" w:type="dxa"/>
@@ -176,12 +107,6 @@
         <w:tc>
           <w:tcPr>
             <w:tcW w:w="4361" w:type="dxa"/>
-            <w:tcBorders>
-              <w:top w:val="none"/>
-              <w:left w:val="none"/>
-              <w:bottom w:val="none"/>
-              <w:right w:val="none"/>
-            </w:tcBorders>
             <w:tcMar>
               <w:top w:w="0" w:type="dxa"/>
               <w:left w:w="108" w:type="dxa"/>
@@ -200,9 +125,7 @@
             </w:pPr>
             <w:r>
               <w:rPr>
-                <w:rFonts w:ascii="Arial" w:hAnsi="Arial" w:eastAsia="Calibri" w:cs="Arial" w:eastAsiaTheme="minorHAnsi"/>
-                <w:sz w:val="22"/>
-                <w:szCs w:val="22"/>
+                <w:rFonts w:ascii="Arial" w:hAnsi="Arial" w:cs="Arial"/>
               </w:rPr>
               <w:t>COURSE / YEAR / SECTION</w:t>
             </w:r>
@@ -211,12 +134,6 @@
         <w:tc>
           <w:tcPr>
             <w:tcW w:w="283" w:type="dxa"/>
-            <w:tcBorders>
-              <w:top w:val="none"/>
-              <w:left w:val="none"/>
-              <w:bottom w:val="none"/>
-              <w:right w:val="none"/>
-            </w:tcBorders>
             <w:tcMar>
               <w:top w:w="0" w:type="dxa"/>
               <w:left w:w="108" w:type="dxa"/>
@@ -235,7 +152,7 @@
             </w:pPr>
             <w:r>
               <w:rPr>
-                <w:rFonts w:ascii="Arial" w:hAnsi="Arial" w:eastAsia="Calibri" w:cs="Arial" w:eastAsiaTheme="minorHAnsi"/>
+                <w:rFonts w:ascii="Arial" w:hAnsi="Arial" w:cs="Arial"/>
                 <w:sz w:val="20"/>
                 <w:szCs w:val="20"/>
               </w:rPr>
@@ -247,10 +164,8 @@
           <w:tcPr>
             <w:tcW w:w="4241" w:type="dxa"/>
             <w:tcBorders>
-              <w:top w:val="single" w:sz="4" w:color="000000"/>
-              <w:left w:val="none"/>
-              <w:bottom w:val="single" w:sz="4" w:color="000000"/>
-              <w:right w:val="none"/>
+              <w:top w:val="single" w:sz="4" w:space="0" w:color="000000"/>
+              <w:bottom w:val="single" w:sz="4" w:space="0" w:color="000000"/>
             </w:tcBorders>
             <w:tcMar>
               <w:top w:w="0" w:type="dxa"/>
@@ -275,12 +190,6 @@
         <w:tc>
           <w:tcPr>
             <w:tcW w:w="4361" w:type="dxa"/>
-            <w:tcBorders>
-              <w:top w:val="none"/>
-              <w:left w:val="none"/>
-              <w:bottom w:val="none"/>
-              <w:right w:val="none"/>
-            </w:tcBorders>
             <w:tcMar>
               <w:top w:w="0" w:type="dxa"/>
               <w:left w:w="108" w:type="dxa"/>
@@ -299,9 +208,7 @@
             </w:pPr>
             <w:r>
               <w:rPr>
-                <w:rFonts w:ascii="Arial" w:hAnsi="Arial" w:eastAsia="Calibri" w:cs="Arial" w:eastAsiaTheme="minorHAnsi"/>
-                <w:sz w:val="22"/>
-                <w:szCs w:val="22"/>
+                <w:rFonts w:ascii="Arial" w:hAnsi="Arial" w:cs="Arial"/>
               </w:rPr>
               <w:t>SCHEDULE CODE</w:t>
             </w:r>
@@ -310,12 +217,6 @@
         <w:tc>
           <w:tcPr>
             <w:tcW w:w="283" w:type="dxa"/>
-            <w:tcBorders>
-              <w:top w:val="none"/>
-              <w:left w:val="none"/>
-              <w:bottom w:val="none"/>
-              <w:right w:val="none"/>
-            </w:tcBorders>
             <w:tcMar>
               <w:top w:w="0" w:type="dxa"/>
               <w:left w:w="108" w:type="dxa"/>
@@ -334,7 +235,7 @@
             </w:pPr>
             <w:r>
               <w:rPr>
-                <w:rFonts w:ascii="Arial" w:hAnsi="Arial" w:eastAsia="Calibri" w:cs="Arial" w:eastAsiaTheme="minorHAnsi"/>
+                <w:rFonts w:ascii="Arial" w:hAnsi="Arial" w:cs="Arial"/>
                 <w:sz w:val="20"/>
                 <w:szCs w:val="20"/>
               </w:rPr>
@@ -346,10 +247,8 @@
           <w:tcPr>
             <w:tcW w:w="4241" w:type="dxa"/>
             <w:tcBorders>
-              <w:top w:val="single" w:sz="4" w:color="000000"/>
-              <w:left w:val="none"/>
-              <w:bottom w:val="single" w:sz="4" w:color="000000"/>
-              <w:right w:val="none"/>
+              <w:top w:val="single" w:sz="4" w:space="0" w:color="000000"/>
+              <w:bottom w:val="single" w:sz="4" w:space="0" w:color="000000"/>
             </w:tcBorders>
             <w:tcMar>
               <w:top w:w="0" w:type="dxa"/>
@@ -374,12 +273,6 @@
         <w:tc>
           <w:tcPr>
             <w:tcW w:w="4361" w:type="dxa"/>
-            <w:tcBorders>
-              <w:top w:val="none"/>
-              <w:left w:val="none"/>
-              <w:bottom w:val="none"/>
-              <w:right w:val="none"/>
-            </w:tcBorders>
             <w:tcMar>
               <w:top w:w="0" w:type="dxa"/>
               <w:left w:w="108" w:type="dxa"/>
@@ -398,9 +291,7 @@
             </w:pPr>
             <w:r>
               <w:rPr>
-                <w:rFonts w:ascii="Arial" w:hAnsi="Arial" w:eastAsia="Calibri" w:cs="Arial" w:eastAsiaTheme="minorHAnsi"/>
-                <w:sz w:val="22"/>
-                <w:szCs w:val="22"/>
+                <w:rFonts w:ascii="Arial" w:hAnsi="Arial" w:cs="Arial"/>
               </w:rPr>
               <w:t>SUBJECT CODE / TITLE</w:t>
             </w:r>
@@ -409,12 +300,6 @@
         <w:tc>
           <w:tcPr>
             <w:tcW w:w="283" w:type="dxa"/>
-            <w:tcBorders>
-              <w:top w:val="none"/>
-              <w:left w:val="none"/>
-              <w:bottom w:val="none"/>
-              <w:right w:val="none"/>
-            </w:tcBorders>
             <w:tcMar>
               <w:top w:w="0" w:type="dxa"/>
               <w:left w:w="108" w:type="dxa"/>
@@ -433,7 +318,7 @@
             </w:pPr>
             <w:r>
               <w:rPr>
-                <w:rFonts w:ascii="Arial" w:hAnsi="Arial" w:eastAsia="Calibri" w:cs="Arial" w:eastAsiaTheme="minorHAnsi"/>
+                <w:rFonts w:ascii="Arial" w:hAnsi="Arial" w:cs="Arial"/>
                 <w:sz w:val="20"/>
                 <w:szCs w:val="20"/>
               </w:rPr>
@@ -445,10 +330,8 @@
           <w:tcPr>
             <w:tcW w:w="4241" w:type="dxa"/>
             <w:tcBorders>
-              <w:top w:val="single" w:sz="4" w:color="000000"/>
-              <w:left w:val="none"/>
-              <w:bottom w:val="single" w:sz="4" w:color="000000"/>
-              <w:right w:val="none"/>
+              <w:top w:val="single" w:sz="4" w:space="0" w:color="000000"/>
+              <w:bottom w:val="single" w:sz="4" w:space="0" w:color="000000"/>
             </w:tcBorders>
             <w:tcMar>
               <w:top w:w="0" w:type="dxa"/>
@@ -473,12 +356,6 @@
         <w:tc>
           <w:tcPr>
             <w:tcW w:w="4361" w:type="dxa"/>
-            <w:tcBorders>
-              <w:top w:val="none"/>
-              <w:left w:val="none"/>
-              <w:bottom w:val="none"/>
-              <w:right w:val="none"/>
-            </w:tcBorders>
             <w:tcMar>
               <w:top w:w="0" w:type="dxa"/>
               <w:left w:w="108" w:type="dxa"/>
@@ -497,9 +374,7 @@
             </w:pPr>
             <w:r>
               <w:rPr>
-                <w:rFonts w:ascii="Arial" w:hAnsi="Arial" w:eastAsia="Calibri" w:cs="Arial" w:eastAsiaTheme="minorHAnsi"/>
-                <w:sz w:val="22"/>
-                <w:szCs w:val="22"/>
+                <w:rFonts w:ascii="Arial" w:hAnsi="Arial" w:cs="Arial"/>
               </w:rPr>
               <w:t>SEMESTER / ACADEMIC YEAR</w:t>
             </w:r>
@@ -508,12 +383,6 @@
         <w:tc>
           <w:tcPr>
             <w:tcW w:w="283" w:type="dxa"/>
-            <w:tcBorders>
-              <w:top w:val="none"/>
-              <w:left w:val="none"/>
-              <w:bottom w:val="none"/>
-              <w:right w:val="none"/>
-            </w:tcBorders>
             <w:tcMar>
               <w:top w:w="0" w:type="dxa"/>
               <w:left w:w="108" w:type="dxa"/>
@@ -532,7 +401,7 @@
             </w:pPr>
             <w:r>
               <w:rPr>
-                <w:rFonts w:ascii="Arial" w:hAnsi="Arial" w:eastAsia="Calibri" w:cs="Arial" w:eastAsiaTheme="minorHAnsi"/>
+                <w:rFonts w:ascii="Arial" w:hAnsi="Arial" w:cs="Arial"/>
                 <w:sz w:val="20"/>
                 <w:szCs w:val="20"/>
               </w:rPr>
@@ -544,10 +413,8 @@
           <w:tcPr>
             <w:tcW w:w="4241" w:type="dxa"/>
             <w:tcBorders>
-              <w:top w:val="single" w:sz="4" w:color="000000"/>
-              <w:left w:val="none"/>
-              <w:bottom w:val="single" w:sz="4" w:color="000000"/>
-              <w:right w:val="none"/>
+              <w:top w:val="single" w:sz="4" w:space="0" w:color="000000"/>
+              <w:bottom w:val="single" w:sz="4" w:space="0" w:color="000000"/>
             </w:tcBorders>
             <w:tcMar>
               <w:top w:w="0" w:type="dxa"/>
@@ -572,12 +439,6 @@
         <w:tc>
           <w:tcPr>
             <w:tcW w:w="4361" w:type="dxa"/>
-            <w:tcBorders>
-              <w:top w:val="none"/>
-              <w:left w:val="none"/>
-              <w:bottom w:val="none"/>
-              <w:right w:val="none"/>
-            </w:tcBorders>
             <w:tcMar>
               <w:top w:w="0" w:type="dxa"/>
               <w:left w:w="108" w:type="dxa"/>
@@ -596,9 +457,7 @@
             </w:pPr>
             <w:r>
               <w:rPr>
-                <w:rFonts w:ascii="Arial" w:hAnsi="Arial" w:eastAsia="Calibri" w:cs="Arial" w:eastAsiaTheme="minorHAnsi"/>
-                <w:sz w:val="22"/>
-                <w:szCs w:val="22"/>
+                <w:rFonts w:ascii="Arial" w:hAnsi="Arial" w:cs="Arial"/>
               </w:rPr>
               <w:t>DATE</w:t>
             </w:r>
@@ -607,12 +466,6 @@
         <w:tc>
           <w:tcPr>
             <w:tcW w:w="283" w:type="dxa"/>
-            <w:tcBorders>
-              <w:top w:val="none"/>
-              <w:left w:val="none"/>
-              <w:bottom w:val="none"/>
-              <w:right w:val="none"/>
-            </w:tcBorders>
             <w:tcMar>
               <w:top w:w="0" w:type="dxa"/>
               <w:left w:w="108" w:type="dxa"/>
@@ -631,7 +484,7 @@
             </w:pPr>
             <w:r>
               <w:rPr>
-                <w:rFonts w:ascii="Arial" w:hAnsi="Arial" w:eastAsia="Calibri" w:cs="Arial" w:eastAsiaTheme="minorHAnsi"/>
+                <w:rFonts w:ascii="Arial" w:hAnsi="Arial" w:cs="Arial"/>
                 <w:sz w:val="20"/>
                 <w:szCs w:val="20"/>
               </w:rPr>
@@ -643,10 +496,8 @@
           <w:tcPr>
             <w:tcW w:w="4241" w:type="dxa"/>
             <w:tcBorders>
-              <w:top w:val="single" w:sz="4" w:color="000000"/>
-              <w:left w:val="none"/>
-              <w:bottom w:val="single" w:sz="4" w:color="000000"/>
-              <w:right w:val="none"/>
+              <w:top w:val="single" w:sz="4" w:space="0" w:color="000000"/>
+              <w:bottom w:val="single" w:sz="4" w:space="0" w:color="000000"/>
             </w:tcBorders>
             <w:tcMar>
               <w:top w:w="0" w:type="dxa"/>
@@ -698,11 +549,9 @@
       </w:pPr>
       <w:r>
         <w:rPr>
-          <w:rFonts w:ascii="Arial" w:hAnsi="Arial" w:eastAsia="Calibri" w:cs="Arial" w:eastAsiaTheme="minorHAnsi"/>
+          <w:rFonts w:ascii="Arial" w:hAnsi="Arial" w:cs="Arial"/>
           <w:i/>
           <w:iCs/>
-          <w:sz w:val="22"/>
-          <w:szCs w:val="22"/>
         </w:rPr>
         <w:t>This serves as confirmation that the instructor of this subject has presented and discussed the Final Grades. By affixing our signatures opposite our names, we acknowledge receipt and understanding of the grades presented.</w:t>
       </w:r>
@@ -745,13 +594,7 @@
           <w:insideH w:val="single" w:sz="4" w:space="0" w:color="auto"/>
           <w:insideV w:val="single" w:sz="4" w:space="0" w:color="auto"/>
         </w:tblBorders>
-        <w:tblCellMar>
-          <w:top w:w="0" w:type="dxa"/>
-          <w:left w:w="108" w:type="dxa"/>
-          <w:bottom w:w="0" w:type="dxa"/>
-          <w:right w:w="108" w:type="dxa"/>
-        </w:tblCellMar>
-        <w:tblLook w:firstRow="1" w:lastRow="1" w:firstColumn="1" w:lastColumn="1"/>
+        <w:tblLook w:val="07E0" w:firstRow="1" w:lastRow="1" w:firstColumn="1" w:lastColumn="1" w:noHBand="1" w:noVBand="1"/>
       </w:tblPr>
       <w:tblGrid>
         <w:gridCol w:w="4936"/>
@@ -789,11 +632,9 @@
             </w:pPr>
             <w:r>
               <w:rPr>
-                <w:rFonts w:ascii="Arial" w:hAnsi="Arial" w:eastAsia="Calibri" w:cs="Arial" w:eastAsiaTheme="minorHAnsi"/>
+                <w:rFonts w:ascii="Arial" w:hAnsi="Arial" w:cs="Arial"/>
                 <w:b/>
                 <w:bCs/>
-                <w:sz w:val="22"/>
-                <w:szCs w:val="22"/>
               </w:rPr>
               <w:t>NAME OF STUDENTS</w:t>
             </w:r>
@@ -826,11 +667,9 @@
             </w:pPr>
             <w:r>
               <w:rPr>
-                <w:rFonts w:ascii="Arial" w:hAnsi="Arial" w:eastAsia="Calibri" w:cs="Arial" w:eastAsiaTheme="minorHAnsi"/>
+                <w:rFonts w:ascii="Arial" w:hAnsi="Arial" w:cs="Arial"/>
                 <w:b/>
                 <w:bCs/>
-                <w:sz w:val="22"/>
-                <w:szCs w:val="22"/>
               </w:rPr>
               <w:t>STUDENT NUMBER</w:t>
             </w:r>
@@ -863,11 +702,9 @@
             </w:pPr>
             <w:r>
               <w:rPr>
-                <w:rFonts w:ascii="Arial" w:hAnsi="Arial" w:eastAsia="Calibri" w:cs="Arial" w:eastAsiaTheme="minorHAnsi"/>
+                <w:rFonts w:ascii="Arial" w:hAnsi="Arial" w:cs="Arial"/>
                 <w:b/>
                 <w:bCs/>
-                <w:sz w:val="22"/>
-                <w:szCs w:val="22"/>
               </w:rPr>
               <w:t>SIGNATURE</w:t>
             </w:r>
@@ -4845,6 +4682,7 @@
       <w:footerReference w:type="default" r:id="rId8"/>
       <w:pgSz w:w="11909" w:h="16834"/>
       <w:pgMar w:top="1728" w:right="1080" w:bottom="576" w:left="2160" w:header="432" w:footer="432" w:gutter="0"/>
+      <w:cols w:space="720"/>
       <w:docGrid w:linePitch="360"/>
     </w:sectPr>
   </w:body>
@@ -4871,7 +4709,7 @@
 </file>
 
 <file path=word/footer1.xml><?xml version="1.0" encoding="utf-8"?>
-<w:ftr xmlns:wpc="http://schemas.microsoft.com/office/word/2010/wordprocessingCanvas" xmlns:mc="http://schemas.openxmlformats.org/markup-compatibility/2006" xmlns:o="urn:schemas-microsoft-com:office:office" xmlns:r="http://schemas.openxmlformats.org/officeDocument/2006/relationships" xmlns:m="http://schemas.openxmlformats.org/officeDocument/2006/math" xmlns:v="urn:schemas-microsoft-com:vml" xmlns:wp14="http://schemas.microsoft.com/office/word/2010/wordprocessingDrawing" xmlns:wp="http://schemas.openxmlformats.org/drawingml/2006/wordprocessingDrawing" xmlns:w10="urn:schemas-microsoft-com:office:word" xmlns:w="http://schemas.openxmlformats.org/wordprocessingml/2006/main" xmlns:w14="http://schemas.microsoft.com/office/word/2010/wordml" xmlns:w15="http://schemas.microsoft.com/office/word/2012/wordml" xmlns:w16se="http://schemas.microsoft.com/office/word/2015/wordml/symex" xmlns:w16cid="http://schemas.microsoft.com/office/word/2016/wordml/cid" xmlns:w16="http://schemas.microsoft.com/office/word/2018/wordml" xmlns:w16cex="http://schemas.microsoft.com/office/word/2018/wordml/cex" xmlns:w16sdtdh="http://schemas.microsoft.com/office/word/2020/wordml/sdtdatahash" xmlns:wne="http://schemas.microsoft.com/office/word/2006/wordml" xmlns:wpg="http://schemas.microsoft.com/office/word/2010/wordprocessingGroup" xmlns:wps="http://schemas.microsoft.com/office/word/2010/wordprocessingShape">
+<w:ftr xmlns:wpc="http://schemas.microsoft.com/office/word/2010/wordprocessingCanvas" xmlns:cx="http://schemas.microsoft.com/office/drawing/2014/chartex" xmlns:cx1="http://schemas.microsoft.com/office/drawing/2015/9/8/chartex" xmlns:cx2="http://schemas.microsoft.com/office/drawing/2015/10/21/chartex" xmlns:cx3="http://schemas.microsoft.com/office/drawing/2016/5/9/chartex" xmlns:cx4="http://schemas.microsoft.com/office/drawing/2016/5/10/chartex" xmlns:cx5="http://schemas.microsoft.com/office/drawing/2016/5/11/chartex" xmlns:cx6="http://schemas.microsoft.com/office/drawing/2016/5/12/chartex" xmlns:cx7="http://schemas.microsoft.com/office/drawing/2016/5/13/chartex" xmlns:cx8="http://schemas.microsoft.com/office/drawing/2016/5/14/chartex" xmlns:mc="http://schemas.openxmlformats.org/markup-compatibility/2006" xmlns:aink="http://schemas.microsoft.com/office/drawing/2016/ink" xmlns:am3d="http://schemas.microsoft.com/office/drawing/2017/model3d" xmlns:o="urn:schemas-microsoft-com:office:office" xmlns:oel="http://schemas.microsoft.com/office/2019/extlst" xmlns:r="http://schemas.openxmlformats.org/officeDocument/2006/relationships" xmlns:m="http://schemas.openxmlformats.org/officeDocument/2006/math" xmlns:v="urn:schemas-microsoft-com:vml" xmlns:wp14="http://schemas.microsoft.com/office/word/2010/wordprocessingDrawing" xmlns:wp="http://schemas.openxmlformats.org/drawingml/2006/wordprocessingDrawing" xmlns:w10="urn:schemas-microsoft-com:office:word" xmlns:w="http://schemas.openxmlformats.org/wordprocessingml/2006/main" xmlns:w14="http://schemas.microsoft.com/office/word/2010/wordml" xmlns:w15="http://schemas.microsoft.com/office/word/2012/wordml" xmlns:w16cex="http://schemas.microsoft.com/office/word/2018/wordml/cex" xmlns:w16cid="http://schemas.microsoft.com/office/word/2016/wordml/cid" xmlns:w16="http://schemas.microsoft.com/office/word/2018/wordml" xmlns:w16du="http://schemas.microsoft.com/office/word/2023/wordml/word16du" xmlns:w16sdtdh="http://schemas.microsoft.com/office/word/2020/wordml/sdtdatahash" xmlns:w16sdtfl="http://schemas.microsoft.com/office/word/2024/wordml/sdtformatlock" xmlns:w16se="http://schemas.microsoft.com/office/word/2015/wordml/symex" xmlns:wpg="http://schemas.microsoft.com/office/word/2010/wordprocessingGroup" xmlns:wpi="http://schemas.microsoft.com/office/word/2010/wordprocessingInk" xmlns:wne="http://schemas.microsoft.com/office/word/2006/wordml" xmlns:wps="http://schemas.microsoft.com/office/word/2010/wordprocessingShape" mc:Ignorable="w14 w15 w16se w16cid w16 w16cex w16sdtdh w16sdtfl w16du wp14">
   <w:p>
     <w:pPr>
       <w:pStyle w:val="Footer"/>
@@ -4889,52 +4727,7 @@
         <w:sz w:val="18"/>
         <w:szCs w:val="18"/>
       </w:rPr>
-      <w:t>V01-</w:t>
-    </w:r>
-    <w:r>
-      <w:rPr>
-        <w:rFonts w:ascii="Arial" w:hAnsi="Arial" w:cs="Arial"/>
-        <w:i/>
-        <w:sz w:val="18"/>
-        <w:szCs w:val="18"/>
-      </w:rPr>
-      <w:t>xxxx</w:t>
-    </w:r>
-    <w:r>
-      <w:rPr>
-        <w:rFonts w:ascii="Arial" w:hAnsi="Arial" w:cs="Arial"/>
-        <w:i/>
-        <w:sz w:val="18"/>
-        <w:szCs w:val="18"/>
-      </w:rPr>
-      <w:t>-</w:t>
-    </w:r>
-    <w:r>
-      <w:rPr>
-        <w:rFonts w:ascii="Arial" w:hAnsi="Arial" w:cs="Arial"/>
-        <w:i/>
-        <w:sz w:val="18"/>
-        <w:szCs w:val="18"/>
-      </w:rPr>
-      <w:t>xx</w:t>
-    </w:r>
-    <w:r>
-      <w:rPr>
-        <w:rFonts w:ascii="Arial" w:hAnsi="Arial" w:cs="Arial"/>
-        <w:i/>
-        <w:sz w:val="18"/>
-        <w:szCs w:val="18"/>
-      </w:rPr>
-      <w:t>-</w:t>
-    </w:r>
-    <w:r>
-      <w:rPr>
-        <w:rFonts w:ascii="Arial" w:hAnsi="Arial" w:cs="Arial"/>
-        <w:i/>
-        <w:sz w:val="18"/>
-        <w:szCs w:val="18"/>
-      </w:rPr>
-      <w:t>xx</w:t>
+      <w:t>V01-xxxx-xx-xx</w:t>
     </w:r>
   </w:p>
 </w:ftr>
@@ -4960,7 +4753,27 @@
 </file>
 
 <file path=word/header1.xml><?xml version="1.0" encoding="utf-8"?>
-<w:hdr xmlns:wpc="http://schemas.microsoft.com/office/word/2010/wordprocessingCanvas" xmlns:mc="http://schemas.openxmlformats.org/markup-compatibility/2006" xmlns:o="urn:schemas-microsoft-com:office:office" xmlns:r="http://schemas.openxmlformats.org/officeDocument/2006/relationships" xmlns:m="http://schemas.openxmlformats.org/officeDocument/2006/math" xmlns:v="urn:schemas-microsoft-com:vml" xmlns:wp14="http://schemas.microsoft.com/office/word/2010/wordprocessingDrawing" xmlns:wp="http://schemas.openxmlformats.org/drawingml/2006/wordprocessingDrawing" xmlns:w10="urn:schemas-microsoft-com:office:word" xmlns:w="http://schemas.openxmlformats.org/wordprocessingml/2006/main" xmlns:w14="http://schemas.microsoft.com/office/word/2010/wordml" xmlns:w15="http://schemas.microsoft.com/office/word/2012/wordml" xmlns:w16se="http://schemas.microsoft.com/office/word/2015/wordml/symex" xmlns:w16cid="http://schemas.microsoft.com/office/word/2016/wordml/cid" xmlns:w16="http://schemas.microsoft.com/office/word/2018/wordml" xmlns:w16cex="http://schemas.microsoft.com/office/word/2018/wordml/cex" xmlns:w16sdtdh="http://schemas.microsoft.com/office/word/2020/wordml/sdtdatahash" xmlns:wne="http://schemas.microsoft.com/office/word/2006/wordml" xmlns:wpg="http://schemas.microsoft.com/office/word/2010/wordprocessingGroup" xmlns:wps="http://schemas.microsoft.com/office/word/2010/wordprocessingShape">
+<w:hdr xmlns:wpc="http://schemas.microsoft.com/office/word/2010/wordprocessingCanvas" xmlns:cx="http://schemas.microsoft.com/office/drawing/2014/chartex" xmlns:cx1="http://schemas.microsoft.com/office/drawing/2015/9/8/chartex" xmlns:cx2="http://schemas.microsoft.com/office/drawing/2015/10/21/chartex" xmlns:cx3="http://schemas.microsoft.com/office/drawing/2016/5/9/chartex" xmlns:cx4="http://schemas.microsoft.com/office/drawing/2016/5/10/chartex" xmlns:cx5="http://schemas.microsoft.com/office/drawing/2016/5/11/chartex" xmlns:cx6="http://schemas.microsoft.com/office/drawing/2016/5/12/chartex" xmlns:cx7="http://schemas.microsoft.com/office/drawing/2016/5/13/chartex" xmlns:cx8="http://schemas.microsoft.com/office/drawing/2016/5/14/chartex" xmlns:mc="http://schemas.openxmlformats.org/markup-compatibility/2006" xmlns:aink="http://schemas.microsoft.com/office/drawing/2016/ink" xmlns:am3d="http://schemas.microsoft.com/office/drawing/2017/model3d" xmlns:o="urn:schemas-microsoft-com:office:office" xmlns:oel="http://schemas.microsoft.com/office/2019/extlst" xmlns:r="http://schemas.openxmlformats.org/officeDocument/2006/relationships" xmlns:m="http://schemas.openxmlformats.org/officeDocument/2006/math" xmlns:v="urn:schemas-microsoft-com:vml" xmlns:wp14="http://schemas.microsoft.com/office/word/2010/wordprocessingDrawing" xmlns:wp="http://schemas.openxmlformats.org/drawingml/2006/wordprocessingDrawing" xmlns:w10="urn:schemas-microsoft-com:office:word" xmlns:w="http://schemas.openxmlformats.org/wordprocessingml/2006/main" xmlns:w14="http://schemas.microsoft.com/office/word/2010/wordml" xmlns:w15="http://schemas.microsoft.com/office/word/2012/wordml" xmlns:w16cex="http://schemas.microsoft.com/office/word/2018/wordml/cex" xmlns:w16cid="http://schemas.microsoft.com/office/word/2016/wordml/cid" xmlns:w16="http://schemas.microsoft.com/office/word/2018/wordml" xmlns:w16du="http://schemas.microsoft.com/office/word/2023/wordml/word16du" xmlns:w16sdtdh="http://schemas.microsoft.com/office/word/2020/wordml/sdtdatahash" xmlns:w16sdtfl="http://schemas.microsoft.com/office/word/2024/wordml/sdtformatlock" xmlns:w16se="http://schemas.microsoft.com/office/word/2015/wordml/symex" xmlns:wpg="http://schemas.microsoft.com/office/word/2010/wordprocessingGroup" xmlns:wpi="http://schemas.microsoft.com/office/word/2010/wordprocessingInk" xmlns:wne="http://schemas.microsoft.com/office/word/2006/wordml" xmlns:wps="http://schemas.microsoft.com/office/word/2010/wordprocessingShape" mc:Ignorable="w14 w15 w16se w16cid w16 w16cex w16sdtdh w16sdtfl w16du wp14">
+  <w:p>
+    <w:pPr>
+      <w:jc w:val="right"/>
+      <w:rPr>
+        <w:rFonts w:ascii="Century Gothic" w:hAnsi="Century Gothic"/>
+        <w:color w:val="000000"/>
+        <w:sz w:val="18"/>
+        <w:szCs w:val="18"/>
+      </w:rPr>
+    </w:pPr>
+    <w:r>
+      <w:rPr>
+        <w:rFonts w:ascii="Century Gothic" w:hAnsi="Century Gothic"/>
+        <w:color w:val="000000"/>
+        <w:sz w:val="18"/>
+        <w:szCs w:val="18"/>
+      </w:rPr>
+      <w:t>XXXX-XX-XXX</w:t>
+    </w:r>
+  </w:p>
   <w:p>
     <w:pPr>
       <w:jc w:val="center"/>
@@ -4972,12 +4785,13 @@
     </w:pPr>
     <w:r>
       <w:rPr>
-        <w:rFonts w:ascii="Bookman Old Style" w:hAnsi="Bookman Old Style" w:eastAsia="Times New Roman"/>
+        <w:rFonts w:ascii="Bookman Old Style" w:eastAsia="Times New Roman" w:hAnsi="Bookman Old Style"/>
+        <w:noProof/>
         <w:sz w:val="28"/>
         <w:szCs w:val="28"/>
       </w:rPr>
       <w:drawing>
-        <wp:anchor distT="0" distB="0" distL="114300" distR="114300" simplePos="0" relativeHeight="251658240" behindDoc="0" locked="0" layoutInCell="1" allowOverlap="1">
+        <wp:anchor distT="0" distB="0" distL="114300" distR="114300" simplePos="0" relativeHeight="251658240" behindDoc="0" locked="0" layoutInCell="1" allowOverlap="1" wp14:anchorId="4BB7C27A" wp14:editId="63AC9258">
           <wp:simplePos x="0" y="0"/>
           <wp:positionH relativeFrom="column">
             <wp:posOffset>399415</wp:posOffset>
@@ -5000,7 +4814,7 @@
                   <pic:cNvPicPr/>
                 </pic:nvPicPr>
                 <pic:blipFill>
-                  <a:blip r:embed="rId4"/>
+                  <a:blip r:embed="rId1"/>
                   <a:stretch>
                     <a:fillRect/>
                   </a:stretch>
@@ -5034,9 +4848,19 @@
       <w:rPr>
         <w:rFonts w:ascii="Bookman Old Style" w:hAnsi="Bookman Old Style"/>
         <w:b/>
+        <w:snapToGrid w:val="0"/>
         <w:color w:val="000000"/>
       </w:rPr>
     </w:pPr>
+    <w:r>
+      <w:rPr>
+        <w:rFonts w:ascii="Bookman Old Style" w:hAnsi="Bookman Old Style"/>
+        <w:b/>
+        <w:sz w:val="28"/>
+        <w:szCs w:val="28"/>
+      </w:rPr>
+      <w:t>CAVITE STATE UNIVERSITY</w:t>
+    </w:r>
   </w:p>
   <w:p>
     <w:pPr>
@@ -5060,7 +4884,7 @@
     <w:pPr>
       <w:jc w:val="center"/>
       <w:rPr>
-        <w:rFonts w:ascii="Arial" w:hAnsi="Arial" w:eastAsia="Times New Roman" w:cs="Arial"/>
+        <w:rFonts w:ascii="Arial" w:eastAsia="Times New Roman" w:hAnsi="Arial" w:cs="Arial"/>
         <w:color w:val="000000"/>
       </w:rPr>
     </w:pPr>
@@ -5080,7 +4904,7 @@
         <w:tab w:val="left" w:pos="360"/>
       </w:tabs>
       <w:rPr>
-        <w:rFonts w:ascii="Arial" w:hAnsi="Arial" w:eastAsia="Times New Roman" w:cs="Arial"/>
+        <w:rFonts w:ascii="Arial" w:eastAsia="Times New Roman" w:hAnsi="Arial" w:cs="Arial"/>
         <w:color w:val="000000"/>
       </w:rPr>
     </w:pPr>
@@ -5091,7 +4915,7 @@
         <w:tab w:val="left" w:pos="360"/>
       </w:tabs>
       <w:rPr>
-        <w:rFonts w:ascii="Arial" w:hAnsi="Arial" w:eastAsia="Times New Roman" w:cs="Arial"/>
+        <w:rFonts w:ascii="Arial" w:eastAsia="Times New Roman" w:hAnsi="Arial" w:cs="Arial"/>
         <w:color w:val="000000"/>
       </w:rPr>
     </w:pPr>
@@ -5100,13 +4924,13 @@
     <w:pPr>
       <w:jc w:val="center"/>
       <w:rPr>
-        <w:rFonts w:ascii="Arial" w:hAnsi="Arial" w:eastAsia="Times New Roman" w:cs="Arial"/>
+        <w:rFonts w:ascii="Arial" w:eastAsia="Times New Roman" w:hAnsi="Arial" w:cs="Arial"/>
         <w:b/>
       </w:rPr>
     </w:pPr>
     <w:r>
       <w:rPr>
-        <w:rFonts w:ascii="Arial" w:hAnsi="Arial" w:eastAsia="Times New Roman" w:cs="Arial"/>
+        <w:rFonts w:ascii="Arial" w:eastAsia="Times New Roman" w:hAnsi="Arial" w:cs="Arial"/>
         <w:b/>
       </w:rPr>
       <w:t>COLLEGE OF ENGINEERING AND INFORMATION TECHNOLOGY</w:t>
@@ -5116,7 +4940,7 @@
     <w:pPr>
       <w:jc w:val="center"/>
       <w:rPr>
-        <w:rFonts w:ascii="Arial" w:hAnsi="Arial" w:eastAsia="Times New Roman" w:cs="Arial"/>
+        <w:rFonts w:ascii="Arial" w:eastAsia="Times New Roman" w:hAnsi="Arial" w:cs="Arial"/>
         <w:b/>
       </w:rPr>
     </w:pPr>
@@ -5126,13 +4950,13 @@
       <w:pStyle w:val="Header"/>
       <w:jc w:val="center"/>
       <w:rPr>
-        <w:rFonts w:ascii="Arial" w:hAnsi="Arial" w:eastAsia="Times New Roman" w:cs="Arial"/>
+        <w:rFonts w:ascii="Arial" w:eastAsia="Times New Roman" w:hAnsi="Arial" w:cs="Arial"/>
         <w:b/>
       </w:rPr>
     </w:pPr>
     <w:r>
       <w:rPr>
-        <w:rFonts w:ascii="Arial" w:hAnsi="Arial" w:eastAsia="Times New Roman" w:cs="Arial"/>
+        <w:rFonts w:ascii="Arial" w:eastAsia="Times New Roman" w:hAnsi="Arial" w:cs="Arial"/>
         <w:b/>
       </w:rPr>
       <w:t>FINAL GRADE DISCUSSION AND ACKNOWLEDGMENT FORM</w:t>
@@ -5151,7 +4975,7 @@
 </file>
 
 <file path=word/numbering.xml><?xml version="1.0" encoding="utf-8"?>
-<w:numbering xmlns:wpc="http://schemas.microsoft.com/office/word/2010/wordprocessingCanvas" xmlns:cx="http://schemas.microsoft.com/office/drawing/2014/chartex" xmlns:cx1="http://schemas.microsoft.com/office/drawing/2015/9/8/chartex" xmlns:cx2="http://schemas.microsoft.com/office/drawing/2015/10/21/chartex" xmlns:cx3="http://schemas.microsoft.com/office/drawing/2016/5/9/chartex" xmlns:cx4="http://schemas.microsoft.com/office/drawing/2016/5/10/chartex" xmlns:cx5="http://schemas.microsoft.com/office/drawing/2016/5/11/chartex" xmlns:cx6="http://schemas.microsoft.com/office/drawing/2016/5/12/chartex" xmlns:cx7="http://schemas.microsoft.com/office/drawing/2016/5/13/chartex" xmlns:cx8="http://schemas.microsoft.com/office/drawing/2016/5/14/chartex" xmlns:mc="http://schemas.openxmlformats.org/markup-compatibility/2006" xmlns:aink="http://schemas.microsoft.com/office/drawing/2016/ink" xmlns:am3d="http://schemas.microsoft.com/office/drawing/2017/model3d" xmlns:o="urn:schemas-microsoft-com:office:office" xmlns:r="http://schemas.openxmlformats.org/officeDocument/2006/relationships" xmlns:m="http://schemas.openxmlformats.org/officeDocument/2006/math" xmlns:v="urn:schemas-microsoft-com:vml" xmlns:wp14="http://schemas.microsoft.com/office/word/2010/wordprocessingDrawing" xmlns:wp="http://schemas.openxmlformats.org/drawingml/2006/wordprocessingDrawing" xmlns:w10="urn:schemas-microsoft-com:office:word" xmlns:w="http://schemas.openxmlformats.org/wordprocessingml/2006/main" xmlns:w14="http://schemas.microsoft.com/office/word/2010/wordml" xmlns:w15="http://schemas.microsoft.com/office/word/2012/wordml" xmlns:w16cex="http://schemas.microsoft.com/office/word/2018/wordml/cex" xmlns:w16cid="http://schemas.microsoft.com/office/word/2016/wordml/cid" xmlns:w16="http://schemas.microsoft.com/office/word/2018/wordml" xmlns:w16se="http://schemas.microsoft.com/office/word/2015/wordml/symex" xmlns:wpg="http://schemas.microsoft.com/office/word/2010/wordprocessingGroup" xmlns:wpi="http://schemas.microsoft.com/office/word/2010/wordprocessingInk" xmlns:wne="http://schemas.microsoft.com/office/word/2006/wordml" xmlns:wps="http://schemas.microsoft.com/office/word/2010/wordprocessingShape" mc:Ignorable="w14 w15 w16se w16cid w16 w16cex wp14">
+<w:numbering xmlns:wpc="http://schemas.microsoft.com/office/word/2010/wordprocessingCanvas" xmlns:cx="http://schemas.microsoft.com/office/drawing/2014/chartex" xmlns:cx1="http://schemas.microsoft.com/office/drawing/2015/9/8/chartex" xmlns:cx2="http://schemas.microsoft.com/office/drawing/2015/10/21/chartex" xmlns:cx3="http://schemas.microsoft.com/office/drawing/2016/5/9/chartex" xmlns:cx4="http://schemas.microsoft.com/office/drawing/2016/5/10/chartex" xmlns:cx5="http://schemas.microsoft.com/office/drawing/2016/5/11/chartex" xmlns:cx6="http://schemas.microsoft.com/office/drawing/2016/5/12/chartex" xmlns:cx7="http://schemas.microsoft.com/office/drawing/2016/5/13/chartex" xmlns:cx8="http://schemas.microsoft.com/office/drawing/2016/5/14/chartex" xmlns:mc="http://schemas.openxmlformats.org/markup-compatibility/2006" xmlns:aink="http://schemas.microsoft.com/office/drawing/2016/ink" xmlns:am3d="http://schemas.microsoft.com/office/drawing/2017/model3d" xmlns:o="urn:schemas-microsoft-com:office:office" xmlns:oel="http://schemas.microsoft.com/office/2019/extlst" xmlns:r="http://schemas.openxmlformats.org/officeDocument/2006/relationships" xmlns:m="http://schemas.openxmlformats.org/officeDocument/2006/math" xmlns:v="urn:schemas-microsoft-com:vml" xmlns:wp14="http://schemas.microsoft.com/office/word/2010/wordprocessingDrawing" xmlns:wp="http://schemas.openxmlformats.org/drawingml/2006/wordprocessingDrawing" xmlns:w10="urn:schemas-microsoft-com:office:word" xmlns:w="http://schemas.openxmlformats.org/wordprocessingml/2006/main" xmlns:w14="http://schemas.microsoft.com/office/word/2010/wordml" xmlns:w15="http://schemas.microsoft.com/office/word/2012/wordml" xmlns:w16cex="http://schemas.microsoft.com/office/word/2018/wordml/cex" xmlns:w16cid="http://schemas.microsoft.com/office/word/2016/wordml/cid" xmlns:w16="http://schemas.microsoft.com/office/word/2018/wordml" xmlns:w16du="http://schemas.microsoft.com/office/word/2023/wordml/word16du" xmlns:w16sdtdh="http://schemas.microsoft.com/office/word/2020/wordml/sdtdatahash" xmlns:w16sdtfl="http://schemas.microsoft.com/office/word/2024/wordml/sdtformatlock" xmlns:w16se="http://schemas.microsoft.com/office/word/2015/wordml/symex" xmlns:wpg="http://schemas.microsoft.com/office/word/2010/wordprocessingGroup" xmlns:wpi="http://schemas.microsoft.com/office/word/2010/wordprocessingInk" xmlns:wne="http://schemas.microsoft.com/office/word/2006/wordml" xmlns:wps="http://schemas.microsoft.com/office/word/2010/wordprocessingShape" mc:Ignorable="w14 w15 w16se w16cid w16 w16cex w16sdtdh w16sdtfl w16du wp14">
   <w:abstractNum w:abstractNumId="0" w15:restartNumberingAfterBreak="0">
     <w:nsid w:val="0E6F5C24"/>
     <w:multiLevelType w:val="hybridMultilevel"/>
@@ -5355,17 +5179,17 @@
       </w:pPr>
     </w:lvl>
   </w:abstractNum>
-  <w:num w:numId="1">
+  <w:num w:numId="1" w16cid:durableId="635184709">
     <w:abstractNumId w:val="1"/>
   </w:num>
-  <w:num w:numId="2">
+  <w:num w:numId="2" w16cid:durableId="234781362">
     <w:abstractNumId w:val="0"/>
   </w:num>
 </w:numbering>
 </file>
 
 <file path=word/styles.xml><?xml version="1.0" encoding="utf-8"?>
-<w:styles xmlns:mc="http://schemas.openxmlformats.org/markup-compatibility/2006" xmlns:r="http://schemas.openxmlformats.org/officeDocument/2006/relationships" xmlns:w="http://schemas.openxmlformats.org/wordprocessingml/2006/main" xmlns:w14="http://schemas.microsoft.com/office/word/2010/wordml" xmlns:w15="http://schemas.microsoft.com/office/word/2012/wordml" xmlns:w16cex="http://schemas.microsoft.com/office/word/2018/wordml/cex" xmlns:w16cid="http://schemas.microsoft.com/office/word/2016/wordml/cid" xmlns:w16="http://schemas.microsoft.com/office/word/2018/wordml" xmlns:w16se="http://schemas.microsoft.com/office/word/2015/wordml/symex" mc:Ignorable="w14 w15 w16se w16cid w16 w16cex">
+<w:styles xmlns:mc="http://schemas.openxmlformats.org/markup-compatibility/2006" xmlns:r="http://schemas.openxmlformats.org/officeDocument/2006/relationships" xmlns:w="http://schemas.openxmlformats.org/wordprocessingml/2006/main" xmlns:w14="http://schemas.microsoft.com/office/word/2010/wordml" xmlns:w15="http://schemas.microsoft.com/office/word/2012/wordml" xmlns:w16cex="http://schemas.microsoft.com/office/word/2018/wordml/cex" xmlns:w16cid="http://schemas.microsoft.com/office/word/2016/wordml/cid" xmlns:w16="http://schemas.microsoft.com/office/word/2018/wordml" xmlns:w16du="http://schemas.microsoft.com/office/word/2023/wordml/word16du" xmlns:w16sdtdh="http://schemas.microsoft.com/office/word/2020/wordml/sdtdatahash" xmlns:w16sdtfl="http://schemas.microsoft.com/office/word/2024/wordml/sdtformatlock" xmlns:w16se="http://schemas.microsoft.com/office/word/2015/wordml/symex" mc:Ignorable="w14 w15 w16se w16cid w16 w16cex w16sdtdh w16sdtfl w16du">
   <w:docDefaults>
     <w:rPrDefault>
       <w:rPr>

</xml_diff>